<commit_message>
Developed The Delivery Address Feature of This App Completely Time : 1:02 AM
</commit_message>
<xml_diff>
--- a/Project Structure/Project Structure.docx
+++ b/Project Structure/Project Structure.docx
@@ -18,7 +18,7 @@
           <w:szCs w:val="24"/>
         </w:rPr>
         <w:pict w14:anchorId="7FD56637">
-          <v:rect id="_x0000_i1029" style="width:0;height:1.5pt" o:hralign="center" o:hrstd="t" o:hr="t" fillcolor="#a0a0a0" stroked="f"/>
+          <v:rect id="_x0000_i1025" style="width:0;height:1.5pt" o:hralign="center" o:hrstd="t" o:hr="t" fillcolor="#a0a0a0" stroked="f"/>
         </w:pict>
       </w:r>
     </w:p>
@@ -38,6 +38,36 @@
           <w:szCs w:val="24"/>
         </w:rPr>
         <w:pict w14:anchorId="38BF37BA">
+          <v:rect id="_x0000_i1026" style="width:0;height:1.5pt" o:hralign="center" o:hrstd="t" o:hr="t" fillcolor="#a0a0a0" stroked="f"/>
+        </w:pict>
+      </w:r>
+    </w:p>
+    <w:p>
+      <w:pPr>
+        <w:spacing w:after="0" w:line="240" w:lineRule="auto"/>
+        <w:rPr>
+          <w:rFonts w:ascii="Times New Roman" w:eastAsia="Times New Roman" w:hAnsi="Times New Roman" w:cs="Times New Roman"/>
+          <w:sz w:val="24"/>
+          <w:szCs w:val="24"/>
+        </w:rPr>
+      </w:pPr>
+    </w:p>
+    <w:p>
+      <w:pPr>
+        <w:spacing w:after="0" w:line="240" w:lineRule="auto"/>
+        <w:rPr>
+          <w:rFonts w:ascii="Times New Roman" w:eastAsia="Times New Roman" w:hAnsi="Times New Roman" w:cs="Times New Roman"/>
+          <w:sz w:val="24"/>
+          <w:szCs w:val="24"/>
+        </w:rPr>
+      </w:pPr>
+      <w:r>
+        <w:rPr>
+          <w:rFonts w:ascii="Times New Roman" w:eastAsia="Times New Roman" w:hAnsi="Times New Roman" w:cs="Times New Roman"/>
+          <w:sz w:val="24"/>
+          <w:szCs w:val="24"/>
+        </w:rPr>
+        <w:pict w14:anchorId="669B5EBD">
           <v:rect id="_x0000_i1030" style="width:0;height:1.5pt" o:hralign="center" o:hrstd="t" o:hr="t" fillcolor="#a0a0a0" stroked="f"/>
         </w:pict>
       </w:r>
@@ -62,7 +92,7 @@
           <w:sz w:val="36"/>
           <w:szCs w:val="36"/>
         </w:rPr>
-        <w:t>📍 Delivery Address — Full Deep Dive</w:t>
+        <w:t>💳 Payments — Full Deep Dive</w:t>
       </w:r>
     </w:p>
     <w:p>
@@ -80,1893 +110,8 @@
           <w:sz w:val="24"/>
           <w:szCs w:val="24"/>
         </w:rPr>
-        <w:pict w14:anchorId="1AC9BC34">
+        <w:pict w14:anchorId="718E55CB">
           <v:rect id="_x0000_i1031" style="width:0;height:1.5pt" o:hralign="center" o:hrstd="t" o:hr="t" fillcolor="#a0a0a0" stroked="f"/>
-        </w:pict>
-      </w:r>
-    </w:p>
-    <w:p>
-      <w:pPr>
-        <w:spacing w:before="100" w:beforeAutospacing="1" w:after="100" w:afterAutospacing="1" w:line="240" w:lineRule="auto"/>
-        <w:outlineLvl w:val="2"/>
-        <w:rPr>
-          <w:rFonts w:ascii="Times New Roman" w:eastAsia="Times New Roman" w:hAnsi="Times New Roman" w:cs="Times New Roman"/>
-          <w:b/>
-          <w:bCs/>
-          <w:sz w:val="27"/>
-          <w:szCs w:val="27"/>
-        </w:rPr>
-      </w:pPr>
-      <w:r>
-        <w:rPr>
-          <w:rFonts w:ascii="Times New Roman" w:eastAsia="Times New Roman" w:hAnsi="Times New Roman" w:cs="Times New Roman"/>
-          <w:b/>
-          <w:bCs/>
-          <w:sz w:val="27"/>
-          <w:szCs w:val="27"/>
-        </w:rPr>
-        <w:t>🗄️ Database Model</w:t>
-      </w:r>
-    </w:p>
-    <w:tbl>
-      <w:tblPr>
-        <w:tblW w:w="0" w:type="auto"/>
-        <w:tblCellSpacing w:w="15" w:type="dxa"/>
-        <w:tblCellMar>
-          <w:top w:w="15" w:type="dxa"/>
-          <w:left w:w="15" w:type="dxa"/>
-          <w:bottom w:w="15" w:type="dxa"/>
-          <w:right w:w="15" w:type="dxa"/>
-        </w:tblCellMar>
-        <w:tblLook w:val="04A0" w:firstRow="1" w:lastRow="0" w:firstColumn="1" w:lastColumn="0" w:noHBand="0" w:noVBand="1"/>
-      </w:tblPr>
-      <w:tblGrid>
-        <w:gridCol w:w="1276"/>
-        <w:gridCol w:w="1180"/>
-        <w:gridCol w:w="1975"/>
-      </w:tblGrid>
-      <w:tr>
-        <w:trPr>
-          <w:tblHeader/>
-          <w:tblCellSpacing w:w="15" w:type="dxa"/>
-        </w:trPr>
-        <w:tc>
-          <w:tcPr>
-            <w:tcW w:w="0" w:type="auto"/>
-            <w:vAlign w:val="center"/>
-            <w:hideMark/>
-          </w:tcPr>
-          <w:p>
-            <w:pPr>
-              <w:spacing w:after="0" w:line="240" w:lineRule="auto"/>
-              <w:jc w:val="center"/>
-              <w:rPr>
-                <w:rFonts w:ascii="Times New Roman" w:eastAsia="Times New Roman" w:hAnsi="Times New Roman" w:cs="Times New Roman"/>
-                <w:b/>
-                <w:bCs/>
-                <w:sz w:val="24"/>
-                <w:szCs w:val="24"/>
-              </w:rPr>
-            </w:pPr>
-            <w:r>
-              <w:rPr>
-                <w:rFonts w:ascii="Times New Roman" w:eastAsia="Times New Roman" w:hAnsi="Times New Roman" w:cs="Times New Roman"/>
-                <w:b/>
-                <w:bCs/>
-                <w:sz w:val="24"/>
-                <w:szCs w:val="24"/>
-              </w:rPr>
-              <w:t>Column</w:t>
-            </w:r>
-          </w:p>
-        </w:tc>
-        <w:tc>
-          <w:tcPr>
-            <w:tcW w:w="0" w:type="auto"/>
-            <w:vAlign w:val="center"/>
-            <w:hideMark/>
-          </w:tcPr>
-          <w:p>
-            <w:pPr>
-              <w:spacing w:after="0" w:line="240" w:lineRule="auto"/>
-              <w:jc w:val="center"/>
-              <w:rPr>
-                <w:rFonts w:ascii="Times New Roman" w:eastAsia="Times New Roman" w:hAnsi="Times New Roman" w:cs="Times New Roman"/>
-                <w:b/>
-                <w:bCs/>
-                <w:sz w:val="24"/>
-                <w:szCs w:val="24"/>
-              </w:rPr>
-            </w:pPr>
-            <w:r>
-              <w:rPr>
-                <w:rFonts w:ascii="Times New Roman" w:eastAsia="Times New Roman" w:hAnsi="Times New Roman" w:cs="Times New Roman"/>
-                <w:b/>
-                <w:bCs/>
-                <w:sz w:val="24"/>
-                <w:szCs w:val="24"/>
-              </w:rPr>
-              <w:t>Type</w:t>
-            </w:r>
-          </w:p>
-        </w:tc>
-        <w:tc>
-          <w:tcPr>
-            <w:tcW w:w="0" w:type="auto"/>
-            <w:vAlign w:val="center"/>
-            <w:hideMark/>
-          </w:tcPr>
-          <w:p>
-            <w:pPr>
-              <w:spacing w:after="0" w:line="240" w:lineRule="auto"/>
-              <w:jc w:val="center"/>
-              <w:rPr>
-                <w:rFonts w:ascii="Times New Roman" w:eastAsia="Times New Roman" w:hAnsi="Times New Roman" w:cs="Times New Roman"/>
-                <w:b/>
-                <w:bCs/>
-                <w:sz w:val="24"/>
-                <w:szCs w:val="24"/>
-              </w:rPr>
-            </w:pPr>
-            <w:r>
-              <w:rPr>
-                <w:rFonts w:ascii="Times New Roman" w:eastAsia="Times New Roman" w:hAnsi="Times New Roman" w:cs="Times New Roman"/>
-                <w:b/>
-                <w:bCs/>
-                <w:sz w:val="24"/>
-                <w:szCs w:val="24"/>
-              </w:rPr>
-              <w:t>Notes</w:t>
-            </w:r>
-          </w:p>
-        </w:tc>
-      </w:tr>
-      <w:tr>
-        <w:trPr>
-          <w:tblCellSpacing w:w="15" w:type="dxa"/>
-        </w:trPr>
-        <w:tc>
-          <w:tcPr>
-            <w:tcW w:w="0" w:type="auto"/>
-            <w:vAlign w:val="center"/>
-            <w:hideMark/>
-          </w:tcPr>
-          <w:p>
-            <w:pPr>
-              <w:spacing w:after="0" w:line="240" w:lineRule="auto"/>
-              <w:rPr>
-                <w:rFonts w:ascii="Times New Roman" w:eastAsia="Times New Roman" w:hAnsi="Times New Roman" w:cs="Times New Roman"/>
-                <w:sz w:val="24"/>
-                <w:szCs w:val="24"/>
-              </w:rPr>
-            </w:pPr>
-            <w:r>
-              <w:rPr>
-                <w:rFonts w:ascii="Courier New" w:eastAsia="Times New Roman" w:hAnsi="Courier New" w:cs="Courier New"/>
-                <w:sz w:val="20"/>
-                <w:szCs w:val="20"/>
-              </w:rPr>
-              <w:t>id</w:t>
-            </w:r>
-          </w:p>
-        </w:tc>
-        <w:tc>
-          <w:tcPr>
-            <w:tcW w:w="0" w:type="auto"/>
-            <w:vAlign w:val="center"/>
-            <w:hideMark/>
-          </w:tcPr>
-          <w:p>
-            <w:pPr>
-              <w:spacing w:after="0" w:line="240" w:lineRule="auto"/>
-              <w:rPr>
-                <w:rFonts w:ascii="Times New Roman" w:eastAsia="Times New Roman" w:hAnsi="Times New Roman" w:cs="Times New Roman"/>
-                <w:sz w:val="24"/>
-                <w:szCs w:val="24"/>
-              </w:rPr>
-            </w:pPr>
-            <w:r>
-              <w:rPr>
-                <w:rFonts w:ascii="Times New Roman" w:eastAsia="Times New Roman" w:hAnsi="Times New Roman" w:cs="Times New Roman"/>
-                <w:sz w:val="24"/>
-                <w:szCs w:val="24"/>
-              </w:rPr>
-              <w:t>Integer</w:t>
-            </w:r>
-          </w:p>
-        </w:tc>
-        <w:tc>
-          <w:tcPr>
-            <w:tcW w:w="0" w:type="auto"/>
-            <w:vAlign w:val="center"/>
-            <w:hideMark/>
-          </w:tcPr>
-          <w:p>
-            <w:pPr>
-              <w:spacing w:after="0" w:line="240" w:lineRule="auto"/>
-              <w:rPr>
-                <w:rFonts w:ascii="Times New Roman" w:eastAsia="Times New Roman" w:hAnsi="Times New Roman" w:cs="Times New Roman"/>
-                <w:sz w:val="24"/>
-                <w:szCs w:val="24"/>
-              </w:rPr>
-            </w:pPr>
-          </w:p>
-        </w:tc>
-      </w:tr>
-      <w:tr>
-        <w:trPr>
-          <w:tblCellSpacing w:w="15" w:type="dxa"/>
-        </w:trPr>
-        <w:tc>
-          <w:tcPr>
-            <w:tcW w:w="0" w:type="auto"/>
-            <w:vAlign w:val="center"/>
-            <w:hideMark/>
-          </w:tcPr>
-          <w:p>
-            <w:pPr>
-              <w:spacing w:after="0" w:line="240" w:lineRule="auto"/>
-              <w:rPr>
-                <w:rFonts w:ascii="Times New Roman" w:eastAsia="Times New Roman" w:hAnsi="Times New Roman" w:cs="Times New Roman"/>
-                <w:sz w:val="24"/>
-                <w:szCs w:val="24"/>
-              </w:rPr>
-            </w:pPr>
-            <w:r>
-              <w:rPr>
-                <w:rFonts w:ascii="Courier New" w:eastAsia="Times New Roman" w:hAnsi="Courier New" w:cs="Courier New"/>
-                <w:sz w:val="20"/>
-                <w:szCs w:val="20"/>
-              </w:rPr>
-              <w:t>user_id</w:t>
-            </w:r>
-          </w:p>
-        </w:tc>
-        <w:tc>
-          <w:tcPr>
-            <w:tcW w:w="0" w:type="auto"/>
-            <w:vAlign w:val="center"/>
-            <w:hideMark/>
-          </w:tcPr>
-          <w:p>
-            <w:pPr>
-              <w:spacing w:after="0" w:line="240" w:lineRule="auto"/>
-              <w:rPr>
-                <w:rFonts w:ascii="Times New Roman" w:eastAsia="Times New Roman" w:hAnsi="Times New Roman" w:cs="Times New Roman"/>
-                <w:sz w:val="24"/>
-                <w:szCs w:val="24"/>
-              </w:rPr>
-            </w:pPr>
-            <w:r>
-              <w:rPr>
-                <w:rFonts w:ascii="Times New Roman" w:eastAsia="Times New Roman" w:hAnsi="Times New Roman" w:cs="Times New Roman"/>
-                <w:sz w:val="24"/>
-                <w:szCs w:val="24"/>
-              </w:rPr>
-              <w:t>FK → User</w:t>
-            </w:r>
-          </w:p>
-        </w:tc>
-        <w:tc>
-          <w:tcPr>
-            <w:tcW w:w="0" w:type="auto"/>
-            <w:vAlign w:val="center"/>
-            <w:hideMark/>
-          </w:tcPr>
-          <w:p>
-            <w:pPr>
-              <w:spacing w:after="0" w:line="240" w:lineRule="auto"/>
-              <w:rPr>
-                <w:rFonts w:ascii="Times New Roman" w:eastAsia="Times New Roman" w:hAnsi="Times New Roman" w:cs="Times New Roman"/>
-                <w:sz w:val="24"/>
-                <w:szCs w:val="24"/>
-              </w:rPr>
-            </w:pPr>
-          </w:p>
-        </w:tc>
-      </w:tr>
-      <w:tr>
-        <w:trPr>
-          <w:tblCellSpacing w:w="15" w:type="dxa"/>
-        </w:trPr>
-        <w:tc>
-          <w:tcPr>
-            <w:tcW w:w="0" w:type="auto"/>
-            <w:vAlign w:val="center"/>
-            <w:hideMark/>
-          </w:tcPr>
-          <w:p>
-            <w:pPr>
-              <w:spacing w:after="0" w:line="240" w:lineRule="auto"/>
-              <w:rPr>
-                <w:rFonts w:ascii="Times New Roman" w:eastAsia="Times New Roman" w:hAnsi="Times New Roman" w:cs="Times New Roman"/>
-                <w:sz w:val="24"/>
-                <w:szCs w:val="24"/>
-              </w:rPr>
-            </w:pPr>
-            <w:r>
-              <w:rPr>
-                <w:rFonts w:ascii="Courier New" w:eastAsia="Times New Roman" w:hAnsi="Courier New" w:cs="Courier New"/>
-                <w:sz w:val="20"/>
-                <w:szCs w:val="20"/>
-              </w:rPr>
-              <w:t>label</w:t>
-            </w:r>
-          </w:p>
-        </w:tc>
-        <w:tc>
-          <w:tcPr>
-            <w:tcW w:w="0" w:type="auto"/>
-            <w:vAlign w:val="center"/>
-            <w:hideMark/>
-          </w:tcPr>
-          <w:p>
-            <w:pPr>
-              <w:spacing w:after="0" w:line="240" w:lineRule="auto"/>
-              <w:rPr>
-                <w:rFonts w:ascii="Times New Roman" w:eastAsia="Times New Roman" w:hAnsi="Times New Roman" w:cs="Times New Roman"/>
-                <w:sz w:val="24"/>
-                <w:szCs w:val="24"/>
-              </w:rPr>
-            </w:pPr>
-            <w:r>
-              <w:rPr>
-                <w:rFonts w:ascii="Times New Roman" w:eastAsia="Times New Roman" w:hAnsi="Times New Roman" w:cs="Times New Roman"/>
-                <w:sz w:val="24"/>
-                <w:szCs w:val="24"/>
-              </w:rPr>
-              <w:t>Enum</w:t>
-            </w:r>
-          </w:p>
-        </w:tc>
-        <w:tc>
-          <w:tcPr>
-            <w:tcW w:w="0" w:type="auto"/>
-            <w:vAlign w:val="center"/>
-            <w:hideMark/>
-          </w:tcPr>
-          <w:p>
-            <w:pPr>
-              <w:spacing w:after="0" w:line="240" w:lineRule="auto"/>
-              <w:rPr>
-                <w:rFonts w:ascii="Times New Roman" w:eastAsia="Times New Roman" w:hAnsi="Times New Roman" w:cs="Times New Roman"/>
-                <w:sz w:val="24"/>
-                <w:szCs w:val="24"/>
-              </w:rPr>
-            </w:pPr>
-            <w:r>
-              <w:rPr>
-                <w:rFonts w:ascii="Courier New" w:eastAsia="Times New Roman" w:hAnsi="Courier New" w:cs="Courier New"/>
-                <w:sz w:val="20"/>
-                <w:szCs w:val="20"/>
-              </w:rPr>
-              <w:t>home</w:t>
-            </w:r>
-            <w:r>
-              <w:rPr>
-                <w:rFonts w:ascii="Times New Roman" w:eastAsia="Times New Roman" w:hAnsi="Times New Roman" w:cs="Times New Roman"/>
-                <w:sz w:val="24"/>
-                <w:szCs w:val="24"/>
-              </w:rPr>
-              <w:t xml:space="preserve">, </w:t>
-            </w:r>
-            <w:r>
-              <w:rPr>
-                <w:rFonts w:ascii="Courier New" w:eastAsia="Times New Roman" w:hAnsi="Courier New" w:cs="Courier New"/>
-                <w:sz w:val="20"/>
-                <w:szCs w:val="20"/>
-              </w:rPr>
-              <w:t>work</w:t>
-            </w:r>
-            <w:r>
-              <w:rPr>
-                <w:rFonts w:ascii="Times New Roman" w:eastAsia="Times New Roman" w:hAnsi="Times New Roman" w:cs="Times New Roman"/>
-                <w:sz w:val="24"/>
-                <w:szCs w:val="24"/>
-              </w:rPr>
-              <w:t xml:space="preserve">, </w:t>
-            </w:r>
-            <w:r>
-              <w:rPr>
-                <w:rFonts w:ascii="Courier New" w:eastAsia="Times New Roman" w:hAnsi="Courier New" w:cs="Courier New"/>
-                <w:sz w:val="20"/>
-                <w:szCs w:val="20"/>
-              </w:rPr>
-              <w:t>other</w:t>
-            </w:r>
-          </w:p>
-        </w:tc>
-      </w:tr>
-      <w:tr>
-        <w:trPr>
-          <w:tblCellSpacing w:w="15" w:type="dxa"/>
-        </w:trPr>
-        <w:tc>
-          <w:tcPr>
-            <w:tcW w:w="0" w:type="auto"/>
-            <w:vAlign w:val="center"/>
-            <w:hideMark/>
-          </w:tcPr>
-          <w:p>
-            <w:pPr>
-              <w:spacing w:after="0" w:line="240" w:lineRule="auto"/>
-              <w:rPr>
-                <w:rFonts w:ascii="Times New Roman" w:eastAsia="Times New Roman" w:hAnsi="Times New Roman" w:cs="Times New Roman"/>
-                <w:sz w:val="24"/>
-                <w:szCs w:val="24"/>
-              </w:rPr>
-            </w:pPr>
-            <w:r>
-              <w:rPr>
-                <w:rFonts w:ascii="Courier New" w:eastAsia="Times New Roman" w:hAnsi="Courier New" w:cs="Courier New"/>
-                <w:sz w:val="20"/>
-                <w:szCs w:val="20"/>
-              </w:rPr>
-              <w:t>street</w:t>
-            </w:r>
-          </w:p>
-        </w:tc>
-        <w:tc>
-          <w:tcPr>
-            <w:tcW w:w="0" w:type="auto"/>
-            <w:vAlign w:val="center"/>
-            <w:hideMark/>
-          </w:tcPr>
-          <w:p>
-            <w:pPr>
-              <w:spacing w:after="0" w:line="240" w:lineRule="auto"/>
-              <w:rPr>
-                <w:rFonts w:ascii="Times New Roman" w:eastAsia="Times New Roman" w:hAnsi="Times New Roman" w:cs="Times New Roman"/>
-                <w:sz w:val="24"/>
-                <w:szCs w:val="24"/>
-              </w:rPr>
-            </w:pPr>
-            <w:r>
-              <w:rPr>
-                <w:rFonts w:ascii="Times New Roman" w:eastAsia="Times New Roman" w:hAnsi="Times New Roman" w:cs="Times New Roman"/>
-                <w:sz w:val="24"/>
-                <w:szCs w:val="24"/>
-              </w:rPr>
-              <w:t>String</w:t>
-            </w:r>
-          </w:p>
-        </w:tc>
-        <w:tc>
-          <w:tcPr>
-            <w:tcW w:w="0" w:type="auto"/>
-            <w:vAlign w:val="center"/>
-            <w:hideMark/>
-          </w:tcPr>
-          <w:p>
-            <w:pPr>
-              <w:spacing w:after="0" w:line="240" w:lineRule="auto"/>
-              <w:rPr>
-                <w:rFonts w:ascii="Times New Roman" w:eastAsia="Times New Roman" w:hAnsi="Times New Roman" w:cs="Times New Roman"/>
-                <w:sz w:val="24"/>
-                <w:szCs w:val="24"/>
-              </w:rPr>
-            </w:pPr>
-          </w:p>
-        </w:tc>
-      </w:tr>
-      <w:tr>
-        <w:trPr>
-          <w:tblCellSpacing w:w="15" w:type="dxa"/>
-        </w:trPr>
-        <w:tc>
-          <w:tcPr>
-            <w:tcW w:w="0" w:type="auto"/>
-            <w:vAlign w:val="center"/>
-            <w:hideMark/>
-          </w:tcPr>
-          <w:p>
-            <w:pPr>
-              <w:spacing w:after="0" w:line="240" w:lineRule="auto"/>
-              <w:rPr>
-                <w:rFonts w:ascii="Times New Roman" w:eastAsia="Times New Roman" w:hAnsi="Times New Roman" w:cs="Times New Roman"/>
-                <w:sz w:val="24"/>
-                <w:szCs w:val="24"/>
-              </w:rPr>
-            </w:pPr>
-            <w:r>
-              <w:rPr>
-                <w:rFonts w:ascii="Courier New" w:eastAsia="Times New Roman" w:hAnsi="Courier New" w:cs="Courier New"/>
-                <w:sz w:val="20"/>
-                <w:szCs w:val="20"/>
-              </w:rPr>
-              <w:t>city</w:t>
-            </w:r>
-          </w:p>
-        </w:tc>
-        <w:tc>
-          <w:tcPr>
-            <w:tcW w:w="0" w:type="auto"/>
-            <w:vAlign w:val="center"/>
-            <w:hideMark/>
-          </w:tcPr>
-          <w:p>
-            <w:pPr>
-              <w:spacing w:after="0" w:line="240" w:lineRule="auto"/>
-              <w:rPr>
-                <w:rFonts w:ascii="Times New Roman" w:eastAsia="Times New Roman" w:hAnsi="Times New Roman" w:cs="Times New Roman"/>
-                <w:sz w:val="24"/>
-                <w:szCs w:val="24"/>
-              </w:rPr>
-            </w:pPr>
-            <w:r>
-              <w:rPr>
-                <w:rFonts w:ascii="Times New Roman" w:eastAsia="Times New Roman" w:hAnsi="Times New Roman" w:cs="Times New Roman"/>
-                <w:sz w:val="24"/>
-                <w:szCs w:val="24"/>
-              </w:rPr>
-              <w:t>String</w:t>
-            </w:r>
-          </w:p>
-        </w:tc>
-        <w:tc>
-          <w:tcPr>
-            <w:tcW w:w="0" w:type="auto"/>
-            <w:vAlign w:val="center"/>
-            <w:hideMark/>
-          </w:tcPr>
-          <w:p>
-            <w:pPr>
-              <w:spacing w:after="0" w:line="240" w:lineRule="auto"/>
-              <w:rPr>
-                <w:rFonts w:ascii="Times New Roman" w:eastAsia="Times New Roman" w:hAnsi="Times New Roman" w:cs="Times New Roman"/>
-                <w:sz w:val="24"/>
-                <w:szCs w:val="24"/>
-              </w:rPr>
-            </w:pPr>
-          </w:p>
-        </w:tc>
-      </w:tr>
-      <w:tr>
-        <w:trPr>
-          <w:tblCellSpacing w:w="15" w:type="dxa"/>
-        </w:trPr>
-        <w:tc>
-          <w:tcPr>
-            <w:tcW w:w="0" w:type="auto"/>
-            <w:vAlign w:val="center"/>
-            <w:hideMark/>
-          </w:tcPr>
-          <w:p>
-            <w:pPr>
-              <w:spacing w:after="0" w:line="240" w:lineRule="auto"/>
-              <w:rPr>
-                <w:rFonts w:ascii="Times New Roman" w:eastAsia="Times New Roman" w:hAnsi="Times New Roman" w:cs="Times New Roman"/>
-                <w:sz w:val="24"/>
-                <w:szCs w:val="24"/>
-              </w:rPr>
-            </w:pPr>
-            <w:r>
-              <w:rPr>
-                <w:rFonts w:ascii="Courier New" w:eastAsia="Times New Roman" w:hAnsi="Courier New" w:cs="Courier New"/>
-                <w:sz w:val="20"/>
-                <w:szCs w:val="20"/>
-              </w:rPr>
-              <w:t>zip_code</w:t>
-            </w:r>
-          </w:p>
-        </w:tc>
-        <w:tc>
-          <w:tcPr>
-            <w:tcW w:w="0" w:type="auto"/>
-            <w:vAlign w:val="center"/>
-            <w:hideMark/>
-          </w:tcPr>
-          <w:p>
-            <w:pPr>
-              <w:spacing w:after="0" w:line="240" w:lineRule="auto"/>
-              <w:rPr>
-                <w:rFonts w:ascii="Times New Roman" w:eastAsia="Times New Roman" w:hAnsi="Times New Roman" w:cs="Times New Roman"/>
-                <w:sz w:val="24"/>
-                <w:szCs w:val="24"/>
-              </w:rPr>
-            </w:pPr>
-            <w:r>
-              <w:rPr>
-                <w:rFonts w:ascii="Times New Roman" w:eastAsia="Times New Roman" w:hAnsi="Times New Roman" w:cs="Times New Roman"/>
-                <w:sz w:val="24"/>
-                <w:szCs w:val="24"/>
-              </w:rPr>
-              <w:t>String</w:t>
-            </w:r>
-          </w:p>
-        </w:tc>
-        <w:tc>
-          <w:tcPr>
-            <w:tcW w:w="0" w:type="auto"/>
-            <w:vAlign w:val="center"/>
-            <w:hideMark/>
-          </w:tcPr>
-          <w:p>
-            <w:pPr>
-              <w:spacing w:after="0" w:line="240" w:lineRule="auto"/>
-              <w:rPr>
-                <w:rFonts w:ascii="Times New Roman" w:eastAsia="Times New Roman" w:hAnsi="Times New Roman" w:cs="Times New Roman"/>
-                <w:sz w:val="24"/>
-                <w:szCs w:val="24"/>
-              </w:rPr>
-            </w:pPr>
-          </w:p>
-        </w:tc>
-      </w:tr>
-      <w:tr>
-        <w:trPr>
-          <w:tblCellSpacing w:w="15" w:type="dxa"/>
-        </w:trPr>
-        <w:tc>
-          <w:tcPr>
-            <w:tcW w:w="0" w:type="auto"/>
-            <w:vAlign w:val="center"/>
-            <w:hideMark/>
-          </w:tcPr>
-          <w:p>
-            <w:pPr>
-              <w:spacing w:after="0" w:line="240" w:lineRule="auto"/>
-              <w:rPr>
-                <w:rFonts w:ascii="Times New Roman" w:eastAsia="Times New Roman" w:hAnsi="Times New Roman" w:cs="Times New Roman"/>
-                <w:sz w:val="24"/>
-                <w:szCs w:val="24"/>
-              </w:rPr>
-            </w:pPr>
-            <w:r>
-              <w:rPr>
-                <w:rFonts w:ascii="Courier New" w:eastAsia="Times New Roman" w:hAnsi="Courier New" w:cs="Courier New"/>
-                <w:sz w:val="20"/>
-                <w:szCs w:val="20"/>
-              </w:rPr>
-              <w:t>is_default</w:t>
-            </w:r>
-          </w:p>
-        </w:tc>
-        <w:tc>
-          <w:tcPr>
-            <w:tcW w:w="0" w:type="auto"/>
-            <w:vAlign w:val="center"/>
-            <w:hideMark/>
-          </w:tcPr>
-          <w:p>
-            <w:pPr>
-              <w:spacing w:after="0" w:line="240" w:lineRule="auto"/>
-              <w:rPr>
-                <w:rFonts w:ascii="Times New Roman" w:eastAsia="Times New Roman" w:hAnsi="Times New Roman" w:cs="Times New Roman"/>
-                <w:sz w:val="24"/>
-                <w:szCs w:val="24"/>
-              </w:rPr>
-            </w:pPr>
-            <w:r>
-              <w:rPr>
-                <w:rFonts w:ascii="Times New Roman" w:eastAsia="Times New Roman" w:hAnsi="Times New Roman" w:cs="Times New Roman"/>
-                <w:sz w:val="24"/>
-                <w:szCs w:val="24"/>
-              </w:rPr>
-              <w:t>Boolean</w:t>
-            </w:r>
-          </w:p>
-        </w:tc>
-        <w:tc>
-          <w:tcPr>
-            <w:tcW w:w="0" w:type="auto"/>
-            <w:vAlign w:val="center"/>
-            <w:hideMark/>
-          </w:tcPr>
-          <w:p>
-            <w:pPr>
-              <w:spacing w:after="0" w:line="240" w:lineRule="auto"/>
-              <w:rPr>
-                <w:rFonts w:ascii="Times New Roman" w:eastAsia="Times New Roman" w:hAnsi="Times New Roman" w:cs="Times New Roman"/>
-                <w:sz w:val="24"/>
-                <w:szCs w:val="24"/>
-              </w:rPr>
-            </w:pPr>
-            <w:r>
-              <w:rPr>
-                <w:rFonts w:ascii="Times New Roman" w:eastAsia="Times New Roman" w:hAnsi="Times New Roman" w:cs="Times New Roman"/>
-                <w:sz w:val="24"/>
-                <w:szCs w:val="24"/>
-              </w:rPr>
-              <w:t>one default per user</w:t>
-            </w:r>
-          </w:p>
-        </w:tc>
-      </w:tr>
-      <w:tr>
-        <w:trPr>
-          <w:tblCellSpacing w:w="15" w:type="dxa"/>
-        </w:trPr>
-        <w:tc>
-          <w:tcPr>
-            <w:tcW w:w="0" w:type="auto"/>
-            <w:vAlign w:val="center"/>
-            <w:hideMark/>
-          </w:tcPr>
-          <w:p>
-            <w:pPr>
-              <w:spacing w:after="0" w:line="240" w:lineRule="auto"/>
-              <w:rPr>
-                <w:rFonts w:ascii="Times New Roman" w:eastAsia="Times New Roman" w:hAnsi="Times New Roman" w:cs="Times New Roman"/>
-                <w:sz w:val="24"/>
-                <w:szCs w:val="24"/>
-              </w:rPr>
-            </w:pPr>
-            <w:r>
-              <w:rPr>
-                <w:rFonts w:ascii="Courier New" w:eastAsia="Times New Roman" w:hAnsi="Courier New" w:cs="Courier New"/>
-                <w:sz w:val="20"/>
-                <w:szCs w:val="20"/>
-              </w:rPr>
-              <w:t>created_at</w:t>
-            </w:r>
-          </w:p>
-        </w:tc>
-        <w:tc>
-          <w:tcPr>
-            <w:tcW w:w="0" w:type="auto"/>
-            <w:vAlign w:val="center"/>
-            <w:hideMark/>
-          </w:tcPr>
-          <w:p>
-            <w:pPr>
-              <w:spacing w:after="0" w:line="240" w:lineRule="auto"/>
-              <w:rPr>
-                <w:rFonts w:ascii="Times New Roman" w:eastAsia="Times New Roman" w:hAnsi="Times New Roman" w:cs="Times New Roman"/>
-                <w:sz w:val="24"/>
-                <w:szCs w:val="24"/>
-              </w:rPr>
-            </w:pPr>
-            <w:r>
-              <w:rPr>
-                <w:rFonts w:ascii="Times New Roman" w:eastAsia="Times New Roman" w:hAnsi="Times New Roman" w:cs="Times New Roman"/>
-                <w:sz w:val="24"/>
-                <w:szCs w:val="24"/>
-              </w:rPr>
-              <w:t>DateTime</w:t>
-            </w:r>
-          </w:p>
-        </w:tc>
-        <w:tc>
-          <w:tcPr>
-            <w:tcW w:w="0" w:type="auto"/>
-            <w:vAlign w:val="center"/>
-            <w:hideMark/>
-          </w:tcPr>
-          <w:p>
-            <w:pPr>
-              <w:spacing w:after="0" w:line="240" w:lineRule="auto"/>
-              <w:rPr>
-                <w:rFonts w:ascii="Times New Roman" w:eastAsia="Times New Roman" w:hAnsi="Times New Roman" w:cs="Times New Roman"/>
-                <w:sz w:val="24"/>
-                <w:szCs w:val="24"/>
-              </w:rPr>
-            </w:pPr>
-          </w:p>
-        </w:tc>
-      </w:tr>
-    </w:tbl>
-    <w:p>
-      <w:pPr>
-        <w:spacing w:before="100" w:beforeAutospacing="1" w:after="100" w:afterAutospacing="1" w:line="240" w:lineRule="auto"/>
-        <w:outlineLvl w:val="2"/>
-        <w:rPr>
-          <w:rFonts w:ascii="Times New Roman" w:eastAsia="Times New Roman" w:hAnsi="Times New Roman" w:cs="Times New Roman"/>
-          <w:b/>
-          <w:bCs/>
-          <w:sz w:val="27"/>
-          <w:szCs w:val="27"/>
-        </w:rPr>
-      </w:pPr>
-      <w:r>
-        <w:rPr>
-          <w:rFonts w:ascii="Times New Roman" w:eastAsia="Times New Roman" w:hAnsi="Times New Roman" w:cs="Times New Roman"/>
-          <w:b/>
-          <w:bCs/>
-          <w:sz w:val="27"/>
-          <w:szCs w:val="27"/>
-        </w:rPr>
-        <w:t>📡 API Endpoints</w:t>
-      </w:r>
-    </w:p>
-    <w:tbl>
-      <w:tblPr>
-        <w:tblW w:w="0" w:type="auto"/>
-        <w:tblCellSpacing w:w="15" w:type="dxa"/>
-        <w:tblCellMar>
-          <w:top w:w="15" w:type="dxa"/>
-          <w:left w:w="15" w:type="dxa"/>
-          <w:bottom w:w="15" w:type="dxa"/>
-          <w:right w:w="15" w:type="dxa"/>
-        </w:tblCellMar>
-        <w:tblLook w:val="04A0" w:firstRow="1" w:lastRow="0" w:firstColumn="1" w:lastColumn="0" w:noHBand="0" w:noVBand="1"/>
-      </w:tblPr>
-      <w:tblGrid>
-        <w:gridCol w:w="875"/>
-        <w:gridCol w:w="4141"/>
-        <w:gridCol w:w="994"/>
-        <w:gridCol w:w="1835"/>
-      </w:tblGrid>
-      <w:tr>
-        <w:trPr>
-          <w:tblHeader/>
-          <w:tblCellSpacing w:w="15" w:type="dxa"/>
-        </w:trPr>
-        <w:tc>
-          <w:tcPr>
-            <w:tcW w:w="0" w:type="auto"/>
-            <w:vAlign w:val="center"/>
-            <w:hideMark/>
-          </w:tcPr>
-          <w:p>
-            <w:pPr>
-              <w:spacing w:after="0" w:line="240" w:lineRule="auto"/>
-              <w:jc w:val="center"/>
-              <w:rPr>
-                <w:rFonts w:ascii="Times New Roman" w:eastAsia="Times New Roman" w:hAnsi="Times New Roman" w:cs="Times New Roman"/>
-                <w:b/>
-                <w:bCs/>
-                <w:sz w:val="24"/>
-                <w:szCs w:val="24"/>
-              </w:rPr>
-            </w:pPr>
-            <w:r>
-              <w:rPr>
-                <w:rFonts w:ascii="Times New Roman" w:eastAsia="Times New Roman" w:hAnsi="Times New Roman" w:cs="Times New Roman"/>
-                <w:b/>
-                <w:bCs/>
-                <w:sz w:val="24"/>
-                <w:szCs w:val="24"/>
-              </w:rPr>
-              <w:t>Method</w:t>
-            </w:r>
-          </w:p>
-        </w:tc>
-        <w:tc>
-          <w:tcPr>
-            <w:tcW w:w="0" w:type="auto"/>
-            <w:vAlign w:val="center"/>
-            <w:hideMark/>
-          </w:tcPr>
-          <w:p>
-            <w:pPr>
-              <w:spacing w:after="0" w:line="240" w:lineRule="auto"/>
-              <w:jc w:val="center"/>
-              <w:rPr>
-                <w:rFonts w:ascii="Times New Roman" w:eastAsia="Times New Roman" w:hAnsi="Times New Roman" w:cs="Times New Roman"/>
-                <w:b/>
-                <w:bCs/>
-                <w:sz w:val="24"/>
-                <w:szCs w:val="24"/>
-              </w:rPr>
-            </w:pPr>
-            <w:r>
-              <w:rPr>
-                <w:rFonts w:ascii="Times New Roman" w:eastAsia="Times New Roman" w:hAnsi="Times New Roman" w:cs="Times New Roman"/>
-                <w:b/>
-                <w:bCs/>
-                <w:sz w:val="24"/>
-                <w:szCs w:val="24"/>
-              </w:rPr>
-              <w:t>URL</w:t>
-            </w:r>
-          </w:p>
-        </w:tc>
-        <w:tc>
-          <w:tcPr>
-            <w:tcW w:w="0" w:type="auto"/>
-            <w:vAlign w:val="center"/>
-            <w:hideMark/>
-          </w:tcPr>
-          <w:p>
-            <w:pPr>
-              <w:spacing w:after="0" w:line="240" w:lineRule="auto"/>
-              <w:jc w:val="center"/>
-              <w:rPr>
-                <w:rFonts w:ascii="Times New Roman" w:eastAsia="Times New Roman" w:hAnsi="Times New Roman" w:cs="Times New Roman"/>
-                <w:b/>
-                <w:bCs/>
-                <w:sz w:val="24"/>
-                <w:szCs w:val="24"/>
-              </w:rPr>
-            </w:pPr>
-            <w:r>
-              <w:rPr>
-                <w:rFonts w:ascii="Times New Roman" w:eastAsia="Times New Roman" w:hAnsi="Times New Roman" w:cs="Times New Roman"/>
-                <w:b/>
-                <w:bCs/>
-                <w:sz w:val="24"/>
-                <w:szCs w:val="24"/>
-              </w:rPr>
-              <w:t>Who</w:t>
-            </w:r>
-          </w:p>
-        </w:tc>
-        <w:tc>
-          <w:tcPr>
-            <w:tcW w:w="0" w:type="auto"/>
-            <w:vAlign w:val="center"/>
-            <w:hideMark/>
-          </w:tcPr>
-          <w:p>
-            <w:pPr>
-              <w:spacing w:after="0" w:line="240" w:lineRule="auto"/>
-              <w:jc w:val="center"/>
-              <w:rPr>
-                <w:rFonts w:ascii="Times New Roman" w:eastAsia="Times New Roman" w:hAnsi="Times New Roman" w:cs="Times New Roman"/>
-                <w:b/>
-                <w:bCs/>
-                <w:sz w:val="24"/>
-                <w:szCs w:val="24"/>
-              </w:rPr>
-            </w:pPr>
-            <w:r>
-              <w:rPr>
-                <w:rFonts w:ascii="Times New Roman" w:eastAsia="Times New Roman" w:hAnsi="Times New Roman" w:cs="Times New Roman"/>
-                <w:b/>
-                <w:bCs/>
-                <w:sz w:val="24"/>
-                <w:szCs w:val="24"/>
-              </w:rPr>
-              <w:t>What</w:t>
-            </w:r>
-          </w:p>
-        </w:tc>
-      </w:tr>
-      <w:tr>
-        <w:trPr>
-          <w:tblCellSpacing w:w="15" w:type="dxa"/>
-        </w:trPr>
-        <w:tc>
-          <w:tcPr>
-            <w:tcW w:w="0" w:type="auto"/>
-            <w:vAlign w:val="center"/>
-            <w:hideMark/>
-          </w:tcPr>
-          <w:p>
-            <w:pPr>
-              <w:spacing w:after="0" w:line="240" w:lineRule="auto"/>
-              <w:rPr>
-                <w:rFonts w:ascii="Times New Roman" w:eastAsia="Times New Roman" w:hAnsi="Times New Roman" w:cs="Times New Roman"/>
-                <w:sz w:val="24"/>
-                <w:szCs w:val="24"/>
-              </w:rPr>
-            </w:pPr>
-            <w:r>
-              <w:rPr>
-                <w:rFonts w:ascii="Courier New" w:eastAsia="Times New Roman" w:hAnsi="Courier New" w:cs="Courier New"/>
-                <w:sz w:val="20"/>
-                <w:szCs w:val="20"/>
-              </w:rPr>
-              <w:t>GET</w:t>
-            </w:r>
-          </w:p>
-        </w:tc>
-        <w:tc>
-          <w:tcPr>
-            <w:tcW w:w="0" w:type="auto"/>
-            <w:vAlign w:val="center"/>
-            <w:hideMark/>
-          </w:tcPr>
-          <w:p>
-            <w:pPr>
-              <w:spacing w:after="0" w:line="240" w:lineRule="auto"/>
-              <w:rPr>
-                <w:rFonts w:ascii="Times New Roman" w:eastAsia="Times New Roman" w:hAnsi="Times New Roman" w:cs="Times New Roman"/>
-                <w:sz w:val="24"/>
-                <w:szCs w:val="24"/>
-              </w:rPr>
-            </w:pPr>
-            <w:r>
-              <w:rPr>
-                <w:rFonts w:ascii="Courier New" w:eastAsia="Times New Roman" w:hAnsi="Courier New" w:cs="Courier New"/>
-                <w:sz w:val="20"/>
-                <w:szCs w:val="20"/>
-              </w:rPr>
-              <w:t>/api/v1/addresses</w:t>
-            </w:r>
-          </w:p>
-        </w:tc>
-        <w:tc>
-          <w:tcPr>
-            <w:tcW w:w="0" w:type="auto"/>
-            <w:vAlign w:val="center"/>
-            <w:hideMark/>
-          </w:tcPr>
-          <w:p>
-            <w:pPr>
-              <w:spacing w:after="0" w:line="240" w:lineRule="auto"/>
-              <w:rPr>
-                <w:rFonts w:ascii="Times New Roman" w:eastAsia="Times New Roman" w:hAnsi="Times New Roman" w:cs="Times New Roman"/>
-                <w:sz w:val="24"/>
-                <w:szCs w:val="24"/>
-              </w:rPr>
-            </w:pPr>
-            <w:r>
-              <w:rPr>
-                <w:rFonts w:ascii="Times New Roman" w:eastAsia="Times New Roman" w:hAnsi="Times New Roman" w:cs="Times New Roman"/>
-                <w:sz w:val="24"/>
-                <w:szCs w:val="24"/>
-              </w:rPr>
-              <w:t>Customer</w:t>
-            </w:r>
-          </w:p>
-        </w:tc>
-        <w:tc>
-          <w:tcPr>
-            <w:tcW w:w="0" w:type="auto"/>
-            <w:vAlign w:val="center"/>
-            <w:hideMark/>
-          </w:tcPr>
-          <w:p>
-            <w:pPr>
-              <w:spacing w:after="0" w:line="240" w:lineRule="auto"/>
-              <w:rPr>
-                <w:rFonts w:ascii="Times New Roman" w:eastAsia="Times New Roman" w:hAnsi="Times New Roman" w:cs="Times New Roman"/>
-                <w:sz w:val="24"/>
-                <w:szCs w:val="24"/>
-              </w:rPr>
-            </w:pPr>
-            <w:r>
-              <w:rPr>
-                <w:rFonts w:ascii="Times New Roman" w:eastAsia="Times New Roman" w:hAnsi="Times New Roman" w:cs="Times New Roman"/>
-                <w:sz w:val="24"/>
-                <w:szCs w:val="24"/>
-              </w:rPr>
-              <w:t>List my addresses</w:t>
-            </w:r>
-          </w:p>
-        </w:tc>
-      </w:tr>
-      <w:tr>
-        <w:trPr>
-          <w:tblCellSpacing w:w="15" w:type="dxa"/>
-        </w:trPr>
-        <w:tc>
-          <w:tcPr>
-            <w:tcW w:w="0" w:type="auto"/>
-            <w:vAlign w:val="center"/>
-            <w:hideMark/>
-          </w:tcPr>
-          <w:p>
-            <w:pPr>
-              <w:spacing w:after="0" w:line="240" w:lineRule="auto"/>
-              <w:rPr>
-                <w:rFonts w:ascii="Times New Roman" w:eastAsia="Times New Roman" w:hAnsi="Times New Roman" w:cs="Times New Roman"/>
-                <w:sz w:val="24"/>
-                <w:szCs w:val="24"/>
-              </w:rPr>
-            </w:pPr>
-            <w:r>
-              <w:rPr>
-                <w:rFonts w:ascii="Courier New" w:eastAsia="Times New Roman" w:hAnsi="Courier New" w:cs="Courier New"/>
-                <w:sz w:val="20"/>
-                <w:szCs w:val="20"/>
-              </w:rPr>
-              <w:t>POST</w:t>
-            </w:r>
-          </w:p>
-        </w:tc>
-        <w:tc>
-          <w:tcPr>
-            <w:tcW w:w="0" w:type="auto"/>
-            <w:vAlign w:val="center"/>
-            <w:hideMark/>
-          </w:tcPr>
-          <w:p>
-            <w:pPr>
-              <w:spacing w:after="0" w:line="240" w:lineRule="auto"/>
-              <w:rPr>
-                <w:rFonts w:ascii="Times New Roman" w:eastAsia="Times New Roman" w:hAnsi="Times New Roman" w:cs="Times New Roman"/>
-                <w:sz w:val="24"/>
-                <w:szCs w:val="24"/>
-              </w:rPr>
-            </w:pPr>
-            <w:r>
-              <w:rPr>
-                <w:rFonts w:ascii="Courier New" w:eastAsia="Times New Roman" w:hAnsi="Courier New" w:cs="Courier New"/>
-                <w:sz w:val="20"/>
-                <w:szCs w:val="20"/>
-              </w:rPr>
-              <w:t>/api/v1/addresses</w:t>
-            </w:r>
-          </w:p>
-        </w:tc>
-        <w:tc>
-          <w:tcPr>
-            <w:tcW w:w="0" w:type="auto"/>
-            <w:vAlign w:val="center"/>
-            <w:hideMark/>
-          </w:tcPr>
-          <w:p>
-            <w:pPr>
-              <w:spacing w:after="0" w:line="240" w:lineRule="auto"/>
-              <w:rPr>
-                <w:rFonts w:ascii="Times New Roman" w:eastAsia="Times New Roman" w:hAnsi="Times New Roman" w:cs="Times New Roman"/>
-                <w:sz w:val="24"/>
-                <w:szCs w:val="24"/>
-              </w:rPr>
-            </w:pPr>
-            <w:r>
-              <w:rPr>
-                <w:rFonts w:ascii="Times New Roman" w:eastAsia="Times New Roman" w:hAnsi="Times New Roman" w:cs="Times New Roman"/>
-                <w:sz w:val="24"/>
-                <w:szCs w:val="24"/>
-              </w:rPr>
-              <w:t>Customer</w:t>
-            </w:r>
-          </w:p>
-        </w:tc>
-        <w:tc>
-          <w:tcPr>
-            <w:tcW w:w="0" w:type="auto"/>
-            <w:vAlign w:val="center"/>
-            <w:hideMark/>
-          </w:tcPr>
-          <w:p>
-            <w:pPr>
-              <w:spacing w:after="0" w:line="240" w:lineRule="auto"/>
-              <w:rPr>
-                <w:rFonts w:ascii="Times New Roman" w:eastAsia="Times New Roman" w:hAnsi="Times New Roman" w:cs="Times New Roman"/>
-                <w:sz w:val="24"/>
-                <w:szCs w:val="24"/>
-              </w:rPr>
-            </w:pPr>
-            <w:r>
-              <w:rPr>
-                <w:rFonts w:ascii="Times New Roman" w:eastAsia="Times New Roman" w:hAnsi="Times New Roman" w:cs="Times New Roman"/>
-                <w:sz w:val="24"/>
-                <w:szCs w:val="24"/>
-              </w:rPr>
-              <w:t>Add new address</w:t>
-            </w:r>
-          </w:p>
-        </w:tc>
-      </w:tr>
-      <w:tr>
-        <w:trPr>
-          <w:tblCellSpacing w:w="15" w:type="dxa"/>
-        </w:trPr>
-        <w:tc>
-          <w:tcPr>
-            <w:tcW w:w="0" w:type="auto"/>
-            <w:vAlign w:val="center"/>
-            <w:hideMark/>
-          </w:tcPr>
-          <w:p>
-            <w:pPr>
-              <w:spacing w:after="0" w:line="240" w:lineRule="auto"/>
-              <w:rPr>
-                <w:rFonts w:ascii="Times New Roman" w:eastAsia="Times New Roman" w:hAnsi="Times New Roman" w:cs="Times New Roman"/>
-                <w:sz w:val="24"/>
-                <w:szCs w:val="24"/>
-              </w:rPr>
-            </w:pPr>
-            <w:r>
-              <w:rPr>
-                <w:rFonts w:ascii="Courier New" w:eastAsia="Times New Roman" w:hAnsi="Courier New" w:cs="Courier New"/>
-                <w:sz w:val="20"/>
-                <w:szCs w:val="20"/>
-              </w:rPr>
-              <w:t>PATCH</w:t>
-            </w:r>
-          </w:p>
-        </w:tc>
-        <w:tc>
-          <w:tcPr>
-            <w:tcW w:w="0" w:type="auto"/>
-            <w:vAlign w:val="center"/>
-            <w:hideMark/>
-          </w:tcPr>
-          <w:p>
-            <w:pPr>
-              <w:spacing w:after="0" w:line="240" w:lineRule="auto"/>
-              <w:rPr>
-                <w:rFonts w:ascii="Times New Roman" w:eastAsia="Times New Roman" w:hAnsi="Times New Roman" w:cs="Times New Roman"/>
-                <w:sz w:val="24"/>
-                <w:szCs w:val="24"/>
-              </w:rPr>
-            </w:pPr>
-            <w:r>
-              <w:rPr>
-                <w:rFonts w:ascii="Courier New" w:eastAsia="Times New Roman" w:hAnsi="Courier New" w:cs="Courier New"/>
-                <w:sz w:val="20"/>
-                <w:szCs w:val="20"/>
-              </w:rPr>
-              <w:t>/api/v1/addresses/{id}</w:t>
-            </w:r>
-          </w:p>
-        </w:tc>
-        <w:tc>
-          <w:tcPr>
-            <w:tcW w:w="0" w:type="auto"/>
-            <w:vAlign w:val="center"/>
-            <w:hideMark/>
-          </w:tcPr>
-          <w:p>
-            <w:pPr>
-              <w:spacing w:after="0" w:line="240" w:lineRule="auto"/>
-              <w:rPr>
-                <w:rFonts w:ascii="Times New Roman" w:eastAsia="Times New Roman" w:hAnsi="Times New Roman" w:cs="Times New Roman"/>
-                <w:sz w:val="24"/>
-                <w:szCs w:val="24"/>
-              </w:rPr>
-            </w:pPr>
-            <w:r>
-              <w:rPr>
-                <w:rFonts w:ascii="Times New Roman" w:eastAsia="Times New Roman" w:hAnsi="Times New Roman" w:cs="Times New Roman"/>
-                <w:sz w:val="24"/>
-                <w:szCs w:val="24"/>
-              </w:rPr>
-              <w:t>Customer</w:t>
-            </w:r>
-          </w:p>
-        </w:tc>
-        <w:tc>
-          <w:tcPr>
-            <w:tcW w:w="0" w:type="auto"/>
-            <w:vAlign w:val="center"/>
-            <w:hideMark/>
-          </w:tcPr>
-          <w:p>
-            <w:pPr>
-              <w:spacing w:after="0" w:line="240" w:lineRule="auto"/>
-              <w:rPr>
-                <w:rFonts w:ascii="Times New Roman" w:eastAsia="Times New Roman" w:hAnsi="Times New Roman" w:cs="Times New Roman"/>
-                <w:sz w:val="24"/>
-                <w:szCs w:val="24"/>
-              </w:rPr>
-            </w:pPr>
-            <w:r>
-              <w:rPr>
-                <w:rFonts w:ascii="Times New Roman" w:eastAsia="Times New Roman" w:hAnsi="Times New Roman" w:cs="Times New Roman"/>
-                <w:sz w:val="24"/>
-                <w:szCs w:val="24"/>
-              </w:rPr>
-              <w:t>Update an address</w:t>
-            </w:r>
-          </w:p>
-        </w:tc>
-      </w:tr>
-      <w:tr>
-        <w:trPr>
-          <w:tblCellSpacing w:w="15" w:type="dxa"/>
-        </w:trPr>
-        <w:tc>
-          <w:tcPr>
-            <w:tcW w:w="0" w:type="auto"/>
-            <w:vAlign w:val="center"/>
-            <w:hideMark/>
-          </w:tcPr>
-          <w:p>
-            <w:pPr>
-              <w:spacing w:after="0" w:line="240" w:lineRule="auto"/>
-              <w:rPr>
-                <w:rFonts w:ascii="Times New Roman" w:eastAsia="Times New Roman" w:hAnsi="Times New Roman" w:cs="Times New Roman"/>
-                <w:sz w:val="24"/>
-                <w:szCs w:val="24"/>
-              </w:rPr>
-            </w:pPr>
-            <w:r>
-              <w:rPr>
-                <w:rFonts w:ascii="Courier New" w:eastAsia="Times New Roman" w:hAnsi="Courier New" w:cs="Courier New"/>
-                <w:sz w:val="20"/>
-                <w:szCs w:val="20"/>
-              </w:rPr>
-              <w:t>DELETE</w:t>
-            </w:r>
-          </w:p>
-        </w:tc>
-        <w:tc>
-          <w:tcPr>
-            <w:tcW w:w="0" w:type="auto"/>
-            <w:vAlign w:val="center"/>
-            <w:hideMark/>
-          </w:tcPr>
-          <w:p>
-            <w:pPr>
-              <w:spacing w:after="0" w:line="240" w:lineRule="auto"/>
-              <w:rPr>
-                <w:rFonts w:ascii="Times New Roman" w:eastAsia="Times New Roman" w:hAnsi="Times New Roman" w:cs="Times New Roman"/>
-                <w:sz w:val="24"/>
-                <w:szCs w:val="24"/>
-              </w:rPr>
-            </w:pPr>
-            <w:r>
-              <w:rPr>
-                <w:rFonts w:ascii="Courier New" w:eastAsia="Times New Roman" w:hAnsi="Courier New" w:cs="Courier New"/>
-                <w:sz w:val="20"/>
-                <w:szCs w:val="20"/>
-              </w:rPr>
-              <w:t>/api/v1/addresses/{id}</w:t>
-            </w:r>
-          </w:p>
-        </w:tc>
-        <w:tc>
-          <w:tcPr>
-            <w:tcW w:w="0" w:type="auto"/>
-            <w:vAlign w:val="center"/>
-            <w:hideMark/>
-          </w:tcPr>
-          <w:p>
-            <w:pPr>
-              <w:spacing w:after="0" w:line="240" w:lineRule="auto"/>
-              <w:rPr>
-                <w:rFonts w:ascii="Times New Roman" w:eastAsia="Times New Roman" w:hAnsi="Times New Roman" w:cs="Times New Roman"/>
-                <w:sz w:val="24"/>
-                <w:szCs w:val="24"/>
-              </w:rPr>
-            </w:pPr>
-            <w:r>
-              <w:rPr>
-                <w:rFonts w:ascii="Times New Roman" w:eastAsia="Times New Roman" w:hAnsi="Times New Roman" w:cs="Times New Roman"/>
-                <w:sz w:val="24"/>
-                <w:szCs w:val="24"/>
-              </w:rPr>
-              <w:t>Customer</w:t>
-            </w:r>
-          </w:p>
-        </w:tc>
-        <w:tc>
-          <w:tcPr>
-            <w:tcW w:w="0" w:type="auto"/>
-            <w:vAlign w:val="center"/>
-            <w:hideMark/>
-          </w:tcPr>
-          <w:p>
-            <w:pPr>
-              <w:spacing w:after="0" w:line="240" w:lineRule="auto"/>
-              <w:rPr>
-                <w:rFonts w:ascii="Times New Roman" w:eastAsia="Times New Roman" w:hAnsi="Times New Roman" w:cs="Times New Roman"/>
-                <w:sz w:val="24"/>
-                <w:szCs w:val="24"/>
-              </w:rPr>
-            </w:pPr>
-            <w:r>
-              <w:rPr>
-                <w:rFonts w:ascii="Times New Roman" w:eastAsia="Times New Roman" w:hAnsi="Times New Roman" w:cs="Times New Roman"/>
-                <w:sz w:val="24"/>
-                <w:szCs w:val="24"/>
-              </w:rPr>
-              <w:t>Delete an address</w:t>
-            </w:r>
-          </w:p>
-        </w:tc>
-      </w:tr>
-      <w:tr>
-        <w:trPr>
-          <w:tblCellSpacing w:w="15" w:type="dxa"/>
-        </w:trPr>
-        <w:tc>
-          <w:tcPr>
-            <w:tcW w:w="0" w:type="auto"/>
-            <w:vAlign w:val="center"/>
-            <w:hideMark/>
-          </w:tcPr>
-          <w:p>
-            <w:pPr>
-              <w:spacing w:after="0" w:line="240" w:lineRule="auto"/>
-              <w:rPr>
-                <w:rFonts w:ascii="Times New Roman" w:eastAsia="Times New Roman" w:hAnsi="Times New Roman" w:cs="Times New Roman"/>
-                <w:sz w:val="24"/>
-                <w:szCs w:val="24"/>
-              </w:rPr>
-            </w:pPr>
-            <w:r>
-              <w:rPr>
-                <w:rFonts w:ascii="Courier New" w:eastAsia="Times New Roman" w:hAnsi="Courier New" w:cs="Courier New"/>
-                <w:sz w:val="20"/>
-                <w:szCs w:val="20"/>
-              </w:rPr>
-              <w:t>PATCH</w:t>
-            </w:r>
-          </w:p>
-        </w:tc>
-        <w:tc>
-          <w:tcPr>
-            <w:tcW w:w="0" w:type="auto"/>
-            <w:vAlign w:val="center"/>
-            <w:hideMark/>
-          </w:tcPr>
-          <w:p>
-            <w:pPr>
-              <w:spacing w:after="0" w:line="240" w:lineRule="auto"/>
-              <w:rPr>
-                <w:rFonts w:ascii="Times New Roman" w:eastAsia="Times New Roman" w:hAnsi="Times New Roman" w:cs="Times New Roman"/>
-                <w:sz w:val="24"/>
-                <w:szCs w:val="24"/>
-              </w:rPr>
-            </w:pPr>
-            <w:r>
-              <w:rPr>
-                <w:rFonts w:ascii="Courier New" w:eastAsia="Times New Roman" w:hAnsi="Courier New" w:cs="Courier New"/>
-                <w:sz w:val="20"/>
-                <w:szCs w:val="20"/>
-              </w:rPr>
-              <w:t>/api/v1/addresses/{id}/set-default</w:t>
-            </w:r>
-          </w:p>
-        </w:tc>
-        <w:tc>
-          <w:tcPr>
-            <w:tcW w:w="0" w:type="auto"/>
-            <w:vAlign w:val="center"/>
-            <w:hideMark/>
-          </w:tcPr>
-          <w:p>
-            <w:pPr>
-              <w:spacing w:after="0" w:line="240" w:lineRule="auto"/>
-              <w:rPr>
-                <w:rFonts w:ascii="Times New Roman" w:eastAsia="Times New Roman" w:hAnsi="Times New Roman" w:cs="Times New Roman"/>
-                <w:sz w:val="24"/>
-                <w:szCs w:val="24"/>
-              </w:rPr>
-            </w:pPr>
-            <w:r>
-              <w:rPr>
-                <w:rFonts w:ascii="Times New Roman" w:eastAsia="Times New Roman" w:hAnsi="Times New Roman" w:cs="Times New Roman"/>
-                <w:sz w:val="24"/>
-                <w:szCs w:val="24"/>
-              </w:rPr>
-              <w:t>Customer</w:t>
-            </w:r>
-          </w:p>
-        </w:tc>
-        <w:tc>
-          <w:tcPr>
-            <w:tcW w:w="0" w:type="auto"/>
-            <w:vAlign w:val="center"/>
-            <w:hideMark/>
-          </w:tcPr>
-          <w:p>
-            <w:pPr>
-              <w:spacing w:after="0" w:line="240" w:lineRule="auto"/>
-              <w:rPr>
-                <w:rFonts w:ascii="Times New Roman" w:eastAsia="Times New Roman" w:hAnsi="Times New Roman" w:cs="Times New Roman"/>
-                <w:sz w:val="24"/>
-                <w:szCs w:val="24"/>
-              </w:rPr>
-            </w:pPr>
-            <w:r>
-              <w:rPr>
-                <w:rFonts w:ascii="Times New Roman" w:eastAsia="Times New Roman" w:hAnsi="Times New Roman" w:cs="Times New Roman"/>
-                <w:sz w:val="24"/>
-                <w:szCs w:val="24"/>
-              </w:rPr>
-              <w:t>Mark as default</w:t>
-            </w:r>
-          </w:p>
-        </w:tc>
-      </w:tr>
-    </w:tbl>
-    <w:p>
-      <w:pPr>
-        <w:spacing w:before="100" w:beforeAutospacing="1" w:after="100" w:afterAutospacing="1" w:line="240" w:lineRule="auto"/>
-        <w:outlineLvl w:val="2"/>
-        <w:rPr>
-          <w:rFonts w:ascii="Times New Roman" w:eastAsia="Times New Roman" w:hAnsi="Times New Roman" w:cs="Times New Roman"/>
-          <w:b/>
-          <w:bCs/>
-          <w:sz w:val="27"/>
-          <w:szCs w:val="27"/>
-        </w:rPr>
-      </w:pPr>
-      <w:r>
-        <w:rPr>
-          <w:rFonts w:ascii="Times New Roman" w:eastAsia="Times New Roman" w:hAnsi="Times New Roman" w:cs="Times New Roman"/>
-          <w:b/>
-          <w:bCs/>
-          <w:sz w:val="27"/>
-          <w:szCs w:val="27"/>
-        </w:rPr>
-        <w:t>⚙️ Business Logic Rules</w:t>
-      </w:r>
-    </w:p>
-    <w:p>
-      <w:pPr>
-        <w:numPr>
-          <w:ilvl w:val="0"/>
-          <w:numId w:val="18"/>
-        </w:numPr>
-        <w:spacing w:before="100" w:beforeAutospacing="1" w:after="100" w:afterAutospacing="1" w:line="240" w:lineRule="auto"/>
-        <w:rPr>
-          <w:rFonts w:ascii="Times New Roman" w:eastAsia="Times New Roman" w:hAnsi="Times New Roman" w:cs="Times New Roman"/>
-          <w:sz w:val="24"/>
-          <w:szCs w:val="24"/>
-        </w:rPr>
-      </w:pPr>
-      <w:r>
-        <w:rPr>
-          <w:rFonts w:ascii="Times New Roman" w:eastAsia="Times New Roman" w:hAnsi="Times New Roman" w:cs="Times New Roman"/>
-          <w:sz w:val="24"/>
-          <w:szCs w:val="24"/>
-        </w:rPr>
-        <w:t xml:space="preserve">A user can have </w:t>
-      </w:r>
-      <w:r>
-        <w:rPr>
-          <w:rFonts w:ascii="Times New Roman" w:eastAsia="Times New Roman" w:hAnsi="Times New Roman" w:cs="Times New Roman"/>
-          <w:b/>
-          <w:bCs/>
-          <w:sz w:val="24"/>
-          <w:szCs w:val="24"/>
-        </w:rPr>
-        <w:t>maximum 5 addresses</w:t>
-      </w:r>
-      <w:r>
-        <w:rPr>
-          <w:rFonts w:ascii="Times New Roman" w:eastAsia="Times New Roman" w:hAnsi="Times New Roman" w:cs="Times New Roman"/>
-          <w:sz w:val="24"/>
-          <w:szCs w:val="24"/>
-        </w:rPr>
-        <w:t xml:space="preserve"> — reject if they try to add more</w:t>
-      </w:r>
-    </w:p>
-    <w:p>
-      <w:pPr>
-        <w:numPr>
-          <w:ilvl w:val="0"/>
-          <w:numId w:val="18"/>
-        </w:numPr>
-        <w:spacing w:before="100" w:beforeAutospacing="1" w:after="100" w:afterAutospacing="1" w:line="240" w:lineRule="auto"/>
-        <w:rPr>
-          <w:rFonts w:ascii="Times New Roman" w:eastAsia="Times New Roman" w:hAnsi="Times New Roman" w:cs="Times New Roman"/>
-          <w:sz w:val="24"/>
-          <w:szCs w:val="24"/>
-        </w:rPr>
-      </w:pPr>
-      <w:r>
-        <w:rPr>
-          <w:rFonts w:ascii="Times New Roman" w:eastAsia="Times New Roman" w:hAnsi="Times New Roman" w:cs="Times New Roman"/>
-          <w:sz w:val="24"/>
-          <w:szCs w:val="24"/>
-        </w:rPr>
-        <w:t xml:space="preserve">Only </w:t>
-      </w:r>
-      <w:r>
-        <w:rPr>
-          <w:rFonts w:ascii="Times New Roman" w:eastAsia="Times New Roman" w:hAnsi="Times New Roman" w:cs="Times New Roman"/>
-          <w:b/>
-          <w:bCs/>
-          <w:sz w:val="24"/>
-          <w:szCs w:val="24"/>
-        </w:rPr>
-        <w:t xml:space="preserve">one address can be </w:t>
-      </w:r>
-      <w:r>
-        <w:rPr>
-          <w:rFonts w:ascii="Courier New" w:eastAsia="Times New Roman" w:hAnsi="Courier New" w:cs="Courier New"/>
-          <w:b/>
-          <w:bCs/>
-          <w:sz w:val="20"/>
-          <w:szCs w:val="20"/>
-        </w:rPr>
-        <w:t>is_default=True</w:t>
-      </w:r>
-      <w:r>
-        <w:rPr>
-          <w:rFonts w:ascii="Times New Roman" w:eastAsia="Times New Roman" w:hAnsi="Times New Roman" w:cs="Times New Roman"/>
-          <w:sz w:val="24"/>
-          <w:szCs w:val="24"/>
-        </w:rPr>
-        <w:t xml:space="preserve"> per user — when setting a new default, unset the previous one in the same DB transaction</w:t>
-      </w:r>
-    </w:p>
-    <w:p>
-      <w:pPr>
-        <w:numPr>
-          <w:ilvl w:val="0"/>
-          <w:numId w:val="18"/>
-        </w:numPr>
-        <w:spacing w:before="100" w:beforeAutospacing="1" w:after="100" w:afterAutospacing="1" w:line="240" w:lineRule="auto"/>
-        <w:rPr>
-          <w:rFonts w:ascii="Times New Roman" w:eastAsia="Times New Roman" w:hAnsi="Times New Roman" w:cs="Times New Roman"/>
-          <w:sz w:val="24"/>
-          <w:szCs w:val="24"/>
-        </w:rPr>
-      </w:pPr>
-      <w:r>
-        <w:rPr>
-          <w:rFonts w:ascii="Times New Roman" w:eastAsia="Times New Roman" w:hAnsi="Times New Roman" w:cs="Times New Roman"/>
-          <w:sz w:val="24"/>
-          <w:szCs w:val="24"/>
-        </w:rPr>
-        <w:t xml:space="preserve">You cannot delete an address that is </w:t>
-      </w:r>
-      <w:r>
-        <w:rPr>
-          <w:rFonts w:ascii="Times New Roman" w:eastAsia="Times New Roman" w:hAnsi="Times New Roman" w:cs="Times New Roman"/>
-          <w:b/>
-          <w:bCs/>
-          <w:sz w:val="24"/>
-          <w:szCs w:val="24"/>
-        </w:rPr>
-        <w:t>linked to an active order</w:t>
-      </w:r>
-    </w:p>
-    <w:p>
-      <w:pPr>
-        <w:numPr>
-          <w:ilvl w:val="0"/>
-          <w:numId w:val="18"/>
-        </w:numPr>
-        <w:spacing w:before="100" w:beforeAutospacing="1" w:after="100" w:afterAutospacing="1" w:line="240" w:lineRule="auto"/>
-        <w:rPr>
-          <w:rFonts w:ascii="Times New Roman" w:eastAsia="Times New Roman" w:hAnsi="Times New Roman" w:cs="Times New Roman"/>
-          <w:sz w:val="24"/>
-          <w:szCs w:val="24"/>
-        </w:rPr>
-      </w:pPr>
-      <w:r>
-        <w:rPr>
-          <w:rFonts w:ascii="Times New Roman" w:eastAsia="Times New Roman" w:hAnsi="Times New Roman" w:cs="Times New Roman"/>
-          <w:sz w:val="24"/>
-          <w:szCs w:val="24"/>
-        </w:rPr>
-        <w:t xml:space="preserve">When placing an order, if no address is selected, use the </w:t>
-      </w:r>
-      <w:r>
-        <w:rPr>
-          <w:rFonts w:ascii="Times New Roman" w:eastAsia="Times New Roman" w:hAnsi="Times New Roman" w:cs="Times New Roman"/>
-          <w:b/>
-          <w:bCs/>
-          <w:sz w:val="24"/>
-          <w:szCs w:val="24"/>
-        </w:rPr>
-        <w:t>default address automatically</w:t>
-      </w:r>
-    </w:p>
-    <w:p>
-      <w:pPr>
-        <w:numPr>
-          <w:ilvl w:val="0"/>
-          <w:numId w:val="18"/>
-        </w:numPr>
-        <w:spacing w:before="100" w:beforeAutospacing="1" w:after="100" w:afterAutospacing="1" w:line="240" w:lineRule="auto"/>
-        <w:rPr>
-          <w:rFonts w:ascii="Times New Roman" w:eastAsia="Times New Roman" w:hAnsi="Times New Roman" w:cs="Times New Roman"/>
-          <w:sz w:val="24"/>
-          <w:szCs w:val="24"/>
-        </w:rPr>
-      </w:pPr>
-      <w:r>
-        <w:rPr>
-          <w:rFonts w:ascii="Times New Roman" w:eastAsia="Times New Roman" w:hAnsi="Times New Roman" w:cs="Times New Roman"/>
-          <w:sz w:val="24"/>
-          <w:szCs w:val="24"/>
-        </w:rPr>
-        <w:t xml:space="preserve">An address belongs to a user — always filter by </w:t>
-      </w:r>
-      <w:r>
-        <w:rPr>
-          <w:rFonts w:ascii="Courier New" w:eastAsia="Times New Roman" w:hAnsi="Courier New" w:cs="Courier New"/>
-          <w:sz w:val="20"/>
-          <w:szCs w:val="20"/>
-        </w:rPr>
-        <w:t>user_id</w:t>
-      </w:r>
-      <w:r>
-        <w:rPr>
-          <w:rFonts w:ascii="Times New Roman" w:eastAsia="Times New Roman" w:hAnsi="Times New Roman" w:cs="Times New Roman"/>
-          <w:sz w:val="24"/>
-          <w:szCs w:val="24"/>
-        </w:rPr>
-        <w:t xml:space="preserve"> of logged-in user, never expose other users' addresses</w:t>
-      </w:r>
-    </w:p>
-    <w:p>
-      <w:pPr>
-        <w:spacing w:after="0" w:line="240" w:lineRule="auto"/>
-        <w:rPr>
-          <w:rFonts w:ascii="Times New Roman" w:eastAsia="Times New Roman" w:hAnsi="Times New Roman" w:cs="Times New Roman"/>
-          <w:sz w:val="24"/>
-          <w:szCs w:val="24"/>
-        </w:rPr>
-      </w:pPr>
-      <w:r>
-        <w:rPr>
-          <w:rFonts w:ascii="Times New Roman" w:eastAsia="Times New Roman" w:hAnsi="Times New Roman" w:cs="Times New Roman"/>
-          <w:sz w:val="24"/>
-          <w:szCs w:val="24"/>
-        </w:rPr>
-        <w:pict w14:anchorId="4845E45E">
-          <v:rect id="_x0000_i1032" style="width:0;height:1.5pt" o:hralign="center" o:hrstd="t" o:hr="t" fillcolor="#a0a0a0" stroked="f"/>
-        </w:pict>
-      </w:r>
-    </w:p>
-    <w:p>
-      <w:pPr>
-        <w:spacing w:before="100" w:beforeAutospacing="1" w:after="100" w:afterAutospacing="1" w:line="240" w:lineRule="auto"/>
-        <w:outlineLvl w:val="2"/>
-        <w:rPr>
-          <w:rFonts w:ascii="Times New Roman" w:eastAsia="Times New Roman" w:hAnsi="Times New Roman" w:cs="Times New Roman"/>
-          <w:b/>
-          <w:bCs/>
-          <w:sz w:val="27"/>
-          <w:szCs w:val="27"/>
-        </w:rPr>
-      </w:pPr>
-      <w:r>
-        <w:rPr>
-          <w:rFonts w:ascii="Times New Roman" w:eastAsia="Times New Roman" w:hAnsi="Times New Roman" w:cs="Times New Roman"/>
-          <w:b/>
-          <w:bCs/>
-          <w:sz w:val="27"/>
-          <w:szCs w:val="27"/>
-        </w:rPr>
-        <w:t>📦 Pydantic Schemas</w:t>
-      </w:r>
-    </w:p>
-    <w:p>
-      <w:pPr>
-        <w:numPr>
-          <w:ilvl w:val="0"/>
-          <w:numId w:val="19"/>
-        </w:numPr>
-        <w:spacing w:before="100" w:beforeAutospacing="1" w:after="100" w:afterAutospacing="1" w:line="240" w:lineRule="auto"/>
-        <w:rPr>
-          <w:rFonts w:ascii="Times New Roman" w:eastAsia="Times New Roman" w:hAnsi="Times New Roman" w:cs="Times New Roman"/>
-          <w:sz w:val="24"/>
-          <w:szCs w:val="24"/>
-        </w:rPr>
-      </w:pPr>
-      <w:r>
-        <w:rPr>
-          <w:rFonts w:ascii="Courier New" w:eastAsia="Times New Roman" w:hAnsi="Courier New" w:cs="Courier New"/>
-          <w:sz w:val="20"/>
-          <w:szCs w:val="20"/>
-        </w:rPr>
-        <w:t>AddressCreateSchema</w:t>
-      </w:r>
-      <w:r>
-        <w:rPr>
-          <w:rFonts w:ascii="Times New Roman" w:eastAsia="Times New Roman" w:hAnsi="Times New Roman" w:cs="Times New Roman"/>
-          <w:sz w:val="24"/>
-          <w:szCs w:val="24"/>
-        </w:rPr>
-        <w:t xml:space="preserve"> — label, street, city, zip_code, is_default</w:t>
-      </w:r>
-    </w:p>
-    <w:p>
-      <w:pPr>
-        <w:numPr>
-          <w:ilvl w:val="0"/>
-          <w:numId w:val="19"/>
-        </w:numPr>
-        <w:spacing w:before="100" w:beforeAutospacing="1" w:after="100" w:afterAutospacing="1" w:line="240" w:lineRule="auto"/>
-        <w:rPr>
-          <w:rFonts w:ascii="Times New Roman" w:eastAsia="Times New Roman" w:hAnsi="Times New Roman" w:cs="Times New Roman"/>
-          <w:sz w:val="24"/>
-          <w:szCs w:val="24"/>
-        </w:rPr>
-      </w:pPr>
-      <w:r>
-        <w:rPr>
-          <w:rFonts w:ascii="Courier New" w:eastAsia="Times New Roman" w:hAnsi="Courier New" w:cs="Courier New"/>
-          <w:sz w:val="20"/>
-          <w:szCs w:val="20"/>
-        </w:rPr>
-        <w:t>AddressUpdateSchema</w:t>
-      </w:r>
-      <w:r>
-        <w:rPr>
-          <w:rFonts w:ascii="Times New Roman" w:eastAsia="Times New Roman" w:hAnsi="Times New Roman" w:cs="Times New Roman"/>
-          <w:sz w:val="24"/>
-          <w:szCs w:val="24"/>
-        </w:rPr>
-        <w:t xml:space="preserve"> — all fields optional</w:t>
-      </w:r>
-    </w:p>
-    <w:p>
-      <w:pPr>
-        <w:numPr>
-          <w:ilvl w:val="0"/>
-          <w:numId w:val="19"/>
-        </w:numPr>
-        <w:spacing w:before="100" w:beforeAutospacing="1" w:after="100" w:afterAutospacing="1" w:line="240" w:lineRule="auto"/>
-        <w:rPr>
-          <w:rFonts w:ascii="Times New Roman" w:eastAsia="Times New Roman" w:hAnsi="Times New Roman" w:cs="Times New Roman"/>
-          <w:sz w:val="24"/>
-          <w:szCs w:val="24"/>
-        </w:rPr>
-      </w:pPr>
-      <w:r>
-        <w:rPr>
-          <w:rFonts w:ascii="Courier New" w:eastAsia="Times New Roman" w:hAnsi="Courier New" w:cs="Courier New"/>
-          <w:sz w:val="20"/>
-          <w:szCs w:val="20"/>
-        </w:rPr>
-        <w:t>AddressResponseSchema</w:t>
-      </w:r>
-      <w:r>
-        <w:rPr>
-          <w:rFonts w:ascii="Times New Roman" w:eastAsia="Times New Roman" w:hAnsi="Times New Roman" w:cs="Times New Roman"/>
-          <w:sz w:val="24"/>
-          <w:szCs w:val="24"/>
-        </w:rPr>
-        <w:t xml:space="preserve"> — all fields including id and is_default</w:t>
-      </w:r>
-    </w:p>
-    <w:p>
-      <w:pPr>
-        <w:spacing w:after="0" w:line="240" w:lineRule="auto"/>
-        <w:rPr>
-          <w:rFonts w:ascii="Times New Roman" w:eastAsia="Times New Roman" w:hAnsi="Times New Roman" w:cs="Times New Roman"/>
-          <w:sz w:val="24"/>
-          <w:szCs w:val="24"/>
-        </w:rPr>
-      </w:pPr>
-      <w:r>
-        <w:rPr>
-          <w:rFonts w:ascii="Times New Roman" w:eastAsia="Times New Roman" w:hAnsi="Times New Roman" w:cs="Times New Roman"/>
-          <w:sz w:val="24"/>
-          <w:szCs w:val="24"/>
-        </w:rPr>
-        <w:pict w14:anchorId="3C56BCF2">
-          <v:rect id="_x0000_i1033" style="width:0;height:1.5pt" o:hralign="center" o:hrstd="t" o:hr="t" fillcolor="#a0a0a0" stroked="f"/>
-        </w:pict>
-      </w:r>
-    </w:p>
-    <w:p>
-      <w:pPr>
-        <w:spacing w:after="0" w:line="240" w:lineRule="auto"/>
-        <w:rPr>
-          <w:rFonts w:ascii="Times New Roman" w:eastAsia="Times New Roman" w:hAnsi="Times New Roman" w:cs="Times New Roman"/>
-          <w:sz w:val="24"/>
-          <w:szCs w:val="24"/>
-        </w:rPr>
-      </w:pPr>
-      <w:r>
-        <w:rPr>
-          <w:rFonts w:ascii="Times New Roman" w:eastAsia="Times New Roman" w:hAnsi="Times New Roman" w:cs="Times New Roman"/>
-          <w:sz w:val="24"/>
-          <w:szCs w:val="24"/>
-        </w:rPr>
-        <w:pict w14:anchorId="669B5EBD">
-          <v:rect id="_x0000_i1034" style="width:0;height:1.5pt" o:hralign="center" o:hrstd="t" o:hr="t" fillcolor="#a0a0a0" stroked="f"/>
-        </w:pict>
-      </w:r>
-    </w:p>
-    <w:p>
-      <w:pPr>
-        <w:spacing w:before="100" w:beforeAutospacing="1" w:after="100" w:afterAutospacing="1" w:line="240" w:lineRule="auto"/>
-        <w:outlineLvl w:val="1"/>
-        <w:rPr>
-          <w:rFonts w:ascii="Times New Roman" w:eastAsia="Times New Roman" w:hAnsi="Times New Roman" w:cs="Times New Roman"/>
-          <w:b/>
-          <w:bCs/>
-          <w:sz w:val="36"/>
-          <w:szCs w:val="36"/>
-        </w:rPr>
-      </w:pPr>
-      <w:r>
-        <w:rPr>
-          <w:rFonts w:ascii="Times New Roman" w:eastAsia="Times New Roman" w:hAnsi="Times New Roman" w:cs="Times New Roman"/>
-          <w:b/>
-          <w:bCs/>
-          <w:sz w:val="36"/>
-          <w:szCs w:val="36"/>
-        </w:rPr>
-        <w:t>💳 Payments — Full Deep Dive</w:t>
-      </w:r>
-    </w:p>
-    <w:p>
-      <w:pPr>
-        <w:spacing w:after="0" w:line="240" w:lineRule="auto"/>
-        <w:rPr>
-          <w:rFonts w:ascii="Times New Roman" w:eastAsia="Times New Roman" w:hAnsi="Times New Roman" w:cs="Times New Roman"/>
-          <w:sz w:val="24"/>
-          <w:szCs w:val="24"/>
-        </w:rPr>
-      </w:pPr>
-      <w:r>
-        <w:rPr>
-          <w:rFonts w:ascii="Times New Roman" w:eastAsia="Times New Roman" w:hAnsi="Times New Roman" w:cs="Times New Roman"/>
-          <w:sz w:val="24"/>
-          <w:szCs w:val="24"/>
-        </w:rPr>
-        <w:pict w14:anchorId="718E55CB">
-          <v:rect id="_x0000_i1035" style="width:0;height:1.5pt" o:hralign="center" o:hrstd="t" o:hr="t" fillcolor="#a0a0a0" stroked="f"/>
         </w:pict>
       </w:r>
     </w:p>
@@ -3612,7 +1757,7 @@
           <w:szCs w:val="24"/>
         </w:rPr>
         <w:pict w14:anchorId="7C7E447A">
-          <v:rect id="_x0000_i1036" style="width:0;height:1.5pt" o:hralign="center" o:hrstd="t" o:hr="t" fillcolor="#a0a0a0" stroked="f"/>
+          <v:rect id="_x0000_i1032" style="width:0;height:1.5pt" o:hralign="center" o:hrstd="t" o:hr="t" fillcolor="#a0a0a0" stroked="f"/>
         </w:pict>
       </w:r>
     </w:p>
@@ -3715,7 +1860,7 @@
           <w:szCs w:val="24"/>
         </w:rPr>
         <w:pict w14:anchorId="131606B7">
-          <v:rect id="_x0000_i1037" style="width:0;height:1.5pt" o:hralign="center" o:hrstd="t" o:hr="t" fillcolor="#a0a0a0" stroked="f"/>
+          <v:rect id="_x0000_i1033" style="width:0;height:1.5pt" o:hralign="center" o:hrstd="t" o:hr="t" fillcolor="#a0a0a0" stroked="f"/>
         </w:pict>
       </w:r>
     </w:p>
@@ -3735,7 +1880,7 @@
           <w:szCs w:val="24"/>
         </w:rPr>
         <w:pict w14:anchorId="4F0C60D6">
-          <v:rect id="_x0000_i1038" style="width:0;height:1.5pt" o:hralign="center" o:hrstd="t" o:hr="t" fillcolor="#a0a0a0" stroked="f"/>
+          <v:rect id="_x0000_i1034" style="width:0;height:1.5pt" o:hralign="center" o:hrstd="t" o:hr="t" fillcolor="#a0a0a0" stroked="f"/>
         </w:pict>
       </w:r>
     </w:p>
@@ -3778,7 +1923,7 @@
           <w:szCs w:val="24"/>
         </w:rPr>
         <w:pict w14:anchorId="28EBE116">
-          <v:rect id="_x0000_i1039" style="width:0;height:1.5pt" o:hralign="center" o:hrstd="t" o:hr="t" fillcolor="#a0a0a0" stroked="f"/>
+          <v:rect id="_x0000_i1035" style="width:0;height:1.5pt" o:hralign="center" o:hrstd="t" o:hr="t" fillcolor="#a0a0a0" stroked="f"/>
         </w:pict>
       </w:r>
     </w:p>
@@ -5383,7 +3528,7 @@
           <w:szCs w:val="24"/>
         </w:rPr>
         <w:pict w14:anchorId="7C26DFAE">
-          <v:rect id="_x0000_i1040" style="width:0;height:1.5pt" o:hralign="center" o:hrstd="t" o:hr="t" fillcolor="#a0a0a0" stroked="f"/>
+          <v:rect id="_x0000_i1036" style="width:0;height:1.5pt" o:hralign="center" o:hrstd="t" o:hr="t" fillcolor="#a0a0a0" stroked="f"/>
         </w:pict>
       </w:r>
     </w:p>
@@ -5486,7 +3631,7 @@
           <w:szCs w:val="24"/>
         </w:rPr>
         <w:pict w14:anchorId="7A601C7B">
-          <v:rect id="_x0000_i1041" style="width:0;height:1.5pt" o:hralign="center" o:hrstd="t" o:hr="t" fillcolor="#a0a0a0" stroked="f"/>
+          <v:rect id="_x0000_i1037" style="width:0;height:1.5pt" o:hralign="center" o:hrstd="t" o:hr="t" fillcolor="#a0a0a0" stroked="f"/>
         </w:pict>
       </w:r>
     </w:p>
@@ -5506,7 +3651,7 @@
           <w:szCs w:val="24"/>
         </w:rPr>
         <w:pict w14:anchorId="543187B4">
-          <v:rect id="_x0000_i1042" style="width:0;height:1.5pt" o:hralign="center" o:hrstd="t" o:hr="t" fillcolor="#a0a0a0" stroked="f"/>
+          <v:rect id="_x0000_i1038" style="width:0;height:1.5pt" o:hralign="center" o:hrstd="t" o:hr="t" fillcolor="#a0a0a0" stroked="f"/>
         </w:pict>
       </w:r>
     </w:p>
@@ -5549,7 +3694,7 @@
           <w:szCs w:val="24"/>
         </w:rPr>
         <w:pict w14:anchorId="0B2FE953">
-          <v:rect id="_x0000_i1043" style="width:0;height:1.5pt" o:hralign="center" o:hrstd="t" o:hr="t" fillcolor="#a0a0a0" stroked="f"/>
+          <v:rect id="_x0000_i1039" style="width:0;height:1.5pt" o:hralign="center" o:hrstd="t" o:hr="t" fillcolor="#a0a0a0" stroked="f"/>
         </w:pict>
       </w:r>
     </w:p>
@@ -7077,7 +5222,7 @@
           <w:szCs w:val="24"/>
         </w:rPr>
         <w:pict w14:anchorId="4816BBF7">
-          <v:rect id="_x0000_i1044" style="width:0;height:1.5pt" o:hralign="center" o:hrstd="t" o:hr="t" fillcolor="#a0a0a0" stroked="f"/>
+          <v:rect id="_x0000_i1040" style="width:0;height:1.5pt" o:hralign="center" o:hrstd="t" o:hr="t" fillcolor="#a0a0a0" stroked="f"/>
         </w:pict>
       </w:r>
     </w:p>
@@ -7097,7 +5242,7 @@
           <w:szCs w:val="24"/>
         </w:rPr>
         <w:pict w14:anchorId="2B35D005">
-          <v:rect id="_x0000_i1045" style="width:0;height:1.5pt" o:hralign="center" o:hrstd="t" o:hr="t" fillcolor="#a0a0a0" stroked="f"/>
+          <v:rect id="_x0000_i1041" style="width:0;height:1.5pt" o:hralign="center" o:hrstd="t" o:hr="t" fillcolor="#a0a0a0" stroked="f"/>
         </w:pict>
       </w:r>
     </w:p>
@@ -7140,7 +5285,7 @@
           <w:szCs w:val="24"/>
         </w:rPr>
         <w:pict w14:anchorId="4A7A08C3">
-          <v:rect id="_x0000_i1046" style="width:0;height:1.5pt" o:hralign="center" o:hrstd="t" o:hr="t" fillcolor="#a0a0a0" stroked="f"/>
+          <v:rect id="_x0000_i1042" style="width:0;height:1.5pt" o:hralign="center" o:hrstd="t" o:hr="t" fillcolor="#a0a0a0" stroked="f"/>
         </w:pict>
       </w:r>
     </w:p>
@@ -8458,7 +6603,7 @@
           <w:szCs w:val="24"/>
         </w:rPr>
         <w:pict w14:anchorId="46AEFC7A">
-          <v:rect id="_x0000_i1047" style="width:0;height:1.5pt" o:hralign="center" o:hrstd="t" o:hr="t" fillcolor="#a0a0a0" stroked="f"/>
+          <v:rect id="_x0000_i1043" style="width:0;height:1.5pt" o:hralign="center" o:hrstd="t" o:hr="t" fillcolor="#a0a0a0" stroked="f"/>
         </w:pict>
       </w:r>
     </w:p>
@@ -8705,7 +6850,7 @@
           <w:szCs w:val="24"/>
         </w:rPr>
         <w:pict w14:anchorId="4218B3C7">
-          <v:rect id="_x0000_i1048" style="width:0;height:1.5pt" o:hralign="center" o:hrstd="t" o:hr="t" fillcolor="#a0a0a0" stroked="f"/>
+          <v:rect id="_x0000_i1044" style="width:0;height:1.5pt" o:hralign="center" o:hrstd="t" o:hr="t" fillcolor="#a0a0a0" stroked="f"/>
         </w:pict>
       </w:r>
     </w:p>
@@ -8725,7 +6870,7 @@
           <w:szCs w:val="24"/>
         </w:rPr>
         <w:pict w14:anchorId="48B5C2DE">
-          <v:rect id="_x0000_i1049" style="width:0;height:1.5pt" o:hralign="center" o:hrstd="t" o:hr="t" fillcolor="#a0a0a0" stroked="f"/>
+          <v:rect id="_x0000_i1045" style="width:0;height:1.5pt" o:hralign="center" o:hrstd="t" o:hr="t" fillcolor="#a0a0a0" stroked="f"/>
         </w:pict>
       </w:r>
     </w:p>

</xml_diff>

<commit_message>
Developed Payment Feature Completely 5.05.26 4:29 PM
</commit_message>
<xml_diff>
--- a/Project Structure/Project Structure.docx
+++ b/Project Structure/Project Structure.docx
@@ -1,6 +1,6 @@
 
 <file path=word/document.xml><?xml version="1.0" encoding="utf-8"?>
-<w:document xmlns:wpc="http://schemas.microsoft.com/office/word/2010/wordprocessingCanvas" xmlns:cx="http://schemas.microsoft.com/office/drawing/2014/chartex" xmlns:cx1="http://schemas.microsoft.com/office/drawing/2015/9/8/chartex" xmlns:cx2="http://schemas.microsoft.com/office/drawing/2015/10/21/chartex" xmlns:cx3="http://schemas.microsoft.com/office/drawing/2016/5/9/chartex" xmlns:cx4="http://schemas.microsoft.com/office/drawing/2016/5/10/chartex" xmlns:cx5="http://schemas.microsoft.com/office/drawing/2016/5/11/chartex" xmlns:cx6="http://schemas.microsoft.com/office/drawing/2016/5/12/chartex" xmlns:cx7="http://schemas.microsoft.com/office/drawing/2016/5/13/chartex" xmlns:cx8="http://schemas.microsoft.com/office/drawing/2016/5/14/chartex" xmlns:mc="http://schemas.openxmlformats.org/markup-compatibility/2006" xmlns:aink="http://schemas.microsoft.com/office/drawing/2016/ink" xmlns:am3d="http://schemas.microsoft.com/office/drawing/2017/model3d" xmlns:o="urn:schemas-microsoft-com:office:office" xmlns:oel="http://schemas.microsoft.com/office/2019/extlst" xmlns:r="http://schemas.openxmlformats.org/officeDocument/2006/relationships" xmlns:m="http://schemas.openxmlformats.org/officeDocument/2006/math" xmlns:v="urn:schemas-microsoft-com:vml" xmlns:wp14="http://schemas.microsoft.com/office/word/2010/wordprocessingDrawing" xmlns:wp="http://schemas.openxmlformats.org/drawingml/2006/wordprocessingDrawing" xmlns:w10="urn:schemas-microsoft-com:office:word" xmlns:w="http://schemas.openxmlformats.org/wordprocessingml/2006/main" xmlns:w14="http://schemas.microsoft.com/office/word/2010/wordml" xmlns:w15="http://schemas.microsoft.com/office/word/2012/wordml" xmlns:w16cex="http://schemas.microsoft.com/office/word/2018/wordml/cex" xmlns:w16cid="http://schemas.microsoft.com/office/word/2016/wordml/cid" xmlns:w16="http://schemas.microsoft.com/office/word/2018/wordml" xmlns:w16du="http://schemas.microsoft.com/office/word/2023/wordml/word16du" xmlns:w16sdtdh="http://schemas.microsoft.com/office/word/2020/wordml/sdtdatahash" xmlns:w16sdtfl="http://schemas.microsoft.com/office/word/2024/wordml/sdtformatlock" xmlns:w16se="http://schemas.microsoft.com/office/word/2015/wordml/symex" xmlns:wpg="http://schemas.microsoft.com/office/word/2010/wordprocessingGroup" xmlns:wpi="http://schemas.microsoft.com/office/word/2010/wordprocessingInk" xmlns:wne="http://schemas.microsoft.com/office/word/2006/wordml" xmlns:wps="http://schemas.microsoft.com/office/word/2010/wordprocessingShape" mc:Ignorable="w14 w15 w16se w16cid w16 w16cex w16sdtdh w16sdtfl w16du wp14">
+<w:document xmlns:wpc="http://schemas.microsoft.com/office/word/2010/wordprocessingCanvas" xmlns:mc="http://schemas.openxmlformats.org/markup-compatibility/2006" xmlns:o="urn:schemas-microsoft-com:office:office" xmlns:r="http://schemas.openxmlformats.org/officeDocument/2006/relationships" xmlns:m="http://schemas.openxmlformats.org/officeDocument/2006/math" xmlns:v="urn:schemas-microsoft-com:vml" xmlns:wp14="http://schemas.microsoft.com/office/word/2010/wordprocessingDrawing" xmlns:wp="http://schemas.openxmlformats.org/drawingml/2006/wordprocessingDrawing" xmlns:w10="urn:schemas-microsoft-com:office:word" xmlns:w="http://schemas.openxmlformats.org/wordprocessingml/2006/main" xmlns:w14="http://schemas.microsoft.com/office/word/2010/wordml" xmlns:wpg="http://schemas.microsoft.com/office/word/2010/wordprocessingGroup" xmlns:wpi="http://schemas.microsoft.com/office/word/2010/wordprocessingInk" xmlns:wne="http://schemas.microsoft.com/office/word/2006/wordml" xmlns:wps="http://schemas.microsoft.com/office/word/2010/wordprocessingShape" mc:Ignorable="w14 wp14">
   <w:body>
     <w:p>
       <w:pPr>
@@ -11,66 +11,6 @@
           <w:szCs w:val="24"/>
         </w:rPr>
       </w:pPr>
-      <w:r>
-        <w:rPr>
-          <w:rFonts w:ascii="Times New Roman" w:eastAsia="Times New Roman" w:hAnsi="Times New Roman" w:cs="Times New Roman"/>
-          <w:sz w:val="24"/>
-          <w:szCs w:val="24"/>
-        </w:rPr>
-        <w:pict w14:anchorId="7FD56637">
-          <v:rect id="_x0000_i1025" style="width:0;height:1.5pt" o:hralign="center" o:hrstd="t" o:hr="t" fillcolor="#a0a0a0" stroked="f"/>
-        </w:pict>
-      </w:r>
-    </w:p>
-    <w:p>
-      <w:pPr>
-        <w:spacing w:after="0" w:line="240" w:lineRule="auto"/>
-        <w:rPr>
-          <w:rFonts w:ascii="Times New Roman" w:eastAsia="Times New Roman" w:hAnsi="Times New Roman" w:cs="Times New Roman"/>
-          <w:sz w:val="24"/>
-          <w:szCs w:val="24"/>
-        </w:rPr>
-      </w:pPr>
-      <w:r>
-        <w:rPr>
-          <w:rFonts w:ascii="Times New Roman" w:eastAsia="Times New Roman" w:hAnsi="Times New Roman" w:cs="Times New Roman"/>
-          <w:sz w:val="24"/>
-          <w:szCs w:val="24"/>
-        </w:rPr>
-        <w:pict w14:anchorId="38BF37BA">
-          <v:rect id="_x0000_i1026" style="width:0;height:1.5pt" o:hralign="center" o:hrstd="t" o:hr="t" fillcolor="#a0a0a0" stroked="f"/>
-        </w:pict>
-      </w:r>
-    </w:p>
-    <w:p>
-      <w:pPr>
-        <w:spacing w:after="0" w:line="240" w:lineRule="auto"/>
-        <w:rPr>
-          <w:rFonts w:ascii="Times New Roman" w:eastAsia="Times New Roman" w:hAnsi="Times New Roman" w:cs="Times New Roman"/>
-          <w:sz w:val="24"/>
-          <w:szCs w:val="24"/>
-        </w:rPr>
-      </w:pPr>
-    </w:p>
-    <w:p>
-      <w:pPr>
-        <w:spacing w:after="0" w:line="240" w:lineRule="auto"/>
-        <w:rPr>
-          <w:rFonts w:ascii="Times New Roman" w:eastAsia="Times New Roman" w:hAnsi="Times New Roman" w:cs="Times New Roman"/>
-          <w:sz w:val="24"/>
-          <w:szCs w:val="24"/>
-        </w:rPr>
-      </w:pPr>
-      <w:r>
-        <w:rPr>
-          <w:rFonts w:ascii="Times New Roman" w:eastAsia="Times New Roman" w:hAnsi="Times New Roman" w:cs="Times New Roman"/>
-          <w:sz w:val="24"/>
-          <w:szCs w:val="24"/>
-        </w:rPr>
-        <w:pict w14:anchorId="669B5EBD">
-          <v:rect id="_x0000_i1030" style="width:0;height:1.5pt" o:hralign="center" o:hrstd="t" o:hr="t" fillcolor="#a0a0a0" stroked="f"/>
-        </w:pict>
-      </w:r>
     </w:p>
     <w:p>
       <w:pPr>
@@ -84,6 +24,8 @@
           <w:szCs w:val="36"/>
         </w:rPr>
       </w:pPr>
+      <w:bookmarkStart w:id="0" w:name="_GoBack"/>
+      <w:bookmarkEnd w:id="0"/>
       <w:r>
         <w:rPr>
           <w:rFonts w:ascii="Times New Roman" w:eastAsia="Times New Roman" w:hAnsi="Times New Roman" w:cs="Times New Roman"/>
@@ -92,7 +34,7 @@
           <w:sz w:val="36"/>
           <w:szCs w:val="36"/>
         </w:rPr>
-        <w:t>💳 Payments — Full Deep Dive</w:t>
+        <w:t>⭐ Reviews &amp; Ratings — Full Deep Dive</w:t>
       </w:r>
     </w:p>
     <w:p>
@@ -110,1820 +52,8 @@
           <w:sz w:val="24"/>
           <w:szCs w:val="24"/>
         </w:rPr>
-        <w:pict w14:anchorId="718E55CB">
-          <v:rect id="_x0000_i1031" style="width:0;height:1.5pt" o:hralign="center" o:hrstd="t" o:hr="t" fillcolor="#a0a0a0" stroked="f"/>
-        </w:pict>
-      </w:r>
-    </w:p>
-    <w:p>
-      <w:pPr>
-        <w:spacing w:before="100" w:beforeAutospacing="1" w:after="100" w:afterAutospacing="1" w:line="240" w:lineRule="auto"/>
-        <w:outlineLvl w:val="2"/>
-        <w:rPr>
-          <w:rFonts w:ascii="Times New Roman" w:eastAsia="Times New Roman" w:hAnsi="Times New Roman" w:cs="Times New Roman"/>
-          <w:b/>
-          <w:bCs/>
-          <w:sz w:val="27"/>
-          <w:szCs w:val="27"/>
-        </w:rPr>
-      </w:pPr>
-      <w:r>
-        <w:rPr>
-          <w:rFonts w:ascii="Times New Roman" w:eastAsia="Times New Roman" w:hAnsi="Times New Roman" w:cs="Times New Roman"/>
-          <w:b/>
-          <w:bCs/>
-          <w:sz w:val="27"/>
-          <w:szCs w:val="27"/>
-        </w:rPr>
-        <w:t>🗄️ Database Model</w:t>
-      </w:r>
-    </w:p>
-    <w:tbl>
-      <w:tblPr>
-        <w:tblW w:w="0" w:type="auto"/>
-        <w:tblCellSpacing w:w="15" w:type="dxa"/>
-        <w:tblCellMar>
-          <w:top w:w="15" w:type="dxa"/>
-          <w:left w:w="15" w:type="dxa"/>
-          <w:bottom w:w="15" w:type="dxa"/>
-          <w:right w:w="15" w:type="dxa"/>
-        </w:tblCellMar>
-        <w:tblLook w:val="04A0" w:firstRow="1" w:lastRow="0" w:firstColumn="1" w:lastColumn="0" w:noHBand="0" w:noVBand="1"/>
-      </w:tblPr>
-      <w:tblGrid>
-        <w:gridCol w:w="1276"/>
-        <w:gridCol w:w="1287"/>
-        <w:gridCol w:w="3436"/>
-      </w:tblGrid>
-      <w:tr>
-        <w:trPr>
-          <w:tblHeader/>
-          <w:tblCellSpacing w:w="15" w:type="dxa"/>
-        </w:trPr>
-        <w:tc>
-          <w:tcPr>
-            <w:tcW w:w="0" w:type="auto"/>
-            <w:vAlign w:val="center"/>
-            <w:hideMark/>
-          </w:tcPr>
-          <w:p>
-            <w:pPr>
-              <w:spacing w:after="0" w:line="240" w:lineRule="auto"/>
-              <w:jc w:val="center"/>
-              <w:rPr>
-                <w:rFonts w:ascii="Times New Roman" w:eastAsia="Times New Roman" w:hAnsi="Times New Roman" w:cs="Times New Roman"/>
-                <w:b/>
-                <w:bCs/>
-                <w:sz w:val="24"/>
-                <w:szCs w:val="24"/>
-              </w:rPr>
-            </w:pPr>
-            <w:r>
-              <w:rPr>
-                <w:rFonts w:ascii="Times New Roman" w:eastAsia="Times New Roman" w:hAnsi="Times New Roman" w:cs="Times New Roman"/>
-                <w:b/>
-                <w:bCs/>
-                <w:sz w:val="24"/>
-                <w:szCs w:val="24"/>
-              </w:rPr>
-              <w:t>Column</w:t>
-            </w:r>
-          </w:p>
-        </w:tc>
-        <w:tc>
-          <w:tcPr>
-            <w:tcW w:w="0" w:type="auto"/>
-            <w:vAlign w:val="center"/>
-            <w:hideMark/>
-          </w:tcPr>
-          <w:p>
-            <w:pPr>
-              <w:spacing w:after="0" w:line="240" w:lineRule="auto"/>
-              <w:jc w:val="center"/>
-              <w:rPr>
-                <w:rFonts w:ascii="Times New Roman" w:eastAsia="Times New Roman" w:hAnsi="Times New Roman" w:cs="Times New Roman"/>
-                <w:b/>
-                <w:bCs/>
-                <w:sz w:val="24"/>
-                <w:szCs w:val="24"/>
-              </w:rPr>
-            </w:pPr>
-            <w:r>
-              <w:rPr>
-                <w:rFonts w:ascii="Times New Roman" w:eastAsia="Times New Roman" w:hAnsi="Times New Roman" w:cs="Times New Roman"/>
-                <w:b/>
-                <w:bCs/>
-                <w:sz w:val="24"/>
-                <w:szCs w:val="24"/>
-              </w:rPr>
-              <w:t>Type</w:t>
-            </w:r>
-          </w:p>
-        </w:tc>
-        <w:tc>
-          <w:tcPr>
-            <w:tcW w:w="0" w:type="auto"/>
-            <w:vAlign w:val="center"/>
-            <w:hideMark/>
-          </w:tcPr>
-          <w:p>
-            <w:pPr>
-              <w:spacing w:after="0" w:line="240" w:lineRule="auto"/>
-              <w:jc w:val="center"/>
-              <w:rPr>
-                <w:rFonts w:ascii="Times New Roman" w:eastAsia="Times New Roman" w:hAnsi="Times New Roman" w:cs="Times New Roman"/>
-                <w:b/>
-                <w:bCs/>
-                <w:sz w:val="24"/>
-                <w:szCs w:val="24"/>
-              </w:rPr>
-            </w:pPr>
-            <w:r>
-              <w:rPr>
-                <w:rFonts w:ascii="Times New Roman" w:eastAsia="Times New Roman" w:hAnsi="Times New Roman" w:cs="Times New Roman"/>
-                <w:b/>
-                <w:bCs/>
-                <w:sz w:val="24"/>
-                <w:szCs w:val="24"/>
-              </w:rPr>
-              <w:t>Notes</w:t>
-            </w:r>
-          </w:p>
-        </w:tc>
-      </w:tr>
-      <w:tr>
-        <w:trPr>
-          <w:tblCellSpacing w:w="15" w:type="dxa"/>
-        </w:trPr>
-        <w:tc>
-          <w:tcPr>
-            <w:tcW w:w="0" w:type="auto"/>
-            <w:vAlign w:val="center"/>
-            <w:hideMark/>
-          </w:tcPr>
-          <w:p>
-            <w:pPr>
-              <w:spacing w:after="0" w:line="240" w:lineRule="auto"/>
-              <w:rPr>
-                <w:rFonts w:ascii="Times New Roman" w:eastAsia="Times New Roman" w:hAnsi="Times New Roman" w:cs="Times New Roman"/>
-                <w:sz w:val="24"/>
-                <w:szCs w:val="24"/>
-              </w:rPr>
-            </w:pPr>
-            <w:r>
-              <w:rPr>
-                <w:rFonts w:ascii="Courier New" w:eastAsia="Times New Roman" w:hAnsi="Courier New" w:cs="Courier New"/>
-                <w:sz w:val="20"/>
-                <w:szCs w:val="20"/>
-              </w:rPr>
-              <w:t>id</w:t>
-            </w:r>
-          </w:p>
-        </w:tc>
-        <w:tc>
-          <w:tcPr>
-            <w:tcW w:w="0" w:type="auto"/>
-            <w:vAlign w:val="center"/>
-            <w:hideMark/>
-          </w:tcPr>
-          <w:p>
-            <w:pPr>
-              <w:spacing w:after="0" w:line="240" w:lineRule="auto"/>
-              <w:rPr>
-                <w:rFonts w:ascii="Times New Roman" w:eastAsia="Times New Roman" w:hAnsi="Times New Roman" w:cs="Times New Roman"/>
-                <w:sz w:val="24"/>
-                <w:szCs w:val="24"/>
-              </w:rPr>
-            </w:pPr>
-            <w:r>
-              <w:rPr>
-                <w:rFonts w:ascii="Times New Roman" w:eastAsia="Times New Roman" w:hAnsi="Times New Roman" w:cs="Times New Roman"/>
-                <w:sz w:val="24"/>
-                <w:szCs w:val="24"/>
-              </w:rPr>
-              <w:t>UUID</w:t>
-            </w:r>
-          </w:p>
-        </w:tc>
-        <w:tc>
-          <w:tcPr>
-            <w:tcW w:w="0" w:type="auto"/>
-            <w:vAlign w:val="center"/>
-            <w:hideMark/>
-          </w:tcPr>
-          <w:p>
-            <w:pPr>
-              <w:spacing w:after="0" w:line="240" w:lineRule="auto"/>
-              <w:rPr>
-                <w:rFonts w:ascii="Times New Roman" w:eastAsia="Times New Roman" w:hAnsi="Times New Roman" w:cs="Times New Roman"/>
-                <w:sz w:val="24"/>
-                <w:szCs w:val="24"/>
-              </w:rPr>
-            </w:pPr>
-          </w:p>
-        </w:tc>
-      </w:tr>
-      <w:tr>
-        <w:trPr>
-          <w:tblCellSpacing w:w="15" w:type="dxa"/>
-        </w:trPr>
-        <w:tc>
-          <w:tcPr>
-            <w:tcW w:w="0" w:type="auto"/>
-            <w:vAlign w:val="center"/>
-            <w:hideMark/>
-          </w:tcPr>
-          <w:p>
-            <w:pPr>
-              <w:spacing w:after="0" w:line="240" w:lineRule="auto"/>
-              <w:rPr>
-                <w:rFonts w:ascii="Times New Roman" w:eastAsia="Times New Roman" w:hAnsi="Times New Roman" w:cs="Times New Roman"/>
-                <w:sz w:val="24"/>
-                <w:szCs w:val="24"/>
-              </w:rPr>
-            </w:pPr>
-            <w:r>
-              <w:rPr>
-                <w:rFonts w:ascii="Courier New" w:eastAsia="Times New Roman" w:hAnsi="Courier New" w:cs="Courier New"/>
-                <w:sz w:val="20"/>
-                <w:szCs w:val="20"/>
-              </w:rPr>
-              <w:t>order_id</w:t>
-            </w:r>
-          </w:p>
-        </w:tc>
-        <w:tc>
-          <w:tcPr>
-            <w:tcW w:w="0" w:type="auto"/>
-            <w:vAlign w:val="center"/>
-            <w:hideMark/>
-          </w:tcPr>
-          <w:p>
-            <w:pPr>
-              <w:spacing w:after="0" w:line="240" w:lineRule="auto"/>
-              <w:rPr>
-                <w:rFonts w:ascii="Times New Roman" w:eastAsia="Times New Roman" w:hAnsi="Times New Roman" w:cs="Times New Roman"/>
-                <w:sz w:val="24"/>
-                <w:szCs w:val="24"/>
-              </w:rPr>
-            </w:pPr>
-            <w:r>
-              <w:rPr>
-                <w:rFonts w:ascii="Times New Roman" w:eastAsia="Times New Roman" w:hAnsi="Times New Roman" w:cs="Times New Roman"/>
-                <w:sz w:val="24"/>
-                <w:szCs w:val="24"/>
-              </w:rPr>
-              <w:t>FK → Order</w:t>
-            </w:r>
-          </w:p>
-        </w:tc>
-        <w:tc>
-          <w:tcPr>
-            <w:tcW w:w="0" w:type="auto"/>
-            <w:vAlign w:val="center"/>
-            <w:hideMark/>
-          </w:tcPr>
-          <w:p>
-            <w:pPr>
-              <w:spacing w:after="0" w:line="240" w:lineRule="auto"/>
-              <w:rPr>
-                <w:rFonts w:ascii="Times New Roman" w:eastAsia="Times New Roman" w:hAnsi="Times New Roman" w:cs="Times New Roman"/>
-                <w:sz w:val="24"/>
-                <w:szCs w:val="24"/>
-              </w:rPr>
-            </w:pPr>
-            <w:r>
-              <w:rPr>
-                <w:rFonts w:ascii="Times New Roman" w:eastAsia="Times New Roman" w:hAnsi="Times New Roman" w:cs="Times New Roman"/>
-                <w:sz w:val="24"/>
-                <w:szCs w:val="24"/>
-              </w:rPr>
-              <w:t>one-to-one</w:t>
-            </w:r>
-          </w:p>
-        </w:tc>
-      </w:tr>
-      <w:tr>
-        <w:trPr>
-          <w:tblCellSpacing w:w="15" w:type="dxa"/>
-        </w:trPr>
-        <w:tc>
-          <w:tcPr>
-            <w:tcW w:w="0" w:type="auto"/>
-            <w:vAlign w:val="center"/>
-            <w:hideMark/>
-          </w:tcPr>
-          <w:p>
-            <w:pPr>
-              <w:spacing w:after="0" w:line="240" w:lineRule="auto"/>
-              <w:rPr>
-                <w:rFonts w:ascii="Times New Roman" w:eastAsia="Times New Roman" w:hAnsi="Times New Roman" w:cs="Times New Roman"/>
-                <w:sz w:val="24"/>
-                <w:szCs w:val="24"/>
-              </w:rPr>
-            </w:pPr>
-            <w:r>
-              <w:rPr>
-                <w:rFonts w:ascii="Courier New" w:eastAsia="Times New Roman" w:hAnsi="Courier New" w:cs="Courier New"/>
-                <w:sz w:val="20"/>
-                <w:szCs w:val="20"/>
-              </w:rPr>
-              <w:t>method</w:t>
-            </w:r>
-          </w:p>
-        </w:tc>
-        <w:tc>
-          <w:tcPr>
-            <w:tcW w:w="0" w:type="auto"/>
-            <w:vAlign w:val="center"/>
-            <w:hideMark/>
-          </w:tcPr>
-          <w:p>
-            <w:pPr>
-              <w:spacing w:after="0" w:line="240" w:lineRule="auto"/>
-              <w:rPr>
-                <w:rFonts w:ascii="Times New Roman" w:eastAsia="Times New Roman" w:hAnsi="Times New Roman" w:cs="Times New Roman"/>
-                <w:sz w:val="24"/>
-                <w:szCs w:val="24"/>
-              </w:rPr>
-            </w:pPr>
-            <w:r>
-              <w:rPr>
-                <w:rFonts w:ascii="Times New Roman" w:eastAsia="Times New Roman" w:hAnsi="Times New Roman" w:cs="Times New Roman"/>
-                <w:sz w:val="24"/>
-                <w:szCs w:val="24"/>
-              </w:rPr>
-              <w:t>Enum</w:t>
-            </w:r>
-          </w:p>
-        </w:tc>
-        <w:tc>
-          <w:tcPr>
-            <w:tcW w:w="0" w:type="auto"/>
-            <w:vAlign w:val="center"/>
-            <w:hideMark/>
-          </w:tcPr>
-          <w:p>
-            <w:pPr>
-              <w:spacing w:after="0" w:line="240" w:lineRule="auto"/>
-              <w:rPr>
-                <w:rFonts w:ascii="Times New Roman" w:eastAsia="Times New Roman" w:hAnsi="Times New Roman" w:cs="Times New Roman"/>
-                <w:sz w:val="24"/>
-                <w:szCs w:val="24"/>
-              </w:rPr>
-            </w:pPr>
-            <w:r>
-              <w:rPr>
-                <w:rFonts w:ascii="Courier New" w:eastAsia="Times New Roman" w:hAnsi="Courier New" w:cs="Courier New"/>
-                <w:sz w:val="20"/>
-                <w:szCs w:val="20"/>
-              </w:rPr>
-              <w:t>cash_on_delivery</w:t>
-            </w:r>
-            <w:r>
-              <w:rPr>
-                <w:rFonts w:ascii="Times New Roman" w:eastAsia="Times New Roman" w:hAnsi="Times New Roman" w:cs="Times New Roman"/>
-                <w:sz w:val="24"/>
-                <w:szCs w:val="24"/>
-              </w:rPr>
-              <w:t xml:space="preserve">, </w:t>
-            </w:r>
-            <w:r>
-              <w:rPr>
-                <w:rFonts w:ascii="Courier New" w:eastAsia="Times New Roman" w:hAnsi="Courier New" w:cs="Courier New"/>
-                <w:sz w:val="20"/>
-                <w:szCs w:val="20"/>
-              </w:rPr>
-              <w:t>card</w:t>
-            </w:r>
-          </w:p>
-        </w:tc>
-      </w:tr>
-      <w:tr>
-        <w:trPr>
-          <w:tblCellSpacing w:w="15" w:type="dxa"/>
-        </w:trPr>
-        <w:tc>
-          <w:tcPr>
-            <w:tcW w:w="0" w:type="auto"/>
-            <w:vAlign w:val="center"/>
-            <w:hideMark/>
-          </w:tcPr>
-          <w:p>
-            <w:pPr>
-              <w:spacing w:after="0" w:line="240" w:lineRule="auto"/>
-              <w:rPr>
-                <w:rFonts w:ascii="Times New Roman" w:eastAsia="Times New Roman" w:hAnsi="Times New Roman" w:cs="Times New Roman"/>
-                <w:sz w:val="24"/>
-                <w:szCs w:val="24"/>
-              </w:rPr>
-            </w:pPr>
-            <w:r>
-              <w:rPr>
-                <w:rFonts w:ascii="Courier New" w:eastAsia="Times New Roman" w:hAnsi="Courier New" w:cs="Courier New"/>
-                <w:sz w:val="20"/>
-                <w:szCs w:val="20"/>
-              </w:rPr>
-              <w:t>status</w:t>
-            </w:r>
-          </w:p>
-        </w:tc>
-        <w:tc>
-          <w:tcPr>
-            <w:tcW w:w="0" w:type="auto"/>
-            <w:vAlign w:val="center"/>
-            <w:hideMark/>
-          </w:tcPr>
-          <w:p>
-            <w:pPr>
-              <w:spacing w:after="0" w:line="240" w:lineRule="auto"/>
-              <w:rPr>
-                <w:rFonts w:ascii="Times New Roman" w:eastAsia="Times New Roman" w:hAnsi="Times New Roman" w:cs="Times New Roman"/>
-                <w:sz w:val="24"/>
-                <w:szCs w:val="24"/>
-              </w:rPr>
-            </w:pPr>
-            <w:r>
-              <w:rPr>
-                <w:rFonts w:ascii="Times New Roman" w:eastAsia="Times New Roman" w:hAnsi="Times New Roman" w:cs="Times New Roman"/>
-                <w:sz w:val="24"/>
-                <w:szCs w:val="24"/>
-              </w:rPr>
-              <w:t>Enum</w:t>
-            </w:r>
-          </w:p>
-        </w:tc>
-        <w:tc>
-          <w:tcPr>
-            <w:tcW w:w="0" w:type="auto"/>
-            <w:vAlign w:val="center"/>
-            <w:hideMark/>
-          </w:tcPr>
-          <w:p>
-            <w:pPr>
-              <w:spacing w:after="0" w:line="240" w:lineRule="auto"/>
-              <w:rPr>
-                <w:rFonts w:ascii="Times New Roman" w:eastAsia="Times New Roman" w:hAnsi="Times New Roman" w:cs="Times New Roman"/>
-                <w:sz w:val="24"/>
-                <w:szCs w:val="24"/>
-              </w:rPr>
-            </w:pPr>
-            <w:r>
-              <w:rPr>
-                <w:rFonts w:ascii="Courier New" w:eastAsia="Times New Roman" w:hAnsi="Courier New" w:cs="Courier New"/>
-                <w:sz w:val="20"/>
-                <w:szCs w:val="20"/>
-              </w:rPr>
-              <w:t>pending</w:t>
-            </w:r>
-            <w:r>
-              <w:rPr>
-                <w:rFonts w:ascii="Times New Roman" w:eastAsia="Times New Roman" w:hAnsi="Times New Roman" w:cs="Times New Roman"/>
-                <w:sz w:val="24"/>
-                <w:szCs w:val="24"/>
-              </w:rPr>
-              <w:t xml:space="preserve">, </w:t>
-            </w:r>
-            <w:r>
-              <w:rPr>
-                <w:rFonts w:ascii="Courier New" w:eastAsia="Times New Roman" w:hAnsi="Courier New" w:cs="Courier New"/>
-                <w:sz w:val="20"/>
-                <w:szCs w:val="20"/>
-              </w:rPr>
-              <w:t>paid</w:t>
-            </w:r>
-            <w:r>
-              <w:rPr>
-                <w:rFonts w:ascii="Times New Roman" w:eastAsia="Times New Roman" w:hAnsi="Times New Roman" w:cs="Times New Roman"/>
-                <w:sz w:val="24"/>
-                <w:szCs w:val="24"/>
-              </w:rPr>
-              <w:t xml:space="preserve">, </w:t>
-            </w:r>
-            <w:r>
-              <w:rPr>
-                <w:rFonts w:ascii="Courier New" w:eastAsia="Times New Roman" w:hAnsi="Courier New" w:cs="Courier New"/>
-                <w:sz w:val="20"/>
-                <w:szCs w:val="20"/>
-              </w:rPr>
-              <w:t>failed</w:t>
-            </w:r>
-            <w:r>
-              <w:rPr>
-                <w:rFonts w:ascii="Times New Roman" w:eastAsia="Times New Roman" w:hAnsi="Times New Roman" w:cs="Times New Roman"/>
-                <w:sz w:val="24"/>
-                <w:szCs w:val="24"/>
-              </w:rPr>
-              <w:t xml:space="preserve">, </w:t>
-            </w:r>
-            <w:r>
-              <w:rPr>
-                <w:rFonts w:ascii="Courier New" w:eastAsia="Times New Roman" w:hAnsi="Courier New" w:cs="Courier New"/>
-                <w:sz w:val="20"/>
-                <w:szCs w:val="20"/>
-              </w:rPr>
-              <w:t>refunded</w:t>
-            </w:r>
-          </w:p>
-        </w:tc>
-      </w:tr>
-      <w:tr>
-        <w:trPr>
-          <w:tblCellSpacing w:w="15" w:type="dxa"/>
-        </w:trPr>
-        <w:tc>
-          <w:tcPr>
-            <w:tcW w:w="0" w:type="auto"/>
-            <w:vAlign w:val="center"/>
-            <w:hideMark/>
-          </w:tcPr>
-          <w:p>
-            <w:pPr>
-              <w:spacing w:after="0" w:line="240" w:lineRule="auto"/>
-              <w:rPr>
-                <w:rFonts w:ascii="Times New Roman" w:eastAsia="Times New Roman" w:hAnsi="Times New Roman" w:cs="Times New Roman"/>
-                <w:sz w:val="24"/>
-                <w:szCs w:val="24"/>
-              </w:rPr>
-            </w:pPr>
-            <w:r>
-              <w:rPr>
-                <w:rFonts w:ascii="Courier New" w:eastAsia="Times New Roman" w:hAnsi="Courier New" w:cs="Courier New"/>
-                <w:sz w:val="20"/>
-                <w:szCs w:val="20"/>
-              </w:rPr>
-              <w:t>amount</w:t>
-            </w:r>
-          </w:p>
-        </w:tc>
-        <w:tc>
-          <w:tcPr>
-            <w:tcW w:w="0" w:type="auto"/>
-            <w:vAlign w:val="center"/>
-            <w:hideMark/>
-          </w:tcPr>
-          <w:p>
-            <w:pPr>
-              <w:spacing w:after="0" w:line="240" w:lineRule="auto"/>
-              <w:rPr>
-                <w:rFonts w:ascii="Times New Roman" w:eastAsia="Times New Roman" w:hAnsi="Times New Roman" w:cs="Times New Roman"/>
-                <w:sz w:val="24"/>
-                <w:szCs w:val="24"/>
-              </w:rPr>
-            </w:pPr>
-            <w:r>
-              <w:rPr>
-                <w:rFonts w:ascii="Times New Roman" w:eastAsia="Times New Roman" w:hAnsi="Times New Roman" w:cs="Times New Roman"/>
-                <w:sz w:val="24"/>
-                <w:szCs w:val="24"/>
-              </w:rPr>
-              <w:t>Float</w:t>
-            </w:r>
-          </w:p>
-        </w:tc>
-        <w:tc>
-          <w:tcPr>
-            <w:tcW w:w="0" w:type="auto"/>
-            <w:vAlign w:val="center"/>
-            <w:hideMark/>
-          </w:tcPr>
-          <w:p>
-            <w:pPr>
-              <w:spacing w:after="0" w:line="240" w:lineRule="auto"/>
-              <w:rPr>
-                <w:rFonts w:ascii="Times New Roman" w:eastAsia="Times New Roman" w:hAnsi="Times New Roman" w:cs="Times New Roman"/>
-                <w:sz w:val="24"/>
-                <w:szCs w:val="24"/>
-              </w:rPr>
-            </w:pPr>
-            <w:r>
-              <w:rPr>
-                <w:rFonts w:ascii="Times New Roman" w:eastAsia="Times New Roman" w:hAnsi="Times New Roman" w:cs="Times New Roman"/>
-                <w:sz w:val="24"/>
-                <w:szCs w:val="24"/>
-              </w:rPr>
-              <w:t>copied from order total</w:t>
-            </w:r>
-          </w:p>
-        </w:tc>
-      </w:tr>
-      <w:tr>
-        <w:trPr>
-          <w:tblCellSpacing w:w="15" w:type="dxa"/>
-        </w:trPr>
-        <w:tc>
-          <w:tcPr>
-            <w:tcW w:w="0" w:type="auto"/>
-            <w:vAlign w:val="center"/>
-            <w:hideMark/>
-          </w:tcPr>
-          <w:p>
-            <w:pPr>
-              <w:spacing w:after="0" w:line="240" w:lineRule="auto"/>
-              <w:rPr>
-                <w:rFonts w:ascii="Times New Roman" w:eastAsia="Times New Roman" w:hAnsi="Times New Roman" w:cs="Times New Roman"/>
-                <w:sz w:val="24"/>
-                <w:szCs w:val="24"/>
-              </w:rPr>
-            </w:pPr>
-            <w:r>
-              <w:rPr>
-                <w:rFonts w:ascii="Courier New" w:eastAsia="Times New Roman" w:hAnsi="Courier New" w:cs="Courier New"/>
-                <w:sz w:val="20"/>
-                <w:szCs w:val="20"/>
-              </w:rPr>
-              <w:t>paid_at</w:t>
-            </w:r>
-          </w:p>
-        </w:tc>
-        <w:tc>
-          <w:tcPr>
-            <w:tcW w:w="0" w:type="auto"/>
-            <w:vAlign w:val="center"/>
-            <w:hideMark/>
-          </w:tcPr>
-          <w:p>
-            <w:pPr>
-              <w:spacing w:after="0" w:line="240" w:lineRule="auto"/>
-              <w:rPr>
-                <w:rFonts w:ascii="Times New Roman" w:eastAsia="Times New Roman" w:hAnsi="Times New Roman" w:cs="Times New Roman"/>
-                <w:sz w:val="24"/>
-                <w:szCs w:val="24"/>
-              </w:rPr>
-            </w:pPr>
-            <w:r>
-              <w:rPr>
-                <w:rFonts w:ascii="Times New Roman" w:eastAsia="Times New Roman" w:hAnsi="Times New Roman" w:cs="Times New Roman"/>
-                <w:sz w:val="24"/>
-                <w:szCs w:val="24"/>
-              </w:rPr>
-              <w:t>DateTime</w:t>
-            </w:r>
-          </w:p>
-        </w:tc>
-        <w:tc>
-          <w:tcPr>
-            <w:tcW w:w="0" w:type="auto"/>
-            <w:vAlign w:val="center"/>
-            <w:hideMark/>
-          </w:tcPr>
-          <w:p>
-            <w:pPr>
-              <w:spacing w:after="0" w:line="240" w:lineRule="auto"/>
-              <w:rPr>
-                <w:rFonts w:ascii="Times New Roman" w:eastAsia="Times New Roman" w:hAnsi="Times New Roman" w:cs="Times New Roman"/>
-                <w:sz w:val="24"/>
-                <w:szCs w:val="24"/>
-              </w:rPr>
-            </w:pPr>
-            <w:r>
-              <w:rPr>
-                <w:rFonts w:ascii="Times New Roman" w:eastAsia="Times New Roman" w:hAnsi="Times New Roman" w:cs="Times New Roman"/>
-                <w:sz w:val="24"/>
-                <w:szCs w:val="24"/>
-              </w:rPr>
-              <w:t>null until payment confirmed</w:t>
-            </w:r>
-          </w:p>
-        </w:tc>
-      </w:tr>
-      <w:tr>
-        <w:trPr>
-          <w:tblCellSpacing w:w="15" w:type="dxa"/>
-        </w:trPr>
-        <w:tc>
-          <w:tcPr>
-            <w:tcW w:w="0" w:type="auto"/>
-            <w:vAlign w:val="center"/>
-            <w:hideMark/>
-          </w:tcPr>
-          <w:p>
-            <w:pPr>
-              <w:spacing w:after="0" w:line="240" w:lineRule="auto"/>
-              <w:rPr>
-                <w:rFonts w:ascii="Times New Roman" w:eastAsia="Times New Roman" w:hAnsi="Times New Roman" w:cs="Times New Roman"/>
-                <w:sz w:val="24"/>
-                <w:szCs w:val="24"/>
-              </w:rPr>
-            </w:pPr>
-            <w:r>
-              <w:rPr>
-                <w:rFonts w:ascii="Courier New" w:eastAsia="Times New Roman" w:hAnsi="Courier New" w:cs="Courier New"/>
-                <w:sz w:val="20"/>
-                <w:szCs w:val="20"/>
-              </w:rPr>
-              <w:t>created_at</w:t>
-            </w:r>
-          </w:p>
-        </w:tc>
-        <w:tc>
-          <w:tcPr>
-            <w:tcW w:w="0" w:type="auto"/>
-            <w:vAlign w:val="center"/>
-            <w:hideMark/>
-          </w:tcPr>
-          <w:p>
-            <w:pPr>
-              <w:spacing w:after="0" w:line="240" w:lineRule="auto"/>
-              <w:rPr>
-                <w:rFonts w:ascii="Times New Roman" w:eastAsia="Times New Roman" w:hAnsi="Times New Roman" w:cs="Times New Roman"/>
-                <w:sz w:val="24"/>
-                <w:szCs w:val="24"/>
-              </w:rPr>
-            </w:pPr>
-            <w:r>
-              <w:rPr>
-                <w:rFonts w:ascii="Times New Roman" w:eastAsia="Times New Roman" w:hAnsi="Times New Roman" w:cs="Times New Roman"/>
-                <w:sz w:val="24"/>
-                <w:szCs w:val="24"/>
-              </w:rPr>
-              <w:t>DateTime</w:t>
-            </w:r>
-          </w:p>
-        </w:tc>
-        <w:tc>
-          <w:tcPr>
-            <w:tcW w:w="0" w:type="auto"/>
-            <w:vAlign w:val="center"/>
-            <w:hideMark/>
-          </w:tcPr>
-          <w:p>
-            <w:pPr>
-              <w:spacing w:after="0" w:line="240" w:lineRule="auto"/>
-              <w:rPr>
-                <w:rFonts w:ascii="Times New Roman" w:eastAsia="Times New Roman" w:hAnsi="Times New Roman" w:cs="Times New Roman"/>
-                <w:sz w:val="24"/>
-                <w:szCs w:val="24"/>
-              </w:rPr>
-            </w:pPr>
-          </w:p>
-        </w:tc>
-      </w:tr>
-    </w:tbl>
-    <w:p>
-      <w:pPr>
-        <w:spacing w:before="100" w:beforeAutospacing="1" w:after="100" w:afterAutospacing="1" w:line="240" w:lineRule="auto"/>
-        <w:outlineLvl w:val="2"/>
-        <w:rPr>
-          <w:rFonts w:ascii="Times New Roman" w:eastAsia="Times New Roman" w:hAnsi="Times New Roman" w:cs="Times New Roman"/>
-          <w:b/>
-          <w:bCs/>
-          <w:sz w:val="27"/>
-          <w:szCs w:val="27"/>
-        </w:rPr>
-      </w:pPr>
-      <w:r>
-        <w:rPr>
-          <w:rFonts w:ascii="Times New Roman" w:eastAsia="Times New Roman" w:hAnsi="Times New Roman" w:cs="Times New Roman"/>
-          <w:b/>
-          <w:bCs/>
-          <w:sz w:val="27"/>
-          <w:szCs w:val="27"/>
-        </w:rPr>
-        <w:t>📡 API Endpoints</w:t>
-      </w:r>
-    </w:p>
-    <w:tbl>
-      <w:tblPr>
-        <w:tblW w:w="0" w:type="auto"/>
-        <w:tblCellSpacing w:w="15" w:type="dxa"/>
-        <w:tblCellMar>
-          <w:top w:w="15" w:type="dxa"/>
-          <w:left w:w="15" w:type="dxa"/>
-          <w:bottom w:w="15" w:type="dxa"/>
-          <w:right w:w="15" w:type="dxa"/>
-        </w:tblCellMar>
-        <w:tblLook w:val="04A0" w:firstRow="1" w:lastRow="0" w:firstColumn="1" w:lastColumn="0" w:noHBand="0" w:noVBand="1"/>
-      </w:tblPr>
-      <w:tblGrid>
-        <w:gridCol w:w="875"/>
-        <w:gridCol w:w="3421"/>
-        <w:gridCol w:w="994"/>
-        <w:gridCol w:w="2794"/>
-      </w:tblGrid>
-      <w:tr>
-        <w:trPr>
-          <w:tblHeader/>
-          <w:tblCellSpacing w:w="15" w:type="dxa"/>
-        </w:trPr>
-        <w:tc>
-          <w:tcPr>
-            <w:tcW w:w="0" w:type="auto"/>
-            <w:vAlign w:val="center"/>
-            <w:hideMark/>
-          </w:tcPr>
-          <w:p>
-            <w:pPr>
-              <w:spacing w:after="0" w:line="240" w:lineRule="auto"/>
-              <w:jc w:val="center"/>
-              <w:rPr>
-                <w:rFonts w:ascii="Times New Roman" w:eastAsia="Times New Roman" w:hAnsi="Times New Roman" w:cs="Times New Roman"/>
-                <w:b/>
-                <w:bCs/>
-                <w:sz w:val="24"/>
-                <w:szCs w:val="24"/>
-              </w:rPr>
-            </w:pPr>
-            <w:r>
-              <w:rPr>
-                <w:rFonts w:ascii="Times New Roman" w:eastAsia="Times New Roman" w:hAnsi="Times New Roman" w:cs="Times New Roman"/>
-                <w:b/>
-                <w:bCs/>
-                <w:sz w:val="24"/>
-                <w:szCs w:val="24"/>
-              </w:rPr>
-              <w:t>Method</w:t>
-            </w:r>
-          </w:p>
-        </w:tc>
-        <w:tc>
-          <w:tcPr>
-            <w:tcW w:w="0" w:type="auto"/>
-            <w:vAlign w:val="center"/>
-            <w:hideMark/>
-          </w:tcPr>
-          <w:p>
-            <w:pPr>
-              <w:spacing w:after="0" w:line="240" w:lineRule="auto"/>
-              <w:jc w:val="center"/>
-              <w:rPr>
-                <w:rFonts w:ascii="Times New Roman" w:eastAsia="Times New Roman" w:hAnsi="Times New Roman" w:cs="Times New Roman"/>
-                <w:b/>
-                <w:bCs/>
-                <w:sz w:val="24"/>
-                <w:szCs w:val="24"/>
-              </w:rPr>
-            </w:pPr>
-            <w:r>
-              <w:rPr>
-                <w:rFonts w:ascii="Times New Roman" w:eastAsia="Times New Roman" w:hAnsi="Times New Roman" w:cs="Times New Roman"/>
-                <w:b/>
-                <w:bCs/>
-                <w:sz w:val="24"/>
-                <w:szCs w:val="24"/>
-              </w:rPr>
-              <w:t>URL</w:t>
-            </w:r>
-          </w:p>
-        </w:tc>
-        <w:tc>
-          <w:tcPr>
-            <w:tcW w:w="0" w:type="auto"/>
-            <w:vAlign w:val="center"/>
-            <w:hideMark/>
-          </w:tcPr>
-          <w:p>
-            <w:pPr>
-              <w:spacing w:after="0" w:line="240" w:lineRule="auto"/>
-              <w:jc w:val="center"/>
-              <w:rPr>
-                <w:rFonts w:ascii="Times New Roman" w:eastAsia="Times New Roman" w:hAnsi="Times New Roman" w:cs="Times New Roman"/>
-                <w:b/>
-                <w:bCs/>
-                <w:sz w:val="24"/>
-                <w:szCs w:val="24"/>
-              </w:rPr>
-            </w:pPr>
-            <w:r>
-              <w:rPr>
-                <w:rFonts w:ascii="Times New Roman" w:eastAsia="Times New Roman" w:hAnsi="Times New Roman" w:cs="Times New Roman"/>
-                <w:b/>
-                <w:bCs/>
-                <w:sz w:val="24"/>
-                <w:szCs w:val="24"/>
-              </w:rPr>
-              <w:t>Who</w:t>
-            </w:r>
-          </w:p>
-        </w:tc>
-        <w:tc>
-          <w:tcPr>
-            <w:tcW w:w="0" w:type="auto"/>
-            <w:vAlign w:val="center"/>
-            <w:hideMark/>
-          </w:tcPr>
-          <w:p>
-            <w:pPr>
-              <w:spacing w:after="0" w:line="240" w:lineRule="auto"/>
-              <w:jc w:val="center"/>
-              <w:rPr>
-                <w:rFonts w:ascii="Times New Roman" w:eastAsia="Times New Roman" w:hAnsi="Times New Roman" w:cs="Times New Roman"/>
-                <w:b/>
-                <w:bCs/>
-                <w:sz w:val="24"/>
-                <w:szCs w:val="24"/>
-              </w:rPr>
-            </w:pPr>
-            <w:r>
-              <w:rPr>
-                <w:rFonts w:ascii="Times New Roman" w:eastAsia="Times New Roman" w:hAnsi="Times New Roman" w:cs="Times New Roman"/>
-                <w:b/>
-                <w:bCs/>
-                <w:sz w:val="24"/>
-                <w:szCs w:val="24"/>
-              </w:rPr>
-              <w:t>What</w:t>
-            </w:r>
-          </w:p>
-        </w:tc>
-      </w:tr>
-      <w:tr>
-        <w:trPr>
-          <w:tblCellSpacing w:w="15" w:type="dxa"/>
-        </w:trPr>
-        <w:tc>
-          <w:tcPr>
-            <w:tcW w:w="0" w:type="auto"/>
-            <w:vAlign w:val="center"/>
-            <w:hideMark/>
-          </w:tcPr>
-          <w:p>
-            <w:pPr>
-              <w:spacing w:after="0" w:line="240" w:lineRule="auto"/>
-              <w:rPr>
-                <w:rFonts w:ascii="Times New Roman" w:eastAsia="Times New Roman" w:hAnsi="Times New Roman" w:cs="Times New Roman"/>
-                <w:sz w:val="24"/>
-                <w:szCs w:val="24"/>
-              </w:rPr>
-            </w:pPr>
-            <w:r>
-              <w:rPr>
-                <w:rFonts w:ascii="Courier New" w:eastAsia="Times New Roman" w:hAnsi="Courier New" w:cs="Courier New"/>
-                <w:sz w:val="20"/>
-                <w:szCs w:val="20"/>
-              </w:rPr>
-              <w:t>GET</w:t>
-            </w:r>
-          </w:p>
-        </w:tc>
-        <w:tc>
-          <w:tcPr>
-            <w:tcW w:w="0" w:type="auto"/>
-            <w:vAlign w:val="center"/>
-            <w:hideMark/>
-          </w:tcPr>
-          <w:p>
-            <w:pPr>
-              <w:spacing w:after="0" w:line="240" w:lineRule="auto"/>
-              <w:rPr>
-                <w:rFonts w:ascii="Times New Roman" w:eastAsia="Times New Roman" w:hAnsi="Times New Roman" w:cs="Times New Roman"/>
-                <w:sz w:val="24"/>
-                <w:szCs w:val="24"/>
-              </w:rPr>
-            </w:pPr>
-            <w:r>
-              <w:rPr>
-                <w:rFonts w:ascii="Courier New" w:eastAsia="Times New Roman" w:hAnsi="Courier New" w:cs="Courier New"/>
-                <w:sz w:val="20"/>
-                <w:szCs w:val="20"/>
-              </w:rPr>
-              <w:t>/api/v1/payments/my-payments</w:t>
-            </w:r>
-          </w:p>
-        </w:tc>
-        <w:tc>
-          <w:tcPr>
-            <w:tcW w:w="0" w:type="auto"/>
-            <w:vAlign w:val="center"/>
-            <w:hideMark/>
-          </w:tcPr>
-          <w:p>
-            <w:pPr>
-              <w:spacing w:after="0" w:line="240" w:lineRule="auto"/>
-              <w:rPr>
-                <w:rFonts w:ascii="Times New Roman" w:eastAsia="Times New Roman" w:hAnsi="Times New Roman" w:cs="Times New Roman"/>
-                <w:sz w:val="24"/>
-                <w:szCs w:val="24"/>
-              </w:rPr>
-            </w:pPr>
-            <w:r>
-              <w:rPr>
-                <w:rFonts w:ascii="Times New Roman" w:eastAsia="Times New Roman" w:hAnsi="Times New Roman" w:cs="Times New Roman"/>
-                <w:sz w:val="24"/>
-                <w:szCs w:val="24"/>
-              </w:rPr>
-              <w:t>Customer</w:t>
-            </w:r>
-          </w:p>
-        </w:tc>
-        <w:tc>
-          <w:tcPr>
-            <w:tcW w:w="0" w:type="auto"/>
-            <w:vAlign w:val="center"/>
-            <w:hideMark/>
-          </w:tcPr>
-          <w:p>
-            <w:pPr>
-              <w:spacing w:after="0" w:line="240" w:lineRule="auto"/>
-              <w:rPr>
-                <w:rFonts w:ascii="Times New Roman" w:eastAsia="Times New Roman" w:hAnsi="Times New Roman" w:cs="Times New Roman"/>
-                <w:sz w:val="24"/>
-                <w:szCs w:val="24"/>
-              </w:rPr>
-            </w:pPr>
-            <w:r>
-              <w:rPr>
-                <w:rFonts w:ascii="Times New Roman" w:eastAsia="Times New Roman" w:hAnsi="Times New Roman" w:cs="Times New Roman"/>
-                <w:sz w:val="24"/>
-                <w:szCs w:val="24"/>
-              </w:rPr>
-              <w:t>My payment history</w:t>
-            </w:r>
-          </w:p>
-        </w:tc>
-      </w:tr>
-      <w:tr>
-        <w:trPr>
-          <w:tblCellSpacing w:w="15" w:type="dxa"/>
-        </w:trPr>
-        <w:tc>
-          <w:tcPr>
-            <w:tcW w:w="0" w:type="auto"/>
-            <w:vAlign w:val="center"/>
-            <w:hideMark/>
-          </w:tcPr>
-          <w:p>
-            <w:pPr>
-              <w:spacing w:after="0" w:line="240" w:lineRule="auto"/>
-              <w:rPr>
-                <w:rFonts w:ascii="Times New Roman" w:eastAsia="Times New Roman" w:hAnsi="Times New Roman" w:cs="Times New Roman"/>
-                <w:sz w:val="24"/>
-                <w:szCs w:val="24"/>
-              </w:rPr>
-            </w:pPr>
-            <w:r>
-              <w:rPr>
-                <w:rFonts w:ascii="Courier New" w:eastAsia="Times New Roman" w:hAnsi="Courier New" w:cs="Courier New"/>
-                <w:sz w:val="20"/>
-                <w:szCs w:val="20"/>
-              </w:rPr>
-              <w:t>GET</w:t>
-            </w:r>
-          </w:p>
-        </w:tc>
-        <w:tc>
-          <w:tcPr>
-            <w:tcW w:w="0" w:type="auto"/>
-            <w:vAlign w:val="center"/>
-            <w:hideMark/>
-          </w:tcPr>
-          <w:p>
-            <w:pPr>
-              <w:spacing w:after="0" w:line="240" w:lineRule="auto"/>
-              <w:rPr>
-                <w:rFonts w:ascii="Times New Roman" w:eastAsia="Times New Roman" w:hAnsi="Times New Roman" w:cs="Times New Roman"/>
-                <w:sz w:val="24"/>
-                <w:szCs w:val="24"/>
-              </w:rPr>
-            </w:pPr>
-            <w:r>
-              <w:rPr>
-                <w:rFonts w:ascii="Courier New" w:eastAsia="Times New Roman" w:hAnsi="Courier New" w:cs="Courier New"/>
-                <w:sz w:val="20"/>
-                <w:szCs w:val="20"/>
-              </w:rPr>
-              <w:t>/api/v1/payments/{order_id}</w:t>
-            </w:r>
-          </w:p>
-        </w:tc>
-        <w:tc>
-          <w:tcPr>
-            <w:tcW w:w="0" w:type="auto"/>
-            <w:vAlign w:val="center"/>
-            <w:hideMark/>
-          </w:tcPr>
-          <w:p>
-            <w:pPr>
-              <w:spacing w:after="0" w:line="240" w:lineRule="auto"/>
-              <w:rPr>
-                <w:rFonts w:ascii="Times New Roman" w:eastAsia="Times New Roman" w:hAnsi="Times New Roman" w:cs="Times New Roman"/>
-                <w:sz w:val="24"/>
-                <w:szCs w:val="24"/>
-              </w:rPr>
-            </w:pPr>
-            <w:r>
-              <w:rPr>
-                <w:rFonts w:ascii="Times New Roman" w:eastAsia="Times New Roman" w:hAnsi="Times New Roman" w:cs="Times New Roman"/>
-                <w:sz w:val="24"/>
-                <w:szCs w:val="24"/>
-              </w:rPr>
-              <w:t>Customer</w:t>
-            </w:r>
-          </w:p>
-        </w:tc>
-        <w:tc>
-          <w:tcPr>
-            <w:tcW w:w="0" w:type="auto"/>
-            <w:vAlign w:val="center"/>
-            <w:hideMark/>
-          </w:tcPr>
-          <w:p>
-            <w:pPr>
-              <w:spacing w:after="0" w:line="240" w:lineRule="auto"/>
-              <w:rPr>
-                <w:rFonts w:ascii="Times New Roman" w:eastAsia="Times New Roman" w:hAnsi="Times New Roman" w:cs="Times New Roman"/>
-                <w:sz w:val="24"/>
-                <w:szCs w:val="24"/>
-              </w:rPr>
-            </w:pPr>
-            <w:r>
-              <w:rPr>
-                <w:rFonts w:ascii="Times New Roman" w:eastAsia="Times New Roman" w:hAnsi="Times New Roman" w:cs="Times New Roman"/>
-                <w:sz w:val="24"/>
-                <w:szCs w:val="24"/>
-              </w:rPr>
-              <w:t>Payment for a specific order</w:t>
-            </w:r>
-          </w:p>
-        </w:tc>
-      </w:tr>
-      <w:tr>
-        <w:trPr>
-          <w:tblCellSpacing w:w="15" w:type="dxa"/>
-        </w:trPr>
-        <w:tc>
-          <w:tcPr>
-            <w:tcW w:w="0" w:type="auto"/>
-            <w:vAlign w:val="center"/>
-            <w:hideMark/>
-          </w:tcPr>
-          <w:p>
-            <w:pPr>
-              <w:spacing w:after="0" w:line="240" w:lineRule="auto"/>
-              <w:rPr>
-                <w:rFonts w:ascii="Times New Roman" w:eastAsia="Times New Roman" w:hAnsi="Times New Roman" w:cs="Times New Roman"/>
-                <w:sz w:val="24"/>
-                <w:szCs w:val="24"/>
-              </w:rPr>
-            </w:pPr>
-            <w:r>
-              <w:rPr>
-                <w:rFonts w:ascii="Courier New" w:eastAsia="Times New Roman" w:hAnsi="Courier New" w:cs="Courier New"/>
-                <w:sz w:val="20"/>
-                <w:szCs w:val="20"/>
-              </w:rPr>
-              <w:t>PATCH</w:t>
-            </w:r>
-          </w:p>
-        </w:tc>
-        <w:tc>
-          <w:tcPr>
-            <w:tcW w:w="0" w:type="auto"/>
-            <w:vAlign w:val="center"/>
-            <w:hideMark/>
-          </w:tcPr>
-          <w:p>
-            <w:pPr>
-              <w:spacing w:after="0" w:line="240" w:lineRule="auto"/>
-              <w:rPr>
-                <w:rFonts w:ascii="Times New Roman" w:eastAsia="Times New Roman" w:hAnsi="Times New Roman" w:cs="Times New Roman"/>
-                <w:sz w:val="24"/>
-                <w:szCs w:val="24"/>
-              </w:rPr>
-            </w:pPr>
-            <w:r>
-              <w:rPr>
-                <w:rFonts w:ascii="Courier New" w:eastAsia="Times New Roman" w:hAnsi="Courier New" w:cs="Courier New"/>
-                <w:sz w:val="20"/>
-                <w:szCs w:val="20"/>
-              </w:rPr>
-              <w:t>/api/v1/payments/{id}/status</w:t>
-            </w:r>
-          </w:p>
-        </w:tc>
-        <w:tc>
-          <w:tcPr>
-            <w:tcW w:w="0" w:type="auto"/>
-            <w:vAlign w:val="center"/>
-            <w:hideMark/>
-          </w:tcPr>
-          <w:p>
-            <w:pPr>
-              <w:spacing w:after="0" w:line="240" w:lineRule="auto"/>
-              <w:rPr>
-                <w:rFonts w:ascii="Times New Roman" w:eastAsia="Times New Roman" w:hAnsi="Times New Roman" w:cs="Times New Roman"/>
-                <w:sz w:val="24"/>
-                <w:szCs w:val="24"/>
-              </w:rPr>
-            </w:pPr>
-            <w:r>
-              <w:rPr>
-                <w:rFonts w:ascii="Times New Roman" w:eastAsia="Times New Roman" w:hAnsi="Times New Roman" w:cs="Times New Roman"/>
-                <w:sz w:val="24"/>
-                <w:szCs w:val="24"/>
-              </w:rPr>
-              <w:t>Admin</w:t>
-            </w:r>
-          </w:p>
-        </w:tc>
-        <w:tc>
-          <w:tcPr>
-            <w:tcW w:w="0" w:type="auto"/>
-            <w:vAlign w:val="center"/>
-            <w:hideMark/>
-          </w:tcPr>
-          <w:p>
-            <w:pPr>
-              <w:spacing w:after="0" w:line="240" w:lineRule="auto"/>
-              <w:rPr>
-                <w:rFonts w:ascii="Times New Roman" w:eastAsia="Times New Roman" w:hAnsi="Times New Roman" w:cs="Times New Roman"/>
-                <w:sz w:val="24"/>
-                <w:szCs w:val="24"/>
-              </w:rPr>
-            </w:pPr>
-            <w:r>
-              <w:rPr>
-                <w:rFonts w:ascii="Times New Roman" w:eastAsia="Times New Roman" w:hAnsi="Times New Roman" w:cs="Times New Roman"/>
-                <w:sz w:val="24"/>
-                <w:szCs w:val="24"/>
-              </w:rPr>
-              <w:t>Update payment status</w:t>
-            </w:r>
-          </w:p>
-        </w:tc>
-      </w:tr>
-      <w:tr>
-        <w:trPr>
-          <w:tblCellSpacing w:w="15" w:type="dxa"/>
-        </w:trPr>
-        <w:tc>
-          <w:tcPr>
-            <w:tcW w:w="0" w:type="auto"/>
-            <w:vAlign w:val="center"/>
-            <w:hideMark/>
-          </w:tcPr>
-          <w:p>
-            <w:pPr>
-              <w:spacing w:after="0" w:line="240" w:lineRule="auto"/>
-              <w:rPr>
-                <w:rFonts w:ascii="Times New Roman" w:eastAsia="Times New Roman" w:hAnsi="Times New Roman" w:cs="Times New Roman"/>
-                <w:sz w:val="24"/>
-                <w:szCs w:val="24"/>
-              </w:rPr>
-            </w:pPr>
-            <w:r>
-              <w:rPr>
-                <w:rFonts w:ascii="Courier New" w:eastAsia="Times New Roman" w:hAnsi="Courier New" w:cs="Courier New"/>
-                <w:sz w:val="20"/>
-                <w:szCs w:val="20"/>
-              </w:rPr>
-              <w:t>GET</w:t>
-            </w:r>
-          </w:p>
-        </w:tc>
-        <w:tc>
-          <w:tcPr>
-            <w:tcW w:w="0" w:type="auto"/>
-            <w:vAlign w:val="center"/>
-            <w:hideMark/>
-          </w:tcPr>
-          <w:p>
-            <w:pPr>
-              <w:spacing w:after="0" w:line="240" w:lineRule="auto"/>
-              <w:rPr>
-                <w:rFonts w:ascii="Times New Roman" w:eastAsia="Times New Roman" w:hAnsi="Times New Roman" w:cs="Times New Roman"/>
-                <w:sz w:val="24"/>
-                <w:szCs w:val="24"/>
-              </w:rPr>
-            </w:pPr>
-            <w:r>
-              <w:rPr>
-                <w:rFonts w:ascii="Courier New" w:eastAsia="Times New Roman" w:hAnsi="Courier New" w:cs="Courier New"/>
-                <w:sz w:val="20"/>
-                <w:szCs w:val="20"/>
-              </w:rPr>
-              <w:t>/api/v1/payments</w:t>
-            </w:r>
-          </w:p>
-        </w:tc>
-        <w:tc>
-          <w:tcPr>
-            <w:tcW w:w="0" w:type="auto"/>
-            <w:vAlign w:val="center"/>
-            <w:hideMark/>
-          </w:tcPr>
-          <w:p>
-            <w:pPr>
-              <w:spacing w:after="0" w:line="240" w:lineRule="auto"/>
-              <w:rPr>
-                <w:rFonts w:ascii="Times New Roman" w:eastAsia="Times New Roman" w:hAnsi="Times New Roman" w:cs="Times New Roman"/>
-                <w:sz w:val="24"/>
-                <w:szCs w:val="24"/>
-              </w:rPr>
-            </w:pPr>
-            <w:r>
-              <w:rPr>
-                <w:rFonts w:ascii="Times New Roman" w:eastAsia="Times New Roman" w:hAnsi="Times New Roman" w:cs="Times New Roman"/>
-                <w:sz w:val="24"/>
-                <w:szCs w:val="24"/>
-              </w:rPr>
-              <w:t>Admin</w:t>
-            </w:r>
-          </w:p>
-        </w:tc>
-        <w:tc>
-          <w:tcPr>
-            <w:tcW w:w="0" w:type="auto"/>
-            <w:vAlign w:val="center"/>
-            <w:hideMark/>
-          </w:tcPr>
-          <w:p>
-            <w:pPr>
-              <w:spacing w:after="0" w:line="240" w:lineRule="auto"/>
-              <w:rPr>
-                <w:rFonts w:ascii="Times New Roman" w:eastAsia="Times New Roman" w:hAnsi="Times New Roman" w:cs="Times New Roman"/>
-                <w:sz w:val="24"/>
-                <w:szCs w:val="24"/>
-              </w:rPr>
-            </w:pPr>
-            <w:r>
-              <w:rPr>
-                <w:rFonts w:ascii="Times New Roman" w:eastAsia="Times New Roman" w:hAnsi="Times New Roman" w:cs="Times New Roman"/>
-                <w:sz w:val="24"/>
-                <w:szCs w:val="24"/>
-              </w:rPr>
-              <w:t>All payments list</w:t>
-            </w:r>
-          </w:p>
-        </w:tc>
-      </w:tr>
-    </w:tbl>
-    <w:p>
-      <w:pPr>
-        <w:spacing w:before="100" w:beforeAutospacing="1" w:after="100" w:afterAutospacing="1" w:line="240" w:lineRule="auto"/>
-        <w:outlineLvl w:val="2"/>
-        <w:rPr>
-          <w:rFonts w:ascii="Times New Roman" w:eastAsia="Times New Roman" w:hAnsi="Times New Roman" w:cs="Times New Roman"/>
-          <w:b/>
-          <w:bCs/>
-          <w:sz w:val="27"/>
-          <w:szCs w:val="27"/>
-        </w:rPr>
-      </w:pPr>
-      <w:r>
-        <w:rPr>
-          <w:rFonts w:ascii="Times New Roman" w:eastAsia="Times New Roman" w:hAnsi="Times New Roman" w:cs="Times New Roman"/>
-          <w:b/>
-          <w:bCs/>
-          <w:sz w:val="27"/>
-          <w:szCs w:val="27"/>
-        </w:rPr>
-        <w:t>⚙️ Business Logic Rules</w:t>
-      </w:r>
-    </w:p>
-    <w:p>
-      <w:pPr>
-        <w:numPr>
-          <w:ilvl w:val="0"/>
-          <w:numId w:val="20"/>
-        </w:numPr>
-        <w:spacing w:before="100" w:beforeAutospacing="1" w:after="100" w:afterAutospacing="1" w:line="240" w:lineRule="auto"/>
-        <w:rPr>
-          <w:rFonts w:ascii="Times New Roman" w:eastAsia="Times New Roman" w:hAnsi="Times New Roman" w:cs="Times New Roman"/>
-          <w:sz w:val="24"/>
-          <w:szCs w:val="24"/>
-        </w:rPr>
-      </w:pPr>
-      <w:r>
-        <w:rPr>
-          <w:rFonts w:ascii="Times New Roman" w:eastAsia="Times New Roman" w:hAnsi="Times New Roman" w:cs="Times New Roman"/>
-          <w:sz w:val="24"/>
-          <w:szCs w:val="24"/>
-        </w:rPr>
-        <w:t xml:space="preserve">Payment record is </w:t>
-      </w:r>
-      <w:r>
-        <w:rPr>
-          <w:rFonts w:ascii="Times New Roman" w:eastAsia="Times New Roman" w:hAnsi="Times New Roman" w:cs="Times New Roman"/>
-          <w:b/>
-          <w:bCs/>
-          <w:sz w:val="24"/>
-          <w:szCs w:val="24"/>
-        </w:rPr>
-        <w:t>auto-created</w:t>
-      </w:r>
-      <w:r>
-        <w:rPr>
-          <w:rFonts w:ascii="Times New Roman" w:eastAsia="Times New Roman" w:hAnsi="Times New Roman" w:cs="Times New Roman"/>
-          <w:sz w:val="24"/>
-          <w:szCs w:val="24"/>
-        </w:rPr>
-        <w:t xml:space="preserve"> when order is placed — customer never manually creates it</w:t>
-      </w:r>
-    </w:p>
-    <w:p>
-      <w:pPr>
-        <w:numPr>
-          <w:ilvl w:val="0"/>
-          <w:numId w:val="20"/>
-        </w:numPr>
-        <w:spacing w:before="100" w:beforeAutospacing="1" w:after="100" w:afterAutospacing="1" w:line="240" w:lineRule="auto"/>
-        <w:rPr>
-          <w:rFonts w:ascii="Times New Roman" w:eastAsia="Times New Roman" w:hAnsi="Times New Roman" w:cs="Times New Roman"/>
-          <w:sz w:val="24"/>
-          <w:szCs w:val="24"/>
-        </w:rPr>
-      </w:pPr>
-      <w:r>
-        <w:rPr>
-          <w:rFonts w:ascii="Times New Roman" w:eastAsia="Times New Roman" w:hAnsi="Times New Roman" w:cs="Times New Roman"/>
-          <w:sz w:val="24"/>
-          <w:szCs w:val="24"/>
-        </w:rPr>
-        <w:t xml:space="preserve">For </w:t>
-      </w:r>
-      <w:r>
-        <w:rPr>
-          <w:rFonts w:ascii="Courier New" w:eastAsia="Times New Roman" w:hAnsi="Courier New" w:cs="Courier New"/>
-          <w:sz w:val="20"/>
-          <w:szCs w:val="20"/>
-        </w:rPr>
-        <w:t>cash_on_delivery</w:t>
-      </w:r>
-      <w:r>
-        <w:rPr>
-          <w:rFonts w:ascii="Times New Roman" w:eastAsia="Times New Roman" w:hAnsi="Times New Roman" w:cs="Times New Roman"/>
-          <w:sz w:val="24"/>
-          <w:szCs w:val="24"/>
-        </w:rPr>
-        <w:t xml:space="preserve"> — status starts as </w:t>
-      </w:r>
-      <w:r>
-        <w:rPr>
-          <w:rFonts w:ascii="Courier New" w:eastAsia="Times New Roman" w:hAnsi="Courier New" w:cs="Courier New"/>
-          <w:sz w:val="20"/>
-          <w:szCs w:val="20"/>
-        </w:rPr>
-        <w:t>pending</w:t>
-      </w:r>
-      <w:r>
-        <w:rPr>
-          <w:rFonts w:ascii="Times New Roman" w:eastAsia="Times New Roman" w:hAnsi="Times New Roman" w:cs="Times New Roman"/>
-          <w:sz w:val="24"/>
-          <w:szCs w:val="24"/>
-        </w:rPr>
-        <w:t xml:space="preserve">, admin marks </w:t>
-      </w:r>
-      <w:r>
-        <w:rPr>
-          <w:rFonts w:ascii="Courier New" w:eastAsia="Times New Roman" w:hAnsi="Courier New" w:cs="Courier New"/>
-          <w:sz w:val="20"/>
-          <w:szCs w:val="20"/>
-        </w:rPr>
-        <w:t>paid</w:t>
-      </w:r>
-      <w:r>
-        <w:rPr>
-          <w:rFonts w:ascii="Times New Roman" w:eastAsia="Times New Roman" w:hAnsi="Times New Roman" w:cs="Times New Roman"/>
-          <w:sz w:val="24"/>
-          <w:szCs w:val="24"/>
-        </w:rPr>
-        <w:t xml:space="preserve"> after delivery</w:t>
-      </w:r>
-    </w:p>
-    <w:p>
-      <w:pPr>
-        <w:numPr>
-          <w:ilvl w:val="0"/>
-          <w:numId w:val="20"/>
-        </w:numPr>
-        <w:spacing w:before="100" w:beforeAutospacing="1" w:after="100" w:afterAutospacing="1" w:line="240" w:lineRule="auto"/>
-        <w:rPr>
-          <w:rFonts w:ascii="Times New Roman" w:eastAsia="Times New Roman" w:hAnsi="Times New Roman" w:cs="Times New Roman"/>
-          <w:sz w:val="24"/>
-          <w:szCs w:val="24"/>
-        </w:rPr>
-      </w:pPr>
-      <w:r>
-        <w:rPr>
-          <w:rFonts w:ascii="Times New Roman" w:eastAsia="Times New Roman" w:hAnsi="Times New Roman" w:cs="Times New Roman"/>
-          <w:sz w:val="24"/>
-          <w:szCs w:val="24"/>
-        </w:rPr>
-        <w:t xml:space="preserve">For </w:t>
-      </w:r>
-      <w:r>
-        <w:rPr>
-          <w:rFonts w:ascii="Courier New" w:eastAsia="Times New Roman" w:hAnsi="Courier New" w:cs="Courier New"/>
-          <w:sz w:val="20"/>
-          <w:szCs w:val="20"/>
-        </w:rPr>
-        <w:t>card</w:t>
-      </w:r>
-      <w:r>
-        <w:rPr>
-          <w:rFonts w:ascii="Times New Roman" w:eastAsia="Times New Roman" w:hAnsi="Times New Roman" w:cs="Times New Roman"/>
-          <w:sz w:val="24"/>
-          <w:szCs w:val="24"/>
-        </w:rPr>
-        <w:t xml:space="preserve"> — in a real app this would call Stripe, but for your project just expose an endpoint for admin to manually mark it</w:t>
-      </w:r>
-    </w:p>
-    <w:p>
-      <w:pPr>
-        <w:numPr>
-          <w:ilvl w:val="0"/>
-          <w:numId w:val="20"/>
-        </w:numPr>
-        <w:spacing w:before="100" w:beforeAutospacing="1" w:after="100" w:afterAutospacing="1" w:line="240" w:lineRule="auto"/>
-        <w:rPr>
-          <w:rFonts w:ascii="Times New Roman" w:eastAsia="Times New Roman" w:hAnsi="Times New Roman" w:cs="Times New Roman"/>
-          <w:sz w:val="24"/>
-          <w:szCs w:val="24"/>
-        </w:rPr>
-      </w:pPr>
-      <w:r>
-        <w:rPr>
-          <w:rFonts w:ascii="Times New Roman" w:eastAsia="Times New Roman" w:hAnsi="Times New Roman" w:cs="Times New Roman"/>
-          <w:sz w:val="24"/>
-          <w:szCs w:val="24"/>
-        </w:rPr>
-        <w:t xml:space="preserve">When order is cancelled — payment status should update to </w:t>
-      </w:r>
-      <w:r>
-        <w:rPr>
-          <w:rFonts w:ascii="Courier New" w:eastAsia="Times New Roman" w:hAnsi="Courier New" w:cs="Courier New"/>
-          <w:sz w:val="20"/>
-          <w:szCs w:val="20"/>
-        </w:rPr>
-        <w:t>refunded</w:t>
-      </w:r>
-      <w:r>
-        <w:rPr>
-          <w:rFonts w:ascii="Times New Roman" w:eastAsia="Times New Roman" w:hAnsi="Times New Roman" w:cs="Times New Roman"/>
-          <w:sz w:val="24"/>
-          <w:szCs w:val="24"/>
-        </w:rPr>
-        <w:t xml:space="preserve"> if it was </w:t>
-      </w:r>
-      <w:r>
-        <w:rPr>
-          <w:rFonts w:ascii="Courier New" w:eastAsia="Times New Roman" w:hAnsi="Courier New" w:cs="Courier New"/>
-          <w:sz w:val="20"/>
-          <w:szCs w:val="20"/>
-        </w:rPr>
-        <w:t>paid</w:t>
-      </w:r>
-    </w:p>
-    <w:p>
-      <w:pPr>
-        <w:numPr>
-          <w:ilvl w:val="0"/>
-          <w:numId w:val="20"/>
-        </w:numPr>
-        <w:spacing w:before="100" w:beforeAutospacing="1" w:after="100" w:afterAutospacing="1" w:line="240" w:lineRule="auto"/>
-        <w:rPr>
-          <w:rFonts w:ascii="Times New Roman" w:eastAsia="Times New Roman" w:hAnsi="Times New Roman" w:cs="Times New Roman"/>
-          <w:sz w:val="24"/>
-          <w:szCs w:val="24"/>
-        </w:rPr>
-      </w:pPr>
-      <w:r>
-        <w:rPr>
-          <w:rFonts w:ascii="Courier New" w:eastAsia="Times New Roman" w:hAnsi="Courier New" w:cs="Courier New"/>
-          <w:sz w:val="20"/>
-          <w:szCs w:val="20"/>
-        </w:rPr>
-        <w:t>amount</w:t>
-      </w:r>
-      <w:r>
-        <w:rPr>
-          <w:rFonts w:ascii="Times New Roman" w:eastAsia="Times New Roman" w:hAnsi="Times New Roman" w:cs="Times New Roman"/>
-          <w:sz w:val="24"/>
-          <w:szCs w:val="24"/>
-        </w:rPr>
-        <w:t xml:space="preserve"> must match </w:t>
-      </w:r>
-      <w:r>
-        <w:rPr>
-          <w:rFonts w:ascii="Courier New" w:eastAsia="Times New Roman" w:hAnsi="Courier New" w:cs="Courier New"/>
-          <w:sz w:val="20"/>
-          <w:szCs w:val="20"/>
-        </w:rPr>
-        <w:t>order.total_price</w:t>
-      </w:r>
-      <w:r>
-        <w:rPr>
-          <w:rFonts w:ascii="Times New Roman" w:eastAsia="Times New Roman" w:hAnsi="Times New Roman" w:cs="Times New Roman"/>
-          <w:sz w:val="24"/>
-          <w:szCs w:val="24"/>
-        </w:rPr>
-        <w:t xml:space="preserve"> exactly — validate this</w:t>
-      </w:r>
-    </w:p>
-    <w:p>
-      <w:pPr>
-        <w:numPr>
-          <w:ilvl w:val="0"/>
-          <w:numId w:val="20"/>
-        </w:numPr>
-        <w:spacing w:before="100" w:beforeAutospacing="1" w:after="100" w:afterAutospacing="1" w:line="240" w:lineRule="auto"/>
-        <w:rPr>
-          <w:rFonts w:ascii="Times New Roman" w:eastAsia="Times New Roman" w:hAnsi="Times New Roman" w:cs="Times New Roman"/>
-          <w:sz w:val="24"/>
-          <w:szCs w:val="24"/>
-        </w:rPr>
-      </w:pPr>
-      <w:r>
-        <w:rPr>
-          <w:rFonts w:ascii="Times New Roman" w:eastAsia="Times New Roman" w:hAnsi="Times New Roman" w:cs="Times New Roman"/>
-          <w:sz w:val="24"/>
-          <w:szCs w:val="24"/>
-        </w:rPr>
-        <w:t xml:space="preserve">One order = one payment record, always — enforce unique constraint on </w:t>
-      </w:r>
-      <w:r>
-        <w:rPr>
-          <w:rFonts w:ascii="Courier New" w:eastAsia="Times New Roman" w:hAnsi="Courier New" w:cs="Courier New"/>
-          <w:sz w:val="20"/>
-          <w:szCs w:val="20"/>
-        </w:rPr>
-        <w:t>order_id</w:t>
-      </w:r>
-    </w:p>
-    <w:p>
-      <w:pPr>
-        <w:spacing w:after="0" w:line="240" w:lineRule="auto"/>
-        <w:rPr>
-          <w:rFonts w:ascii="Times New Roman" w:eastAsia="Times New Roman" w:hAnsi="Times New Roman" w:cs="Times New Roman"/>
-          <w:sz w:val="24"/>
-          <w:szCs w:val="24"/>
-        </w:rPr>
-      </w:pPr>
-      <w:r>
-        <w:rPr>
-          <w:rFonts w:ascii="Times New Roman" w:eastAsia="Times New Roman" w:hAnsi="Times New Roman" w:cs="Times New Roman"/>
-          <w:sz w:val="24"/>
-          <w:szCs w:val="24"/>
-        </w:rPr>
-        <w:pict w14:anchorId="7C7E447A">
-          <v:rect id="_x0000_i1032" style="width:0;height:1.5pt" o:hralign="center" o:hrstd="t" o:hr="t" fillcolor="#a0a0a0" stroked="f"/>
-        </w:pict>
-      </w:r>
-    </w:p>
-    <w:p>
-      <w:pPr>
-        <w:spacing w:before="100" w:beforeAutospacing="1" w:after="100" w:afterAutospacing="1" w:line="240" w:lineRule="auto"/>
-        <w:outlineLvl w:val="2"/>
-        <w:rPr>
-          <w:rFonts w:ascii="Times New Roman" w:eastAsia="Times New Roman" w:hAnsi="Times New Roman" w:cs="Times New Roman"/>
-          <w:b/>
-          <w:bCs/>
-          <w:sz w:val="27"/>
-          <w:szCs w:val="27"/>
-        </w:rPr>
-      </w:pPr>
-      <w:r>
-        <w:rPr>
-          <w:rFonts w:ascii="Times New Roman" w:eastAsia="Times New Roman" w:hAnsi="Times New Roman" w:cs="Times New Roman"/>
-          <w:b/>
-          <w:bCs/>
-          <w:sz w:val="27"/>
-          <w:szCs w:val="27"/>
-        </w:rPr>
-        <w:t>📦 Pydantic Schemas</w:t>
-      </w:r>
-    </w:p>
-    <w:p>
-      <w:pPr>
-        <w:numPr>
-          <w:ilvl w:val="0"/>
-          <w:numId w:val="21"/>
-        </w:numPr>
-        <w:spacing w:before="100" w:beforeAutospacing="1" w:after="100" w:afterAutospacing="1" w:line="240" w:lineRule="auto"/>
-        <w:rPr>
-          <w:rFonts w:ascii="Times New Roman" w:eastAsia="Times New Roman" w:hAnsi="Times New Roman" w:cs="Times New Roman"/>
-          <w:sz w:val="24"/>
-          <w:szCs w:val="24"/>
-        </w:rPr>
-      </w:pPr>
-      <w:r>
-        <w:rPr>
-          <w:rFonts w:ascii="Courier New" w:eastAsia="Times New Roman" w:hAnsi="Courier New" w:cs="Courier New"/>
-          <w:sz w:val="20"/>
-          <w:szCs w:val="20"/>
-        </w:rPr>
-        <w:t>PaymentResponseSchema</w:t>
-      </w:r>
-      <w:r>
-        <w:rPr>
-          <w:rFonts w:ascii="Times New Roman" w:eastAsia="Times New Roman" w:hAnsi="Times New Roman" w:cs="Times New Roman"/>
-          <w:sz w:val="24"/>
-          <w:szCs w:val="24"/>
-        </w:rPr>
-        <w:t xml:space="preserve"> — id, order_id, method, status, amount, paid_at</w:t>
-      </w:r>
-    </w:p>
-    <w:p>
-      <w:pPr>
-        <w:numPr>
-          <w:ilvl w:val="0"/>
-          <w:numId w:val="21"/>
-        </w:numPr>
-        <w:spacing w:before="100" w:beforeAutospacing="1" w:after="100" w:afterAutospacing="1" w:line="240" w:lineRule="auto"/>
-        <w:rPr>
-          <w:rFonts w:ascii="Times New Roman" w:eastAsia="Times New Roman" w:hAnsi="Times New Roman" w:cs="Times New Roman"/>
-          <w:sz w:val="24"/>
-          <w:szCs w:val="24"/>
-        </w:rPr>
-      </w:pPr>
-      <w:r>
-        <w:rPr>
-          <w:rFonts w:ascii="Courier New" w:eastAsia="Times New Roman" w:hAnsi="Courier New" w:cs="Courier New"/>
-          <w:sz w:val="20"/>
-          <w:szCs w:val="20"/>
-        </w:rPr>
-        <w:t>PaymentStatusUpdateSchema</w:t>
-      </w:r>
-      <w:r>
-        <w:rPr>
-          <w:rFonts w:ascii="Times New Roman" w:eastAsia="Times New Roman" w:hAnsi="Times New Roman" w:cs="Times New Roman"/>
-          <w:sz w:val="24"/>
-          <w:szCs w:val="24"/>
-        </w:rPr>
-        <w:t xml:space="preserve"> — new_status (admin only)</w:t>
-      </w:r>
-    </w:p>
-    <w:p>
-      <w:pPr>
-        <w:spacing w:after="0" w:line="240" w:lineRule="auto"/>
-        <w:rPr>
-          <w:rFonts w:ascii="Times New Roman" w:eastAsia="Times New Roman" w:hAnsi="Times New Roman" w:cs="Times New Roman"/>
-          <w:sz w:val="24"/>
-          <w:szCs w:val="24"/>
-        </w:rPr>
-      </w:pPr>
-      <w:r>
-        <w:rPr>
-          <w:rFonts w:ascii="Times New Roman" w:eastAsia="Times New Roman" w:hAnsi="Times New Roman" w:cs="Times New Roman"/>
-          <w:sz w:val="24"/>
-          <w:szCs w:val="24"/>
-        </w:rPr>
-        <w:pict w14:anchorId="131606B7">
-          <v:rect id="_x0000_i1033" style="width:0;height:1.5pt" o:hralign="center" o:hrstd="t" o:hr="t" fillcolor="#a0a0a0" stroked="f"/>
-        </w:pict>
-      </w:r>
-    </w:p>
-    <w:p>
-      <w:pPr>
-        <w:spacing w:after="0" w:line="240" w:lineRule="auto"/>
-        <w:rPr>
-          <w:rFonts w:ascii="Times New Roman" w:eastAsia="Times New Roman" w:hAnsi="Times New Roman" w:cs="Times New Roman"/>
-          <w:sz w:val="24"/>
-          <w:szCs w:val="24"/>
-        </w:rPr>
-      </w:pPr>
-      <w:r>
-        <w:rPr>
-          <w:rFonts w:ascii="Times New Roman" w:eastAsia="Times New Roman" w:hAnsi="Times New Roman" w:cs="Times New Roman"/>
-          <w:sz w:val="24"/>
-          <w:szCs w:val="24"/>
-        </w:rPr>
-        <w:pict w14:anchorId="4F0C60D6">
-          <v:rect id="_x0000_i1034" style="width:0;height:1.5pt" o:hralign="center" o:hrstd="t" o:hr="t" fillcolor="#a0a0a0" stroked="f"/>
-        </w:pict>
-      </w:r>
-    </w:p>
-    <w:p>
-      <w:pPr>
-        <w:spacing w:before="100" w:beforeAutospacing="1" w:after="100" w:afterAutospacing="1" w:line="240" w:lineRule="auto"/>
-        <w:outlineLvl w:val="1"/>
-        <w:rPr>
-          <w:rFonts w:ascii="Times New Roman" w:eastAsia="Times New Roman" w:hAnsi="Times New Roman" w:cs="Times New Roman"/>
-          <w:b/>
-          <w:bCs/>
-          <w:sz w:val="36"/>
-          <w:szCs w:val="36"/>
-        </w:rPr>
-      </w:pPr>
-      <w:r>
-        <w:rPr>
-          <w:rFonts w:ascii="Times New Roman" w:eastAsia="Times New Roman" w:hAnsi="Times New Roman" w:cs="Times New Roman"/>
-          <w:b/>
-          <w:bCs/>
-          <w:sz w:val="36"/>
-          <w:szCs w:val="36"/>
-        </w:rPr>
-        <w:t>⭐ Reviews &amp; Ratings — Full Deep Dive</w:t>
-      </w:r>
-    </w:p>
-    <w:p>
-      <w:pPr>
-        <w:spacing w:after="0" w:line="240" w:lineRule="auto"/>
-        <w:rPr>
-          <w:rFonts w:ascii="Times New Roman" w:eastAsia="Times New Roman" w:hAnsi="Times New Roman" w:cs="Times New Roman"/>
-          <w:sz w:val="24"/>
-          <w:szCs w:val="24"/>
-        </w:rPr>
-      </w:pPr>
-      <w:r>
-        <w:rPr>
-          <w:rFonts w:ascii="Times New Roman" w:eastAsia="Times New Roman" w:hAnsi="Times New Roman" w:cs="Times New Roman"/>
-          <w:sz w:val="24"/>
-          <w:szCs w:val="24"/>
-        </w:rPr>
         <w:pict w14:anchorId="28EBE116">
-          <v:rect id="_x0000_i1035" style="width:0;height:1.5pt" o:hralign="center" o:hrstd="t" o:hr="t" fillcolor="#a0a0a0" stroked="f"/>
+          <v:rect id="_x0000_i1025" style="width:0;height:1.5pt" o:hralign="center" o:hrstd="t" o:hr="t" fillcolor="#a0a0a0" stroked="f"/>
         </w:pict>
       </w:r>
     </w:p>
@@ -2154,6 +284,7 @@
                 <w:szCs w:val="24"/>
               </w:rPr>
             </w:pPr>
+            <w:proofErr w:type="spellStart"/>
             <w:r>
               <w:rPr>
                 <w:rFonts w:ascii="Courier New" w:eastAsia="Times New Roman" w:hAnsi="Courier New" w:cs="Courier New"/>
@@ -2162,6 +293,7 @@
               </w:rPr>
               <w:t>order_id</w:t>
             </w:r>
+            <w:proofErr w:type="spellEnd"/>
           </w:p>
         </w:tc>
         <w:tc>
@@ -2234,6 +366,7 @@
                 <w:szCs w:val="24"/>
               </w:rPr>
             </w:pPr>
+            <w:proofErr w:type="spellStart"/>
             <w:r>
               <w:rPr>
                 <w:rFonts w:ascii="Courier New" w:eastAsia="Times New Roman" w:hAnsi="Courier New" w:cs="Courier New"/>
@@ -2242,6 +375,7 @@
               </w:rPr>
               <w:t>user_id</w:t>
             </w:r>
+            <w:proofErr w:type="spellEnd"/>
           </w:p>
         </w:tc>
         <w:tc>
@@ -2466,6 +600,7 @@
                 <w:szCs w:val="24"/>
               </w:rPr>
             </w:pPr>
+            <w:proofErr w:type="spellStart"/>
             <w:r>
               <w:rPr>
                 <w:rFonts w:ascii="Courier New" w:eastAsia="Times New Roman" w:hAnsi="Courier New" w:cs="Courier New"/>
@@ -2474,23 +609,25 @@
               </w:rPr>
               <w:t>created_at</w:t>
             </w:r>
-          </w:p>
-        </w:tc>
-        <w:tc>
-          <w:tcPr>
-            <w:tcW w:w="0" w:type="auto"/>
-            <w:vAlign w:val="center"/>
-            <w:hideMark/>
-          </w:tcPr>
-          <w:p>
-            <w:pPr>
-              <w:spacing w:after="0" w:line="240" w:lineRule="auto"/>
-              <w:rPr>
-                <w:rFonts w:ascii="Times New Roman" w:eastAsia="Times New Roman" w:hAnsi="Times New Roman" w:cs="Times New Roman"/>
-                <w:sz w:val="24"/>
-                <w:szCs w:val="24"/>
-              </w:rPr>
-            </w:pPr>
+            <w:proofErr w:type="spellEnd"/>
+          </w:p>
+        </w:tc>
+        <w:tc>
+          <w:tcPr>
+            <w:tcW w:w="0" w:type="auto"/>
+            <w:vAlign w:val="center"/>
+            <w:hideMark/>
+          </w:tcPr>
+          <w:p>
+            <w:pPr>
+              <w:spacing w:after="0" w:line="240" w:lineRule="auto"/>
+              <w:rPr>
+                <w:rFonts w:ascii="Times New Roman" w:eastAsia="Times New Roman" w:hAnsi="Times New Roman" w:cs="Times New Roman"/>
+                <w:sz w:val="24"/>
+                <w:szCs w:val="24"/>
+              </w:rPr>
+            </w:pPr>
+            <w:proofErr w:type="spellStart"/>
             <w:r>
               <w:rPr>
                 <w:rFonts w:ascii="Times New Roman" w:eastAsia="Times New Roman" w:hAnsi="Times New Roman" w:cs="Times New Roman"/>
@@ -2499,6 +636,7 @@
               </w:rPr>
               <w:t>DateTime</w:t>
             </w:r>
+            <w:proofErr w:type="spellEnd"/>
           </w:p>
         </w:tc>
         <w:tc>
@@ -2737,7 +875,25 @@
                 <w:sz w:val="20"/>
                 <w:szCs w:val="20"/>
               </w:rPr>
-              <w:t>/api/v1/reviews</w:t>
+              <w:t>/</w:t>
+            </w:r>
+            <w:proofErr w:type="spellStart"/>
+            <w:r>
+              <w:rPr>
+                <w:rFonts w:ascii="Courier New" w:eastAsia="Times New Roman" w:hAnsi="Courier New" w:cs="Courier New"/>
+                <w:sz w:val="20"/>
+                <w:szCs w:val="20"/>
+              </w:rPr>
+              <w:t>api</w:t>
+            </w:r>
+            <w:proofErr w:type="spellEnd"/>
+            <w:r>
+              <w:rPr>
+                <w:rFonts w:ascii="Courier New" w:eastAsia="Times New Roman" w:hAnsi="Courier New" w:cs="Courier New"/>
+                <w:sz w:val="20"/>
+                <w:szCs w:val="20"/>
+              </w:rPr>
+              <w:t>/v1/reviews</w:t>
             </w:r>
           </w:p>
         </w:tc>
@@ -2842,7 +998,25 @@
                 <w:sz w:val="20"/>
                 <w:szCs w:val="20"/>
               </w:rPr>
-              <w:t>/api/v1/reviews/my-reviews</w:t>
+              <w:t>/</w:t>
+            </w:r>
+            <w:proofErr w:type="spellStart"/>
+            <w:r>
+              <w:rPr>
+                <w:rFonts w:ascii="Courier New" w:eastAsia="Times New Roman" w:hAnsi="Courier New" w:cs="Courier New"/>
+                <w:sz w:val="20"/>
+                <w:szCs w:val="20"/>
+              </w:rPr>
+              <w:t>api</w:t>
+            </w:r>
+            <w:proofErr w:type="spellEnd"/>
+            <w:r>
+              <w:rPr>
+                <w:rFonts w:ascii="Courier New" w:eastAsia="Times New Roman" w:hAnsi="Courier New" w:cs="Courier New"/>
+                <w:sz w:val="20"/>
+                <w:szCs w:val="20"/>
+              </w:rPr>
+              <w:t>/v1/reviews/my-reviews</w:t>
             </w:r>
           </w:p>
         </w:tc>
@@ -2947,7 +1121,25 @@
                 <w:sz w:val="20"/>
                 <w:szCs w:val="20"/>
               </w:rPr>
-              <w:t>/api/v1/reviews</w:t>
+              <w:t>/</w:t>
+            </w:r>
+            <w:proofErr w:type="spellStart"/>
+            <w:r>
+              <w:rPr>
+                <w:rFonts w:ascii="Courier New" w:eastAsia="Times New Roman" w:hAnsi="Courier New" w:cs="Courier New"/>
+                <w:sz w:val="20"/>
+                <w:szCs w:val="20"/>
+              </w:rPr>
+              <w:t>api</w:t>
+            </w:r>
+            <w:proofErr w:type="spellEnd"/>
+            <w:r>
+              <w:rPr>
+                <w:rFonts w:ascii="Courier New" w:eastAsia="Times New Roman" w:hAnsi="Courier New" w:cs="Courier New"/>
+                <w:sz w:val="20"/>
+                <w:szCs w:val="20"/>
+              </w:rPr>
+              <w:t>/v1/reviews</w:t>
             </w:r>
           </w:p>
         </w:tc>
@@ -3052,7 +1244,25 @@
                 <w:sz w:val="20"/>
                 <w:szCs w:val="20"/>
               </w:rPr>
-              <w:t>/api/v1/reviews/{id}</w:t>
+              <w:t>/</w:t>
+            </w:r>
+            <w:proofErr w:type="spellStart"/>
+            <w:r>
+              <w:rPr>
+                <w:rFonts w:ascii="Courier New" w:eastAsia="Times New Roman" w:hAnsi="Courier New" w:cs="Courier New"/>
+                <w:sz w:val="20"/>
+                <w:szCs w:val="20"/>
+              </w:rPr>
+              <w:t>api</w:t>
+            </w:r>
+            <w:proofErr w:type="spellEnd"/>
+            <w:r>
+              <w:rPr>
+                <w:rFonts w:ascii="Courier New" w:eastAsia="Times New Roman" w:hAnsi="Courier New" w:cs="Courier New"/>
+                <w:sz w:val="20"/>
+                <w:szCs w:val="20"/>
+              </w:rPr>
+              <w:t>/v1/reviews/{id}</w:t>
             </w:r>
           </w:p>
         </w:tc>
@@ -3157,7 +1367,25 @@
                 <w:sz w:val="20"/>
                 <w:szCs w:val="20"/>
               </w:rPr>
-              <w:t>/api/v1/menu/pizzas/{id}/reviews</w:t>
+              <w:t>/</w:t>
+            </w:r>
+            <w:proofErr w:type="spellStart"/>
+            <w:r>
+              <w:rPr>
+                <w:rFonts w:ascii="Courier New" w:eastAsia="Times New Roman" w:hAnsi="Courier New" w:cs="Courier New"/>
+                <w:sz w:val="20"/>
+                <w:szCs w:val="20"/>
+              </w:rPr>
+              <w:t>api</w:t>
+            </w:r>
+            <w:proofErr w:type="spellEnd"/>
+            <w:r>
+              <w:rPr>
+                <w:rFonts w:ascii="Courier New" w:eastAsia="Times New Roman" w:hAnsi="Courier New" w:cs="Courier New"/>
+                <w:sz w:val="20"/>
+                <w:szCs w:val="20"/>
+              </w:rPr>
+              <w:t>/v1/menu/pizzas/{id}/reviews</w:t>
             </w:r>
           </w:p>
         </w:tc>
@@ -3257,13 +1485,23 @@
         </w:rPr>
         <w:t xml:space="preserve">Review is only allowed when </w:t>
       </w:r>
+      <w:proofErr w:type="spellStart"/>
       <w:r>
         <w:rPr>
           <w:rFonts w:ascii="Courier New" w:eastAsia="Times New Roman" w:hAnsi="Courier New" w:cs="Courier New"/>
           <w:sz w:val="20"/>
           <w:szCs w:val="20"/>
         </w:rPr>
-        <w:t>order.status == delivered</w:t>
+        <w:t>order.status</w:t>
+      </w:r>
+      <w:proofErr w:type="spellEnd"/>
+      <w:r>
+        <w:rPr>
+          <w:rFonts w:ascii="Courier New" w:eastAsia="Times New Roman" w:hAnsi="Courier New" w:cs="Courier New"/>
+          <w:sz w:val="20"/>
+          <w:szCs w:val="20"/>
+        </w:rPr>
+        <w:t xml:space="preserve"> == delivered</w:t>
       </w:r>
       <w:r>
         <w:rPr>
@@ -3313,6 +1551,7 @@
         </w:rPr>
         <w:t xml:space="preserve"> on </w:t>
       </w:r>
+      <w:proofErr w:type="spellStart"/>
       <w:r>
         <w:rPr>
           <w:rFonts w:ascii="Courier New" w:eastAsia="Times New Roman" w:hAnsi="Courier New" w:cs="Courier New"/>
@@ -3321,6 +1560,7 @@
         </w:rPr>
         <w:t>order_id</w:t>
       </w:r>
+      <w:proofErr w:type="spellEnd"/>
       <w:r>
         <w:rPr>
           <w:rFonts w:ascii="Times New Roman" w:eastAsia="Times New Roman" w:hAnsi="Times New Roman" w:cs="Times New Roman"/>
@@ -3401,13 +1641,23 @@
         </w:rPr>
         <w:t xml:space="preserve"> — validate in Pydantic with </w:t>
       </w:r>
+      <w:proofErr w:type="spellStart"/>
       <w:r>
         <w:rPr>
           <w:rFonts w:ascii="Courier New" w:eastAsia="Times New Roman" w:hAnsi="Courier New" w:cs="Courier New"/>
           <w:sz w:val="20"/>
           <w:szCs w:val="20"/>
         </w:rPr>
-        <w:t>ge=1, le=5</w:t>
+        <w:t>ge</w:t>
+      </w:r>
+      <w:proofErr w:type="spellEnd"/>
+      <w:r>
+        <w:rPr>
+          <w:rFonts w:ascii="Courier New" w:eastAsia="Times New Roman" w:hAnsi="Courier New" w:cs="Courier New"/>
+          <w:sz w:val="20"/>
+          <w:szCs w:val="20"/>
+        </w:rPr>
+        <w:t>=1, le=5</w:t>
       </w:r>
     </w:p>
     <w:p>
@@ -3528,7 +1778,7 @@
           <w:szCs w:val="24"/>
         </w:rPr>
         <w:pict w14:anchorId="7C26DFAE">
-          <v:rect id="_x0000_i1036" style="width:0;height:1.5pt" o:hralign="center" o:hrstd="t" o:hr="t" fillcolor="#a0a0a0" stroked="f"/>
+          <v:rect id="_x0000_i1026" style="width:0;height:1.5pt" o:hralign="center" o:hrstd="t" o:hr="t" fillcolor="#a0a0a0" stroked="f"/>
         </w:pict>
       </w:r>
     </w:p>
@@ -3568,6 +1818,7 @@
           <w:szCs w:val="24"/>
         </w:rPr>
       </w:pPr>
+      <w:proofErr w:type="spellStart"/>
       <w:r>
         <w:rPr>
           <w:rFonts w:ascii="Courier New" w:eastAsia="Times New Roman" w:hAnsi="Courier New" w:cs="Courier New"/>
@@ -3576,13 +1827,32 @@
         </w:rPr>
         <w:t>ReviewCreateSchema</w:t>
       </w:r>
-      <w:r>
-        <w:rPr>
-          <w:rFonts w:ascii="Times New Roman" w:eastAsia="Times New Roman" w:hAnsi="Times New Roman" w:cs="Times New Roman"/>
-          <w:sz w:val="24"/>
-          <w:szCs w:val="24"/>
-        </w:rPr>
-        <w:t xml:space="preserve"> — order_id, rating, comment</w:t>
+      <w:proofErr w:type="spellEnd"/>
+      <w:r>
+        <w:rPr>
+          <w:rFonts w:ascii="Times New Roman" w:eastAsia="Times New Roman" w:hAnsi="Times New Roman" w:cs="Times New Roman"/>
+          <w:sz w:val="24"/>
+          <w:szCs w:val="24"/>
+        </w:rPr>
+        <w:t xml:space="preserve"> — </w:t>
+      </w:r>
+      <w:proofErr w:type="spellStart"/>
+      <w:r>
+        <w:rPr>
+          <w:rFonts w:ascii="Times New Roman" w:eastAsia="Times New Roman" w:hAnsi="Times New Roman" w:cs="Times New Roman"/>
+          <w:sz w:val="24"/>
+          <w:szCs w:val="24"/>
+        </w:rPr>
+        <w:t>order_id</w:t>
+      </w:r>
+      <w:proofErr w:type="spellEnd"/>
+      <w:r>
+        <w:rPr>
+          <w:rFonts w:ascii="Times New Roman" w:eastAsia="Times New Roman" w:hAnsi="Times New Roman" w:cs="Times New Roman"/>
+          <w:sz w:val="24"/>
+          <w:szCs w:val="24"/>
+        </w:rPr>
+        <w:t>, rating, comment</w:t>
       </w:r>
     </w:p>
     <w:p>
@@ -3598,6 +1868,7 @@
           <w:szCs w:val="24"/>
         </w:rPr>
       </w:pPr>
+      <w:proofErr w:type="spellStart"/>
       <w:r>
         <w:rPr>
           <w:rFonts w:ascii="Courier New" w:eastAsia="Times New Roman" w:hAnsi="Courier New" w:cs="Courier New"/>
@@ -3606,13 +1877,50 @@
         </w:rPr>
         <w:t>ReviewResponseSchema</w:t>
       </w:r>
-      <w:r>
-        <w:rPr>
-          <w:rFonts w:ascii="Times New Roman" w:eastAsia="Times New Roman" w:hAnsi="Times New Roman" w:cs="Times New Roman"/>
-          <w:sz w:val="24"/>
-          <w:szCs w:val="24"/>
-        </w:rPr>
-        <w:t xml:space="preserve"> — rating, comment, created_at, user full_name (not email)</w:t>
+      <w:proofErr w:type="spellEnd"/>
+      <w:r>
+        <w:rPr>
+          <w:rFonts w:ascii="Times New Roman" w:eastAsia="Times New Roman" w:hAnsi="Times New Roman" w:cs="Times New Roman"/>
+          <w:sz w:val="24"/>
+          <w:szCs w:val="24"/>
+        </w:rPr>
+        <w:t xml:space="preserve"> — rating, comment, </w:t>
+      </w:r>
+      <w:proofErr w:type="spellStart"/>
+      <w:r>
+        <w:rPr>
+          <w:rFonts w:ascii="Times New Roman" w:eastAsia="Times New Roman" w:hAnsi="Times New Roman" w:cs="Times New Roman"/>
+          <w:sz w:val="24"/>
+          <w:szCs w:val="24"/>
+        </w:rPr>
+        <w:t>created_at</w:t>
+      </w:r>
+      <w:proofErr w:type="spellEnd"/>
+      <w:r>
+        <w:rPr>
+          <w:rFonts w:ascii="Times New Roman" w:eastAsia="Times New Roman" w:hAnsi="Times New Roman" w:cs="Times New Roman"/>
+          <w:sz w:val="24"/>
+          <w:szCs w:val="24"/>
+        </w:rPr>
+        <w:t xml:space="preserve">, user </w:t>
+      </w:r>
+      <w:proofErr w:type="spellStart"/>
+      <w:r>
+        <w:rPr>
+          <w:rFonts w:ascii="Times New Roman" w:eastAsia="Times New Roman" w:hAnsi="Times New Roman" w:cs="Times New Roman"/>
+          <w:sz w:val="24"/>
+          <w:szCs w:val="24"/>
+        </w:rPr>
+        <w:t>full_name</w:t>
+      </w:r>
+      <w:proofErr w:type="spellEnd"/>
+      <w:r>
+        <w:rPr>
+          <w:rFonts w:ascii="Times New Roman" w:eastAsia="Times New Roman" w:hAnsi="Times New Roman" w:cs="Times New Roman"/>
+          <w:sz w:val="24"/>
+          <w:szCs w:val="24"/>
+        </w:rPr>
+        <w:t xml:space="preserve"> (not email)</w:t>
       </w:r>
     </w:p>
     <w:p>
@@ -3631,7 +1939,7 @@
           <w:szCs w:val="24"/>
         </w:rPr>
         <w:pict w14:anchorId="7A601C7B">
-          <v:rect id="_x0000_i1037" style="width:0;height:1.5pt" o:hralign="center" o:hrstd="t" o:hr="t" fillcolor="#a0a0a0" stroked="f"/>
+          <v:rect id="_x0000_i1027" style="width:0;height:1.5pt" o:hralign="center" o:hrstd="t" o:hr="t" fillcolor="#a0a0a0" stroked="f"/>
         </w:pict>
       </w:r>
     </w:p>
@@ -3651,7 +1959,7 @@
           <w:szCs w:val="24"/>
         </w:rPr>
         <w:pict w14:anchorId="543187B4">
-          <v:rect id="_x0000_i1038" style="width:0;height:1.5pt" o:hralign="center" o:hrstd="t" o:hr="t" fillcolor="#a0a0a0" stroked="f"/>
+          <v:rect id="_x0000_i1028" style="width:0;height:1.5pt" o:hralign="center" o:hrstd="t" o:hr="t" fillcolor="#a0a0a0" stroked="f"/>
         </w:pict>
       </w:r>
     </w:p>
@@ -3694,7 +2002,7 @@
           <w:szCs w:val="24"/>
         </w:rPr>
         <w:pict w14:anchorId="0B2FE953">
-          <v:rect id="_x0000_i1039" style="width:0;height:1.5pt" o:hralign="center" o:hrstd="t" o:hr="t" fillcolor="#a0a0a0" stroked="f"/>
+          <v:rect id="_x0000_i1029" style="width:0;height:1.5pt" o:hralign="center" o:hrstd="t" o:hr="t" fillcolor="#a0a0a0" stroked="f"/>
         </w:pict>
       </w:r>
     </w:p>
@@ -3925,6 +2233,7 @@
                 <w:szCs w:val="24"/>
               </w:rPr>
             </w:pPr>
+            <w:proofErr w:type="spellStart"/>
             <w:r>
               <w:rPr>
                 <w:rFonts w:ascii="Courier New" w:eastAsia="Times New Roman" w:hAnsi="Courier New" w:cs="Courier New"/>
@@ -3933,6 +2242,7 @@
               </w:rPr>
               <w:t>user_id</w:t>
             </w:r>
+            <w:proofErr w:type="spellEnd"/>
           </w:p>
         </w:tc>
         <w:tc>
@@ -4157,6 +2467,7 @@
                 <w:szCs w:val="24"/>
               </w:rPr>
             </w:pPr>
+            <w:proofErr w:type="spellStart"/>
             <w:r>
               <w:rPr>
                 <w:rFonts w:ascii="Courier New" w:eastAsia="Times New Roman" w:hAnsi="Courier New" w:cs="Courier New"/>
@@ -4165,6 +2476,7 @@
               </w:rPr>
               <w:t>is_read</w:t>
             </w:r>
+            <w:proofErr w:type="spellEnd"/>
           </w:p>
         </w:tc>
         <w:tc>
@@ -4237,6 +2549,7 @@
                 <w:szCs w:val="24"/>
               </w:rPr>
             </w:pPr>
+            <w:proofErr w:type="spellStart"/>
             <w:r>
               <w:rPr>
                 <w:rFonts w:ascii="Courier New" w:eastAsia="Times New Roman" w:hAnsi="Courier New" w:cs="Courier New"/>
@@ -4245,23 +2558,25 @@
               </w:rPr>
               <w:t>created_at</w:t>
             </w:r>
-          </w:p>
-        </w:tc>
-        <w:tc>
-          <w:tcPr>
-            <w:tcW w:w="0" w:type="auto"/>
-            <w:vAlign w:val="center"/>
-            <w:hideMark/>
-          </w:tcPr>
-          <w:p>
-            <w:pPr>
-              <w:spacing w:after="0" w:line="240" w:lineRule="auto"/>
-              <w:rPr>
-                <w:rFonts w:ascii="Times New Roman" w:eastAsia="Times New Roman" w:hAnsi="Times New Roman" w:cs="Times New Roman"/>
-                <w:sz w:val="24"/>
-                <w:szCs w:val="24"/>
-              </w:rPr>
-            </w:pPr>
+            <w:proofErr w:type="spellEnd"/>
+          </w:p>
+        </w:tc>
+        <w:tc>
+          <w:tcPr>
+            <w:tcW w:w="0" w:type="auto"/>
+            <w:vAlign w:val="center"/>
+            <w:hideMark/>
+          </w:tcPr>
+          <w:p>
+            <w:pPr>
+              <w:spacing w:after="0" w:line="240" w:lineRule="auto"/>
+              <w:rPr>
+                <w:rFonts w:ascii="Times New Roman" w:eastAsia="Times New Roman" w:hAnsi="Times New Roman" w:cs="Times New Roman"/>
+                <w:sz w:val="24"/>
+                <w:szCs w:val="24"/>
+              </w:rPr>
+            </w:pPr>
+            <w:proofErr w:type="spellStart"/>
             <w:r>
               <w:rPr>
                 <w:rFonts w:ascii="Times New Roman" w:eastAsia="Times New Roman" w:hAnsi="Times New Roman" w:cs="Times New Roman"/>
@@ -4270,6 +2585,7 @@
               </w:rPr>
               <w:t>DateTime</w:t>
             </w:r>
+            <w:proofErr w:type="spellEnd"/>
           </w:p>
         </w:tc>
         <w:tc>
@@ -4508,7 +2824,25 @@
                 <w:sz w:val="20"/>
                 <w:szCs w:val="20"/>
               </w:rPr>
-              <w:t>/api/v1/notifications</w:t>
+              <w:t>/</w:t>
+            </w:r>
+            <w:proofErr w:type="spellStart"/>
+            <w:r>
+              <w:rPr>
+                <w:rFonts w:ascii="Courier New" w:eastAsia="Times New Roman" w:hAnsi="Courier New" w:cs="Courier New"/>
+                <w:sz w:val="20"/>
+                <w:szCs w:val="20"/>
+              </w:rPr>
+              <w:t>api</w:t>
+            </w:r>
+            <w:proofErr w:type="spellEnd"/>
+            <w:r>
+              <w:rPr>
+                <w:rFonts w:ascii="Courier New" w:eastAsia="Times New Roman" w:hAnsi="Courier New" w:cs="Courier New"/>
+                <w:sz w:val="20"/>
+                <w:szCs w:val="20"/>
+              </w:rPr>
+              <w:t>/v1/notifications</w:t>
             </w:r>
           </w:p>
         </w:tc>
@@ -4613,7 +2947,25 @@
                 <w:sz w:val="20"/>
                 <w:szCs w:val="20"/>
               </w:rPr>
-              <w:t>/api/v1/notifications/{id}/read</w:t>
+              <w:t>/</w:t>
+            </w:r>
+            <w:proofErr w:type="spellStart"/>
+            <w:r>
+              <w:rPr>
+                <w:rFonts w:ascii="Courier New" w:eastAsia="Times New Roman" w:hAnsi="Courier New" w:cs="Courier New"/>
+                <w:sz w:val="20"/>
+                <w:szCs w:val="20"/>
+              </w:rPr>
+              <w:t>api</w:t>
+            </w:r>
+            <w:proofErr w:type="spellEnd"/>
+            <w:r>
+              <w:rPr>
+                <w:rFonts w:ascii="Courier New" w:eastAsia="Times New Roman" w:hAnsi="Courier New" w:cs="Courier New"/>
+                <w:sz w:val="20"/>
+                <w:szCs w:val="20"/>
+              </w:rPr>
+              <w:t>/v1/notifications/{id}/read</w:t>
             </w:r>
           </w:p>
         </w:tc>
@@ -4718,7 +3070,25 @@
                 <w:sz w:val="20"/>
                 <w:szCs w:val="20"/>
               </w:rPr>
-              <w:t>/api/v1/notifications/read-all</w:t>
+              <w:t>/</w:t>
+            </w:r>
+            <w:proofErr w:type="spellStart"/>
+            <w:r>
+              <w:rPr>
+                <w:rFonts w:ascii="Courier New" w:eastAsia="Times New Roman" w:hAnsi="Courier New" w:cs="Courier New"/>
+                <w:sz w:val="20"/>
+                <w:szCs w:val="20"/>
+              </w:rPr>
+              <w:t>api</w:t>
+            </w:r>
+            <w:proofErr w:type="spellEnd"/>
+            <w:r>
+              <w:rPr>
+                <w:rFonts w:ascii="Courier New" w:eastAsia="Times New Roman" w:hAnsi="Courier New" w:cs="Courier New"/>
+                <w:sz w:val="20"/>
+                <w:szCs w:val="20"/>
+              </w:rPr>
+              <w:t>/v1/notifications/read-all</w:t>
             </w:r>
           </w:p>
         </w:tc>
@@ -4823,7 +3193,25 @@
                 <w:sz w:val="20"/>
                 <w:szCs w:val="20"/>
               </w:rPr>
-              <w:t>/api/v1/notifications/unread-count</w:t>
+              <w:t>/</w:t>
+            </w:r>
+            <w:proofErr w:type="spellStart"/>
+            <w:r>
+              <w:rPr>
+                <w:rFonts w:ascii="Courier New" w:eastAsia="Times New Roman" w:hAnsi="Courier New" w:cs="Courier New"/>
+                <w:sz w:val="20"/>
+                <w:szCs w:val="20"/>
+              </w:rPr>
+              <w:t>api</w:t>
+            </w:r>
+            <w:proofErr w:type="spellEnd"/>
+            <w:r>
+              <w:rPr>
+                <w:rFonts w:ascii="Courier New" w:eastAsia="Times New Roman" w:hAnsi="Courier New" w:cs="Courier New"/>
+                <w:sz w:val="20"/>
+                <w:szCs w:val="20"/>
+              </w:rPr>
+              <w:t>/v1/notifications/unread-count</w:t>
             </w:r>
           </w:p>
         </w:tc>
@@ -4963,13 +3351,41 @@
         </w:rPr>
         <w:t xml:space="preserve">Create a helper function </w:t>
       </w:r>
+      <w:proofErr w:type="spellStart"/>
       <w:r>
         <w:rPr>
           <w:rFonts w:ascii="Courier New" w:eastAsia="Times New Roman" w:hAnsi="Courier New" w:cs="Courier New"/>
           <w:sz w:val="20"/>
           <w:szCs w:val="20"/>
         </w:rPr>
-        <w:t>create_notification(user_id, title, message)</w:t>
+        <w:t>create_notification</w:t>
+      </w:r>
+      <w:proofErr w:type="spellEnd"/>
+      <w:r>
+        <w:rPr>
+          <w:rFonts w:ascii="Courier New" w:eastAsia="Times New Roman" w:hAnsi="Courier New" w:cs="Courier New"/>
+          <w:sz w:val="20"/>
+          <w:szCs w:val="20"/>
+        </w:rPr>
+        <w:t>(</w:t>
+      </w:r>
+      <w:proofErr w:type="spellStart"/>
+      <w:r>
+        <w:rPr>
+          <w:rFonts w:ascii="Courier New" w:eastAsia="Times New Roman" w:hAnsi="Courier New" w:cs="Courier New"/>
+          <w:sz w:val="20"/>
+          <w:szCs w:val="20"/>
+        </w:rPr>
+        <w:t>user_id</w:t>
+      </w:r>
+      <w:proofErr w:type="spellEnd"/>
+      <w:r>
+        <w:rPr>
+          <w:rFonts w:ascii="Courier New" w:eastAsia="Times New Roman" w:hAnsi="Courier New" w:cs="Courier New"/>
+          <w:sz w:val="20"/>
+          <w:szCs w:val="20"/>
+        </w:rPr>
+        <w:t>, title, message)</w:t>
       </w:r>
       <w:r>
         <w:rPr>
@@ -5015,6 +3431,7 @@
           <w:szCs w:val="24"/>
         </w:rPr>
       </w:pPr>
+      <w:proofErr w:type="gramStart"/>
       <w:r>
         <w:rPr>
           <w:rFonts w:ascii="Courier New" w:eastAsia="Times New Roman" w:hAnsi="Courier New" w:cs="Courier New"/>
@@ -5023,6 +3440,7 @@
         </w:rPr>
         <w:t>confirmed</w:t>
       </w:r>
+      <w:proofErr w:type="gramEnd"/>
       <w:r>
         <w:rPr>
           <w:rFonts w:ascii="Times New Roman" w:eastAsia="Times New Roman" w:hAnsi="Times New Roman" w:cs="Times New Roman"/>
@@ -5045,6 +3463,7 @@
           <w:szCs w:val="24"/>
         </w:rPr>
       </w:pPr>
+      <w:proofErr w:type="gramStart"/>
       <w:r>
         <w:rPr>
           <w:rFonts w:ascii="Courier New" w:eastAsia="Times New Roman" w:hAnsi="Courier New" w:cs="Courier New"/>
@@ -5053,6 +3472,7 @@
         </w:rPr>
         <w:t>preparing</w:t>
       </w:r>
+      <w:proofErr w:type="gramEnd"/>
       <w:r>
         <w:rPr>
           <w:rFonts w:ascii="Times New Roman" w:eastAsia="Times New Roman" w:hAnsi="Times New Roman" w:cs="Times New Roman"/>
@@ -5075,6 +3495,7 @@
           <w:szCs w:val="24"/>
         </w:rPr>
       </w:pPr>
+      <w:proofErr w:type="spellStart"/>
       <w:r>
         <w:rPr>
           <w:rFonts w:ascii="Courier New" w:eastAsia="Times New Roman" w:hAnsi="Courier New" w:cs="Courier New"/>
@@ -5083,6 +3504,7 @@
         </w:rPr>
         <w:t>out_for_delivery</w:t>
       </w:r>
+      <w:proofErr w:type="spellEnd"/>
       <w:r>
         <w:rPr>
           <w:rFonts w:ascii="Times New Roman" w:eastAsia="Times New Roman" w:hAnsi="Times New Roman" w:cs="Times New Roman"/>
@@ -5105,6 +3527,7 @@
           <w:szCs w:val="24"/>
         </w:rPr>
       </w:pPr>
+      <w:proofErr w:type="gramStart"/>
       <w:r>
         <w:rPr>
           <w:rFonts w:ascii="Courier New" w:eastAsia="Times New Roman" w:hAnsi="Courier New" w:cs="Courier New"/>
@@ -5113,6 +3536,7 @@
         </w:rPr>
         <w:t>delivered</w:t>
       </w:r>
+      <w:proofErr w:type="gramEnd"/>
       <w:r>
         <w:rPr>
           <w:rFonts w:ascii="Times New Roman" w:eastAsia="Times New Roman" w:hAnsi="Times New Roman" w:cs="Times New Roman"/>
@@ -5135,6 +3559,7 @@
           <w:szCs w:val="24"/>
         </w:rPr>
       </w:pPr>
+      <w:proofErr w:type="gramStart"/>
       <w:r>
         <w:rPr>
           <w:rFonts w:ascii="Courier New" w:eastAsia="Times New Roman" w:hAnsi="Courier New" w:cs="Courier New"/>
@@ -5143,6 +3568,7 @@
         </w:rPr>
         <w:t>cancelled</w:t>
       </w:r>
+      <w:proofErr w:type="gramEnd"/>
       <w:r>
         <w:rPr>
           <w:rFonts w:ascii="Times New Roman" w:eastAsia="Times New Roman" w:hAnsi="Times New Roman" w:cs="Times New Roman"/>
@@ -5222,7 +3648,7 @@
           <w:szCs w:val="24"/>
         </w:rPr>
         <w:pict w14:anchorId="4816BBF7">
-          <v:rect id="_x0000_i1040" style="width:0;height:1.5pt" o:hralign="center" o:hrstd="t" o:hr="t" fillcolor="#a0a0a0" stroked="f"/>
+          <v:rect id="_x0000_i1030" style="width:0;height:1.5pt" o:hralign="center" o:hrstd="t" o:hr="t" fillcolor="#a0a0a0" stroked="f"/>
         </w:pict>
       </w:r>
     </w:p>
@@ -5242,7 +3668,7 @@
           <w:szCs w:val="24"/>
         </w:rPr>
         <w:pict w14:anchorId="2B35D005">
-          <v:rect id="_x0000_i1041" style="width:0;height:1.5pt" o:hralign="center" o:hrstd="t" o:hr="t" fillcolor="#a0a0a0" stroked="f"/>
+          <v:rect id="_x0000_i1031" style="width:0;height:1.5pt" o:hralign="center" o:hrstd="t" o:hr="t" fillcolor="#a0a0a0" stroked="f"/>
         </w:pict>
       </w:r>
     </w:p>
@@ -5285,7 +3711,7 @@
           <w:szCs w:val="24"/>
         </w:rPr>
         <w:pict w14:anchorId="4A7A08C3">
-          <v:rect id="_x0000_i1042" style="width:0;height:1.5pt" o:hralign="center" o:hrstd="t" o:hr="t" fillcolor="#a0a0a0" stroked="f"/>
+          <v:rect id="_x0000_i1032" style="width:0;height:1.5pt" o:hralign="center" o:hrstd="t" o:hr="t" fillcolor="#a0a0a0" stroked="f"/>
         </w:pict>
       </w:r>
     </w:p>
@@ -5506,7 +3932,25 @@
                 <w:sz w:val="20"/>
                 <w:szCs w:val="20"/>
               </w:rPr>
-              <w:t>/api/v1/admin/stats</w:t>
+              <w:t>/</w:t>
+            </w:r>
+            <w:proofErr w:type="spellStart"/>
+            <w:r>
+              <w:rPr>
+                <w:rFonts w:ascii="Courier New" w:eastAsia="Times New Roman" w:hAnsi="Courier New" w:cs="Courier New"/>
+                <w:sz w:val="20"/>
+                <w:szCs w:val="20"/>
+              </w:rPr>
+              <w:t>api</w:t>
+            </w:r>
+            <w:proofErr w:type="spellEnd"/>
+            <w:r>
+              <w:rPr>
+                <w:rFonts w:ascii="Courier New" w:eastAsia="Times New Roman" w:hAnsi="Courier New" w:cs="Courier New"/>
+                <w:sz w:val="20"/>
+                <w:szCs w:val="20"/>
+              </w:rPr>
+              <w:t>/v1/admin/stats</w:t>
             </w:r>
           </w:p>
         </w:tc>
@@ -5611,7 +4055,25 @@
                 <w:sz w:val="20"/>
                 <w:szCs w:val="20"/>
               </w:rPr>
-              <w:t>/api/v1/admin/users</w:t>
+              <w:t>/</w:t>
+            </w:r>
+            <w:proofErr w:type="spellStart"/>
+            <w:r>
+              <w:rPr>
+                <w:rFonts w:ascii="Courier New" w:eastAsia="Times New Roman" w:hAnsi="Courier New" w:cs="Courier New"/>
+                <w:sz w:val="20"/>
+                <w:szCs w:val="20"/>
+              </w:rPr>
+              <w:t>api</w:t>
+            </w:r>
+            <w:proofErr w:type="spellEnd"/>
+            <w:r>
+              <w:rPr>
+                <w:rFonts w:ascii="Courier New" w:eastAsia="Times New Roman" w:hAnsi="Courier New" w:cs="Courier New"/>
+                <w:sz w:val="20"/>
+                <w:szCs w:val="20"/>
+              </w:rPr>
+              <w:t>/v1/admin/users</w:t>
             </w:r>
           </w:p>
         </w:tc>
@@ -5716,7 +4178,25 @@
                 <w:sz w:val="20"/>
                 <w:szCs w:val="20"/>
               </w:rPr>
-              <w:t>/api/v1/admin/users/{id}/deactivate</w:t>
+              <w:t>/</w:t>
+            </w:r>
+            <w:proofErr w:type="spellStart"/>
+            <w:r>
+              <w:rPr>
+                <w:rFonts w:ascii="Courier New" w:eastAsia="Times New Roman" w:hAnsi="Courier New" w:cs="Courier New"/>
+                <w:sz w:val="20"/>
+                <w:szCs w:val="20"/>
+              </w:rPr>
+              <w:t>api</w:t>
+            </w:r>
+            <w:proofErr w:type="spellEnd"/>
+            <w:r>
+              <w:rPr>
+                <w:rFonts w:ascii="Courier New" w:eastAsia="Times New Roman" w:hAnsi="Courier New" w:cs="Courier New"/>
+                <w:sz w:val="20"/>
+                <w:szCs w:val="20"/>
+              </w:rPr>
+              <w:t>/v1/admin/users/{id}/deactivate</w:t>
             </w:r>
           </w:p>
         </w:tc>
@@ -5821,7 +4301,25 @@
                 <w:sz w:val="20"/>
                 <w:szCs w:val="20"/>
               </w:rPr>
-              <w:t>/api/v1/admin/users/{id}/activate</w:t>
+              <w:t>/</w:t>
+            </w:r>
+            <w:proofErr w:type="spellStart"/>
+            <w:r>
+              <w:rPr>
+                <w:rFonts w:ascii="Courier New" w:eastAsia="Times New Roman" w:hAnsi="Courier New" w:cs="Courier New"/>
+                <w:sz w:val="20"/>
+                <w:szCs w:val="20"/>
+              </w:rPr>
+              <w:t>api</w:t>
+            </w:r>
+            <w:proofErr w:type="spellEnd"/>
+            <w:r>
+              <w:rPr>
+                <w:rFonts w:ascii="Courier New" w:eastAsia="Times New Roman" w:hAnsi="Courier New" w:cs="Courier New"/>
+                <w:sz w:val="20"/>
+                <w:szCs w:val="20"/>
+              </w:rPr>
+              <w:t>/v1/admin/users/{id}/activate</w:t>
             </w:r>
           </w:p>
         </w:tc>
@@ -5926,7 +4424,25 @@
                 <w:sz w:val="20"/>
                 <w:szCs w:val="20"/>
               </w:rPr>
-              <w:t>/api/v1/admin/users/{id}/role</w:t>
+              <w:t>/</w:t>
+            </w:r>
+            <w:proofErr w:type="spellStart"/>
+            <w:r>
+              <w:rPr>
+                <w:rFonts w:ascii="Courier New" w:eastAsia="Times New Roman" w:hAnsi="Courier New" w:cs="Courier New"/>
+                <w:sz w:val="20"/>
+                <w:szCs w:val="20"/>
+              </w:rPr>
+              <w:t>api</w:t>
+            </w:r>
+            <w:proofErr w:type="spellEnd"/>
+            <w:r>
+              <w:rPr>
+                <w:rFonts w:ascii="Courier New" w:eastAsia="Times New Roman" w:hAnsi="Courier New" w:cs="Courier New"/>
+                <w:sz w:val="20"/>
+                <w:szCs w:val="20"/>
+              </w:rPr>
+              <w:t>/v1/admin/users/{id}/role</w:t>
             </w:r>
           </w:p>
         </w:tc>
@@ -6031,7 +4547,25 @@
                 <w:sz w:val="20"/>
                 <w:szCs w:val="20"/>
               </w:rPr>
-              <w:t>/api/v1/admin/orders</w:t>
+              <w:t>/</w:t>
+            </w:r>
+            <w:proofErr w:type="spellStart"/>
+            <w:r>
+              <w:rPr>
+                <w:rFonts w:ascii="Courier New" w:eastAsia="Times New Roman" w:hAnsi="Courier New" w:cs="Courier New"/>
+                <w:sz w:val="20"/>
+                <w:szCs w:val="20"/>
+              </w:rPr>
+              <w:t>api</w:t>
+            </w:r>
+            <w:proofErr w:type="spellEnd"/>
+            <w:r>
+              <w:rPr>
+                <w:rFonts w:ascii="Courier New" w:eastAsia="Times New Roman" w:hAnsi="Courier New" w:cs="Courier New"/>
+                <w:sz w:val="20"/>
+                <w:szCs w:val="20"/>
+              </w:rPr>
+              <w:t>/v1/admin/orders</w:t>
             </w:r>
           </w:p>
         </w:tc>
@@ -6107,7 +4641,29 @@
           <w:sz w:val="27"/>
           <w:szCs w:val="27"/>
         </w:rPr>
-        <w:t>⚙️ The Stats Endpoint — What to Return</w:t>
+        <w:t xml:space="preserve">⚙️ </w:t>
+      </w:r>
+      <w:proofErr w:type="gramStart"/>
+      <w:r>
+        <w:rPr>
+          <w:rFonts w:ascii="Times New Roman" w:eastAsia="Times New Roman" w:hAnsi="Times New Roman" w:cs="Times New Roman"/>
+          <w:b/>
+          <w:bCs/>
+          <w:sz w:val="27"/>
+          <w:szCs w:val="27"/>
+        </w:rPr>
+        <w:t>The</w:t>
+      </w:r>
+      <w:proofErr w:type="gramEnd"/>
+      <w:r>
+        <w:rPr>
+          <w:rFonts w:ascii="Times New Roman" w:eastAsia="Times New Roman" w:hAnsi="Times New Roman" w:cs="Times New Roman"/>
+          <w:b/>
+          <w:bCs/>
+          <w:sz w:val="27"/>
+          <w:szCs w:val="27"/>
+        </w:rPr>
+        <w:t xml:space="preserve"> Stats Endpoint — What to Return</w:t>
       </w:r>
     </w:p>
     <w:p>
@@ -6145,7 +4701,27 @@
           <w:sz w:val="20"/>
           <w:szCs w:val="20"/>
         </w:rPr>
-        <w:t>GET /api/v1/admin/stats</w:t>
+        <w:t>GET /</w:t>
+      </w:r>
+      <w:proofErr w:type="spellStart"/>
+      <w:r>
+        <w:rPr>
+          <w:rFonts w:ascii="var(--font-mono)" w:eastAsia="Times New Roman" w:hAnsi="var(--font-mono)" w:cs="Courier New"/>
+          <w:color w:val="EAECF0"/>
+          <w:sz w:val="20"/>
+          <w:szCs w:val="20"/>
+        </w:rPr>
+        <w:t>api</w:t>
+      </w:r>
+      <w:proofErr w:type="spellEnd"/>
+      <w:r>
+        <w:rPr>
+          <w:rFonts w:ascii="var(--font-mono)" w:eastAsia="Times New Roman" w:hAnsi="var(--font-mono)" w:cs="Courier New"/>
+          <w:color w:val="EAECF0"/>
+          <w:sz w:val="20"/>
+          <w:szCs w:val="20"/>
+        </w:rPr>
+        <w:t>/v1/admin/stats</w:t>
       </w:r>
     </w:p>
     <w:p>
@@ -6288,7 +4864,27 @@
           <w:sz w:val="20"/>
           <w:szCs w:val="20"/>
         </w:rPr>
-        <w:t xml:space="preserve">  "total_orders_today": 24,</w:t>
+        <w:t xml:space="preserve">  "</w:t>
+      </w:r>
+      <w:proofErr w:type="spellStart"/>
+      <w:r>
+        <w:rPr>
+          <w:rFonts w:ascii="var(--font-mono)" w:eastAsia="Times New Roman" w:hAnsi="var(--font-mono)" w:cs="Courier New"/>
+          <w:color w:val="EAECF0"/>
+          <w:sz w:val="20"/>
+          <w:szCs w:val="20"/>
+        </w:rPr>
+        <w:t>total_orders_today</w:t>
+      </w:r>
+      <w:proofErr w:type="spellEnd"/>
+      <w:r>
+        <w:rPr>
+          <w:rFonts w:ascii="var(--font-mono)" w:eastAsia="Times New Roman" w:hAnsi="var(--font-mono)" w:cs="Courier New"/>
+          <w:color w:val="EAECF0"/>
+          <w:sz w:val="20"/>
+          <w:szCs w:val="20"/>
+        </w:rPr>
+        <w:t>": 24,</w:t>
       </w:r>
     </w:p>
     <w:p>
@@ -6326,7 +4922,27 @@
           <w:sz w:val="20"/>
           <w:szCs w:val="20"/>
         </w:rPr>
-        <w:t xml:space="preserve">  "revenue_today": 18450.00,</w:t>
+        <w:t xml:space="preserve">  "</w:t>
+      </w:r>
+      <w:proofErr w:type="spellStart"/>
+      <w:r>
+        <w:rPr>
+          <w:rFonts w:ascii="var(--font-mono)" w:eastAsia="Times New Roman" w:hAnsi="var(--font-mono)" w:cs="Courier New"/>
+          <w:color w:val="EAECF0"/>
+          <w:sz w:val="20"/>
+          <w:szCs w:val="20"/>
+        </w:rPr>
+        <w:t>revenue_today</w:t>
+      </w:r>
+      <w:proofErr w:type="spellEnd"/>
+      <w:r>
+        <w:rPr>
+          <w:rFonts w:ascii="var(--font-mono)" w:eastAsia="Times New Roman" w:hAnsi="var(--font-mono)" w:cs="Courier New"/>
+          <w:color w:val="EAECF0"/>
+          <w:sz w:val="20"/>
+          <w:szCs w:val="20"/>
+        </w:rPr>
+        <w:t>": 18450.00,</w:t>
       </w:r>
     </w:p>
     <w:p>
@@ -6364,7 +4980,27 @@
           <w:sz w:val="20"/>
           <w:szCs w:val="20"/>
         </w:rPr>
-        <w:t xml:space="preserve">  "pending_orders": 5,</w:t>
+        <w:t xml:space="preserve">  "</w:t>
+      </w:r>
+      <w:proofErr w:type="spellStart"/>
+      <w:r>
+        <w:rPr>
+          <w:rFonts w:ascii="var(--font-mono)" w:eastAsia="Times New Roman" w:hAnsi="var(--font-mono)" w:cs="Courier New"/>
+          <w:color w:val="EAECF0"/>
+          <w:sz w:val="20"/>
+          <w:szCs w:val="20"/>
+        </w:rPr>
+        <w:t>pending_orders</w:t>
+      </w:r>
+      <w:proofErr w:type="spellEnd"/>
+      <w:r>
+        <w:rPr>
+          <w:rFonts w:ascii="var(--font-mono)" w:eastAsia="Times New Roman" w:hAnsi="var(--font-mono)" w:cs="Courier New"/>
+          <w:color w:val="EAECF0"/>
+          <w:sz w:val="20"/>
+          <w:szCs w:val="20"/>
+        </w:rPr>
+        <w:t>": 5,</w:t>
       </w:r>
     </w:p>
     <w:p>
@@ -6402,7 +5038,27 @@
           <w:sz w:val="20"/>
           <w:szCs w:val="20"/>
         </w:rPr>
-        <w:t xml:space="preserve">  "total_users": 312,</w:t>
+        <w:t xml:space="preserve">  "</w:t>
+      </w:r>
+      <w:proofErr w:type="spellStart"/>
+      <w:r>
+        <w:rPr>
+          <w:rFonts w:ascii="var(--font-mono)" w:eastAsia="Times New Roman" w:hAnsi="var(--font-mono)" w:cs="Courier New"/>
+          <w:color w:val="EAECF0"/>
+          <w:sz w:val="20"/>
+          <w:szCs w:val="20"/>
+        </w:rPr>
+        <w:t>total_users</w:t>
+      </w:r>
+      <w:proofErr w:type="spellEnd"/>
+      <w:r>
+        <w:rPr>
+          <w:rFonts w:ascii="var(--font-mono)" w:eastAsia="Times New Roman" w:hAnsi="var(--font-mono)" w:cs="Courier New"/>
+          <w:color w:val="EAECF0"/>
+          <w:sz w:val="20"/>
+          <w:szCs w:val="20"/>
+        </w:rPr>
+        <w:t>": 312,</w:t>
       </w:r>
     </w:p>
     <w:p>
@@ -6440,7 +5096,27 @@
           <w:sz w:val="20"/>
           <w:szCs w:val="20"/>
         </w:rPr>
-        <w:t xml:space="preserve">  "total_orders_all_time": 1894,</w:t>
+        <w:t xml:space="preserve">  "</w:t>
+      </w:r>
+      <w:proofErr w:type="spellStart"/>
+      <w:r>
+        <w:rPr>
+          <w:rFonts w:ascii="var(--font-mono)" w:eastAsia="Times New Roman" w:hAnsi="var(--font-mono)" w:cs="Courier New"/>
+          <w:color w:val="EAECF0"/>
+          <w:sz w:val="20"/>
+          <w:szCs w:val="20"/>
+        </w:rPr>
+        <w:t>total_orders_all_time</w:t>
+      </w:r>
+      <w:proofErr w:type="spellEnd"/>
+      <w:r>
+        <w:rPr>
+          <w:rFonts w:ascii="var(--font-mono)" w:eastAsia="Times New Roman" w:hAnsi="var(--font-mono)" w:cs="Courier New"/>
+          <w:color w:val="EAECF0"/>
+          <w:sz w:val="20"/>
+          <w:szCs w:val="20"/>
+        </w:rPr>
+        <w:t>": 1894,</w:t>
       </w:r>
     </w:p>
     <w:p>
@@ -6478,7 +5154,27 @@
           <w:sz w:val="20"/>
           <w:szCs w:val="20"/>
         </w:rPr>
-        <w:t xml:space="preserve">  "total_revenue_all_time": 945000.00</w:t>
+        <w:t xml:space="preserve">  "</w:t>
+      </w:r>
+      <w:proofErr w:type="spellStart"/>
+      <w:r>
+        <w:rPr>
+          <w:rFonts w:ascii="var(--font-mono)" w:eastAsia="Times New Roman" w:hAnsi="var(--font-mono)" w:cs="Courier New"/>
+          <w:color w:val="EAECF0"/>
+          <w:sz w:val="20"/>
+          <w:szCs w:val="20"/>
+        </w:rPr>
+        <w:t>total_revenue_all_time</w:t>
+      </w:r>
+      <w:proofErr w:type="spellEnd"/>
+      <w:r>
+        <w:rPr>
+          <w:rFonts w:ascii="var(--font-mono)" w:eastAsia="Times New Roman" w:hAnsi="var(--font-mono)" w:cs="Courier New"/>
+          <w:color w:val="EAECF0"/>
+          <w:sz w:val="20"/>
+          <w:szCs w:val="20"/>
+        </w:rPr>
+        <w:t>": 945000.00</w:t>
       </w:r>
     </w:p>
     <w:p>
@@ -6552,31 +5248,79 @@
           <w:sz w:val="24"/>
           <w:szCs w:val="24"/>
         </w:rPr>
-        <w:t xml:space="preserve"> behind the scenes using SQLAlchemy's </w:t>
-      </w:r>
+        <w:t xml:space="preserve"> behind the scenes using </w:t>
+      </w:r>
+      <w:proofErr w:type="spellStart"/>
+      <w:r>
+        <w:rPr>
+          <w:rFonts w:ascii="Times New Roman" w:eastAsia="Times New Roman" w:hAnsi="Times New Roman" w:cs="Times New Roman"/>
+          <w:sz w:val="24"/>
+          <w:szCs w:val="24"/>
+        </w:rPr>
+        <w:t>SQLAlchemy's</w:t>
+      </w:r>
+      <w:proofErr w:type="spellEnd"/>
+      <w:r>
+        <w:rPr>
+          <w:rFonts w:ascii="Times New Roman" w:eastAsia="Times New Roman" w:hAnsi="Times New Roman" w:cs="Times New Roman"/>
+          <w:sz w:val="24"/>
+          <w:szCs w:val="24"/>
+        </w:rPr>
+        <w:t xml:space="preserve"> </w:t>
+      </w:r>
+      <w:proofErr w:type="spellStart"/>
+      <w:proofErr w:type="gramStart"/>
       <w:r>
         <w:rPr>
           <w:rFonts w:ascii="Courier New" w:eastAsia="Times New Roman" w:hAnsi="Courier New" w:cs="Courier New"/>
           <w:sz w:val="20"/>
           <w:szCs w:val="20"/>
         </w:rPr>
-        <w:t>func.count()</w:t>
-      </w:r>
-      <w:r>
-        <w:rPr>
-          <w:rFonts w:ascii="Times New Roman" w:eastAsia="Times New Roman" w:hAnsi="Times New Roman" w:cs="Times New Roman"/>
-          <w:sz w:val="24"/>
-          <w:szCs w:val="24"/>
-        </w:rPr>
-        <w:t xml:space="preserve"> and </w:t>
-      </w:r>
+        <w:t>func.count</w:t>
+      </w:r>
+      <w:proofErr w:type="spellEnd"/>
       <w:r>
         <w:rPr>
           <w:rFonts w:ascii="Courier New" w:eastAsia="Times New Roman" w:hAnsi="Courier New" w:cs="Courier New"/>
           <w:sz w:val="20"/>
           <w:szCs w:val="20"/>
         </w:rPr>
-        <w:t>func.sum()</w:t>
+        <w:t>(</w:t>
+      </w:r>
+      <w:proofErr w:type="gramEnd"/>
+      <w:r>
+        <w:rPr>
+          <w:rFonts w:ascii="Courier New" w:eastAsia="Times New Roman" w:hAnsi="Courier New" w:cs="Courier New"/>
+          <w:sz w:val="20"/>
+          <w:szCs w:val="20"/>
+        </w:rPr>
+        <w:t>)</w:t>
+      </w:r>
+      <w:r>
+        <w:rPr>
+          <w:rFonts w:ascii="Times New Roman" w:eastAsia="Times New Roman" w:hAnsi="Times New Roman" w:cs="Times New Roman"/>
+          <w:sz w:val="24"/>
+          <w:szCs w:val="24"/>
+        </w:rPr>
+        <w:t xml:space="preserve"> and </w:t>
+      </w:r>
+      <w:proofErr w:type="spellStart"/>
+      <w:r>
+        <w:rPr>
+          <w:rFonts w:ascii="Courier New" w:eastAsia="Times New Roman" w:hAnsi="Courier New" w:cs="Courier New"/>
+          <w:sz w:val="20"/>
+          <w:szCs w:val="20"/>
+        </w:rPr>
+        <w:t>func.sum</w:t>
+      </w:r>
+      <w:proofErr w:type="spellEnd"/>
+      <w:r>
+        <w:rPr>
+          <w:rFonts w:ascii="Courier New" w:eastAsia="Times New Roman" w:hAnsi="Courier New" w:cs="Courier New"/>
+          <w:sz w:val="20"/>
+          <w:szCs w:val="20"/>
+        </w:rPr>
+        <w:t>()</w:t>
       </w:r>
       <w:r>
         <w:rPr>
@@ -6603,7 +5347,7 @@
           <w:szCs w:val="24"/>
         </w:rPr>
         <w:pict w14:anchorId="46AEFC7A">
-          <v:rect id="_x0000_i1043" style="width:0;height:1.5pt" o:hralign="center" o:hrstd="t" o:hr="t" fillcolor="#a0a0a0" stroked="f"/>
+          <v:rect id="_x0000_i1033" style="width:0;height:1.5pt" o:hralign="center" o:hrstd="t" o:hr="t" fillcolor="#a0a0a0" stroked="f"/>
         </w:pict>
       </w:r>
     </w:p>
@@ -6807,24 +5551,44 @@
           <w:sz w:val="20"/>
           <w:szCs w:val="20"/>
         </w:rPr>
-        <w:t>/api/v1/admin/</w:t>
-      </w:r>
-      <w:r>
-        <w:rPr>
-          <w:rFonts w:ascii="Times New Roman" w:eastAsia="Times New Roman" w:hAnsi="Times New Roman" w:cs="Times New Roman"/>
-          <w:sz w:val="24"/>
-          <w:szCs w:val="24"/>
-        </w:rPr>
-        <w:t xml:space="preserve"> prefix and protect with </w:t>
-      </w:r>
+        <w:t>/</w:t>
+      </w:r>
+      <w:proofErr w:type="spellStart"/>
       <w:r>
         <w:rPr>
           <w:rFonts w:ascii="Courier New" w:eastAsia="Times New Roman" w:hAnsi="Courier New" w:cs="Courier New"/>
           <w:sz w:val="20"/>
           <w:szCs w:val="20"/>
         </w:rPr>
+        <w:t>api</w:t>
+      </w:r>
+      <w:proofErr w:type="spellEnd"/>
+      <w:r>
+        <w:rPr>
+          <w:rFonts w:ascii="Courier New" w:eastAsia="Times New Roman" w:hAnsi="Courier New" w:cs="Courier New"/>
+          <w:sz w:val="20"/>
+          <w:szCs w:val="20"/>
+        </w:rPr>
+        <w:t>/v1/admin/</w:t>
+      </w:r>
+      <w:r>
+        <w:rPr>
+          <w:rFonts w:ascii="Times New Roman" w:eastAsia="Times New Roman" w:hAnsi="Times New Roman" w:cs="Times New Roman"/>
+          <w:sz w:val="24"/>
+          <w:szCs w:val="24"/>
+        </w:rPr>
+        <w:t xml:space="preserve"> prefix and protect with </w:t>
+      </w:r>
+      <w:proofErr w:type="spellStart"/>
+      <w:r>
+        <w:rPr>
+          <w:rFonts w:ascii="Courier New" w:eastAsia="Times New Roman" w:hAnsi="Courier New" w:cs="Courier New"/>
+          <w:sz w:val="20"/>
+          <w:szCs w:val="20"/>
+        </w:rPr>
         <w:t>require_admin</w:t>
       </w:r>
+      <w:proofErr w:type="spellEnd"/>
       <w:r>
         <w:rPr>
           <w:rFonts w:ascii="Times New Roman" w:eastAsia="Times New Roman" w:hAnsi="Times New Roman" w:cs="Times New Roman"/>
@@ -6850,7 +5614,7 @@
           <w:szCs w:val="24"/>
         </w:rPr>
         <w:pict w14:anchorId="4218B3C7">
-          <v:rect id="_x0000_i1044" style="width:0;height:1.5pt" o:hralign="center" o:hrstd="t" o:hr="t" fillcolor="#a0a0a0" stroked="f"/>
+          <v:rect id="_x0000_i1034" style="width:0;height:1.5pt" o:hralign="center" o:hrstd="t" o:hr="t" fillcolor="#a0a0a0" stroked="f"/>
         </w:pict>
       </w:r>
     </w:p>
@@ -6870,7 +5634,7 @@
           <w:szCs w:val="24"/>
         </w:rPr>
         <w:pict w14:anchorId="48B5C2DE">
-          <v:rect id="_x0000_i1045" style="width:0;height:1.5pt" o:hralign="center" o:hrstd="t" o:hr="t" fillcolor="#a0a0a0" stroked="f"/>
+          <v:rect id="_x0000_i1035" style="width:0;height:1.5pt" o:hralign="center" o:hrstd="t" o:hr="t" fillcolor="#a0a0a0" stroked="f"/>
         </w:pict>
       </w:r>
     </w:p>
@@ -7490,7 +6254,25 @@
           <w:sz w:val="24"/>
           <w:szCs w:val="24"/>
         </w:rPr>
-        <w:t>Build it in the order we discussed, test each feature before moving on, and this project alone can get you a junior backend role. You've got a complete roadmap — now go build it! 🚀</w:t>
+        <w:t xml:space="preserve">Build it in the order we discussed, test each feature before moving </w:t>
+      </w:r>
+      <w:proofErr w:type="gramStart"/>
+      <w:r>
+        <w:rPr>
+          <w:rFonts w:ascii="Times New Roman" w:eastAsia="Times New Roman" w:hAnsi="Times New Roman" w:cs="Times New Roman"/>
+          <w:sz w:val="24"/>
+          <w:szCs w:val="24"/>
+        </w:rPr>
+        <w:t>on,</w:t>
+      </w:r>
+      <w:proofErr w:type="gramEnd"/>
+      <w:r>
+        <w:rPr>
+          <w:rFonts w:ascii="Times New Roman" w:eastAsia="Times New Roman" w:hAnsi="Times New Roman" w:cs="Times New Roman"/>
+          <w:sz w:val="24"/>
+          <w:szCs w:val="24"/>
+        </w:rPr>
+        <w:t xml:space="preserve"> and this project alone can get you a junior backend role. You've got a complete roadmap — now go build it! 🚀</w:t>
       </w:r>
     </w:p>
     <w:p>
@@ -7512,7 +6294,7 @@
           <w:szCs w:val="24"/>
         </w:rPr>
       </w:pPr>
-      <w:hyperlink r:id="rId5" w:tgtFrame="_blank" w:history="1">
+      <w:hyperlink r:id="rId6" w:tgtFrame="_blank" w:history="1">
         <w:r>
           <w:rPr>
             <w:rFonts w:ascii="Times New Roman" w:eastAsia="Times New Roman" w:hAnsi="Times New Roman" w:cs="Times New Roman"/>
@@ -7537,8 +6319,8 @@
 </file>
 
 <file path=word/numbering.xml><?xml version="1.0" encoding="utf-8"?>
-<w:numbering xmlns:wpc="http://schemas.microsoft.com/office/word/2010/wordprocessingCanvas" xmlns:cx="http://schemas.microsoft.com/office/drawing/2014/chartex" xmlns:cx1="http://schemas.microsoft.com/office/drawing/2015/9/8/chartex" xmlns:cx2="http://schemas.microsoft.com/office/drawing/2015/10/21/chartex" xmlns:cx3="http://schemas.microsoft.com/office/drawing/2016/5/9/chartex" xmlns:cx4="http://schemas.microsoft.com/office/drawing/2016/5/10/chartex" xmlns:cx5="http://schemas.microsoft.com/office/drawing/2016/5/11/chartex" xmlns:cx6="http://schemas.microsoft.com/office/drawing/2016/5/12/chartex" xmlns:cx7="http://schemas.microsoft.com/office/drawing/2016/5/13/chartex" xmlns:cx8="http://schemas.microsoft.com/office/drawing/2016/5/14/chartex" xmlns:mc="http://schemas.openxmlformats.org/markup-compatibility/2006" xmlns:aink="http://schemas.microsoft.com/office/drawing/2016/ink" xmlns:am3d="http://schemas.microsoft.com/office/drawing/2017/model3d" xmlns:o="urn:schemas-microsoft-com:office:office" xmlns:oel="http://schemas.microsoft.com/office/2019/extlst" xmlns:r="http://schemas.openxmlformats.org/officeDocument/2006/relationships" xmlns:m="http://schemas.openxmlformats.org/officeDocument/2006/math" xmlns:v="urn:schemas-microsoft-com:vml" xmlns:wp14="http://schemas.microsoft.com/office/word/2010/wordprocessingDrawing" xmlns:wp="http://schemas.openxmlformats.org/drawingml/2006/wordprocessingDrawing" xmlns:w10="urn:schemas-microsoft-com:office:word" xmlns:w="http://schemas.openxmlformats.org/wordprocessingml/2006/main" xmlns:w14="http://schemas.microsoft.com/office/word/2010/wordml" xmlns:w15="http://schemas.microsoft.com/office/word/2012/wordml" xmlns:w16cex="http://schemas.microsoft.com/office/word/2018/wordml/cex" xmlns:w16cid="http://schemas.microsoft.com/office/word/2016/wordml/cid" xmlns:w16="http://schemas.microsoft.com/office/word/2018/wordml" xmlns:w16du="http://schemas.microsoft.com/office/word/2023/wordml/word16du" xmlns:w16sdtdh="http://schemas.microsoft.com/office/word/2020/wordml/sdtdatahash" xmlns:w16sdtfl="http://schemas.microsoft.com/office/word/2024/wordml/sdtformatlock" xmlns:w16se="http://schemas.microsoft.com/office/word/2015/wordml/symex" xmlns:wpg="http://schemas.microsoft.com/office/word/2010/wordprocessingGroup" xmlns:wpi="http://schemas.microsoft.com/office/word/2010/wordprocessingInk" xmlns:wne="http://schemas.microsoft.com/office/word/2006/wordml" xmlns:wps="http://schemas.microsoft.com/office/word/2010/wordprocessingShape" mc:Ignorable="w14 w15 w16se w16cid w16 w16cex w16sdtdh w16sdtfl w16du wp14">
-  <w:abstractNum w:abstractNumId="0" w15:restartNumberingAfterBreak="0">
+<w:numbering xmlns:wpc="http://schemas.microsoft.com/office/word/2010/wordprocessingCanvas" xmlns:mc="http://schemas.openxmlformats.org/markup-compatibility/2006" xmlns:o="urn:schemas-microsoft-com:office:office" xmlns:r="http://schemas.openxmlformats.org/officeDocument/2006/relationships" xmlns:m="http://schemas.openxmlformats.org/officeDocument/2006/math" xmlns:v="urn:schemas-microsoft-com:vml" xmlns:wp14="http://schemas.microsoft.com/office/word/2010/wordprocessingDrawing" xmlns:wp="http://schemas.openxmlformats.org/drawingml/2006/wordprocessingDrawing" xmlns:w10="urn:schemas-microsoft-com:office:word" xmlns:w="http://schemas.openxmlformats.org/wordprocessingml/2006/main" xmlns:w14="http://schemas.microsoft.com/office/word/2010/wordml" xmlns:wpg="http://schemas.microsoft.com/office/word/2010/wordprocessingGroup" xmlns:wpi="http://schemas.microsoft.com/office/word/2010/wordprocessingInk" xmlns:wne="http://schemas.microsoft.com/office/word/2006/wordml" xmlns:wps="http://schemas.microsoft.com/office/word/2010/wordprocessingShape" mc:Ignorable="w14 wp14">
+  <w:abstractNum w:abstractNumId="0">
     <w:nsid w:val="0A50570B"/>
     <w:multiLevelType w:val="multilevel"/>
     <w:tmpl w:val="EF566AD4"/>
@@ -7687,7 +6469,7 @@
       </w:rPr>
     </w:lvl>
   </w:abstractNum>
-  <w:abstractNum w:abstractNumId="1" w15:restartNumberingAfterBreak="0">
+  <w:abstractNum w:abstractNumId="1">
     <w:nsid w:val="0B5B5F0E"/>
     <w:multiLevelType w:val="multilevel"/>
     <w:tmpl w:val="D72C641E"/>
@@ -7836,7 +6618,7 @@
       </w:rPr>
     </w:lvl>
   </w:abstractNum>
-  <w:abstractNum w:abstractNumId="2" w15:restartNumberingAfterBreak="0">
+  <w:abstractNum w:abstractNumId="2">
     <w:nsid w:val="0CE15302"/>
     <w:multiLevelType w:val="multilevel"/>
     <w:tmpl w:val="97E6D028"/>
@@ -7985,7 +6767,7 @@
       </w:rPr>
     </w:lvl>
   </w:abstractNum>
-  <w:abstractNum w:abstractNumId="3" w15:restartNumberingAfterBreak="0">
+  <w:abstractNum w:abstractNumId="3">
     <w:nsid w:val="0F0A3508"/>
     <w:multiLevelType w:val="multilevel"/>
     <w:tmpl w:val="4562407A"/>
@@ -8134,7 +6916,7 @@
       </w:rPr>
     </w:lvl>
   </w:abstractNum>
-  <w:abstractNum w:abstractNumId="4" w15:restartNumberingAfterBreak="0">
+  <w:abstractNum w:abstractNumId="4">
     <w:nsid w:val="10D911F9"/>
     <w:multiLevelType w:val="multilevel"/>
     <w:tmpl w:val="76400EA4"/>
@@ -8283,7 +7065,7 @@
       </w:rPr>
     </w:lvl>
   </w:abstractNum>
-  <w:abstractNum w:abstractNumId="5" w15:restartNumberingAfterBreak="0">
+  <w:abstractNum w:abstractNumId="5">
     <w:nsid w:val="14A70BA8"/>
     <w:multiLevelType w:val="multilevel"/>
     <w:tmpl w:val="D730D732"/>
@@ -8432,7 +7214,7 @@
       </w:rPr>
     </w:lvl>
   </w:abstractNum>
-  <w:abstractNum w:abstractNumId="6" w15:restartNumberingAfterBreak="0">
+  <w:abstractNum w:abstractNumId="6">
     <w:nsid w:val="168E7618"/>
     <w:multiLevelType w:val="multilevel"/>
     <w:tmpl w:val="AAFE45A0"/>
@@ -8581,7 +7363,7 @@
       </w:rPr>
     </w:lvl>
   </w:abstractNum>
-  <w:abstractNum w:abstractNumId="7" w15:restartNumberingAfterBreak="0">
+  <w:abstractNum w:abstractNumId="7">
     <w:nsid w:val="1C0E063D"/>
     <w:multiLevelType w:val="multilevel"/>
     <w:tmpl w:val="FB0A4638"/>
@@ -8730,7 +7512,7 @@
       </w:rPr>
     </w:lvl>
   </w:abstractNum>
-  <w:abstractNum w:abstractNumId="8" w15:restartNumberingAfterBreak="0">
+  <w:abstractNum w:abstractNumId="8">
     <w:nsid w:val="1C30125A"/>
     <w:multiLevelType w:val="multilevel"/>
     <w:tmpl w:val="514432C6"/>
@@ -8879,7 +7661,7 @@
       </w:rPr>
     </w:lvl>
   </w:abstractNum>
-  <w:abstractNum w:abstractNumId="9" w15:restartNumberingAfterBreak="0">
+  <w:abstractNum w:abstractNumId="9">
     <w:nsid w:val="1CF105EA"/>
     <w:multiLevelType w:val="multilevel"/>
     <w:tmpl w:val="18F24F44"/>
@@ -9028,7 +7810,7 @@
       </w:rPr>
     </w:lvl>
   </w:abstractNum>
-  <w:abstractNum w:abstractNumId="10" w15:restartNumberingAfterBreak="0">
+  <w:abstractNum w:abstractNumId="10">
     <w:nsid w:val="1FE252DA"/>
     <w:multiLevelType w:val="multilevel"/>
     <w:tmpl w:val="7742AD76"/>
@@ -9177,7 +7959,7 @@
       </w:rPr>
     </w:lvl>
   </w:abstractNum>
-  <w:abstractNum w:abstractNumId="11" w15:restartNumberingAfterBreak="0">
+  <w:abstractNum w:abstractNumId="11">
     <w:nsid w:val="295E48F4"/>
     <w:multiLevelType w:val="multilevel"/>
     <w:tmpl w:val="0330C6AE"/>
@@ -9326,7 +8108,7 @@
       </w:rPr>
     </w:lvl>
   </w:abstractNum>
-  <w:abstractNum w:abstractNumId="12" w15:restartNumberingAfterBreak="0">
+  <w:abstractNum w:abstractNumId="12">
     <w:nsid w:val="335D39FD"/>
     <w:multiLevelType w:val="multilevel"/>
     <w:tmpl w:val="992A5AF4"/>
@@ -9475,7 +8257,7 @@
       </w:rPr>
     </w:lvl>
   </w:abstractNum>
-  <w:abstractNum w:abstractNumId="13" w15:restartNumberingAfterBreak="0">
+  <w:abstractNum w:abstractNumId="13">
     <w:nsid w:val="48116BC5"/>
     <w:multiLevelType w:val="multilevel"/>
     <w:tmpl w:val="40C2B214"/>
@@ -9588,7 +8370,7 @@
       </w:pPr>
     </w:lvl>
   </w:abstractNum>
-  <w:abstractNum w:abstractNumId="14" w15:restartNumberingAfterBreak="0">
+  <w:abstractNum w:abstractNumId="14">
     <w:nsid w:val="4B8A1F08"/>
     <w:multiLevelType w:val="multilevel"/>
     <w:tmpl w:val="6D863582"/>
@@ -9737,7 +8519,7 @@
       </w:rPr>
     </w:lvl>
   </w:abstractNum>
-  <w:abstractNum w:abstractNumId="15" w15:restartNumberingAfterBreak="0">
+  <w:abstractNum w:abstractNumId="15">
     <w:nsid w:val="4DB84BA5"/>
     <w:multiLevelType w:val="multilevel"/>
     <w:tmpl w:val="76808A26"/>
@@ -9886,7 +8668,7 @@
       </w:rPr>
     </w:lvl>
   </w:abstractNum>
-  <w:abstractNum w:abstractNumId="16" w15:restartNumberingAfterBreak="0">
+  <w:abstractNum w:abstractNumId="16">
     <w:nsid w:val="4DD07A24"/>
     <w:multiLevelType w:val="multilevel"/>
     <w:tmpl w:val="332A202A"/>
@@ -10035,7 +8817,7 @@
       </w:rPr>
     </w:lvl>
   </w:abstractNum>
-  <w:abstractNum w:abstractNumId="17" w15:restartNumberingAfterBreak="0">
+  <w:abstractNum w:abstractNumId="17">
     <w:nsid w:val="5A595DFF"/>
     <w:multiLevelType w:val="multilevel"/>
     <w:tmpl w:val="AD400E6A"/>
@@ -10184,7 +8966,7 @@
       </w:rPr>
     </w:lvl>
   </w:abstractNum>
-  <w:abstractNum w:abstractNumId="18" w15:restartNumberingAfterBreak="0">
+  <w:abstractNum w:abstractNumId="18">
     <w:nsid w:val="5F086D89"/>
     <w:multiLevelType w:val="multilevel"/>
     <w:tmpl w:val="BE74D8C8"/>
@@ -10333,7 +9115,7 @@
       </w:rPr>
     </w:lvl>
   </w:abstractNum>
-  <w:abstractNum w:abstractNumId="19" w15:restartNumberingAfterBreak="0">
+  <w:abstractNum w:abstractNumId="19">
     <w:nsid w:val="604C044A"/>
     <w:multiLevelType w:val="multilevel"/>
     <w:tmpl w:val="854638F8"/>
@@ -10482,7 +9264,7 @@
       </w:rPr>
     </w:lvl>
   </w:abstractNum>
-  <w:abstractNum w:abstractNumId="20" w15:restartNumberingAfterBreak="0">
+  <w:abstractNum w:abstractNumId="20">
     <w:nsid w:val="670C7641"/>
     <w:multiLevelType w:val="multilevel"/>
     <w:tmpl w:val="EBC486DE"/>
@@ -10631,7 +9413,7 @@
       </w:rPr>
     </w:lvl>
   </w:abstractNum>
-  <w:abstractNum w:abstractNumId="21" w15:restartNumberingAfterBreak="0">
+  <w:abstractNum w:abstractNumId="21">
     <w:nsid w:val="6A3C4075"/>
     <w:multiLevelType w:val="multilevel"/>
     <w:tmpl w:val="38383568"/>
@@ -10780,7 +9562,7 @@
       </w:rPr>
     </w:lvl>
   </w:abstractNum>
-  <w:abstractNum w:abstractNumId="22" w15:restartNumberingAfterBreak="0">
+  <w:abstractNum w:abstractNumId="22">
     <w:nsid w:val="7695054D"/>
     <w:multiLevelType w:val="multilevel"/>
     <w:tmpl w:val="026C3AFC"/>
@@ -10929,7 +9711,7 @@
       </w:rPr>
     </w:lvl>
   </w:abstractNum>
-  <w:abstractNum w:abstractNumId="23" w15:restartNumberingAfterBreak="0">
+  <w:abstractNum w:abstractNumId="23">
     <w:nsid w:val="7B8875FC"/>
     <w:multiLevelType w:val="multilevel"/>
     <w:tmpl w:val="0632EBEE"/>
@@ -11078,7 +9860,7 @@
       </w:rPr>
     </w:lvl>
   </w:abstractNum>
-  <w:abstractNum w:abstractNumId="24" w15:restartNumberingAfterBreak="0">
+  <w:abstractNum w:abstractNumId="24">
     <w:nsid w:val="7E84640A"/>
     <w:multiLevelType w:val="multilevel"/>
     <w:tmpl w:val="36C6D712"/>
@@ -11227,86 +10009,86 @@
       </w:rPr>
     </w:lvl>
   </w:abstractNum>
-  <w:num w:numId="1" w16cid:durableId="2133399027">
+  <w:num w:numId="1">
     <w:abstractNumId w:val="18"/>
   </w:num>
-  <w:num w:numId="2" w16cid:durableId="1205945505">
+  <w:num w:numId="2">
     <w:abstractNumId w:val="24"/>
   </w:num>
-  <w:num w:numId="3" w16cid:durableId="1855875649">
+  <w:num w:numId="3">
     <w:abstractNumId w:val="2"/>
   </w:num>
-  <w:num w:numId="4" w16cid:durableId="709842615">
+  <w:num w:numId="4">
     <w:abstractNumId w:val="0"/>
   </w:num>
-  <w:num w:numId="5" w16cid:durableId="1684699349">
+  <w:num w:numId="5">
     <w:abstractNumId w:val="19"/>
   </w:num>
-  <w:num w:numId="6" w16cid:durableId="1252851946">
+  <w:num w:numId="6">
     <w:abstractNumId w:val="23"/>
   </w:num>
-  <w:num w:numId="7" w16cid:durableId="727654011">
+  <w:num w:numId="7">
     <w:abstractNumId w:val="13"/>
   </w:num>
-  <w:num w:numId="8" w16cid:durableId="81806632">
+  <w:num w:numId="8">
     <w:abstractNumId w:val="6"/>
   </w:num>
-  <w:num w:numId="9" w16cid:durableId="940450366">
+  <w:num w:numId="9">
     <w:abstractNumId w:val="16"/>
   </w:num>
-  <w:num w:numId="10" w16cid:durableId="1876579679">
+  <w:num w:numId="10">
     <w:abstractNumId w:val="7"/>
   </w:num>
-  <w:num w:numId="11" w16cid:durableId="263197669">
+  <w:num w:numId="11">
     <w:abstractNumId w:val="10"/>
   </w:num>
-  <w:num w:numId="12" w16cid:durableId="1743797718">
+  <w:num w:numId="12">
     <w:abstractNumId w:val="8"/>
   </w:num>
-  <w:num w:numId="13" w16cid:durableId="737559641">
+  <w:num w:numId="13">
     <w:abstractNumId w:val="11"/>
   </w:num>
-  <w:num w:numId="14" w16cid:durableId="2131976924">
+  <w:num w:numId="14">
     <w:abstractNumId w:val="22"/>
   </w:num>
-  <w:num w:numId="15" w16cid:durableId="1864052830">
+  <w:num w:numId="15">
     <w:abstractNumId w:val="3"/>
   </w:num>
-  <w:num w:numId="16" w16cid:durableId="2096047848">
+  <w:num w:numId="16">
     <w:abstractNumId w:val="21"/>
   </w:num>
-  <w:num w:numId="17" w16cid:durableId="860581619">
+  <w:num w:numId="17">
     <w:abstractNumId w:val="4"/>
   </w:num>
-  <w:num w:numId="18" w16cid:durableId="637340719">
+  <w:num w:numId="18">
     <w:abstractNumId w:val="20"/>
   </w:num>
-  <w:num w:numId="19" w16cid:durableId="1258951150">
+  <w:num w:numId="19">
     <w:abstractNumId w:val="12"/>
   </w:num>
-  <w:num w:numId="20" w16cid:durableId="233777890">
+  <w:num w:numId="20">
     <w:abstractNumId w:val="15"/>
   </w:num>
-  <w:num w:numId="21" w16cid:durableId="970673057">
+  <w:num w:numId="21">
     <w:abstractNumId w:val="9"/>
   </w:num>
-  <w:num w:numId="22" w16cid:durableId="789667986">
+  <w:num w:numId="22">
     <w:abstractNumId w:val="14"/>
   </w:num>
-  <w:num w:numId="23" w16cid:durableId="1493838836">
+  <w:num w:numId="23">
     <w:abstractNumId w:val="5"/>
   </w:num>
-  <w:num w:numId="24" w16cid:durableId="1249998342">
+  <w:num w:numId="24">
     <w:abstractNumId w:val="17"/>
   </w:num>
-  <w:num w:numId="25" w16cid:durableId="141393527">
+  <w:num w:numId="25">
     <w:abstractNumId w:val="1"/>
   </w:num>
 </w:numbering>
 </file>
 
 <file path=word/styles.xml><?xml version="1.0" encoding="utf-8"?>
-<w:styles xmlns:mc="http://schemas.openxmlformats.org/markup-compatibility/2006" xmlns:r="http://schemas.openxmlformats.org/officeDocument/2006/relationships" xmlns:w="http://schemas.openxmlformats.org/wordprocessingml/2006/main" xmlns:w14="http://schemas.microsoft.com/office/word/2010/wordml" xmlns:w15="http://schemas.microsoft.com/office/word/2012/wordml" xmlns:w16cex="http://schemas.microsoft.com/office/word/2018/wordml/cex" xmlns:w16cid="http://schemas.microsoft.com/office/word/2016/wordml/cid" xmlns:w16="http://schemas.microsoft.com/office/word/2018/wordml" xmlns:w16du="http://schemas.microsoft.com/office/word/2023/wordml/word16du" xmlns:w16sdtdh="http://schemas.microsoft.com/office/word/2020/wordml/sdtdatahash" xmlns:w16sdtfl="http://schemas.microsoft.com/office/word/2024/wordml/sdtformatlock" xmlns:w16se="http://schemas.microsoft.com/office/word/2015/wordml/symex" mc:Ignorable="w14 w15 w16se w16cid w16 w16cex w16sdtdh w16sdtfl w16du">
+<w:styles xmlns:mc="http://schemas.openxmlformats.org/markup-compatibility/2006" xmlns:r="http://schemas.openxmlformats.org/officeDocument/2006/relationships" xmlns:w="http://schemas.openxmlformats.org/wordprocessingml/2006/main" xmlns:w14="http://schemas.microsoft.com/office/word/2010/wordml" mc:Ignorable="w14">
   <w:docDefaults>
     <w:rPrDefault>
       <w:rPr>
@@ -11322,383 +10104,539 @@
       </w:pPr>
     </w:pPrDefault>
   </w:docDefaults>
-  <w:latentStyles w:defLockedState="0" w:defUIPriority="99" w:defSemiHidden="0" w:defUnhideWhenUsed="0" w:defQFormat="0" w:count="376">
-    <w:lsdException w:name="Normal" w:uiPriority="0" w:qFormat="1"/>
-    <w:lsdException w:name="heading 1" w:uiPriority="9" w:qFormat="1"/>
-    <w:lsdException w:name="heading 2" w:semiHidden="1" w:uiPriority="9" w:unhideWhenUsed="1" w:qFormat="1"/>
-    <w:lsdException w:name="heading 3" w:semiHidden="1" w:uiPriority="9" w:unhideWhenUsed="1" w:qFormat="1"/>
-    <w:lsdException w:name="heading 4" w:semiHidden="1" w:uiPriority="9" w:unhideWhenUsed="1" w:qFormat="1"/>
-    <w:lsdException w:name="heading 5" w:semiHidden="1" w:uiPriority="9" w:unhideWhenUsed="1" w:qFormat="1"/>
-    <w:lsdException w:name="heading 6" w:semiHidden="1" w:uiPriority="9" w:unhideWhenUsed="1" w:qFormat="1"/>
-    <w:lsdException w:name="heading 7" w:semiHidden="1" w:uiPriority="9" w:unhideWhenUsed="1" w:qFormat="1"/>
-    <w:lsdException w:name="heading 8" w:semiHidden="1" w:uiPriority="9" w:unhideWhenUsed="1" w:qFormat="1"/>
-    <w:lsdException w:name="heading 9" w:semiHidden="1" w:uiPriority="9" w:unhideWhenUsed="1" w:qFormat="1"/>
-    <w:lsdException w:name="index 1" w:semiHidden="1" w:unhideWhenUsed="1"/>
-    <w:lsdException w:name="index 2" w:semiHidden="1" w:unhideWhenUsed="1"/>
-    <w:lsdException w:name="index 3" w:semiHidden="1" w:unhideWhenUsed="1"/>
-    <w:lsdException w:name="index 4" w:semiHidden="1" w:unhideWhenUsed="1"/>
-    <w:lsdException w:name="index 5" w:semiHidden="1" w:unhideWhenUsed="1"/>
-    <w:lsdException w:name="index 6" w:semiHidden="1" w:unhideWhenUsed="1"/>
-    <w:lsdException w:name="index 7" w:semiHidden="1" w:unhideWhenUsed="1"/>
-    <w:lsdException w:name="index 8" w:semiHidden="1" w:unhideWhenUsed="1"/>
-    <w:lsdException w:name="index 9" w:semiHidden="1" w:unhideWhenUsed="1"/>
-    <w:lsdException w:name="toc 1" w:semiHidden="1" w:uiPriority="39" w:unhideWhenUsed="1"/>
-    <w:lsdException w:name="toc 2" w:semiHidden="1" w:uiPriority="39" w:unhideWhenUsed="1"/>
-    <w:lsdException w:name="toc 3" w:semiHidden="1" w:uiPriority="39" w:unhideWhenUsed="1"/>
-    <w:lsdException w:name="toc 4" w:semiHidden="1" w:uiPriority="39" w:unhideWhenUsed="1"/>
-    <w:lsdException w:name="toc 5" w:semiHidden="1" w:uiPriority="39" w:unhideWhenUsed="1"/>
-    <w:lsdException w:name="toc 6" w:semiHidden="1" w:uiPriority="39" w:unhideWhenUsed="1"/>
-    <w:lsdException w:name="toc 7" w:semiHidden="1" w:uiPriority="39" w:unhideWhenUsed="1"/>
-    <w:lsdException w:name="toc 8" w:semiHidden="1" w:uiPriority="39" w:unhideWhenUsed="1"/>
-    <w:lsdException w:name="toc 9" w:semiHidden="1" w:uiPriority="39" w:unhideWhenUsed="1"/>
-    <w:lsdException w:name="Normal Indent" w:semiHidden="1" w:unhideWhenUsed="1"/>
-    <w:lsdException w:name="footnote text" w:semiHidden="1" w:unhideWhenUsed="1"/>
-    <w:lsdException w:name="annotation text" w:semiHidden="1" w:unhideWhenUsed="1"/>
-    <w:lsdException w:name="header" w:semiHidden="1" w:unhideWhenUsed="1"/>
-    <w:lsdException w:name="footer" w:semiHidden="1" w:unhideWhenUsed="1"/>
-    <w:lsdException w:name="index heading" w:semiHidden="1" w:unhideWhenUsed="1"/>
-    <w:lsdException w:name="caption" w:semiHidden="1" w:uiPriority="35" w:unhideWhenUsed="1" w:qFormat="1"/>
-    <w:lsdException w:name="table of figures" w:semiHidden="1" w:unhideWhenUsed="1"/>
-    <w:lsdException w:name="envelope address" w:semiHidden="1" w:unhideWhenUsed="1"/>
-    <w:lsdException w:name="envelope return" w:semiHidden="1" w:unhideWhenUsed="1"/>
-    <w:lsdException w:name="footnote reference" w:semiHidden="1" w:unhideWhenUsed="1"/>
-    <w:lsdException w:name="annotation reference" w:semiHidden="1" w:unhideWhenUsed="1"/>
-    <w:lsdException w:name="line number" w:semiHidden="1" w:unhideWhenUsed="1"/>
-    <w:lsdException w:name="page number" w:semiHidden="1" w:unhideWhenUsed="1"/>
-    <w:lsdException w:name="endnote reference" w:semiHidden="1" w:unhideWhenUsed="1"/>
-    <w:lsdException w:name="endnote text" w:semiHidden="1" w:unhideWhenUsed="1"/>
-    <w:lsdException w:name="table of authorities" w:semiHidden="1" w:unhideWhenUsed="1"/>
-    <w:lsdException w:name="macro" w:semiHidden="1" w:unhideWhenUsed="1"/>
-    <w:lsdException w:name="toa heading" w:semiHidden="1" w:unhideWhenUsed="1"/>
-    <w:lsdException w:name="List" w:semiHidden="1" w:unhideWhenUsed="1"/>
-    <w:lsdException w:name="List Bullet" w:semiHidden="1" w:unhideWhenUsed="1"/>
-    <w:lsdException w:name="List Number" w:semiHidden="1" w:unhideWhenUsed="1"/>
-    <w:lsdException w:name="List 2" w:semiHidden="1" w:unhideWhenUsed="1"/>
-    <w:lsdException w:name="List 3" w:semiHidden="1" w:unhideWhenUsed="1"/>
-    <w:lsdException w:name="List 4" w:semiHidden="1" w:unhideWhenUsed="1"/>
-    <w:lsdException w:name="List 5" w:semiHidden="1" w:unhideWhenUsed="1"/>
-    <w:lsdException w:name="List Bullet 2" w:semiHidden="1" w:unhideWhenUsed="1"/>
-    <w:lsdException w:name="List Bullet 3" w:semiHidden="1" w:unhideWhenUsed="1"/>
-    <w:lsdException w:name="List Bullet 4" w:semiHidden="1" w:unhideWhenUsed="1"/>
-    <w:lsdException w:name="List Bullet 5" w:semiHidden="1" w:unhideWhenUsed="1"/>
-    <w:lsdException w:name="List Number 2" w:semiHidden="1" w:unhideWhenUsed="1"/>
-    <w:lsdException w:name="List Number 3" w:semiHidden="1" w:unhideWhenUsed="1"/>
-    <w:lsdException w:name="List Number 4" w:semiHidden="1" w:unhideWhenUsed="1"/>
-    <w:lsdException w:name="List Number 5" w:semiHidden="1" w:unhideWhenUsed="1"/>
-    <w:lsdException w:name="Title" w:uiPriority="10" w:qFormat="1"/>
-    <w:lsdException w:name="Closing" w:semiHidden="1" w:unhideWhenUsed="1"/>
-    <w:lsdException w:name="Signature" w:semiHidden="1" w:unhideWhenUsed="1"/>
-    <w:lsdException w:name="Default Paragraph Font" w:semiHidden="1" w:uiPriority="1" w:unhideWhenUsed="1"/>
-    <w:lsdException w:name="Body Text" w:semiHidden="1" w:unhideWhenUsed="1"/>
-    <w:lsdException w:name="Body Text Indent" w:semiHidden="1" w:unhideWhenUsed="1"/>
-    <w:lsdException w:name="List Continue" w:semiHidden="1" w:unhideWhenUsed="1"/>
-    <w:lsdException w:name="List Continue 2" w:semiHidden="1" w:unhideWhenUsed="1"/>
-    <w:lsdException w:name="List Continue 3" w:semiHidden="1" w:unhideWhenUsed="1"/>
-    <w:lsdException w:name="List Continue 4" w:semiHidden="1" w:unhideWhenUsed="1"/>
-    <w:lsdException w:name="List Continue 5" w:semiHidden="1" w:unhideWhenUsed="1"/>
-    <w:lsdException w:name="Message Header" w:semiHidden="1" w:unhideWhenUsed="1"/>
-    <w:lsdException w:name="Subtitle" w:uiPriority="11" w:qFormat="1"/>
-    <w:lsdException w:name="Salutation" w:semiHidden="1" w:unhideWhenUsed="1"/>
-    <w:lsdException w:name="Date" w:semiHidden="1" w:unhideWhenUsed="1"/>
-    <w:lsdException w:name="Body Text First Indent" w:semiHidden="1" w:unhideWhenUsed="1"/>
-    <w:lsdException w:name="Body Text First Indent 2" w:semiHidden="1" w:unhideWhenUsed="1"/>
-    <w:lsdException w:name="Note Heading" w:semiHidden="1" w:unhideWhenUsed="1"/>
-    <w:lsdException w:name="Body Text 2" w:semiHidden="1" w:unhideWhenUsed="1"/>
-    <w:lsdException w:name="Body Text 3" w:semiHidden="1" w:unhideWhenUsed="1"/>
-    <w:lsdException w:name="Body Text Indent 2" w:semiHidden="1" w:unhideWhenUsed="1"/>
-    <w:lsdException w:name="Body Text Indent 3" w:semiHidden="1" w:unhideWhenUsed="1"/>
-    <w:lsdException w:name="Block Text" w:semiHidden="1" w:unhideWhenUsed="1"/>
-    <w:lsdException w:name="Hyperlink" w:semiHidden="1" w:unhideWhenUsed="1"/>
-    <w:lsdException w:name="FollowedHyperlink" w:semiHidden="1" w:unhideWhenUsed="1"/>
-    <w:lsdException w:name="Strong" w:uiPriority="22" w:qFormat="1"/>
-    <w:lsdException w:name="Emphasis" w:uiPriority="20" w:qFormat="1"/>
-    <w:lsdException w:name="Document Map" w:semiHidden="1" w:unhideWhenUsed="1"/>
-    <w:lsdException w:name="Plain Text" w:semiHidden="1" w:unhideWhenUsed="1"/>
-    <w:lsdException w:name="E-mail Signature" w:semiHidden="1" w:unhideWhenUsed="1"/>
-    <w:lsdException w:name="HTML Top of Form" w:semiHidden="1" w:unhideWhenUsed="1"/>
-    <w:lsdException w:name="HTML Bottom of Form" w:semiHidden="1" w:unhideWhenUsed="1"/>
-    <w:lsdException w:name="Normal (Web)" w:semiHidden="1" w:unhideWhenUsed="1"/>
-    <w:lsdException w:name="HTML Acronym" w:semiHidden="1" w:unhideWhenUsed="1"/>
-    <w:lsdException w:name="HTML Address" w:semiHidden="1" w:unhideWhenUsed="1"/>
-    <w:lsdException w:name="HTML Cite" w:semiHidden="1" w:unhideWhenUsed="1"/>
-    <w:lsdException w:name="HTML Code" w:semiHidden="1" w:unhideWhenUsed="1"/>
-    <w:lsdException w:name="HTML Definition" w:semiHidden="1" w:unhideWhenUsed="1"/>
-    <w:lsdException w:name="HTML Keyboard" w:semiHidden="1" w:unhideWhenUsed="1"/>
-    <w:lsdException w:name="HTML Preformatted" w:semiHidden="1" w:unhideWhenUsed="1"/>
-    <w:lsdException w:name="HTML Sample" w:semiHidden="1" w:unhideWhenUsed="1"/>
-    <w:lsdException w:name="HTML Typewriter" w:semiHidden="1" w:unhideWhenUsed="1"/>
-    <w:lsdException w:name="HTML Variable" w:semiHidden="1" w:unhideWhenUsed="1"/>
-    <w:lsdException w:name="Normal Table" w:semiHidden="1" w:unhideWhenUsed="1"/>
-    <w:lsdException w:name="annotation subject" w:semiHidden="1" w:unhideWhenUsed="1"/>
-    <w:lsdException w:name="No List" w:semiHidden="1" w:unhideWhenUsed="1"/>
-    <w:lsdException w:name="Outline List 1" w:semiHidden="1" w:unhideWhenUsed="1"/>
-    <w:lsdException w:name="Outline List 2" w:semiHidden="1" w:unhideWhenUsed="1"/>
-    <w:lsdException w:name="Outline List 3" w:semiHidden="1" w:unhideWhenUsed="1"/>
-    <w:lsdException w:name="Table Simple 1" w:semiHidden="1" w:unhideWhenUsed="1"/>
-    <w:lsdException w:name="Table Simple 2" w:semiHidden="1" w:unhideWhenUsed="1"/>
-    <w:lsdException w:name="Table Simple 3" w:semiHidden="1" w:unhideWhenUsed="1"/>
-    <w:lsdException w:name="Table Classic 1" w:semiHidden="1" w:unhideWhenUsed="1"/>
-    <w:lsdException w:name="Table Classic 2" w:semiHidden="1" w:unhideWhenUsed="1"/>
-    <w:lsdException w:name="Table Classic 3" w:semiHidden="1" w:unhideWhenUsed="1"/>
-    <w:lsdException w:name="Table Classic 4" w:semiHidden="1" w:unhideWhenUsed="1"/>
-    <w:lsdException w:name="Table Colorful 1" w:semiHidden="1" w:unhideWhenUsed="1"/>
-    <w:lsdException w:name="Table Colorful 2" w:semiHidden="1" w:unhideWhenUsed="1"/>
-    <w:lsdException w:name="Table Colorful 3" w:semiHidden="1" w:unhideWhenUsed="1"/>
-    <w:lsdException w:name="Table Columns 1" w:semiHidden="1" w:unhideWhenUsed="1"/>
-    <w:lsdException w:name="Table Columns 2" w:semiHidden="1" w:unhideWhenUsed="1"/>
-    <w:lsdException w:name="Table Columns 3" w:semiHidden="1" w:unhideWhenUsed="1"/>
-    <w:lsdException w:name="Table Columns 4" w:semiHidden="1" w:unhideWhenUsed="1"/>
-    <w:lsdException w:name="Table Columns 5" w:semiHidden="1" w:unhideWhenUsed="1"/>
-    <w:lsdException w:name="Table Grid 1" w:semiHidden="1" w:unhideWhenUsed="1"/>
-    <w:lsdException w:name="Table Grid 2" w:semiHidden="1" w:unhideWhenUsed="1"/>
-    <w:lsdException w:name="Table Grid 3" w:semiHidden="1" w:unhideWhenUsed="1"/>
-    <w:lsdException w:name="Table Grid 4" w:semiHidden="1" w:unhideWhenUsed="1"/>
-    <w:lsdException w:name="Table Grid 5" w:semiHidden="1" w:unhideWhenUsed="1"/>
-    <w:lsdException w:name="Table Grid 6" w:semiHidden="1" w:unhideWhenUsed="1"/>
-    <w:lsdException w:name="Table Grid 7" w:semiHidden="1" w:unhideWhenUsed="1"/>
-    <w:lsdException w:name="Table Grid 8" w:semiHidden="1" w:unhideWhenUsed="1"/>
-    <w:lsdException w:name="Table List 1" w:semiHidden="1" w:unhideWhenUsed="1"/>
-    <w:lsdException w:name="Table List 2" w:semiHidden="1" w:unhideWhenUsed="1"/>
-    <w:lsdException w:name="Table List 3" w:semiHidden="1" w:unhideWhenUsed="1"/>
-    <w:lsdException w:name="Table List 4" w:semiHidden="1" w:unhideWhenUsed="1"/>
-    <w:lsdException w:name="Table List 5" w:semiHidden="1" w:unhideWhenUsed="1"/>
-    <w:lsdException w:name="Table List 6" w:semiHidden="1" w:unhideWhenUsed="1"/>
-    <w:lsdException w:name="Table List 7" w:semiHidden="1" w:unhideWhenUsed="1"/>
-    <w:lsdException w:name="Table List 8" w:semiHidden="1" w:unhideWhenUsed="1"/>
-    <w:lsdException w:name="Table 3D effects 1" w:semiHidden="1" w:unhideWhenUsed="1"/>
-    <w:lsdException w:name="Table 3D effects 2" w:semiHidden="1" w:unhideWhenUsed="1"/>
-    <w:lsdException w:name="Table 3D effects 3" w:semiHidden="1" w:unhideWhenUsed="1"/>
-    <w:lsdException w:name="Table Contemporary" w:semiHidden="1" w:unhideWhenUsed="1"/>
-    <w:lsdException w:name="Table Elegant" w:semiHidden="1" w:unhideWhenUsed="1"/>
-    <w:lsdException w:name="Table Professional" w:semiHidden="1" w:unhideWhenUsed="1"/>
-    <w:lsdException w:name="Table Subtle 1" w:semiHidden="1" w:unhideWhenUsed="1"/>
-    <w:lsdException w:name="Table Subtle 2" w:semiHidden="1" w:unhideWhenUsed="1"/>
-    <w:lsdException w:name="Table Web 1" w:semiHidden="1" w:unhideWhenUsed="1"/>
-    <w:lsdException w:name="Table Web 2" w:semiHidden="1" w:unhideWhenUsed="1"/>
-    <w:lsdException w:name="Table Web 3" w:semiHidden="1" w:unhideWhenUsed="1"/>
-    <w:lsdException w:name="Balloon Text" w:semiHidden="1" w:unhideWhenUsed="1"/>
-    <w:lsdException w:name="Table Grid" w:uiPriority="59"/>
-    <w:lsdException w:name="Table Theme" w:semiHidden="1" w:unhideWhenUsed="1"/>
-    <w:lsdException w:name="Placeholder Text" w:semiHidden="1"/>
-    <w:lsdException w:name="No Spacing" w:uiPriority="1" w:qFormat="1"/>
-    <w:lsdException w:name="Light Shading" w:uiPriority="60"/>
-    <w:lsdException w:name="Light List" w:uiPriority="61"/>
-    <w:lsdException w:name="Light Grid" w:uiPriority="62"/>
-    <w:lsdException w:name="Medium Shading 1" w:uiPriority="63"/>
-    <w:lsdException w:name="Medium Shading 2" w:uiPriority="64"/>
-    <w:lsdException w:name="Medium List 1" w:uiPriority="65"/>
-    <w:lsdException w:name="Medium List 2" w:uiPriority="66"/>
-    <w:lsdException w:name="Medium Grid 1" w:uiPriority="67"/>
-    <w:lsdException w:name="Medium Grid 2" w:uiPriority="68"/>
-    <w:lsdException w:name="Medium Grid 3" w:uiPriority="69"/>
-    <w:lsdException w:name="Dark List" w:uiPriority="70"/>
-    <w:lsdException w:name="Colorful Shading" w:uiPriority="71"/>
-    <w:lsdException w:name="Colorful List" w:uiPriority="72"/>
-    <w:lsdException w:name="Colorful Grid" w:uiPriority="73"/>
-    <w:lsdException w:name="Light Shading Accent 1" w:uiPriority="60"/>
-    <w:lsdException w:name="Light List Accent 1" w:uiPriority="61"/>
-    <w:lsdException w:name="Light Grid Accent 1" w:uiPriority="62"/>
-    <w:lsdException w:name="Medium Shading 1 Accent 1" w:uiPriority="63"/>
-    <w:lsdException w:name="Medium Shading 2 Accent 1" w:uiPriority="64"/>
-    <w:lsdException w:name="Medium List 1 Accent 1" w:uiPriority="65"/>
-    <w:lsdException w:name="Revision" w:semiHidden="1"/>
-    <w:lsdException w:name="List Paragraph" w:uiPriority="34" w:qFormat="1"/>
-    <w:lsdException w:name="Quote" w:uiPriority="29" w:qFormat="1"/>
-    <w:lsdException w:name="Intense Quote" w:uiPriority="30" w:qFormat="1"/>
-    <w:lsdException w:name="Medium List 2 Accent 1" w:uiPriority="66"/>
-    <w:lsdException w:name="Medium Grid 1 Accent 1" w:uiPriority="67"/>
-    <w:lsdException w:name="Medium Grid 2 Accent 1" w:uiPriority="68"/>
-    <w:lsdException w:name="Medium Grid 3 Accent 1" w:uiPriority="69"/>
-    <w:lsdException w:name="Dark List Accent 1" w:uiPriority="70"/>
-    <w:lsdException w:name="Colorful Shading Accent 1" w:uiPriority="71"/>
-    <w:lsdException w:name="Colorful List Accent 1" w:uiPriority="72"/>
-    <w:lsdException w:name="Colorful Grid Accent 1" w:uiPriority="73"/>
-    <w:lsdException w:name="Light Shading Accent 2" w:uiPriority="60"/>
-    <w:lsdException w:name="Light List Accent 2" w:uiPriority="61"/>
-    <w:lsdException w:name="Light Grid Accent 2" w:uiPriority="62"/>
-    <w:lsdException w:name="Medium Shading 1 Accent 2" w:uiPriority="63"/>
-    <w:lsdException w:name="Medium Shading 2 Accent 2" w:uiPriority="64"/>
-    <w:lsdException w:name="Medium List 1 Accent 2" w:uiPriority="65"/>
-    <w:lsdException w:name="Medium List 2 Accent 2" w:uiPriority="66"/>
-    <w:lsdException w:name="Medium Grid 1 Accent 2" w:uiPriority="67"/>
-    <w:lsdException w:name="Medium Grid 2 Accent 2" w:uiPriority="68"/>
-    <w:lsdException w:name="Medium Grid 3 Accent 2" w:uiPriority="69"/>
-    <w:lsdException w:name="Dark List Accent 2" w:uiPriority="70"/>
-    <w:lsdException w:name="Colorful Shading Accent 2" w:uiPriority="71"/>
-    <w:lsdException w:name="Colorful List Accent 2" w:uiPriority="72"/>
-    <w:lsdException w:name="Colorful Grid Accent 2" w:uiPriority="73"/>
-    <w:lsdException w:name="Light Shading Accent 3" w:uiPriority="60"/>
-    <w:lsdException w:name="Light List Accent 3" w:uiPriority="61"/>
-    <w:lsdException w:name="Light Grid Accent 3" w:uiPriority="62"/>
-    <w:lsdException w:name="Medium Shading 1 Accent 3" w:uiPriority="63"/>
-    <w:lsdException w:name="Medium Shading 2 Accent 3" w:uiPriority="64"/>
-    <w:lsdException w:name="Medium List 1 Accent 3" w:uiPriority="65"/>
-    <w:lsdException w:name="Medium List 2 Accent 3" w:uiPriority="66"/>
-    <w:lsdException w:name="Medium Grid 1 Accent 3" w:uiPriority="67"/>
-    <w:lsdException w:name="Medium Grid 2 Accent 3" w:uiPriority="68"/>
-    <w:lsdException w:name="Medium Grid 3 Accent 3" w:uiPriority="69"/>
-    <w:lsdException w:name="Dark List Accent 3" w:uiPriority="70"/>
-    <w:lsdException w:name="Colorful Shading Accent 3" w:uiPriority="71"/>
-    <w:lsdException w:name="Colorful List Accent 3" w:uiPriority="72"/>
-    <w:lsdException w:name="Colorful Grid Accent 3" w:uiPriority="73"/>
-    <w:lsdException w:name="Light Shading Accent 4" w:uiPriority="60"/>
-    <w:lsdException w:name="Light List Accent 4" w:uiPriority="61"/>
-    <w:lsdException w:name="Light Grid Accent 4" w:uiPriority="62"/>
-    <w:lsdException w:name="Medium Shading 1 Accent 4" w:uiPriority="63"/>
-    <w:lsdException w:name="Medium Shading 2 Accent 4" w:uiPriority="64"/>
-    <w:lsdException w:name="Medium List 1 Accent 4" w:uiPriority="65"/>
-    <w:lsdException w:name="Medium List 2 Accent 4" w:uiPriority="66"/>
-    <w:lsdException w:name="Medium Grid 1 Accent 4" w:uiPriority="67"/>
-    <w:lsdException w:name="Medium Grid 2 Accent 4" w:uiPriority="68"/>
-    <w:lsdException w:name="Medium Grid 3 Accent 4" w:uiPriority="69"/>
-    <w:lsdException w:name="Dark List Accent 4" w:uiPriority="70"/>
-    <w:lsdException w:name="Colorful Shading Accent 4" w:uiPriority="71"/>
-    <w:lsdException w:name="Colorful List Accent 4" w:uiPriority="72"/>
-    <w:lsdException w:name="Colorful Grid Accent 4" w:uiPriority="73"/>
-    <w:lsdException w:name="Light Shading Accent 5" w:uiPriority="60"/>
-    <w:lsdException w:name="Light List Accent 5" w:uiPriority="61"/>
-    <w:lsdException w:name="Light Grid Accent 5" w:uiPriority="62"/>
-    <w:lsdException w:name="Medium Shading 1 Accent 5" w:uiPriority="63"/>
-    <w:lsdException w:name="Medium Shading 2 Accent 5" w:uiPriority="64"/>
-    <w:lsdException w:name="Medium List 1 Accent 5" w:uiPriority="65"/>
-    <w:lsdException w:name="Medium List 2 Accent 5" w:uiPriority="66"/>
-    <w:lsdException w:name="Medium Grid 1 Accent 5" w:uiPriority="67"/>
-    <w:lsdException w:name="Medium Grid 2 Accent 5" w:uiPriority="68"/>
-    <w:lsdException w:name="Medium Grid 3 Accent 5" w:uiPriority="69"/>
-    <w:lsdException w:name="Dark List Accent 5" w:uiPriority="70"/>
-    <w:lsdException w:name="Colorful Shading Accent 5" w:uiPriority="71"/>
-    <w:lsdException w:name="Colorful List Accent 5" w:uiPriority="72"/>
-    <w:lsdException w:name="Colorful Grid Accent 5" w:uiPriority="73"/>
-    <w:lsdException w:name="Light Shading Accent 6" w:uiPriority="60"/>
-    <w:lsdException w:name="Light List Accent 6" w:uiPriority="61"/>
-    <w:lsdException w:name="Light Grid Accent 6" w:uiPriority="62"/>
-    <w:lsdException w:name="Medium Shading 1 Accent 6" w:uiPriority="63"/>
-    <w:lsdException w:name="Medium Shading 2 Accent 6" w:uiPriority="64"/>
-    <w:lsdException w:name="Medium List 1 Accent 6" w:uiPriority="65"/>
-    <w:lsdException w:name="Medium List 2 Accent 6" w:uiPriority="66"/>
-    <w:lsdException w:name="Medium Grid 1 Accent 6" w:uiPriority="67"/>
-    <w:lsdException w:name="Medium Grid 2 Accent 6" w:uiPriority="68"/>
-    <w:lsdException w:name="Medium Grid 3 Accent 6" w:uiPriority="69"/>
-    <w:lsdException w:name="Dark List Accent 6" w:uiPriority="70"/>
-    <w:lsdException w:name="Colorful Shading Accent 6" w:uiPriority="71"/>
-    <w:lsdException w:name="Colorful List Accent 6" w:uiPriority="72"/>
-    <w:lsdException w:name="Colorful Grid Accent 6" w:uiPriority="73"/>
-    <w:lsdException w:name="Subtle Emphasis" w:uiPriority="19" w:qFormat="1"/>
-    <w:lsdException w:name="Intense Emphasis" w:uiPriority="21" w:qFormat="1"/>
-    <w:lsdException w:name="Subtle Reference" w:uiPriority="31" w:qFormat="1"/>
-    <w:lsdException w:name="Intense Reference" w:uiPriority="32" w:qFormat="1"/>
-    <w:lsdException w:name="Book Title" w:uiPriority="33" w:qFormat="1"/>
-    <w:lsdException w:name="Bibliography" w:semiHidden="1" w:uiPriority="37" w:unhideWhenUsed="1"/>
-    <w:lsdException w:name="TOC Heading" w:semiHidden="1" w:uiPriority="39" w:unhideWhenUsed="1" w:qFormat="1"/>
-    <w:lsdException w:name="Plain Table 1" w:uiPriority="41"/>
-    <w:lsdException w:name="Plain Table 2" w:uiPriority="42"/>
-    <w:lsdException w:name="Plain Table 3" w:uiPriority="43"/>
-    <w:lsdException w:name="Plain Table 4" w:uiPriority="44"/>
-    <w:lsdException w:name="Plain Table 5" w:uiPriority="45"/>
-    <w:lsdException w:name="Grid Table Light" w:uiPriority="40"/>
-    <w:lsdException w:name="Grid Table 1 Light" w:uiPriority="46"/>
-    <w:lsdException w:name="Grid Table 2" w:uiPriority="47"/>
-    <w:lsdException w:name="Grid Table 3" w:uiPriority="48"/>
-    <w:lsdException w:name="Grid Table 4" w:uiPriority="49"/>
-    <w:lsdException w:name="Grid Table 5 Dark" w:uiPriority="50"/>
-    <w:lsdException w:name="Grid Table 6 Colorful" w:uiPriority="51"/>
-    <w:lsdException w:name="Grid Table 7 Colorful" w:uiPriority="52"/>
-    <w:lsdException w:name="Grid Table 1 Light Accent 1" w:uiPriority="46"/>
-    <w:lsdException w:name="Grid Table 2 Accent 1" w:uiPriority="47"/>
-    <w:lsdException w:name="Grid Table 3 Accent 1" w:uiPriority="48"/>
-    <w:lsdException w:name="Grid Table 4 Accent 1" w:uiPriority="49"/>
-    <w:lsdException w:name="Grid Table 5 Dark Accent 1" w:uiPriority="50"/>
-    <w:lsdException w:name="Grid Table 6 Colorful Accent 1" w:uiPriority="51"/>
-    <w:lsdException w:name="Grid Table 7 Colorful Accent 1" w:uiPriority="52"/>
-    <w:lsdException w:name="Grid Table 1 Light Accent 2" w:uiPriority="46"/>
-    <w:lsdException w:name="Grid Table 2 Accent 2" w:uiPriority="47"/>
-    <w:lsdException w:name="Grid Table 3 Accent 2" w:uiPriority="48"/>
-    <w:lsdException w:name="Grid Table 4 Accent 2" w:uiPriority="49"/>
-    <w:lsdException w:name="Grid Table 5 Dark Accent 2" w:uiPriority="50"/>
-    <w:lsdException w:name="Grid Table 6 Colorful Accent 2" w:uiPriority="51"/>
-    <w:lsdException w:name="Grid Table 7 Colorful Accent 2" w:uiPriority="52"/>
-    <w:lsdException w:name="Grid Table 1 Light Accent 3" w:uiPriority="46"/>
-    <w:lsdException w:name="Grid Table 2 Accent 3" w:uiPriority="47"/>
-    <w:lsdException w:name="Grid Table 3 Accent 3" w:uiPriority="48"/>
-    <w:lsdException w:name="Grid Table 4 Accent 3" w:uiPriority="49"/>
-    <w:lsdException w:name="Grid Table 5 Dark Accent 3" w:uiPriority="50"/>
-    <w:lsdException w:name="Grid Table 6 Colorful Accent 3" w:uiPriority="51"/>
-    <w:lsdException w:name="Grid Table 7 Colorful Accent 3" w:uiPriority="52"/>
-    <w:lsdException w:name="Grid Table 1 Light Accent 4" w:uiPriority="46"/>
-    <w:lsdException w:name="Grid Table 2 Accent 4" w:uiPriority="47"/>
-    <w:lsdException w:name="Grid Table 3 Accent 4" w:uiPriority="48"/>
-    <w:lsdException w:name="Grid Table 4 Accent 4" w:uiPriority="49"/>
-    <w:lsdException w:name="Grid Table 5 Dark Accent 4" w:uiPriority="50"/>
-    <w:lsdException w:name="Grid Table 6 Colorful Accent 4" w:uiPriority="51"/>
-    <w:lsdException w:name="Grid Table 7 Colorful Accent 4" w:uiPriority="52"/>
-    <w:lsdException w:name="Grid Table 1 Light Accent 5" w:uiPriority="46"/>
-    <w:lsdException w:name="Grid Table 2 Accent 5" w:uiPriority="47"/>
-    <w:lsdException w:name="Grid Table 3 Accent 5" w:uiPriority="48"/>
-    <w:lsdException w:name="Grid Table 4 Accent 5" w:uiPriority="49"/>
-    <w:lsdException w:name="Grid Table 5 Dark Accent 5" w:uiPriority="50"/>
-    <w:lsdException w:name="Grid Table 6 Colorful Accent 5" w:uiPriority="51"/>
-    <w:lsdException w:name="Grid Table 7 Colorful Accent 5" w:uiPriority="52"/>
-    <w:lsdException w:name="Grid Table 1 Light Accent 6" w:uiPriority="46"/>
-    <w:lsdException w:name="Grid Table 2 Accent 6" w:uiPriority="47"/>
-    <w:lsdException w:name="Grid Table 3 Accent 6" w:uiPriority="48"/>
-    <w:lsdException w:name="Grid Table 4 Accent 6" w:uiPriority="49"/>
-    <w:lsdException w:name="Grid Table 5 Dark Accent 6" w:uiPriority="50"/>
-    <w:lsdException w:name="Grid Table 6 Colorful Accent 6" w:uiPriority="51"/>
-    <w:lsdException w:name="Grid Table 7 Colorful Accent 6" w:uiPriority="52"/>
-    <w:lsdException w:name="List Table 1 Light" w:uiPriority="46"/>
-    <w:lsdException w:name="List Table 2" w:uiPriority="47"/>
-    <w:lsdException w:name="List Table 3" w:uiPriority="48"/>
-    <w:lsdException w:name="List Table 4" w:uiPriority="49"/>
-    <w:lsdException w:name="List Table 5 Dark" w:uiPriority="50"/>
-    <w:lsdException w:name="List Table 6 Colorful" w:uiPriority="51"/>
-    <w:lsdException w:name="List Table 7 Colorful" w:uiPriority="52"/>
-    <w:lsdException w:name="List Table 1 Light Accent 1" w:uiPriority="46"/>
-    <w:lsdException w:name="List Table 2 Accent 1" w:uiPriority="47"/>
-    <w:lsdException w:name="List Table 3 Accent 1" w:uiPriority="48"/>
-    <w:lsdException w:name="List Table 4 Accent 1" w:uiPriority="49"/>
-    <w:lsdException w:name="List Table 5 Dark Accent 1" w:uiPriority="50"/>
-    <w:lsdException w:name="List Table 6 Colorful Accent 1" w:uiPriority="51"/>
-    <w:lsdException w:name="List Table 7 Colorful Accent 1" w:uiPriority="52"/>
-    <w:lsdException w:name="List Table 1 Light Accent 2" w:uiPriority="46"/>
-    <w:lsdException w:name="List Table 2 Accent 2" w:uiPriority="47"/>
-    <w:lsdException w:name="List Table 3 Accent 2" w:uiPriority="48"/>
-    <w:lsdException w:name="List Table 4 Accent 2" w:uiPriority="49"/>
-    <w:lsdException w:name="List Table 5 Dark Accent 2" w:uiPriority="50"/>
-    <w:lsdException w:name="List Table 6 Colorful Accent 2" w:uiPriority="51"/>
-    <w:lsdException w:name="List Table 7 Colorful Accent 2" w:uiPriority="52"/>
-    <w:lsdException w:name="List Table 1 Light Accent 3" w:uiPriority="46"/>
-    <w:lsdException w:name="List Table 2 Accent 3" w:uiPriority="47"/>
-    <w:lsdException w:name="List Table 3 Accent 3" w:uiPriority="48"/>
-    <w:lsdException w:name="List Table 4 Accent 3" w:uiPriority="49"/>
-    <w:lsdException w:name="List Table 5 Dark Accent 3" w:uiPriority="50"/>
-    <w:lsdException w:name="List Table 6 Colorful Accent 3" w:uiPriority="51"/>
-    <w:lsdException w:name="List Table 7 Colorful Accent 3" w:uiPriority="52"/>
-    <w:lsdException w:name="List Table 1 Light Accent 4" w:uiPriority="46"/>
-    <w:lsdException w:name="List Table 2 Accent 4" w:uiPriority="47"/>
-    <w:lsdException w:name="List Table 3 Accent 4" w:uiPriority="48"/>
-    <w:lsdException w:name="List Table 4 Accent 4" w:uiPriority="49"/>
-    <w:lsdException w:name="List Table 5 Dark Accent 4" w:uiPriority="50"/>
-    <w:lsdException w:name="List Table 6 Colorful Accent 4" w:uiPriority="51"/>
-    <w:lsdException w:name="List Table 7 Colorful Accent 4" w:uiPriority="52"/>
-    <w:lsdException w:name="List Table 1 Light Accent 5" w:uiPriority="46"/>
-    <w:lsdException w:name="List Table 2 Accent 5" w:uiPriority="47"/>
-    <w:lsdException w:name="List Table 3 Accent 5" w:uiPriority="48"/>
-    <w:lsdException w:name="List Table 4 Accent 5" w:uiPriority="49"/>
-    <w:lsdException w:name="List Table 5 Dark Accent 5" w:uiPriority="50"/>
-    <w:lsdException w:name="List Table 6 Colorful Accent 5" w:uiPriority="51"/>
-    <w:lsdException w:name="List Table 7 Colorful Accent 5" w:uiPriority="52"/>
-    <w:lsdException w:name="List Table 1 Light Accent 6" w:uiPriority="46"/>
-    <w:lsdException w:name="List Table 2 Accent 6" w:uiPriority="47"/>
-    <w:lsdException w:name="List Table 3 Accent 6" w:uiPriority="48"/>
-    <w:lsdException w:name="List Table 4 Accent 6" w:uiPriority="49"/>
-    <w:lsdException w:name="List Table 5 Dark Accent 6" w:uiPriority="50"/>
-    <w:lsdException w:name="List Table 6 Colorful Accent 6" w:uiPriority="51"/>
-    <w:lsdException w:name="List Table 7 Colorful Accent 6" w:uiPriority="52"/>
-    <w:lsdException w:name="Mention" w:semiHidden="1" w:unhideWhenUsed="1"/>
-    <w:lsdException w:name="Smart Hyperlink" w:semiHidden="1" w:unhideWhenUsed="1"/>
-    <w:lsdException w:name="Hashtag" w:semiHidden="1" w:unhideWhenUsed="1"/>
-    <w:lsdException w:name="Unresolved Mention" w:semiHidden="1" w:unhideWhenUsed="1"/>
-    <w:lsdException w:name="Smart Link" w:semiHidden="1" w:unhideWhenUsed="1"/>
+  <w:latentStyles w:defLockedState="0" w:defUIPriority="99" w:defSemiHidden="1" w:defUnhideWhenUsed="1" w:defQFormat="0" w:count="267">
+    <w:lsdException w:name="Normal" w:semiHidden="0" w:uiPriority="0" w:unhideWhenUsed="0" w:qFormat="1"/>
+    <w:lsdException w:name="heading 1" w:semiHidden="0" w:uiPriority="9" w:unhideWhenUsed="0" w:qFormat="1"/>
+    <w:lsdException w:name="heading 2" w:uiPriority="9" w:qFormat="1"/>
+    <w:lsdException w:name="heading 3" w:uiPriority="9" w:qFormat="1"/>
+    <w:lsdException w:name="heading 4" w:uiPriority="9" w:qFormat="1"/>
+    <w:lsdException w:name="heading 5" w:uiPriority="9" w:qFormat="1"/>
+    <w:lsdException w:name="heading 6" w:uiPriority="9" w:qFormat="1"/>
+    <w:lsdException w:name="heading 7" w:uiPriority="9" w:qFormat="1"/>
+    <w:lsdException w:name="heading 8" w:uiPriority="9" w:qFormat="1"/>
+    <w:lsdException w:name="heading 9" w:uiPriority="9" w:qFormat="1"/>
+    <w:lsdException w:name="toc 1" w:uiPriority="39"/>
+    <w:lsdException w:name="toc 2" w:uiPriority="39"/>
+    <w:lsdException w:name="toc 3" w:uiPriority="39"/>
+    <w:lsdException w:name="toc 4" w:uiPriority="39"/>
+    <w:lsdException w:name="toc 5" w:uiPriority="39"/>
+    <w:lsdException w:name="toc 6" w:uiPriority="39"/>
+    <w:lsdException w:name="toc 7" w:uiPriority="39"/>
+    <w:lsdException w:name="toc 8" w:uiPriority="39"/>
+    <w:lsdException w:name="toc 9" w:uiPriority="39"/>
+    <w:lsdException w:name="caption" w:uiPriority="35" w:qFormat="1"/>
+    <w:lsdException w:name="Title" w:semiHidden="0" w:uiPriority="10" w:unhideWhenUsed="0" w:qFormat="1"/>
+    <w:lsdException w:name="Default Paragraph Font" w:uiPriority="1"/>
+    <w:lsdException w:name="Subtitle" w:semiHidden="0" w:uiPriority="11" w:unhideWhenUsed="0" w:qFormat="1"/>
+    <w:lsdException w:name="Strong" w:semiHidden="0" w:uiPriority="22" w:unhideWhenUsed="0" w:qFormat="1"/>
+    <w:lsdException w:name="Emphasis" w:semiHidden="0" w:uiPriority="20" w:unhideWhenUsed="0" w:qFormat="1"/>
+    <w:lsdException w:name="Table Grid" w:semiHidden="0" w:uiPriority="59" w:unhideWhenUsed="0"/>
+    <w:lsdException w:name="Placeholder Text" w:unhideWhenUsed="0"/>
+    <w:lsdException w:name="No Spacing" w:semiHidden="0" w:uiPriority="1" w:unhideWhenUsed="0" w:qFormat="1"/>
+    <w:lsdException w:name="Light Shading" w:semiHidden="0" w:uiPriority="60" w:unhideWhenUsed="0"/>
+    <w:lsdException w:name="Light List" w:semiHidden="0" w:uiPriority="61" w:unhideWhenUsed="0"/>
+    <w:lsdException w:name="Light Grid" w:semiHidden="0" w:uiPriority="62" w:unhideWhenUsed="0"/>
+    <w:lsdException w:name="Medium Shading 1" w:semiHidden="0" w:uiPriority="63" w:unhideWhenUsed="0"/>
+    <w:lsdException w:name="Medium Shading 2" w:semiHidden="0" w:uiPriority="64" w:unhideWhenUsed="0"/>
+    <w:lsdException w:name="Medium List 1" w:semiHidden="0" w:uiPriority="65" w:unhideWhenUsed="0"/>
+    <w:lsdException w:name="Medium List 2" w:semiHidden="0" w:uiPriority="66" w:unhideWhenUsed="0"/>
+    <w:lsdException w:name="Medium Grid 1" w:semiHidden="0" w:uiPriority="67" w:unhideWhenUsed="0"/>
+    <w:lsdException w:name="Medium Grid 2" w:semiHidden="0" w:uiPriority="68" w:unhideWhenUsed="0"/>
+    <w:lsdException w:name="Medium Grid 3" w:semiHidden="0" w:uiPriority="69" w:unhideWhenUsed="0"/>
+    <w:lsdException w:name="Dark List" w:semiHidden="0" w:uiPriority="70" w:unhideWhenUsed="0"/>
+    <w:lsdException w:name="Colorful Shading" w:semiHidden="0" w:uiPriority="71" w:unhideWhenUsed="0"/>
+    <w:lsdException w:name="Colorful List" w:semiHidden="0" w:uiPriority="72" w:unhideWhenUsed="0"/>
+    <w:lsdException w:name="Colorful Grid" w:semiHidden="0" w:uiPriority="73" w:unhideWhenUsed="0"/>
+    <w:lsdException w:name="Light Shading Accent 1" w:semiHidden="0" w:uiPriority="60" w:unhideWhenUsed="0"/>
+    <w:lsdException w:name="Light List Accent 1" w:semiHidden="0" w:uiPriority="61" w:unhideWhenUsed="0"/>
+    <w:lsdException w:name="Light Grid Accent 1" w:semiHidden="0" w:uiPriority="62" w:unhideWhenUsed="0"/>
+    <w:lsdException w:name="Medium Shading 1 Accent 1" w:semiHidden="0" w:uiPriority="63" w:unhideWhenUsed="0"/>
+    <w:lsdException w:name="Medium Shading 2 Accent 1" w:semiHidden="0" w:uiPriority="64" w:unhideWhenUsed="0"/>
+    <w:lsdException w:name="Medium List 1 Accent 1" w:semiHidden="0" w:uiPriority="65" w:unhideWhenUsed="0"/>
+    <w:lsdException w:name="Revision" w:unhideWhenUsed="0"/>
+    <w:lsdException w:name="List Paragraph" w:semiHidden="0" w:uiPriority="34" w:unhideWhenUsed="0" w:qFormat="1"/>
+    <w:lsdException w:name="Quote" w:semiHidden="0" w:uiPriority="29" w:unhideWhenUsed="0" w:qFormat="1"/>
+    <w:lsdException w:name="Intense Quote" w:semiHidden="0" w:uiPriority="30" w:unhideWhenUsed="0" w:qFormat="1"/>
+    <w:lsdException w:name="Medium List 2 Accent 1" w:semiHidden="0" w:uiPriority="66" w:unhideWhenUsed="0"/>
+    <w:lsdException w:name="Medium Grid 1 Accent 1" w:semiHidden="0" w:uiPriority="67" w:unhideWhenUsed="0"/>
+    <w:lsdException w:name="Medium Grid 2 Accent 1" w:semiHidden="0" w:uiPriority="68" w:unhideWhenUsed="0"/>
+    <w:lsdException w:name="Medium Grid 3 Accent 1" w:semiHidden="0" w:uiPriority="69" w:unhideWhenUsed="0"/>
+    <w:lsdException w:name="Dark List Accent 1" w:semiHidden="0" w:uiPriority="70" w:unhideWhenUsed="0"/>
+    <w:lsdException w:name="Colorful Shading Accent 1" w:semiHidden="0" w:uiPriority="71" w:unhideWhenUsed="0"/>
+    <w:lsdException w:name="Colorful List Accent 1" w:semiHidden="0" w:uiPriority="72" w:unhideWhenUsed="0"/>
+    <w:lsdException w:name="Colorful Grid Accent 1" w:semiHidden="0" w:uiPriority="73" w:unhideWhenUsed="0"/>
+    <w:lsdException w:name="Light Shading Accent 2" w:semiHidden="0" w:uiPriority="60" w:unhideWhenUsed="0"/>
+    <w:lsdException w:name="Light List Accent 2" w:semiHidden="0" w:uiPriority="61" w:unhideWhenUsed="0"/>
+    <w:lsdException w:name="Light Grid Accent 2" w:semiHidden="0" w:uiPriority="62" w:unhideWhenUsed="0"/>
+    <w:lsdException w:name="Medium Shading 1 Accent 2" w:semiHidden="0" w:uiPriority="63" w:unhideWhenUsed="0"/>
+    <w:lsdException w:name="Medium Shading 2 Accent 2" w:semiHidden="0" w:uiPriority="64" w:unhideWhenUsed="0"/>
+    <w:lsdException w:name="Medium List 1 Accent 2" w:semiHidden="0" w:uiPriority="65" w:unhideWhenUsed="0"/>
+    <w:lsdException w:name="Medium List 2 Accent 2" w:semiHidden="0" w:uiPriority="66" w:unhideWhenUsed="0"/>
+    <w:lsdException w:name="Medium Grid 1 Accent 2" w:semiHidden="0" w:uiPriority="67" w:unhideWhenUsed="0"/>
+    <w:lsdException w:name="Medium Grid 2 Accent 2" w:semiHidden="0" w:uiPriority="68" w:unhideWhenUsed="0"/>
+    <w:lsdException w:name="Medium Grid 3 Accent 2" w:semiHidden="0" w:uiPriority="69" w:unhideWhenUsed="0"/>
+    <w:lsdException w:name="Dark List Accent 2" w:semiHidden="0" w:uiPriority="70" w:unhideWhenUsed="0"/>
+    <w:lsdException w:name="Colorful Shading Accent 2" w:semiHidden="0" w:uiPriority="71" w:unhideWhenUsed="0"/>
+    <w:lsdException w:name="Colorful List Accent 2" w:semiHidden="0" w:uiPriority="72" w:unhideWhenUsed="0"/>
+    <w:lsdException w:name="Colorful Grid Accent 2" w:semiHidden="0" w:uiPriority="73" w:unhideWhenUsed="0"/>
+    <w:lsdException w:name="Light Shading Accent 3" w:semiHidden="0" w:uiPriority="60" w:unhideWhenUsed="0"/>
+    <w:lsdException w:name="Light List Accent 3" w:semiHidden="0" w:uiPriority="61" w:unhideWhenUsed="0"/>
+    <w:lsdException w:name="Light Grid Accent 3" w:semiHidden="0" w:uiPriority="62" w:unhideWhenUsed="0"/>
+    <w:lsdException w:name="Medium Shading 1 Accent 3" w:semiHidden="0" w:uiPriority="63" w:unhideWhenUsed="0"/>
+    <w:lsdException w:name="Medium Shading 2 Accent 3" w:semiHidden="0" w:uiPriority="64" w:unhideWhenUsed="0"/>
+    <w:lsdException w:name="Medium List 1 Accent 3" w:semiHidden="0" w:uiPriority="65" w:unhideWhenUsed="0"/>
+    <w:lsdException w:name="Medium List 2 Accent 3" w:semiHidden="0" w:uiPriority="66" w:unhideWhenUsed="0"/>
+    <w:lsdException w:name="Medium Grid 1 Accent 3" w:semiHidden="0" w:uiPriority="67" w:unhideWhenUsed="0"/>
+    <w:lsdException w:name="Medium Grid 2 Accent 3" w:semiHidden="0" w:uiPriority="68" w:unhideWhenUsed="0"/>
+    <w:lsdException w:name="Medium Grid 3 Accent 3" w:semiHidden="0" w:uiPriority="69" w:unhideWhenUsed="0"/>
+    <w:lsdException w:name="Dark List Accent 3" w:semiHidden="0" w:uiPriority="70" w:unhideWhenUsed="0"/>
+    <w:lsdException w:name="Colorful Shading Accent 3" w:semiHidden="0" w:uiPriority="71" w:unhideWhenUsed="0"/>
+    <w:lsdException w:name="Colorful List Accent 3" w:semiHidden="0" w:uiPriority="72" w:unhideWhenUsed="0"/>
+    <w:lsdException w:name="Colorful Grid Accent 3" w:semiHidden="0" w:uiPriority="73" w:unhideWhenUsed="0"/>
+    <w:lsdException w:name="Light Shading Accent 4" w:semiHidden="0" w:uiPriority="60" w:unhideWhenUsed="0"/>
+    <w:lsdException w:name="Light List Accent 4" w:semiHidden="0" w:uiPriority="61" w:unhideWhenUsed="0"/>
+    <w:lsdException w:name="Light Grid Accent 4" w:semiHidden="0" w:uiPriority="62" w:unhideWhenUsed="0"/>
+    <w:lsdException w:name="Medium Shading 1 Accent 4" w:semiHidden="0" w:uiPriority="63" w:unhideWhenUsed="0"/>
+    <w:lsdException w:name="Medium Shading 2 Accent 4" w:semiHidden="0" w:uiPriority="64" w:unhideWhenUsed="0"/>
+    <w:lsdException w:name="Medium List 1 Accent 4" w:semiHidden="0" w:uiPriority="65" w:unhideWhenUsed="0"/>
+    <w:lsdException w:name="Medium List 2 Accent 4" w:semiHidden="0" w:uiPriority="66" w:unhideWhenUsed="0"/>
+    <w:lsdException w:name="Medium Grid 1 Accent 4" w:semiHidden="0" w:uiPriority="67" w:unhideWhenUsed="0"/>
+    <w:lsdException w:name="Medium Grid 2 Accent 4" w:semiHidden="0" w:uiPriority="68" w:unhideWhenUsed="0"/>
+    <w:lsdException w:name="Medium Grid 3 Accent 4" w:semiHidden="0" w:uiPriority="69" w:unhideWhenUsed="0"/>
+    <w:lsdException w:name="Dark List Accent 4" w:semiHidden="0" w:uiPriority="70" w:unhideWhenUsed="0"/>
+    <w:lsdException w:name="Colorful Shading Accent 4" w:semiHidden="0" w:uiPriority="71" w:unhideWhenUsed="0"/>
+    <w:lsdException w:name="Colorful List Accent 4" w:semiHidden="0" w:uiPriority="72" w:unhideWhenUsed="0"/>
+    <w:lsdException w:name="Colorful Grid Accent 4" w:semiHidden="0" w:uiPriority="73" w:unhideWhenUsed="0"/>
+    <w:lsdException w:name="Light Shading Accent 5" w:semiHidden="0" w:uiPriority="60" w:unhideWhenUsed="0"/>
+    <w:lsdException w:name="Light List Accent 5" w:semiHidden="0" w:uiPriority="61" w:unhideWhenUsed="0"/>
+    <w:lsdException w:name="Light Grid Accent 5" w:semiHidden="0" w:uiPriority="62" w:unhideWhenUsed="0"/>
+    <w:lsdException w:name="Medium Shading 1 Accent 5" w:semiHidden="0" w:uiPriority="63" w:unhideWhenUsed="0"/>
+    <w:lsdException w:name="Medium Shading 2 Accent 5" w:semiHidden="0" w:uiPriority="64" w:unhideWhenUsed="0"/>
+    <w:lsdException w:name="Medium List 1 Accent 5" w:semiHidden="0" w:uiPriority="65" w:unhideWhenUsed="0"/>
+    <w:lsdException w:name="Medium List 2 Accent 5" w:semiHidden="0" w:uiPriority="66" w:unhideWhenUsed="0"/>
+    <w:lsdException w:name="Medium Grid 1 Accent 5" w:semiHidden="0" w:uiPriority="67" w:unhideWhenUsed="0"/>
+    <w:lsdException w:name="Medium Grid 2 Accent 5" w:semiHidden="0" w:uiPriority="68" w:unhideWhenUsed="0"/>
+    <w:lsdException w:name="Medium Grid 3 Accent 5" w:semiHidden="0" w:uiPriority="69" w:unhideWhenUsed="0"/>
+    <w:lsdException w:name="Dark List Accent 5" w:semiHidden="0" w:uiPriority="70" w:unhideWhenUsed="0"/>
+    <w:lsdException w:name="Colorful Shading Accent 5" w:semiHidden="0" w:uiPriority="71" w:unhideWhenUsed="0"/>
+    <w:lsdException w:name="Colorful List Accent 5" w:semiHidden="0" w:uiPriority="72" w:unhideWhenUsed="0"/>
+    <w:lsdException w:name="Colorful Grid Accent 5" w:semiHidden="0" w:uiPriority="73" w:unhideWhenUsed="0"/>
+    <w:lsdException w:name="Light Shading Accent 6" w:semiHidden="0" w:uiPriority="60" w:unhideWhenUsed="0"/>
+    <w:lsdException w:name="Light List Accent 6" w:semiHidden="0" w:uiPriority="61" w:unhideWhenUsed="0"/>
+    <w:lsdException w:name="Light Grid Accent 6" w:semiHidden="0" w:uiPriority="62" w:unhideWhenUsed="0"/>
+    <w:lsdException w:name="Medium Shading 1 Accent 6" w:semiHidden="0" w:uiPriority="63" w:unhideWhenUsed="0"/>
+    <w:lsdException w:name="Medium Shading 2 Accent 6" w:semiHidden="0" w:uiPriority="64" w:unhideWhenUsed="0"/>
+    <w:lsdException w:name="Medium List 1 Accent 6" w:semiHidden="0" w:uiPriority="65" w:unhideWhenUsed="0"/>
+    <w:lsdException w:name="Medium List 2 Accent 6" w:semiHidden="0" w:uiPriority="66" w:unhideWhenUsed="0"/>
+    <w:lsdException w:name="Medium Grid 1 Accent 6" w:semiHidden="0" w:uiPriority="67" w:unhideWhenUsed="0"/>
+    <w:lsdException w:name="Medium Grid 2 Accent 6" w:semiHidden="0" w:uiPriority="68" w:unhideWhenUsed="0"/>
+    <w:lsdException w:name="Medium Grid 3 Accent 6" w:semiHidden="0" w:uiPriority="69" w:unhideWhenUsed="0"/>
+    <w:lsdException w:name="Dark List Accent 6" w:semiHidden="0" w:uiPriority="70" w:unhideWhenUsed="0"/>
+    <w:lsdException w:name="Colorful Shading Accent 6" w:semiHidden="0" w:uiPriority="71" w:unhideWhenUsed="0"/>
+    <w:lsdException w:name="Colorful List Accent 6" w:semiHidden="0" w:uiPriority="72" w:unhideWhenUsed="0"/>
+    <w:lsdException w:name="Colorful Grid Accent 6" w:semiHidden="0" w:uiPriority="73" w:unhideWhenUsed="0"/>
+    <w:lsdException w:name="Subtle Emphasis" w:semiHidden="0" w:uiPriority="19" w:unhideWhenUsed="0" w:qFormat="1"/>
+    <w:lsdException w:name="Intense Emphasis" w:semiHidden="0" w:uiPriority="21" w:unhideWhenUsed="0" w:qFormat="1"/>
+    <w:lsdException w:name="Subtle Reference" w:semiHidden="0" w:uiPriority="31" w:unhideWhenUsed="0" w:qFormat="1"/>
+    <w:lsdException w:name="Intense Reference" w:semiHidden="0" w:uiPriority="32" w:unhideWhenUsed="0" w:qFormat="1"/>
+    <w:lsdException w:name="Book Title" w:semiHidden="0" w:uiPriority="33" w:unhideWhenUsed="0" w:qFormat="1"/>
+    <w:lsdException w:name="Bibliography" w:uiPriority="37"/>
+    <w:lsdException w:name="TOC Heading" w:uiPriority="39" w:qFormat="1"/>
+  </w:latentStyles>
+  <w:style w:type="paragraph" w:default="1" w:styleId="Normal">
+    <w:name w:val="Normal"/>
+    <w:qFormat/>
+  </w:style>
+  <w:style w:type="paragraph" w:styleId="Heading2">
+    <w:name w:val="heading 2"/>
+    <w:basedOn w:val="Normal"/>
+    <w:link w:val="Heading2Char"/>
+    <w:uiPriority w:val="9"/>
+    <w:qFormat/>
+    <w:rsid w:val="00AB74FD"/>
+    <w:pPr>
+      <w:spacing w:before="100" w:beforeAutospacing="1" w:after="100" w:afterAutospacing="1" w:line="240" w:lineRule="auto"/>
+      <w:outlineLvl w:val="1"/>
+    </w:pPr>
+    <w:rPr>
+      <w:rFonts w:ascii="Times New Roman" w:eastAsia="Times New Roman" w:hAnsi="Times New Roman" w:cs="Times New Roman"/>
+      <w:b/>
+      <w:bCs/>
+      <w:sz w:val="36"/>
+      <w:szCs w:val="36"/>
+    </w:rPr>
+  </w:style>
+  <w:style w:type="paragraph" w:styleId="Heading3">
+    <w:name w:val="heading 3"/>
+    <w:basedOn w:val="Normal"/>
+    <w:link w:val="Heading3Char"/>
+    <w:uiPriority w:val="9"/>
+    <w:qFormat/>
+    <w:rsid w:val="00AB74FD"/>
+    <w:pPr>
+      <w:spacing w:before="100" w:beforeAutospacing="1" w:after="100" w:afterAutospacing="1" w:line="240" w:lineRule="auto"/>
+      <w:outlineLvl w:val="2"/>
+    </w:pPr>
+    <w:rPr>
+      <w:rFonts w:ascii="Times New Roman" w:eastAsia="Times New Roman" w:hAnsi="Times New Roman" w:cs="Times New Roman"/>
+      <w:b/>
+      <w:bCs/>
+      <w:sz w:val="27"/>
+      <w:szCs w:val="27"/>
+    </w:rPr>
+  </w:style>
+  <w:style w:type="character" w:default="1" w:styleId="DefaultParagraphFont">
+    <w:name w:val="Default Paragraph Font"/>
+    <w:uiPriority w:val="1"/>
+    <w:semiHidden/>
+    <w:unhideWhenUsed/>
+  </w:style>
+  <w:style w:type="table" w:default="1" w:styleId="TableNormal">
+    <w:name w:val="Normal Table"/>
+    <w:uiPriority w:val="99"/>
+    <w:semiHidden/>
+    <w:unhideWhenUsed/>
+    <w:tblPr>
+      <w:tblInd w:w="0" w:type="dxa"/>
+      <w:tblCellMar>
+        <w:top w:w="0" w:type="dxa"/>
+        <w:left w:w="108" w:type="dxa"/>
+        <w:bottom w:w="0" w:type="dxa"/>
+        <w:right w:w="108" w:type="dxa"/>
+      </w:tblCellMar>
+    </w:tblPr>
+  </w:style>
+  <w:style w:type="numbering" w:default="1" w:styleId="NoList">
+    <w:name w:val="No List"/>
+    <w:uiPriority w:val="99"/>
+    <w:semiHidden/>
+    <w:unhideWhenUsed/>
+  </w:style>
+  <w:style w:type="character" w:customStyle="1" w:styleId="Heading2Char">
+    <w:name w:val="Heading 2 Char"/>
+    <w:basedOn w:val="DefaultParagraphFont"/>
+    <w:link w:val="Heading2"/>
+    <w:uiPriority w:val="9"/>
+    <w:rsid w:val="00AB74FD"/>
+    <w:rPr>
+      <w:rFonts w:ascii="Times New Roman" w:eastAsia="Times New Roman" w:hAnsi="Times New Roman" w:cs="Times New Roman"/>
+      <w:b/>
+      <w:bCs/>
+      <w:sz w:val="36"/>
+      <w:szCs w:val="36"/>
+    </w:rPr>
+  </w:style>
+  <w:style w:type="character" w:customStyle="1" w:styleId="Heading3Char">
+    <w:name w:val="Heading 3 Char"/>
+    <w:basedOn w:val="DefaultParagraphFont"/>
+    <w:link w:val="Heading3"/>
+    <w:uiPriority w:val="9"/>
+    <w:rsid w:val="00AB74FD"/>
+    <w:rPr>
+      <w:rFonts w:ascii="Times New Roman" w:eastAsia="Times New Roman" w:hAnsi="Times New Roman" w:cs="Times New Roman"/>
+      <w:b/>
+      <w:bCs/>
+      <w:sz w:val="27"/>
+      <w:szCs w:val="27"/>
+    </w:rPr>
+  </w:style>
+  <w:style w:type="paragraph" w:customStyle="1" w:styleId="whitespace-pre-wrap">
+    <w:name w:val="whitespace-pre-wrap"/>
+    <w:basedOn w:val="Normal"/>
+    <w:rsid w:val="00AB74FD"/>
+    <w:pPr>
+      <w:spacing w:before="100" w:beforeAutospacing="1" w:after="100" w:afterAutospacing="1" w:line="240" w:lineRule="auto"/>
+    </w:pPr>
+    <w:rPr>
+      <w:rFonts w:ascii="Times New Roman" w:eastAsia="Times New Roman" w:hAnsi="Times New Roman" w:cs="Times New Roman"/>
+      <w:sz w:val="24"/>
+      <w:szCs w:val="24"/>
+    </w:rPr>
+  </w:style>
+  <w:style w:type="character" w:customStyle="1" w:styleId="text-text-500">
+    <w:name w:val="text-text-500"/>
+    <w:basedOn w:val="DefaultParagraphFont"/>
+    <w:rsid w:val="00AB74FD"/>
+  </w:style>
+  <w:style w:type="paragraph" w:customStyle="1" w:styleId="font-claude-response-body">
+    <w:name w:val="font-claude-response-body"/>
+    <w:basedOn w:val="Normal"/>
+    <w:rsid w:val="00AB74FD"/>
+    <w:pPr>
+      <w:spacing w:before="100" w:beforeAutospacing="1" w:after="100" w:afterAutospacing="1" w:line="240" w:lineRule="auto"/>
+    </w:pPr>
+    <w:rPr>
+      <w:rFonts w:ascii="Times New Roman" w:eastAsia="Times New Roman" w:hAnsi="Times New Roman" w:cs="Times New Roman"/>
+      <w:sz w:val="24"/>
+      <w:szCs w:val="24"/>
+    </w:rPr>
+  </w:style>
+  <w:style w:type="character" w:styleId="Strong">
+    <w:name w:val="Strong"/>
+    <w:basedOn w:val="DefaultParagraphFont"/>
+    <w:uiPriority w:val="22"/>
+    <w:qFormat/>
+    <w:rsid w:val="00AB74FD"/>
+    <w:rPr>
+      <w:b/>
+      <w:bCs/>
+    </w:rPr>
+  </w:style>
+  <w:style w:type="character" w:styleId="HTMLCode">
+    <w:name w:val="HTML Code"/>
+    <w:basedOn w:val="DefaultParagraphFont"/>
+    <w:uiPriority w:val="99"/>
+    <w:semiHidden/>
+    <w:unhideWhenUsed/>
+    <w:rsid w:val="00AB74FD"/>
+    <w:rPr>
+      <w:rFonts w:ascii="Courier New" w:eastAsia="Times New Roman" w:hAnsi="Courier New" w:cs="Courier New"/>
+      <w:sz w:val="20"/>
+      <w:szCs w:val="20"/>
+    </w:rPr>
+  </w:style>
+  <w:style w:type="paragraph" w:styleId="HTMLPreformatted">
+    <w:name w:val="HTML Preformatted"/>
+    <w:basedOn w:val="Normal"/>
+    <w:link w:val="HTMLPreformattedChar"/>
+    <w:uiPriority w:val="99"/>
+    <w:semiHidden/>
+    <w:unhideWhenUsed/>
+    <w:rsid w:val="00AB74FD"/>
+    <w:pPr>
+      <w:tabs>
+        <w:tab w:val="left" w:pos="916"/>
+        <w:tab w:val="left" w:pos="1832"/>
+        <w:tab w:val="left" w:pos="2748"/>
+        <w:tab w:val="left" w:pos="3664"/>
+        <w:tab w:val="left" w:pos="4580"/>
+        <w:tab w:val="left" w:pos="5496"/>
+        <w:tab w:val="left" w:pos="6412"/>
+        <w:tab w:val="left" w:pos="7328"/>
+        <w:tab w:val="left" w:pos="8244"/>
+        <w:tab w:val="left" w:pos="9160"/>
+        <w:tab w:val="left" w:pos="10076"/>
+        <w:tab w:val="left" w:pos="10992"/>
+        <w:tab w:val="left" w:pos="11908"/>
+        <w:tab w:val="left" w:pos="12824"/>
+        <w:tab w:val="left" w:pos="13740"/>
+        <w:tab w:val="left" w:pos="14656"/>
+      </w:tabs>
+      <w:spacing w:after="0" w:line="240" w:lineRule="auto"/>
+    </w:pPr>
+    <w:rPr>
+      <w:rFonts w:ascii="Courier New" w:eastAsia="Times New Roman" w:hAnsi="Courier New" w:cs="Courier New"/>
+      <w:sz w:val="20"/>
+      <w:szCs w:val="20"/>
+    </w:rPr>
+  </w:style>
+  <w:style w:type="character" w:customStyle="1" w:styleId="HTMLPreformattedChar">
+    <w:name w:val="HTML Preformatted Char"/>
+    <w:basedOn w:val="DefaultParagraphFont"/>
+    <w:link w:val="HTMLPreformatted"/>
+    <w:uiPriority w:val="99"/>
+    <w:semiHidden/>
+    <w:rsid w:val="00AB74FD"/>
+    <w:rPr>
+      <w:rFonts w:ascii="Courier New" w:eastAsia="Times New Roman" w:hAnsi="Courier New" w:cs="Courier New"/>
+      <w:sz w:val="20"/>
+      <w:szCs w:val="20"/>
+    </w:rPr>
+  </w:style>
+  <w:style w:type="character" w:styleId="Emphasis">
+    <w:name w:val="Emphasis"/>
+    <w:basedOn w:val="DefaultParagraphFont"/>
+    <w:uiPriority w:val="20"/>
+    <w:qFormat/>
+    <w:rsid w:val="00AB74FD"/>
+    <w:rPr>
+      <w:i/>
+      <w:iCs/>
+    </w:rPr>
+  </w:style>
+  <w:style w:type="paragraph" w:customStyle="1" w:styleId="is-empty">
+    <w:name w:val="is-empty"/>
+    <w:basedOn w:val="Normal"/>
+    <w:rsid w:val="00AB74FD"/>
+    <w:pPr>
+      <w:spacing w:before="100" w:beforeAutospacing="1" w:after="100" w:afterAutospacing="1" w:line="240" w:lineRule="auto"/>
+    </w:pPr>
+    <w:rPr>
+      <w:rFonts w:ascii="Times New Roman" w:eastAsia="Times New Roman" w:hAnsi="Times New Roman" w:cs="Times New Roman"/>
+      <w:sz w:val="24"/>
+      <w:szCs w:val="24"/>
+    </w:rPr>
+  </w:style>
+  <w:style w:type="character" w:styleId="Hyperlink">
+    <w:name w:val="Hyperlink"/>
+    <w:basedOn w:val="DefaultParagraphFont"/>
+    <w:uiPriority w:val="99"/>
+    <w:semiHidden/>
+    <w:unhideWhenUsed/>
+    <w:rsid w:val="00AB74FD"/>
+    <w:rPr>
+      <w:color w:val="0000FF"/>
+      <w:u w:val="single"/>
+    </w:rPr>
+  </w:style>
+</w:styles>
+</file>
+
+<file path=word/stylesWithEffects.xml><?xml version="1.0" encoding="utf-8"?>
+<w:styles xmlns:wpc="http://schemas.microsoft.com/office/word/2010/wordprocessingCanvas" xmlns:mc="http://schemas.openxmlformats.org/markup-compatibility/2006" xmlns:o="urn:schemas-microsoft-com:office:office" xmlns:r="http://schemas.openxmlformats.org/officeDocument/2006/relationships" xmlns:m="http://schemas.openxmlformats.org/officeDocument/2006/math" xmlns:v="urn:schemas-microsoft-com:vml" xmlns:wp14="http://schemas.microsoft.com/office/word/2010/wordprocessingDrawing" xmlns:wp="http://schemas.openxmlformats.org/drawingml/2006/wordprocessingDrawing" xmlns:w10="urn:schemas-microsoft-com:office:word" xmlns:w="http://schemas.openxmlformats.org/wordprocessingml/2006/main" xmlns:w14="http://schemas.microsoft.com/office/word/2010/wordml" xmlns:wpg="http://schemas.microsoft.com/office/word/2010/wordprocessingGroup" xmlns:wpi="http://schemas.microsoft.com/office/word/2010/wordprocessingInk" xmlns:wne="http://schemas.microsoft.com/office/word/2006/wordml" xmlns:wps="http://schemas.microsoft.com/office/word/2010/wordprocessingShape" mc:Ignorable="w14 wp14">
+  <w:docDefaults>
+    <w:rPrDefault>
+      <w:rPr>
+        <w:rFonts w:asciiTheme="minorHAnsi" w:eastAsiaTheme="minorHAnsi" w:hAnsiTheme="minorHAnsi" w:cstheme="minorBidi"/>
+        <w:sz w:val="22"/>
+        <w:szCs w:val="22"/>
+        <w:lang w:val="en-US" w:eastAsia="en-US" w:bidi="ar-SA"/>
+      </w:rPr>
+    </w:rPrDefault>
+    <w:pPrDefault>
+      <w:pPr>
+        <w:spacing w:after="200" w:line="276" w:lineRule="auto"/>
+      </w:pPr>
+    </w:pPrDefault>
+  </w:docDefaults>
+  <w:latentStyles w:defLockedState="0" w:defUIPriority="99" w:defSemiHidden="1" w:defUnhideWhenUsed="1" w:defQFormat="0" w:count="267">
+    <w:lsdException w:name="Normal" w:semiHidden="0" w:uiPriority="0" w:unhideWhenUsed="0" w:qFormat="1"/>
+    <w:lsdException w:name="heading 1" w:semiHidden="0" w:uiPriority="9" w:unhideWhenUsed="0" w:qFormat="1"/>
+    <w:lsdException w:name="heading 2" w:uiPriority="9" w:qFormat="1"/>
+    <w:lsdException w:name="heading 3" w:uiPriority="9" w:qFormat="1"/>
+    <w:lsdException w:name="heading 4" w:uiPriority="9" w:qFormat="1"/>
+    <w:lsdException w:name="heading 5" w:uiPriority="9" w:qFormat="1"/>
+    <w:lsdException w:name="heading 6" w:uiPriority="9" w:qFormat="1"/>
+    <w:lsdException w:name="heading 7" w:uiPriority="9" w:qFormat="1"/>
+    <w:lsdException w:name="heading 8" w:uiPriority="9" w:qFormat="1"/>
+    <w:lsdException w:name="heading 9" w:uiPriority="9" w:qFormat="1"/>
+    <w:lsdException w:name="toc 1" w:uiPriority="39"/>
+    <w:lsdException w:name="toc 2" w:uiPriority="39"/>
+    <w:lsdException w:name="toc 3" w:uiPriority="39"/>
+    <w:lsdException w:name="toc 4" w:uiPriority="39"/>
+    <w:lsdException w:name="toc 5" w:uiPriority="39"/>
+    <w:lsdException w:name="toc 6" w:uiPriority="39"/>
+    <w:lsdException w:name="toc 7" w:uiPriority="39"/>
+    <w:lsdException w:name="toc 8" w:uiPriority="39"/>
+    <w:lsdException w:name="toc 9" w:uiPriority="39"/>
+    <w:lsdException w:name="caption" w:uiPriority="35" w:qFormat="1"/>
+    <w:lsdException w:name="Title" w:semiHidden="0" w:uiPriority="10" w:unhideWhenUsed="0" w:qFormat="1"/>
+    <w:lsdException w:name="Default Paragraph Font" w:uiPriority="1"/>
+    <w:lsdException w:name="Subtitle" w:semiHidden="0" w:uiPriority="11" w:unhideWhenUsed="0" w:qFormat="1"/>
+    <w:lsdException w:name="Strong" w:semiHidden="0" w:uiPriority="22" w:unhideWhenUsed="0" w:qFormat="1"/>
+    <w:lsdException w:name="Emphasis" w:semiHidden="0" w:uiPriority="20" w:unhideWhenUsed="0" w:qFormat="1"/>
+    <w:lsdException w:name="Table Grid" w:semiHidden="0" w:uiPriority="59" w:unhideWhenUsed="0"/>
+    <w:lsdException w:name="Placeholder Text" w:unhideWhenUsed="0"/>
+    <w:lsdException w:name="No Spacing" w:semiHidden="0" w:uiPriority="1" w:unhideWhenUsed="0" w:qFormat="1"/>
+    <w:lsdException w:name="Light Shading" w:semiHidden="0" w:uiPriority="60" w:unhideWhenUsed="0"/>
+    <w:lsdException w:name="Light List" w:semiHidden="0" w:uiPriority="61" w:unhideWhenUsed="0"/>
+    <w:lsdException w:name="Light Grid" w:semiHidden="0" w:uiPriority="62" w:unhideWhenUsed="0"/>
+    <w:lsdException w:name="Medium Shading 1" w:semiHidden="0" w:uiPriority="63" w:unhideWhenUsed="0"/>
+    <w:lsdException w:name="Medium Shading 2" w:semiHidden="0" w:uiPriority="64" w:unhideWhenUsed="0"/>
+    <w:lsdException w:name="Medium List 1" w:semiHidden="0" w:uiPriority="65" w:unhideWhenUsed="0"/>
+    <w:lsdException w:name="Medium List 2" w:semiHidden="0" w:uiPriority="66" w:unhideWhenUsed="0"/>
+    <w:lsdException w:name="Medium Grid 1" w:semiHidden="0" w:uiPriority="67" w:unhideWhenUsed="0"/>
+    <w:lsdException w:name="Medium Grid 2" w:semiHidden="0" w:uiPriority="68" w:unhideWhenUsed="0"/>
+    <w:lsdException w:name="Medium Grid 3" w:semiHidden="0" w:uiPriority="69" w:unhideWhenUsed="0"/>
+    <w:lsdException w:name="Dark List" w:semiHidden="0" w:uiPriority="70" w:unhideWhenUsed="0"/>
+    <w:lsdException w:name="Colorful Shading" w:semiHidden="0" w:uiPriority="71" w:unhideWhenUsed="0"/>
+    <w:lsdException w:name="Colorful List" w:semiHidden="0" w:uiPriority="72" w:unhideWhenUsed="0"/>
+    <w:lsdException w:name="Colorful Grid" w:semiHidden="0" w:uiPriority="73" w:unhideWhenUsed="0"/>
+    <w:lsdException w:name="Light Shading Accent 1" w:semiHidden="0" w:uiPriority="60" w:unhideWhenUsed="0"/>
+    <w:lsdException w:name="Light List Accent 1" w:semiHidden="0" w:uiPriority="61" w:unhideWhenUsed="0"/>
+    <w:lsdException w:name="Light Grid Accent 1" w:semiHidden="0" w:uiPriority="62" w:unhideWhenUsed="0"/>
+    <w:lsdException w:name="Medium Shading 1 Accent 1" w:semiHidden="0" w:uiPriority="63" w:unhideWhenUsed="0"/>
+    <w:lsdException w:name="Medium Shading 2 Accent 1" w:semiHidden="0" w:uiPriority="64" w:unhideWhenUsed="0"/>
+    <w:lsdException w:name="Medium List 1 Accent 1" w:semiHidden="0" w:uiPriority="65" w:unhideWhenUsed="0"/>
+    <w:lsdException w:name="Revision" w:unhideWhenUsed="0"/>
+    <w:lsdException w:name="List Paragraph" w:semiHidden="0" w:uiPriority="34" w:unhideWhenUsed="0" w:qFormat="1"/>
+    <w:lsdException w:name="Quote" w:semiHidden="0" w:uiPriority="29" w:unhideWhenUsed="0" w:qFormat="1"/>
+    <w:lsdException w:name="Intense Quote" w:semiHidden="0" w:uiPriority="30" w:unhideWhenUsed="0" w:qFormat="1"/>
+    <w:lsdException w:name="Medium List 2 Accent 1" w:semiHidden="0" w:uiPriority="66" w:unhideWhenUsed="0"/>
+    <w:lsdException w:name="Medium Grid 1 Accent 1" w:semiHidden="0" w:uiPriority="67" w:unhideWhenUsed="0"/>
+    <w:lsdException w:name="Medium Grid 2 Accent 1" w:semiHidden="0" w:uiPriority="68" w:unhideWhenUsed="0"/>
+    <w:lsdException w:name="Medium Grid 3 Accent 1" w:semiHidden="0" w:uiPriority="69" w:unhideWhenUsed="0"/>
+    <w:lsdException w:name="Dark List Accent 1" w:semiHidden="0" w:uiPriority="70" w:unhideWhenUsed="0"/>
+    <w:lsdException w:name="Colorful Shading Accent 1" w:semiHidden="0" w:uiPriority="71" w:unhideWhenUsed="0"/>
+    <w:lsdException w:name="Colorful List Accent 1" w:semiHidden="0" w:uiPriority="72" w:unhideWhenUsed="0"/>
+    <w:lsdException w:name="Colorful Grid Accent 1" w:semiHidden="0" w:uiPriority="73" w:unhideWhenUsed="0"/>
+    <w:lsdException w:name="Light Shading Accent 2" w:semiHidden="0" w:uiPriority="60" w:unhideWhenUsed="0"/>
+    <w:lsdException w:name="Light List Accent 2" w:semiHidden="0" w:uiPriority="61" w:unhideWhenUsed="0"/>
+    <w:lsdException w:name="Light Grid Accent 2" w:semiHidden="0" w:uiPriority="62" w:unhideWhenUsed="0"/>
+    <w:lsdException w:name="Medium Shading 1 Accent 2" w:semiHidden="0" w:uiPriority="63" w:unhideWhenUsed="0"/>
+    <w:lsdException w:name="Medium Shading 2 Accent 2" w:semiHidden="0" w:uiPriority="64" w:unhideWhenUsed="0"/>
+    <w:lsdException w:name="Medium List 1 Accent 2" w:semiHidden="0" w:uiPriority="65" w:unhideWhenUsed="0"/>
+    <w:lsdException w:name="Medium List 2 Accent 2" w:semiHidden="0" w:uiPriority="66" w:unhideWhenUsed="0"/>
+    <w:lsdException w:name="Medium Grid 1 Accent 2" w:semiHidden="0" w:uiPriority="67" w:unhideWhenUsed="0"/>
+    <w:lsdException w:name="Medium Grid 2 Accent 2" w:semiHidden="0" w:uiPriority="68" w:unhideWhenUsed="0"/>
+    <w:lsdException w:name="Medium Grid 3 Accent 2" w:semiHidden="0" w:uiPriority="69" w:unhideWhenUsed="0"/>
+    <w:lsdException w:name="Dark List Accent 2" w:semiHidden="0" w:uiPriority="70" w:unhideWhenUsed="0"/>
+    <w:lsdException w:name="Colorful Shading Accent 2" w:semiHidden="0" w:uiPriority="71" w:unhideWhenUsed="0"/>
+    <w:lsdException w:name="Colorful List Accent 2" w:semiHidden="0" w:uiPriority="72" w:unhideWhenUsed="0"/>
+    <w:lsdException w:name="Colorful Grid Accent 2" w:semiHidden="0" w:uiPriority="73" w:unhideWhenUsed="0"/>
+    <w:lsdException w:name="Light Shading Accent 3" w:semiHidden="0" w:uiPriority="60" w:unhideWhenUsed="0"/>
+    <w:lsdException w:name="Light List Accent 3" w:semiHidden="0" w:uiPriority="61" w:unhideWhenUsed="0"/>
+    <w:lsdException w:name="Light Grid Accent 3" w:semiHidden="0" w:uiPriority="62" w:unhideWhenUsed="0"/>
+    <w:lsdException w:name="Medium Shading 1 Accent 3" w:semiHidden="0" w:uiPriority="63" w:unhideWhenUsed="0"/>
+    <w:lsdException w:name="Medium Shading 2 Accent 3" w:semiHidden="0" w:uiPriority="64" w:unhideWhenUsed="0"/>
+    <w:lsdException w:name="Medium List 1 Accent 3" w:semiHidden="0" w:uiPriority="65" w:unhideWhenUsed="0"/>
+    <w:lsdException w:name="Medium List 2 Accent 3" w:semiHidden="0" w:uiPriority="66" w:unhideWhenUsed="0"/>
+    <w:lsdException w:name="Medium Grid 1 Accent 3" w:semiHidden="0" w:uiPriority="67" w:unhideWhenUsed="0"/>
+    <w:lsdException w:name="Medium Grid 2 Accent 3" w:semiHidden="0" w:uiPriority="68" w:unhideWhenUsed="0"/>
+    <w:lsdException w:name="Medium Grid 3 Accent 3" w:semiHidden="0" w:uiPriority="69" w:unhideWhenUsed="0"/>
+    <w:lsdException w:name="Dark List Accent 3" w:semiHidden="0" w:uiPriority="70" w:unhideWhenUsed="0"/>
+    <w:lsdException w:name="Colorful Shading Accent 3" w:semiHidden="0" w:uiPriority="71" w:unhideWhenUsed="0"/>
+    <w:lsdException w:name="Colorful List Accent 3" w:semiHidden="0" w:uiPriority="72" w:unhideWhenUsed="0"/>
+    <w:lsdException w:name="Colorful Grid Accent 3" w:semiHidden="0" w:uiPriority="73" w:unhideWhenUsed="0"/>
+    <w:lsdException w:name="Light Shading Accent 4" w:semiHidden="0" w:uiPriority="60" w:unhideWhenUsed="0"/>
+    <w:lsdException w:name="Light List Accent 4" w:semiHidden="0" w:uiPriority="61" w:unhideWhenUsed="0"/>
+    <w:lsdException w:name="Light Grid Accent 4" w:semiHidden="0" w:uiPriority="62" w:unhideWhenUsed="0"/>
+    <w:lsdException w:name="Medium Shading 1 Accent 4" w:semiHidden="0" w:uiPriority="63" w:unhideWhenUsed="0"/>
+    <w:lsdException w:name="Medium Shading 2 Accent 4" w:semiHidden="0" w:uiPriority="64" w:unhideWhenUsed="0"/>
+    <w:lsdException w:name="Medium List 1 Accent 4" w:semiHidden="0" w:uiPriority="65" w:unhideWhenUsed="0"/>
+    <w:lsdException w:name="Medium List 2 Accent 4" w:semiHidden="0" w:uiPriority="66" w:unhideWhenUsed="0"/>
+    <w:lsdException w:name="Medium Grid 1 Accent 4" w:semiHidden="0" w:uiPriority="67" w:unhideWhenUsed="0"/>
+    <w:lsdException w:name="Medium Grid 2 Accent 4" w:semiHidden="0" w:uiPriority="68" w:unhideWhenUsed="0"/>
+    <w:lsdException w:name="Medium Grid 3 Accent 4" w:semiHidden="0" w:uiPriority="69" w:unhideWhenUsed="0"/>
+    <w:lsdException w:name="Dark List Accent 4" w:semiHidden="0" w:uiPriority="70" w:unhideWhenUsed="0"/>
+    <w:lsdException w:name="Colorful Shading Accent 4" w:semiHidden="0" w:uiPriority="71" w:unhideWhenUsed="0"/>
+    <w:lsdException w:name="Colorful List Accent 4" w:semiHidden="0" w:uiPriority="72" w:unhideWhenUsed="0"/>
+    <w:lsdException w:name="Colorful Grid Accent 4" w:semiHidden="0" w:uiPriority="73" w:unhideWhenUsed="0"/>
+    <w:lsdException w:name="Light Shading Accent 5" w:semiHidden="0" w:uiPriority="60" w:unhideWhenUsed="0"/>
+    <w:lsdException w:name="Light List Accent 5" w:semiHidden="0" w:uiPriority="61" w:unhideWhenUsed="0"/>
+    <w:lsdException w:name="Light Grid Accent 5" w:semiHidden="0" w:uiPriority="62" w:unhideWhenUsed="0"/>
+    <w:lsdException w:name="Medium Shading 1 Accent 5" w:semiHidden="0" w:uiPriority="63" w:unhideWhenUsed="0"/>
+    <w:lsdException w:name="Medium Shading 2 Accent 5" w:semiHidden="0" w:uiPriority="64" w:unhideWhenUsed="0"/>
+    <w:lsdException w:name="Medium List 1 Accent 5" w:semiHidden="0" w:uiPriority="65" w:unhideWhenUsed="0"/>
+    <w:lsdException w:name="Medium List 2 Accent 5" w:semiHidden="0" w:uiPriority="66" w:unhideWhenUsed="0"/>
+    <w:lsdException w:name="Medium Grid 1 Accent 5" w:semiHidden="0" w:uiPriority="67" w:unhideWhenUsed="0"/>
+    <w:lsdException w:name="Medium Grid 2 Accent 5" w:semiHidden="0" w:uiPriority="68" w:unhideWhenUsed="0"/>
+    <w:lsdException w:name="Medium Grid 3 Accent 5" w:semiHidden="0" w:uiPriority="69" w:unhideWhenUsed="0"/>
+    <w:lsdException w:name="Dark List Accent 5" w:semiHidden="0" w:uiPriority="70" w:unhideWhenUsed="0"/>
+    <w:lsdException w:name="Colorful Shading Accent 5" w:semiHidden="0" w:uiPriority="71" w:unhideWhenUsed="0"/>
+    <w:lsdException w:name="Colorful List Accent 5" w:semiHidden="0" w:uiPriority="72" w:unhideWhenUsed="0"/>
+    <w:lsdException w:name="Colorful Grid Accent 5" w:semiHidden="0" w:uiPriority="73" w:unhideWhenUsed="0"/>
+    <w:lsdException w:name="Light Shading Accent 6" w:semiHidden="0" w:uiPriority="60" w:unhideWhenUsed="0"/>
+    <w:lsdException w:name="Light List Accent 6" w:semiHidden="0" w:uiPriority="61" w:unhideWhenUsed="0"/>
+    <w:lsdException w:name="Light Grid Accent 6" w:semiHidden="0" w:uiPriority="62" w:unhideWhenUsed="0"/>
+    <w:lsdException w:name="Medium Shading 1 Accent 6" w:semiHidden="0" w:uiPriority="63" w:unhideWhenUsed="0"/>
+    <w:lsdException w:name="Medium Shading 2 Accent 6" w:semiHidden="0" w:uiPriority="64" w:unhideWhenUsed="0"/>
+    <w:lsdException w:name="Medium List 1 Accent 6" w:semiHidden="0" w:uiPriority="65" w:unhideWhenUsed="0"/>
+    <w:lsdException w:name="Medium List 2 Accent 6" w:semiHidden="0" w:uiPriority="66" w:unhideWhenUsed="0"/>
+    <w:lsdException w:name="Medium Grid 1 Accent 6" w:semiHidden="0" w:uiPriority="67" w:unhideWhenUsed="0"/>
+    <w:lsdException w:name="Medium Grid 2 Accent 6" w:semiHidden="0" w:uiPriority="68" w:unhideWhenUsed="0"/>
+    <w:lsdException w:name="Medium Grid 3 Accent 6" w:semiHidden="0" w:uiPriority="69" w:unhideWhenUsed="0"/>
+    <w:lsdException w:name="Dark List Accent 6" w:semiHidden="0" w:uiPriority="70" w:unhideWhenUsed="0"/>
+    <w:lsdException w:name="Colorful Shading Accent 6" w:semiHidden="0" w:uiPriority="71" w:unhideWhenUsed="0"/>
+    <w:lsdException w:name="Colorful List Accent 6" w:semiHidden="0" w:uiPriority="72" w:unhideWhenUsed="0"/>
+    <w:lsdException w:name="Colorful Grid Accent 6" w:semiHidden="0" w:uiPriority="73" w:unhideWhenUsed="0"/>
+    <w:lsdException w:name="Subtle Emphasis" w:semiHidden="0" w:uiPriority="19" w:unhideWhenUsed="0" w:qFormat="1"/>
+    <w:lsdException w:name="Intense Emphasis" w:semiHidden="0" w:uiPriority="21" w:unhideWhenUsed="0" w:qFormat="1"/>
+    <w:lsdException w:name="Subtle Reference" w:semiHidden="0" w:uiPriority="31" w:unhideWhenUsed="0" w:qFormat="1"/>
+    <w:lsdException w:name="Intense Reference" w:semiHidden="0" w:uiPriority="32" w:unhideWhenUsed="0" w:qFormat="1"/>
+    <w:lsdException w:name="Book Title" w:semiHidden="0" w:uiPriority="33" w:unhideWhenUsed="0" w:qFormat="1"/>
+    <w:lsdException w:name="Bibliography" w:uiPriority="37"/>
+    <w:lsdException w:name="TOC Heading" w:uiPriority="39" w:qFormat="1"/>
   </w:latentStyles>
   <w:style w:type="paragraph" w:default="1" w:styleId="Normal">
     <w:name w:val="Normal"/>

</xml_diff>

<commit_message>
Developed Rating Feature Completely 4:32 PM 04.05.2026
</commit_message>
<xml_diff>
--- a/Project Structure/Project Structure.docx
+++ b/Project Structure/Project Structure.docx
@@ -4,16 +4,6 @@
   <w:body>
     <w:p>
       <w:pPr>
-        <w:spacing w:after="0" w:line="240" w:lineRule="auto"/>
-        <w:rPr>
-          <w:rFonts w:ascii="Times New Roman" w:eastAsia="Times New Roman" w:hAnsi="Times New Roman" w:cs="Times New Roman"/>
-          <w:sz w:val="24"/>
-          <w:szCs w:val="24"/>
-        </w:rPr>
-      </w:pPr>
-    </w:p>
-    <w:p>
-      <w:pPr>
         <w:spacing w:before="100" w:beforeAutospacing="1" w:after="100" w:afterAutospacing="1" w:line="240" w:lineRule="auto"/>
         <w:outlineLvl w:val="1"/>
         <w:rPr>
@@ -34,7 +24,7 @@
           <w:sz w:val="36"/>
           <w:szCs w:val="36"/>
         </w:rPr>
-        <w:t>⭐ Reviews &amp; Ratings — Full Deep Dive</w:t>
+        <w:t>🔔 Notifications — Full Deep Dive</w:t>
       </w:r>
     </w:p>
     <w:p>
@@ -52,1957 +42,8 @@
           <w:sz w:val="24"/>
           <w:szCs w:val="24"/>
         </w:rPr>
-        <w:pict w14:anchorId="28EBE116">
+        <w:pict w14:anchorId="0B2FE953">
           <v:rect id="_x0000_i1025" style="width:0;height:1.5pt" o:hralign="center" o:hrstd="t" o:hr="t" fillcolor="#a0a0a0" stroked="f"/>
-        </w:pict>
-      </w:r>
-    </w:p>
-    <w:p>
-      <w:pPr>
-        <w:spacing w:before="100" w:beforeAutospacing="1" w:after="100" w:afterAutospacing="1" w:line="240" w:lineRule="auto"/>
-        <w:outlineLvl w:val="2"/>
-        <w:rPr>
-          <w:rFonts w:ascii="Times New Roman" w:eastAsia="Times New Roman" w:hAnsi="Times New Roman" w:cs="Times New Roman"/>
-          <w:b/>
-          <w:bCs/>
-          <w:sz w:val="27"/>
-          <w:szCs w:val="27"/>
-        </w:rPr>
-      </w:pPr>
-      <w:r>
-        <w:rPr>
-          <w:rFonts w:ascii="Times New Roman" w:eastAsia="Times New Roman" w:hAnsi="Times New Roman" w:cs="Times New Roman"/>
-          <w:b/>
-          <w:bCs/>
-          <w:sz w:val="27"/>
-          <w:szCs w:val="27"/>
-        </w:rPr>
-        <w:t>🗄️ Database Model</w:t>
-      </w:r>
-    </w:p>
-    <w:tbl>
-      <w:tblPr>
-        <w:tblW w:w="0" w:type="auto"/>
-        <w:tblCellSpacing w:w="15" w:type="dxa"/>
-        <w:tblCellMar>
-          <w:top w:w="15" w:type="dxa"/>
-          <w:left w:w="15" w:type="dxa"/>
-          <w:bottom w:w="15" w:type="dxa"/>
-          <w:right w:w="15" w:type="dxa"/>
-        </w:tblCellMar>
-        <w:tblLook w:val="04A0" w:firstRow="1" w:lastRow="0" w:firstColumn="1" w:lastColumn="0" w:noHBand="0" w:noVBand="1"/>
-      </w:tblPr>
-      <w:tblGrid>
-        <w:gridCol w:w="1276"/>
-        <w:gridCol w:w="1287"/>
-        <w:gridCol w:w="3081"/>
-      </w:tblGrid>
-      <w:tr>
-        <w:trPr>
-          <w:tblHeader/>
-          <w:tblCellSpacing w:w="15" w:type="dxa"/>
-        </w:trPr>
-        <w:tc>
-          <w:tcPr>
-            <w:tcW w:w="0" w:type="auto"/>
-            <w:vAlign w:val="center"/>
-            <w:hideMark/>
-          </w:tcPr>
-          <w:p>
-            <w:pPr>
-              <w:spacing w:after="0" w:line="240" w:lineRule="auto"/>
-              <w:jc w:val="center"/>
-              <w:rPr>
-                <w:rFonts w:ascii="Times New Roman" w:eastAsia="Times New Roman" w:hAnsi="Times New Roman" w:cs="Times New Roman"/>
-                <w:b/>
-                <w:bCs/>
-                <w:sz w:val="24"/>
-                <w:szCs w:val="24"/>
-              </w:rPr>
-            </w:pPr>
-            <w:r>
-              <w:rPr>
-                <w:rFonts w:ascii="Times New Roman" w:eastAsia="Times New Roman" w:hAnsi="Times New Roman" w:cs="Times New Roman"/>
-                <w:b/>
-                <w:bCs/>
-                <w:sz w:val="24"/>
-                <w:szCs w:val="24"/>
-              </w:rPr>
-              <w:t>Column</w:t>
-            </w:r>
-          </w:p>
-        </w:tc>
-        <w:tc>
-          <w:tcPr>
-            <w:tcW w:w="0" w:type="auto"/>
-            <w:vAlign w:val="center"/>
-            <w:hideMark/>
-          </w:tcPr>
-          <w:p>
-            <w:pPr>
-              <w:spacing w:after="0" w:line="240" w:lineRule="auto"/>
-              <w:jc w:val="center"/>
-              <w:rPr>
-                <w:rFonts w:ascii="Times New Roman" w:eastAsia="Times New Roman" w:hAnsi="Times New Roman" w:cs="Times New Roman"/>
-                <w:b/>
-                <w:bCs/>
-                <w:sz w:val="24"/>
-                <w:szCs w:val="24"/>
-              </w:rPr>
-            </w:pPr>
-            <w:r>
-              <w:rPr>
-                <w:rFonts w:ascii="Times New Roman" w:eastAsia="Times New Roman" w:hAnsi="Times New Roman" w:cs="Times New Roman"/>
-                <w:b/>
-                <w:bCs/>
-                <w:sz w:val="24"/>
-                <w:szCs w:val="24"/>
-              </w:rPr>
-              <w:t>Type</w:t>
-            </w:r>
-          </w:p>
-        </w:tc>
-        <w:tc>
-          <w:tcPr>
-            <w:tcW w:w="0" w:type="auto"/>
-            <w:vAlign w:val="center"/>
-            <w:hideMark/>
-          </w:tcPr>
-          <w:p>
-            <w:pPr>
-              <w:spacing w:after="0" w:line="240" w:lineRule="auto"/>
-              <w:jc w:val="center"/>
-              <w:rPr>
-                <w:rFonts w:ascii="Times New Roman" w:eastAsia="Times New Roman" w:hAnsi="Times New Roman" w:cs="Times New Roman"/>
-                <w:b/>
-                <w:bCs/>
-                <w:sz w:val="24"/>
-                <w:szCs w:val="24"/>
-              </w:rPr>
-            </w:pPr>
-            <w:r>
-              <w:rPr>
-                <w:rFonts w:ascii="Times New Roman" w:eastAsia="Times New Roman" w:hAnsi="Times New Roman" w:cs="Times New Roman"/>
-                <w:b/>
-                <w:bCs/>
-                <w:sz w:val="24"/>
-                <w:szCs w:val="24"/>
-              </w:rPr>
-              <w:t>Notes</w:t>
-            </w:r>
-          </w:p>
-        </w:tc>
-      </w:tr>
-      <w:tr>
-        <w:trPr>
-          <w:tblCellSpacing w:w="15" w:type="dxa"/>
-        </w:trPr>
-        <w:tc>
-          <w:tcPr>
-            <w:tcW w:w="0" w:type="auto"/>
-            <w:vAlign w:val="center"/>
-            <w:hideMark/>
-          </w:tcPr>
-          <w:p>
-            <w:pPr>
-              <w:spacing w:after="0" w:line="240" w:lineRule="auto"/>
-              <w:rPr>
-                <w:rFonts w:ascii="Times New Roman" w:eastAsia="Times New Roman" w:hAnsi="Times New Roman" w:cs="Times New Roman"/>
-                <w:sz w:val="24"/>
-                <w:szCs w:val="24"/>
-              </w:rPr>
-            </w:pPr>
-            <w:r>
-              <w:rPr>
-                <w:rFonts w:ascii="Courier New" w:eastAsia="Times New Roman" w:hAnsi="Courier New" w:cs="Courier New"/>
-                <w:sz w:val="20"/>
-                <w:szCs w:val="20"/>
-              </w:rPr>
-              <w:t>id</w:t>
-            </w:r>
-          </w:p>
-        </w:tc>
-        <w:tc>
-          <w:tcPr>
-            <w:tcW w:w="0" w:type="auto"/>
-            <w:vAlign w:val="center"/>
-            <w:hideMark/>
-          </w:tcPr>
-          <w:p>
-            <w:pPr>
-              <w:spacing w:after="0" w:line="240" w:lineRule="auto"/>
-              <w:rPr>
-                <w:rFonts w:ascii="Times New Roman" w:eastAsia="Times New Roman" w:hAnsi="Times New Roman" w:cs="Times New Roman"/>
-                <w:sz w:val="24"/>
-                <w:szCs w:val="24"/>
-              </w:rPr>
-            </w:pPr>
-            <w:r>
-              <w:rPr>
-                <w:rFonts w:ascii="Times New Roman" w:eastAsia="Times New Roman" w:hAnsi="Times New Roman" w:cs="Times New Roman"/>
-                <w:sz w:val="24"/>
-                <w:szCs w:val="24"/>
-              </w:rPr>
-              <w:t>Integer</w:t>
-            </w:r>
-          </w:p>
-        </w:tc>
-        <w:tc>
-          <w:tcPr>
-            <w:tcW w:w="0" w:type="auto"/>
-            <w:vAlign w:val="center"/>
-            <w:hideMark/>
-          </w:tcPr>
-          <w:p>
-            <w:pPr>
-              <w:spacing w:after="0" w:line="240" w:lineRule="auto"/>
-              <w:rPr>
-                <w:rFonts w:ascii="Times New Roman" w:eastAsia="Times New Roman" w:hAnsi="Times New Roman" w:cs="Times New Roman"/>
-                <w:sz w:val="24"/>
-                <w:szCs w:val="24"/>
-              </w:rPr>
-            </w:pPr>
-          </w:p>
-        </w:tc>
-      </w:tr>
-      <w:tr>
-        <w:trPr>
-          <w:tblCellSpacing w:w="15" w:type="dxa"/>
-        </w:trPr>
-        <w:tc>
-          <w:tcPr>
-            <w:tcW w:w="0" w:type="auto"/>
-            <w:vAlign w:val="center"/>
-            <w:hideMark/>
-          </w:tcPr>
-          <w:p>
-            <w:pPr>
-              <w:spacing w:after="0" w:line="240" w:lineRule="auto"/>
-              <w:rPr>
-                <w:rFonts w:ascii="Times New Roman" w:eastAsia="Times New Roman" w:hAnsi="Times New Roman" w:cs="Times New Roman"/>
-                <w:sz w:val="24"/>
-                <w:szCs w:val="24"/>
-              </w:rPr>
-            </w:pPr>
-            <w:proofErr w:type="spellStart"/>
-            <w:r>
-              <w:rPr>
-                <w:rFonts w:ascii="Courier New" w:eastAsia="Times New Roman" w:hAnsi="Courier New" w:cs="Courier New"/>
-                <w:sz w:val="20"/>
-                <w:szCs w:val="20"/>
-              </w:rPr>
-              <w:t>order_id</w:t>
-            </w:r>
-            <w:proofErr w:type="spellEnd"/>
-          </w:p>
-        </w:tc>
-        <w:tc>
-          <w:tcPr>
-            <w:tcW w:w="0" w:type="auto"/>
-            <w:vAlign w:val="center"/>
-            <w:hideMark/>
-          </w:tcPr>
-          <w:p>
-            <w:pPr>
-              <w:spacing w:after="0" w:line="240" w:lineRule="auto"/>
-              <w:rPr>
-                <w:rFonts w:ascii="Times New Roman" w:eastAsia="Times New Roman" w:hAnsi="Times New Roman" w:cs="Times New Roman"/>
-                <w:sz w:val="24"/>
-                <w:szCs w:val="24"/>
-              </w:rPr>
-            </w:pPr>
-            <w:r>
-              <w:rPr>
-                <w:rFonts w:ascii="Times New Roman" w:eastAsia="Times New Roman" w:hAnsi="Times New Roman" w:cs="Times New Roman"/>
-                <w:sz w:val="24"/>
-                <w:szCs w:val="24"/>
-              </w:rPr>
-              <w:t>FK → Order</w:t>
-            </w:r>
-          </w:p>
-        </w:tc>
-        <w:tc>
-          <w:tcPr>
-            <w:tcW w:w="0" w:type="auto"/>
-            <w:vAlign w:val="center"/>
-            <w:hideMark/>
-          </w:tcPr>
-          <w:p>
-            <w:pPr>
-              <w:spacing w:after="0" w:line="240" w:lineRule="auto"/>
-              <w:rPr>
-                <w:rFonts w:ascii="Times New Roman" w:eastAsia="Times New Roman" w:hAnsi="Times New Roman" w:cs="Times New Roman"/>
-                <w:sz w:val="24"/>
-                <w:szCs w:val="24"/>
-              </w:rPr>
-            </w:pPr>
-            <w:r>
-              <w:rPr>
-                <w:rFonts w:ascii="Times New Roman" w:eastAsia="Times New Roman" w:hAnsi="Times New Roman" w:cs="Times New Roman"/>
-                <w:sz w:val="24"/>
-                <w:szCs w:val="24"/>
-              </w:rPr>
-              <w:t>unique — one review per order</w:t>
-            </w:r>
-          </w:p>
-        </w:tc>
-      </w:tr>
-      <w:tr>
-        <w:trPr>
-          <w:tblCellSpacing w:w="15" w:type="dxa"/>
-        </w:trPr>
-        <w:tc>
-          <w:tcPr>
-            <w:tcW w:w="0" w:type="auto"/>
-            <w:vAlign w:val="center"/>
-            <w:hideMark/>
-          </w:tcPr>
-          <w:p>
-            <w:pPr>
-              <w:spacing w:after="0" w:line="240" w:lineRule="auto"/>
-              <w:rPr>
-                <w:rFonts w:ascii="Times New Roman" w:eastAsia="Times New Roman" w:hAnsi="Times New Roman" w:cs="Times New Roman"/>
-                <w:sz w:val="24"/>
-                <w:szCs w:val="24"/>
-              </w:rPr>
-            </w:pPr>
-            <w:proofErr w:type="spellStart"/>
-            <w:r>
-              <w:rPr>
-                <w:rFonts w:ascii="Courier New" w:eastAsia="Times New Roman" w:hAnsi="Courier New" w:cs="Courier New"/>
-                <w:sz w:val="20"/>
-                <w:szCs w:val="20"/>
-              </w:rPr>
-              <w:t>user_id</w:t>
-            </w:r>
-            <w:proofErr w:type="spellEnd"/>
-          </w:p>
-        </w:tc>
-        <w:tc>
-          <w:tcPr>
-            <w:tcW w:w="0" w:type="auto"/>
-            <w:vAlign w:val="center"/>
-            <w:hideMark/>
-          </w:tcPr>
-          <w:p>
-            <w:pPr>
-              <w:spacing w:after="0" w:line="240" w:lineRule="auto"/>
-              <w:rPr>
-                <w:rFonts w:ascii="Times New Roman" w:eastAsia="Times New Roman" w:hAnsi="Times New Roman" w:cs="Times New Roman"/>
-                <w:sz w:val="24"/>
-                <w:szCs w:val="24"/>
-              </w:rPr>
-            </w:pPr>
-            <w:r>
-              <w:rPr>
-                <w:rFonts w:ascii="Times New Roman" w:eastAsia="Times New Roman" w:hAnsi="Times New Roman" w:cs="Times New Roman"/>
-                <w:sz w:val="24"/>
-                <w:szCs w:val="24"/>
-              </w:rPr>
-              <w:t>FK → User</w:t>
-            </w:r>
-          </w:p>
-        </w:tc>
-        <w:tc>
-          <w:tcPr>
-            <w:tcW w:w="0" w:type="auto"/>
-            <w:vAlign w:val="center"/>
-            <w:hideMark/>
-          </w:tcPr>
-          <w:p>
-            <w:pPr>
-              <w:spacing w:after="0" w:line="240" w:lineRule="auto"/>
-              <w:rPr>
-                <w:rFonts w:ascii="Times New Roman" w:eastAsia="Times New Roman" w:hAnsi="Times New Roman" w:cs="Times New Roman"/>
-                <w:sz w:val="24"/>
-                <w:szCs w:val="24"/>
-              </w:rPr>
-            </w:pPr>
-          </w:p>
-        </w:tc>
-      </w:tr>
-      <w:tr>
-        <w:trPr>
-          <w:tblCellSpacing w:w="15" w:type="dxa"/>
-        </w:trPr>
-        <w:tc>
-          <w:tcPr>
-            <w:tcW w:w="0" w:type="auto"/>
-            <w:vAlign w:val="center"/>
-            <w:hideMark/>
-          </w:tcPr>
-          <w:p>
-            <w:pPr>
-              <w:spacing w:after="0" w:line="240" w:lineRule="auto"/>
-              <w:rPr>
-                <w:rFonts w:ascii="Times New Roman" w:eastAsia="Times New Roman" w:hAnsi="Times New Roman" w:cs="Times New Roman"/>
-                <w:sz w:val="24"/>
-                <w:szCs w:val="24"/>
-              </w:rPr>
-            </w:pPr>
-            <w:r>
-              <w:rPr>
-                <w:rFonts w:ascii="Courier New" w:eastAsia="Times New Roman" w:hAnsi="Courier New" w:cs="Courier New"/>
-                <w:sz w:val="20"/>
-                <w:szCs w:val="20"/>
-              </w:rPr>
-              <w:t>rating</w:t>
-            </w:r>
-          </w:p>
-        </w:tc>
-        <w:tc>
-          <w:tcPr>
-            <w:tcW w:w="0" w:type="auto"/>
-            <w:vAlign w:val="center"/>
-            <w:hideMark/>
-          </w:tcPr>
-          <w:p>
-            <w:pPr>
-              <w:spacing w:after="0" w:line="240" w:lineRule="auto"/>
-              <w:rPr>
-                <w:rFonts w:ascii="Times New Roman" w:eastAsia="Times New Roman" w:hAnsi="Times New Roman" w:cs="Times New Roman"/>
-                <w:sz w:val="24"/>
-                <w:szCs w:val="24"/>
-              </w:rPr>
-            </w:pPr>
-            <w:r>
-              <w:rPr>
-                <w:rFonts w:ascii="Times New Roman" w:eastAsia="Times New Roman" w:hAnsi="Times New Roman" w:cs="Times New Roman"/>
-                <w:sz w:val="24"/>
-                <w:szCs w:val="24"/>
-              </w:rPr>
-              <w:t>Integer</w:t>
-            </w:r>
-          </w:p>
-        </w:tc>
-        <w:tc>
-          <w:tcPr>
-            <w:tcW w:w="0" w:type="auto"/>
-            <w:vAlign w:val="center"/>
-            <w:hideMark/>
-          </w:tcPr>
-          <w:p>
-            <w:pPr>
-              <w:spacing w:after="0" w:line="240" w:lineRule="auto"/>
-              <w:rPr>
-                <w:rFonts w:ascii="Times New Roman" w:eastAsia="Times New Roman" w:hAnsi="Times New Roman" w:cs="Times New Roman"/>
-                <w:sz w:val="24"/>
-                <w:szCs w:val="24"/>
-              </w:rPr>
-            </w:pPr>
-            <w:r>
-              <w:rPr>
-                <w:rFonts w:ascii="Times New Roman" w:eastAsia="Times New Roman" w:hAnsi="Times New Roman" w:cs="Times New Roman"/>
-                <w:sz w:val="24"/>
-                <w:szCs w:val="24"/>
-              </w:rPr>
-              <w:t>1 to 5 only</w:t>
-            </w:r>
-          </w:p>
-        </w:tc>
-      </w:tr>
-      <w:tr>
-        <w:trPr>
-          <w:tblCellSpacing w:w="15" w:type="dxa"/>
-        </w:trPr>
-        <w:tc>
-          <w:tcPr>
-            <w:tcW w:w="0" w:type="auto"/>
-            <w:vAlign w:val="center"/>
-            <w:hideMark/>
-          </w:tcPr>
-          <w:p>
-            <w:pPr>
-              <w:spacing w:after="0" w:line="240" w:lineRule="auto"/>
-              <w:rPr>
-                <w:rFonts w:ascii="Times New Roman" w:eastAsia="Times New Roman" w:hAnsi="Times New Roman" w:cs="Times New Roman"/>
-                <w:sz w:val="24"/>
-                <w:szCs w:val="24"/>
-              </w:rPr>
-            </w:pPr>
-            <w:r>
-              <w:rPr>
-                <w:rFonts w:ascii="Courier New" w:eastAsia="Times New Roman" w:hAnsi="Courier New" w:cs="Courier New"/>
-                <w:sz w:val="20"/>
-                <w:szCs w:val="20"/>
-              </w:rPr>
-              <w:t>comment</w:t>
-            </w:r>
-          </w:p>
-        </w:tc>
-        <w:tc>
-          <w:tcPr>
-            <w:tcW w:w="0" w:type="auto"/>
-            <w:vAlign w:val="center"/>
-            <w:hideMark/>
-          </w:tcPr>
-          <w:p>
-            <w:pPr>
-              <w:spacing w:after="0" w:line="240" w:lineRule="auto"/>
-              <w:rPr>
-                <w:rFonts w:ascii="Times New Roman" w:eastAsia="Times New Roman" w:hAnsi="Times New Roman" w:cs="Times New Roman"/>
-                <w:sz w:val="24"/>
-                <w:szCs w:val="24"/>
-              </w:rPr>
-            </w:pPr>
-            <w:r>
-              <w:rPr>
-                <w:rFonts w:ascii="Times New Roman" w:eastAsia="Times New Roman" w:hAnsi="Times New Roman" w:cs="Times New Roman"/>
-                <w:sz w:val="24"/>
-                <w:szCs w:val="24"/>
-              </w:rPr>
-              <w:t>String</w:t>
-            </w:r>
-          </w:p>
-        </w:tc>
-        <w:tc>
-          <w:tcPr>
-            <w:tcW w:w="0" w:type="auto"/>
-            <w:vAlign w:val="center"/>
-            <w:hideMark/>
-          </w:tcPr>
-          <w:p>
-            <w:pPr>
-              <w:spacing w:after="0" w:line="240" w:lineRule="auto"/>
-              <w:rPr>
-                <w:rFonts w:ascii="Times New Roman" w:eastAsia="Times New Roman" w:hAnsi="Times New Roman" w:cs="Times New Roman"/>
-                <w:sz w:val="24"/>
-                <w:szCs w:val="24"/>
-              </w:rPr>
-            </w:pPr>
-            <w:r>
-              <w:rPr>
-                <w:rFonts w:ascii="Times New Roman" w:eastAsia="Times New Roman" w:hAnsi="Times New Roman" w:cs="Times New Roman"/>
-                <w:sz w:val="24"/>
-                <w:szCs w:val="24"/>
-              </w:rPr>
-              <w:t>optional</w:t>
-            </w:r>
-          </w:p>
-        </w:tc>
-      </w:tr>
-      <w:tr>
-        <w:trPr>
-          <w:tblCellSpacing w:w="15" w:type="dxa"/>
-        </w:trPr>
-        <w:tc>
-          <w:tcPr>
-            <w:tcW w:w="0" w:type="auto"/>
-            <w:vAlign w:val="center"/>
-            <w:hideMark/>
-          </w:tcPr>
-          <w:p>
-            <w:pPr>
-              <w:spacing w:after="0" w:line="240" w:lineRule="auto"/>
-              <w:rPr>
-                <w:rFonts w:ascii="Times New Roman" w:eastAsia="Times New Roman" w:hAnsi="Times New Roman" w:cs="Times New Roman"/>
-                <w:sz w:val="24"/>
-                <w:szCs w:val="24"/>
-              </w:rPr>
-            </w:pPr>
-            <w:proofErr w:type="spellStart"/>
-            <w:r>
-              <w:rPr>
-                <w:rFonts w:ascii="Courier New" w:eastAsia="Times New Roman" w:hAnsi="Courier New" w:cs="Courier New"/>
-                <w:sz w:val="20"/>
-                <w:szCs w:val="20"/>
-              </w:rPr>
-              <w:t>created_at</w:t>
-            </w:r>
-            <w:proofErr w:type="spellEnd"/>
-          </w:p>
-        </w:tc>
-        <w:tc>
-          <w:tcPr>
-            <w:tcW w:w="0" w:type="auto"/>
-            <w:vAlign w:val="center"/>
-            <w:hideMark/>
-          </w:tcPr>
-          <w:p>
-            <w:pPr>
-              <w:spacing w:after="0" w:line="240" w:lineRule="auto"/>
-              <w:rPr>
-                <w:rFonts w:ascii="Times New Roman" w:eastAsia="Times New Roman" w:hAnsi="Times New Roman" w:cs="Times New Roman"/>
-                <w:sz w:val="24"/>
-                <w:szCs w:val="24"/>
-              </w:rPr>
-            </w:pPr>
-            <w:proofErr w:type="spellStart"/>
-            <w:r>
-              <w:rPr>
-                <w:rFonts w:ascii="Times New Roman" w:eastAsia="Times New Roman" w:hAnsi="Times New Roman" w:cs="Times New Roman"/>
-                <w:sz w:val="24"/>
-                <w:szCs w:val="24"/>
-              </w:rPr>
-              <w:t>DateTime</w:t>
-            </w:r>
-            <w:proofErr w:type="spellEnd"/>
-          </w:p>
-        </w:tc>
-        <w:tc>
-          <w:tcPr>
-            <w:tcW w:w="0" w:type="auto"/>
-            <w:vAlign w:val="center"/>
-            <w:hideMark/>
-          </w:tcPr>
-          <w:p>
-            <w:pPr>
-              <w:spacing w:after="0" w:line="240" w:lineRule="auto"/>
-              <w:rPr>
-                <w:rFonts w:ascii="Times New Roman" w:eastAsia="Times New Roman" w:hAnsi="Times New Roman" w:cs="Times New Roman"/>
-                <w:sz w:val="24"/>
-                <w:szCs w:val="24"/>
-              </w:rPr>
-            </w:pPr>
-          </w:p>
-        </w:tc>
-      </w:tr>
-    </w:tbl>
-    <w:p>
-      <w:pPr>
-        <w:spacing w:before="100" w:beforeAutospacing="1" w:after="100" w:afterAutospacing="1" w:line="240" w:lineRule="auto"/>
-        <w:outlineLvl w:val="2"/>
-        <w:rPr>
-          <w:rFonts w:ascii="Times New Roman" w:eastAsia="Times New Roman" w:hAnsi="Times New Roman" w:cs="Times New Roman"/>
-          <w:b/>
-          <w:bCs/>
-          <w:sz w:val="27"/>
-          <w:szCs w:val="27"/>
-        </w:rPr>
-      </w:pPr>
-      <w:r>
-        <w:rPr>
-          <w:rFonts w:ascii="Times New Roman" w:eastAsia="Times New Roman" w:hAnsi="Times New Roman" w:cs="Times New Roman"/>
-          <w:b/>
-          <w:bCs/>
-          <w:sz w:val="27"/>
-          <w:szCs w:val="27"/>
-        </w:rPr>
-        <w:t>📡 API Endpoints</w:t>
-      </w:r>
-    </w:p>
-    <w:tbl>
-      <w:tblPr>
-        <w:tblW w:w="0" w:type="auto"/>
-        <w:tblCellSpacing w:w="15" w:type="dxa"/>
-        <w:tblCellMar>
-          <w:top w:w="15" w:type="dxa"/>
-          <w:left w:w="15" w:type="dxa"/>
-          <w:bottom w:w="15" w:type="dxa"/>
-          <w:right w:w="15" w:type="dxa"/>
-        </w:tblCellMar>
-        <w:tblLook w:val="04A0" w:firstRow="1" w:lastRow="0" w:firstColumn="1" w:lastColumn="0" w:noHBand="0" w:noVBand="1"/>
-      </w:tblPr>
-      <w:tblGrid>
-        <w:gridCol w:w="875"/>
-        <w:gridCol w:w="3901"/>
-        <w:gridCol w:w="994"/>
-        <w:gridCol w:w="2208"/>
-      </w:tblGrid>
-      <w:tr>
-        <w:trPr>
-          <w:tblHeader/>
-          <w:tblCellSpacing w:w="15" w:type="dxa"/>
-        </w:trPr>
-        <w:tc>
-          <w:tcPr>
-            <w:tcW w:w="0" w:type="auto"/>
-            <w:vAlign w:val="center"/>
-            <w:hideMark/>
-          </w:tcPr>
-          <w:p>
-            <w:pPr>
-              <w:spacing w:after="0" w:line="240" w:lineRule="auto"/>
-              <w:jc w:val="center"/>
-              <w:rPr>
-                <w:rFonts w:ascii="Times New Roman" w:eastAsia="Times New Roman" w:hAnsi="Times New Roman" w:cs="Times New Roman"/>
-                <w:b/>
-                <w:bCs/>
-                <w:sz w:val="24"/>
-                <w:szCs w:val="24"/>
-              </w:rPr>
-            </w:pPr>
-            <w:r>
-              <w:rPr>
-                <w:rFonts w:ascii="Times New Roman" w:eastAsia="Times New Roman" w:hAnsi="Times New Roman" w:cs="Times New Roman"/>
-                <w:b/>
-                <w:bCs/>
-                <w:sz w:val="24"/>
-                <w:szCs w:val="24"/>
-              </w:rPr>
-              <w:t>Method</w:t>
-            </w:r>
-          </w:p>
-        </w:tc>
-        <w:tc>
-          <w:tcPr>
-            <w:tcW w:w="0" w:type="auto"/>
-            <w:vAlign w:val="center"/>
-            <w:hideMark/>
-          </w:tcPr>
-          <w:p>
-            <w:pPr>
-              <w:spacing w:after="0" w:line="240" w:lineRule="auto"/>
-              <w:jc w:val="center"/>
-              <w:rPr>
-                <w:rFonts w:ascii="Times New Roman" w:eastAsia="Times New Roman" w:hAnsi="Times New Roman" w:cs="Times New Roman"/>
-                <w:b/>
-                <w:bCs/>
-                <w:sz w:val="24"/>
-                <w:szCs w:val="24"/>
-              </w:rPr>
-            </w:pPr>
-            <w:r>
-              <w:rPr>
-                <w:rFonts w:ascii="Times New Roman" w:eastAsia="Times New Roman" w:hAnsi="Times New Roman" w:cs="Times New Roman"/>
-                <w:b/>
-                <w:bCs/>
-                <w:sz w:val="24"/>
-                <w:szCs w:val="24"/>
-              </w:rPr>
-              <w:t>URL</w:t>
-            </w:r>
-          </w:p>
-        </w:tc>
-        <w:tc>
-          <w:tcPr>
-            <w:tcW w:w="0" w:type="auto"/>
-            <w:vAlign w:val="center"/>
-            <w:hideMark/>
-          </w:tcPr>
-          <w:p>
-            <w:pPr>
-              <w:spacing w:after="0" w:line="240" w:lineRule="auto"/>
-              <w:jc w:val="center"/>
-              <w:rPr>
-                <w:rFonts w:ascii="Times New Roman" w:eastAsia="Times New Roman" w:hAnsi="Times New Roman" w:cs="Times New Roman"/>
-                <w:b/>
-                <w:bCs/>
-                <w:sz w:val="24"/>
-                <w:szCs w:val="24"/>
-              </w:rPr>
-            </w:pPr>
-            <w:r>
-              <w:rPr>
-                <w:rFonts w:ascii="Times New Roman" w:eastAsia="Times New Roman" w:hAnsi="Times New Roman" w:cs="Times New Roman"/>
-                <w:b/>
-                <w:bCs/>
-                <w:sz w:val="24"/>
-                <w:szCs w:val="24"/>
-              </w:rPr>
-              <w:t>Who</w:t>
-            </w:r>
-          </w:p>
-        </w:tc>
-        <w:tc>
-          <w:tcPr>
-            <w:tcW w:w="0" w:type="auto"/>
-            <w:vAlign w:val="center"/>
-            <w:hideMark/>
-          </w:tcPr>
-          <w:p>
-            <w:pPr>
-              <w:spacing w:after="0" w:line="240" w:lineRule="auto"/>
-              <w:jc w:val="center"/>
-              <w:rPr>
-                <w:rFonts w:ascii="Times New Roman" w:eastAsia="Times New Roman" w:hAnsi="Times New Roman" w:cs="Times New Roman"/>
-                <w:b/>
-                <w:bCs/>
-                <w:sz w:val="24"/>
-                <w:szCs w:val="24"/>
-              </w:rPr>
-            </w:pPr>
-            <w:r>
-              <w:rPr>
-                <w:rFonts w:ascii="Times New Roman" w:eastAsia="Times New Roman" w:hAnsi="Times New Roman" w:cs="Times New Roman"/>
-                <w:b/>
-                <w:bCs/>
-                <w:sz w:val="24"/>
-                <w:szCs w:val="24"/>
-              </w:rPr>
-              <w:t>What</w:t>
-            </w:r>
-          </w:p>
-        </w:tc>
-      </w:tr>
-      <w:tr>
-        <w:trPr>
-          <w:tblCellSpacing w:w="15" w:type="dxa"/>
-        </w:trPr>
-        <w:tc>
-          <w:tcPr>
-            <w:tcW w:w="0" w:type="auto"/>
-            <w:vAlign w:val="center"/>
-            <w:hideMark/>
-          </w:tcPr>
-          <w:p>
-            <w:pPr>
-              <w:spacing w:after="0" w:line="240" w:lineRule="auto"/>
-              <w:rPr>
-                <w:rFonts w:ascii="Times New Roman" w:eastAsia="Times New Roman" w:hAnsi="Times New Roman" w:cs="Times New Roman"/>
-                <w:sz w:val="24"/>
-                <w:szCs w:val="24"/>
-              </w:rPr>
-            </w:pPr>
-            <w:r>
-              <w:rPr>
-                <w:rFonts w:ascii="Courier New" w:eastAsia="Times New Roman" w:hAnsi="Courier New" w:cs="Courier New"/>
-                <w:sz w:val="20"/>
-                <w:szCs w:val="20"/>
-              </w:rPr>
-              <w:t>POST</w:t>
-            </w:r>
-          </w:p>
-        </w:tc>
-        <w:tc>
-          <w:tcPr>
-            <w:tcW w:w="0" w:type="auto"/>
-            <w:vAlign w:val="center"/>
-            <w:hideMark/>
-          </w:tcPr>
-          <w:p>
-            <w:pPr>
-              <w:spacing w:after="0" w:line="240" w:lineRule="auto"/>
-              <w:rPr>
-                <w:rFonts w:ascii="Times New Roman" w:eastAsia="Times New Roman" w:hAnsi="Times New Roman" w:cs="Times New Roman"/>
-                <w:sz w:val="24"/>
-                <w:szCs w:val="24"/>
-              </w:rPr>
-            </w:pPr>
-            <w:r>
-              <w:rPr>
-                <w:rFonts w:ascii="Courier New" w:eastAsia="Times New Roman" w:hAnsi="Courier New" w:cs="Courier New"/>
-                <w:sz w:val="20"/>
-                <w:szCs w:val="20"/>
-              </w:rPr>
-              <w:t>/</w:t>
-            </w:r>
-            <w:proofErr w:type="spellStart"/>
-            <w:r>
-              <w:rPr>
-                <w:rFonts w:ascii="Courier New" w:eastAsia="Times New Roman" w:hAnsi="Courier New" w:cs="Courier New"/>
-                <w:sz w:val="20"/>
-                <w:szCs w:val="20"/>
-              </w:rPr>
-              <w:t>api</w:t>
-            </w:r>
-            <w:proofErr w:type="spellEnd"/>
-            <w:r>
-              <w:rPr>
-                <w:rFonts w:ascii="Courier New" w:eastAsia="Times New Roman" w:hAnsi="Courier New" w:cs="Courier New"/>
-                <w:sz w:val="20"/>
-                <w:szCs w:val="20"/>
-              </w:rPr>
-              <w:t>/v1/reviews</w:t>
-            </w:r>
-          </w:p>
-        </w:tc>
-        <w:tc>
-          <w:tcPr>
-            <w:tcW w:w="0" w:type="auto"/>
-            <w:vAlign w:val="center"/>
-            <w:hideMark/>
-          </w:tcPr>
-          <w:p>
-            <w:pPr>
-              <w:spacing w:after="0" w:line="240" w:lineRule="auto"/>
-              <w:rPr>
-                <w:rFonts w:ascii="Times New Roman" w:eastAsia="Times New Roman" w:hAnsi="Times New Roman" w:cs="Times New Roman"/>
-                <w:sz w:val="24"/>
-                <w:szCs w:val="24"/>
-              </w:rPr>
-            </w:pPr>
-            <w:r>
-              <w:rPr>
-                <w:rFonts w:ascii="Times New Roman" w:eastAsia="Times New Roman" w:hAnsi="Times New Roman" w:cs="Times New Roman"/>
-                <w:sz w:val="24"/>
-                <w:szCs w:val="24"/>
-              </w:rPr>
-              <w:t>Customer</w:t>
-            </w:r>
-          </w:p>
-        </w:tc>
-        <w:tc>
-          <w:tcPr>
-            <w:tcW w:w="0" w:type="auto"/>
-            <w:vAlign w:val="center"/>
-            <w:hideMark/>
-          </w:tcPr>
-          <w:p>
-            <w:pPr>
-              <w:spacing w:after="0" w:line="240" w:lineRule="auto"/>
-              <w:rPr>
-                <w:rFonts w:ascii="Times New Roman" w:eastAsia="Times New Roman" w:hAnsi="Times New Roman" w:cs="Times New Roman"/>
-                <w:sz w:val="24"/>
-                <w:szCs w:val="24"/>
-              </w:rPr>
-            </w:pPr>
-            <w:r>
-              <w:rPr>
-                <w:rFonts w:ascii="Times New Roman" w:eastAsia="Times New Roman" w:hAnsi="Times New Roman" w:cs="Times New Roman"/>
-                <w:sz w:val="24"/>
-                <w:szCs w:val="24"/>
-              </w:rPr>
-              <w:t>Submit a review</w:t>
-            </w:r>
-          </w:p>
-        </w:tc>
-      </w:tr>
-      <w:tr>
-        <w:trPr>
-          <w:tblCellSpacing w:w="15" w:type="dxa"/>
-        </w:trPr>
-        <w:tc>
-          <w:tcPr>
-            <w:tcW w:w="0" w:type="auto"/>
-            <w:vAlign w:val="center"/>
-            <w:hideMark/>
-          </w:tcPr>
-          <w:p>
-            <w:pPr>
-              <w:spacing w:after="0" w:line="240" w:lineRule="auto"/>
-              <w:rPr>
-                <w:rFonts w:ascii="Times New Roman" w:eastAsia="Times New Roman" w:hAnsi="Times New Roman" w:cs="Times New Roman"/>
-                <w:sz w:val="24"/>
-                <w:szCs w:val="24"/>
-              </w:rPr>
-            </w:pPr>
-            <w:r>
-              <w:rPr>
-                <w:rFonts w:ascii="Courier New" w:eastAsia="Times New Roman" w:hAnsi="Courier New" w:cs="Courier New"/>
-                <w:sz w:val="20"/>
-                <w:szCs w:val="20"/>
-              </w:rPr>
-              <w:t>GET</w:t>
-            </w:r>
-          </w:p>
-        </w:tc>
-        <w:tc>
-          <w:tcPr>
-            <w:tcW w:w="0" w:type="auto"/>
-            <w:vAlign w:val="center"/>
-            <w:hideMark/>
-          </w:tcPr>
-          <w:p>
-            <w:pPr>
-              <w:spacing w:after="0" w:line="240" w:lineRule="auto"/>
-              <w:rPr>
-                <w:rFonts w:ascii="Times New Roman" w:eastAsia="Times New Roman" w:hAnsi="Times New Roman" w:cs="Times New Roman"/>
-                <w:sz w:val="24"/>
-                <w:szCs w:val="24"/>
-              </w:rPr>
-            </w:pPr>
-            <w:r>
-              <w:rPr>
-                <w:rFonts w:ascii="Courier New" w:eastAsia="Times New Roman" w:hAnsi="Courier New" w:cs="Courier New"/>
-                <w:sz w:val="20"/>
-                <w:szCs w:val="20"/>
-              </w:rPr>
-              <w:t>/</w:t>
-            </w:r>
-            <w:proofErr w:type="spellStart"/>
-            <w:r>
-              <w:rPr>
-                <w:rFonts w:ascii="Courier New" w:eastAsia="Times New Roman" w:hAnsi="Courier New" w:cs="Courier New"/>
-                <w:sz w:val="20"/>
-                <w:szCs w:val="20"/>
-              </w:rPr>
-              <w:t>api</w:t>
-            </w:r>
-            <w:proofErr w:type="spellEnd"/>
-            <w:r>
-              <w:rPr>
-                <w:rFonts w:ascii="Courier New" w:eastAsia="Times New Roman" w:hAnsi="Courier New" w:cs="Courier New"/>
-                <w:sz w:val="20"/>
-                <w:szCs w:val="20"/>
-              </w:rPr>
-              <w:t>/v1/reviews/my-reviews</w:t>
-            </w:r>
-          </w:p>
-        </w:tc>
-        <w:tc>
-          <w:tcPr>
-            <w:tcW w:w="0" w:type="auto"/>
-            <w:vAlign w:val="center"/>
-            <w:hideMark/>
-          </w:tcPr>
-          <w:p>
-            <w:pPr>
-              <w:spacing w:after="0" w:line="240" w:lineRule="auto"/>
-              <w:rPr>
-                <w:rFonts w:ascii="Times New Roman" w:eastAsia="Times New Roman" w:hAnsi="Times New Roman" w:cs="Times New Roman"/>
-                <w:sz w:val="24"/>
-                <w:szCs w:val="24"/>
-              </w:rPr>
-            </w:pPr>
-            <w:r>
-              <w:rPr>
-                <w:rFonts w:ascii="Times New Roman" w:eastAsia="Times New Roman" w:hAnsi="Times New Roman" w:cs="Times New Roman"/>
-                <w:sz w:val="24"/>
-                <w:szCs w:val="24"/>
-              </w:rPr>
-              <w:t>Customer</w:t>
-            </w:r>
-          </w:p>
-        </w:tc>
-        <w:tc>
-          <w:tcPr>
-            <w:tcW w:w="0" w:type="auto"/>
-            <w:vAlign w:val="center"/>
-            <w:hideMark/>
-          </w:tcPr>
-          <w:p>
-            <w:pPr>
-              <w:spacing w:after="0" w:line="240" w:lineRule="auto"/>
-              <w:rPr>
-                <w:rFonts w:ascii="Times New Roman" w:eastAsia="Times New Roman" w:hAnsi="Times New Roman" w:cs="Times New Roman"/>
-                <w:sz w:val="24"/>
-                <w:szCs w:val="24"/>
-              </w:rPr>
-            </w:pPr>
-            <w:r>
-              <w:rPr>
-                <w:rFonts w:ascii="Times New Roman" w:eastAsia="Times New Roman" w:hAnsi="Times New Roman" w:cs="Times New Roman"/>
-                <w:sz w:val="24"/>
-                <w:szCs w:val="24"/>
-              </w:rPr>
-              <w:t>My review history</w:t>
-            </w:r>
-          </w:p>
-        </w:tc>
-      </w:tr>
-      <w:tr>
-        <w:trPr>
-          <w:tblCellSpacing w:w="15" w:type="dxa"/>
-        </w:trPr>
-        <w:tc>
-          <w:tcPr>
-            <w:tcW w:w="0" w:type="auto"/>
-            <w:vAlign w:val="center"/>
-            <w:hideMark/>
-          </w:tcPr>
-          <w:p>
-            <w:pPr>
-              <w:spacing w:after="0" w:line="240" w:lineRule="auto"/>
-              <w:rPr>
-                <w:rFonts w:ascii="Times New Roman" w:eastAsia="Times New Roman" w:hAnsi="Times New Roman" w:cs="Times New Roman"/>
-                <w:sz w:val="24"/>
-                <w:szCs w:val="24"/>
-              </w:rPr>
-            </w:pPr>
-            <w:r>
-              <w:rPr>
-                <w:rFonts w:ascii="Courier New" w:eastAsia="Times New Roman" w:hAnsi="Courier New" w:cs="Courier New"/>
-                <w:sz w:val="20"/>
-                <w:szCs w:val="20"/>
-              </w:rPr>
-              <w:t>GET</w:t>
-            </w:r>
-          </w:p>
-        </w:tc>
-        <w:tc>
-          <w:tcPr>
-            <w:tcW w:w="0" w:type="auto"/>
-            <w:vAlign w:val="center"/>
-            <w:hideMark/>
-          </w:tcPr>
-          <w:p>
-            <w:pPr>
-              <w:spacing w:after="0" w:line="240" w:lineRule="auto"/>
-              <w:rPr>
-                <w:rFonts w:ascii="Times New Roman" w:eastAsia="Times New Roman" w:hAnsi="Times New Roman" w:cs="Times New Roman"/>
-                <w:sz w:val="24"/>
-                <w:szCs w:val="24"/>
-              </w:rPr>
-            </w:pPr>
-            <w:r>
-              <w:rPr>
-                <w:rFonts w:ascii="Courier New" w:eastAsia="Times New Roman" w:hAnsi="Courier New" w:cs="Courier New"/>
-                <w:sz w:val="20"/>
-                <w:szCs w:val="20"/>
-              </w:rPr>
-              <w:t>/</w:t>
-            </w:r>
-            <w:proofErr w:type="spellStart"/>
-            <w:r>
-              <w:rPr>
-                <w:rFonts w:ascii="Courier New" w:eastAsia="Times New Roman" w:hAnsi="Courier New" w:cs="Courier New"/>
-                <w:sz w:val="20"/>
-                <w:szCs w:val="20"/>
-              </w:rPr>
-              <w:t>api</w:t>
-            </w:r>
-            <w:proofErr w:type="spellEnd"/>
-            <w:r>
-              <w:rPr>
-                <w:rFonts w:ascii="Courier New" w:eastAsia="Times New Roman" w:hAnsi="Courier New" w:cs="Courier New"/>
-                <w:sz w:val="20"/>
-                <w:szCs w:val="20"/>
-              </w:rPr>
-              <w:t>/v1/reviews</w:t>
-            </w:r>
-          </w:p>
-        </w:tc>
-        <w:tc>
-          <w:tcPr>
-            <w:tcW w:w="0" w:type="auto"/>
-            <w:vAlign w:val="center"/>
-            <w:hideMark/>
-          </w:tcPr>
-          <w:p>
-            <w:pPr>
-              <w:spacing w:after="0" w:line="240" w:lineRule="auto"/>
-              <w:rPr>
-                <w:rFonts w:ascii="Times New Roman" w:eastAsia="Times New Roman" w:hAnsi="Times New Roman" w:cs="Times New Roman"/>
-                <w:sz w:val="24"/>
-                <w:szCs w:val="24"/>
-              </w:rPr>
-            </w:pPr>
-            <w:r>
-              <w:rPr>
-                <w:rFonts w:ascii="Times New Roman" w:eastAsia="Times New Roman" w:hAnsi="Times New Roman" w:cs="Times New Roman"/>
-                <w:sz w:val="24"/>
-                <w:szCs w:val="24"/>
-              </w:rPr>
-              <w:t>Admin</w:t>
-            </w:r>
-          </w:p>
-        </w:tc>
-        <w:tc>
-          <w:tcPr>
-            <w:tcW w:w="0" w:type="auto"/>
-            <w:vAlign w:val="center"/>
-            <w:hideMark/>
-          </w:tcPr>
-          <w:p>
-            <w:pPr>
-              <w:spacing w:after="0" w:line="240" w:lineRule="auto"/>
-              <w:rPr>
-                <w:rFonts w:ascii="Times New Roman" w:eastAsia="Times New Roman" w:hAnsi="Times New Roman" w:cs="Times New Roman"/>
-                <w:sz w:val="24"/>
-                <w:szCs w:val="24"/>
-              </w:rPr>
-            </w:pPr>
-            <w:r>
-              <w:rPr>
-                <w:rFonts w:ascii="Times New Roman" w:eastAsia="Times New Roman" w:hAnsi="Times New Roman" w:cs="Times New Roman"/>
-                <w:sz w:val="24"/>
-                <w:szCs w:val="24"/>
-              </w:rPr>
-              <w:t>All reviews</w:t>
-            </w:r>
-          </w:p>
-        </w:tc>
-      </w:tr>
-      <w:tr>
-        <w:trPr>
-          <w:tblCellSpacing w:w="15" w:type="dxa"/>
-        </w:trPr>
-        <w:tc>
-          <w:tcPr>
-            <w:tcW w:w="0" w:type="auto"/>
-            <w:vAlign w:val="center"/>
-            <w:hideMark/>
-          </w:tcPr>
-          <w:p>
-            <w:pPr>
-              <w:spacing w:after="0" w:line="240" w:lineRule="auto"/>
-              <w:rPr>
-                <w:rFonts w:ascii="Times New Roman" w:eastAsia="Times New Roman" w:hAnsi="Times New Roman" w:cs="Times New Roman"/>
-                <w:sz w:val="24"/>
-                <w:szCs w:val="24"/>
-              </w:rPr>
-            </w:pPr>
-            <w:r>
-              <w:rPr>
-                <w:rFonts w:ascii="Courier New" w:eastAsia="Times New Roman" w:hAnsi="Courier New" w:cs="Courier New"/>
-                <w:sz w:val="20"/>
-                <w:szCs w:val="20"/>
-              </w:rPr>
-              <w:t>DELETE</w:t>
-            </w:r>
-          </w:p>
-        </w:tc>
-        <w:tc>
-          <w:tcPr>
-            <w:tcW w:w="0" w:type="auto"/>
-            <w:vAlign w:val="center"/>
-            <w:hideMark/>
-          </w:tcPr>
-          <w:p>
-            <w:pPr>
-              <w:spacing w:after="0" w:line="240" w:lineRule="auto"/>
-              <w:rPr>
-                <w:rFonts w:ascii="Times New Roman" w:eastAsia="Times New Roman" w:hAnsi="Times New Roman" w:cs="Times New Roman"/>
-                <w:sz w:val="24"/>
-                <w:szCs w:val="24"/>
-              </w:rPr>
-            </w:pPr>
-            <w:r>
-              <w:rPr>
-                <w:rFonts w:ascii="Courier New" w:eastAsia="Times New Roman" w:hAnsi="Courier New" w:cs="Courier New"/>
-                <w:sz w:val="20"/>
-                <w:szCs w:val="20"/>
-              </w:rPr>
-              <w:t>/</w:t>
-            </w:r>
-            <w:proofErr w:type="spellStart"/>
-            <w:r>
-              <w:rPr>
-                <w:rFonts w:ascii="Courier New" w:eastAsia="Times New Roman" w:hAnsi="Courier New" w:cs="Courier New"/>
-                <w:sz w:val="20"/>
-                <w:szCs w:val="20"/>
-              </w:rPr>
-              <w:t>api</w:t>
-            </w:r>
-            <w:proofErr w:type="spellEnd"/>
-            <w:r>
-              <w:rPr>
-                <w:rFonts w:ascii="Courier New" w:eastAsia="Times New Roman" w:hAnsi="Courier New" w:cs="Courier New"/>
-                <w:sz w:val="20"/>
-                <w:szCs w:val="20"/>
-              </w:rPr>
-              <w:t>/v1/reviews/{id}</w:t>
-            </w:r>
-          </w:p>
-        </w:tc>
-        <w:tc>
-          <w:tcPr>
-            <w:tcW w:w="0" w:type="auto"/>
-            <w:vAlign w:val="center"/>
-            <w:hideMark/>
-          </w:tcPr>
-          <w:p>
-            <w:pPr>
-              <w:spacing w:after="0" w:line="240" w:lineRule="auto"/>
-              <w:rPr>
-                <w:rFonts w:ascii="Times New Roman" w:eastAsia="Times New Roman" w:hAnsi="Times New Roman" w:cs="Times New Roman"/>
-                <w:sz w:val="24"/>
-                <w:szCs w:val="24"/>
-              </w:rPr>
-            </w:pPr>
-            <w:r>
-              <w:rPr>
-                <w:rFonts w:ascii="Times New Roman" w:eastAsia="Times New Roman" w:hAnsi="Times New Roman" w:cs="Times New Roman"/>
-                <w:sz w:val="24"/>
-                <w:szCs w:val="24"/>
-              </w:rPr>
-              <w:t>Admin</w:t>
-            </w:r>
-          </w:p>
-        </w:tc>
-        <w:tc>
-          <w:tcPr>
-            <w:tcW w:w="0" w:type="auto"/>
-            <w:vAlign w:val="center"/>
-            <w:hideMark/>
-          </w:tcPr>
-          <w:p>
-            <w:pPr>
-              <w:spacing w:after="0" w:line="240" w:lineRule="auto"/>
-              <w:rPr>
-                <w:rFonts w:ascii="Times New Roman" w:eastAsia="Times New Roman" w:hAnsi="Times New Roman" w:cs="Times New Roman"/>
-                <w:sz w:val="24"/>
-                <w:szCs w:val="24"/>
-              </w:rPr>
-            </w:pPr>
-            <w:r>
-              <w:rPr>
-                <w:rFonts w:ascii="Times New Roman" w:eastAsia="Times New Roman" w:hAnsi="Times New Roman" w:cs="Times New Roman"/>
-                <w:sz w:val="24"/>
-                <w:szCs w:val="24"/>
-              </w:rPr>
-              <w:t>Delete abusive review</w:t>
-            </w:r>
-          </w:p>
-        </w:tc>
-      </w:tr>
-      <w:tr>
-        <w:trPr>
-          <w:tblCellSpacing w:w="15" w:type="dxa"/>
-        </w:trPr>
-        <w:tc>
-          <w:tcPr>
-            <w:tcW w:w="0" w:type="auto"/>
-            <w:vAlign w:val="center"/>
-            <w:hideMark/>
-          </w:tcPr>
-          <w:p>
-            <w:pPr>
-              <w:spacing w:after="0" w:line="240" w:lineRule="auto"/>
-              <w:rPr>
-                <w:rFonts w:ascii="Times New Roman" w:eastAsia="Times New Roman" w:hAnsi="Times New Roman" w:cs="Times New Roman"/>
-                <w:sz w:val="24"/>
-                <w:szCs w:val="24"/>
-              </w:rPr>
-            </w:pPr>
-            <w:r>
-              <w:rPr>
-                <w:rFonts w:ascii="Courier New" w:eastAsia="Times New Roman" w:hAnsi="Courier New" w:cs="Courier New"/>
-                <w:sz w:val="20"/>
-                <w:szCs w:val="20"/>
-              </w:rPr>
-              <w:t>GET</w:t>
-            </w:r>
-          </w:p>
-        </w:tc>
-        <w:tc>
-          <w:tcPr>
-            <w:tcW w:w="0" w:type="auto"/>
-            <w:vAlign w:val="center"/>
-            <w:hideMark/>
-          </w:tcPr>
-          <w:p>
-            <w:pPr>
-              <w:spacing w:after="0" w:line="240" w:lineRule="auto"/>
-              <w:rPr>
-                <w:rFonts w:ascii="Times New Roman" w:eastAsia="Times New Roman" w:hAnsi="Times New Roman" w:cs="Times New Roman"/>
-                <w:sz w:val="24"/>
-                <w:szCs w:val="24"/>
-              </w:rPr>
-            </w:pPr>
-            <w:r>
-              <w:rPr>
-                <w:rFonts w:ascii="Courier New" w:eastAsia="Times New Roman" w:hAnsi="Courier New" w:cs="Courier New"/>
-                <w:sz w:val="20"/>
-                <w:szCs w:val="20"/>
-              </w:rPr>
-              <w:t>/</w:t>
-            </w:r>
-            <w:proofErr w:type="spellStart"/>
-            <w:r>
-              <w:rPr>
-                <w:rFonts w:ascii="Courier New" w:eastAsia="Times New Roman" w:hAnsi="Courier New" w:cs="Courier New"/>
-                <w:sz w:val="20"/>
-                <w:szCs w:val="20"/>
-              </w:rPr>
-              <w:t>api</w:t>
-            </w:r>
-            <w:proofErr w:type="spellEnd"/>
-            <w:r>
-              <w:rPr>
-                <w:rFonts w:ascii="Courier New" w:eastAsia="Times New Roman" w:hAnsi="Courier New" w:cs="Courier New"/>
-                <w:sz w:val="20"/>
-                <w:szCs w:val="20"/>
-              </w:rPr>
-              <w:t>/v1/menu/pizzas/{id}/reviews</w:t>
-            </w:r>
-          </w:p>
-        </w:tc>
-        <w:tc>
-          <w:tcPr>
-            <w:tcW w:w="0" w:type="auto"/>
-            <w:vAlign w:val="center"/>
-            <w:hideMark/>
-          </w:tcPr>
-          <w:p>
-            <w:pPr>
-              <w:spacing w:after="0" w:line="240" w:lineRule="auto"/>
-              <w:rPr>
-                <w:rFonts w:ascii="Times New Roman" w:eastAsia="Times New Roman" w:hAnsi="Times New Roman" w:cs="Times New Roman"/>
-                <w:sz w:val="24"/>
-                <w:szCs w:val="24"/>
-              </w:rPr>
-            </w:pPr>
-            <w:r>
-              <w:rPr>
-                <w:rFonts w:ascii="Times New Roman" w:eastAsia="Times New Roman" w:hAnsi="Times New Roman" w:cs="Times New Roman"/>
-                <w:sz w:val="24"/>
-                <w:szCs w:val="24"/>
-              </w:rPr>
-              <w:t>Public</w:t>
-            </w:r>
-          </w:p>
-        </w:tc>
-        <w:tc>
-          <w:tcPr>
-            <w:tcW w:w="0" w:type="auto"/>
-            <w:vAlign w:val="center"/>
-            <w:hideMark/>
-          </w:tcPr>
-          <w:p>
-            <w:pPr>
-              <w:spacing w:after="0" w:line="240" w:lineRule="auto"/>
-              <w:rPr>
-                <w:rFonts w:ascii="Times New Roman" w:eastAsia="Times New Roman" w:hAnsi="Times New Roman" w:cs="Times New Roman"/>
-                <w:sz w:val="24"/>
-                <w:szCs w:val="24"/>
-              </w:rPr>
-            </w:pPr>
-            <w:r>
-              <w:rPr>
-                <w:rFonts w:ascii="Times New Roman" w:eastAsia="Times New Roman" w:hAnsi="Times New Roman" w:cs="Times New Roman"/>
-                <w:sz w:val="24"/>
-                <w:szCs w:val="24"/>
-              </w:rPr>
-              <w:t>Reviews for a pizza</w:t>
-            </w:r>
-          </w:p>
-        </w:tc>
-      </w:tr>
-    </w:tbl>
-    <w:p>
-      <w:pPr>
-        <w:spacing w:before="100" w:beforeAutospacing="1" w:after="100" w:afterAutospacing="1" w:line="240" w:lineRule="auto"/>
-        <w:outlineLvl w:val="2"/>
-        <w:rPr>
-          <w:rFonts w:ascii="Times New Roman" w:eastAsia="Times New Roman" w:hAnsi="Times New Roman" w:cs="Times New Roman"/>
-          <w:b/>
-          <w:bCs/>
-          <w:sz w:val="27"/>
-          <w:szCs w:val="27"/>
-        </w:rPr>
-      </w:pPr>
-      <w:r>
-        <w:rPr>
-          <w:rFonts w:ascii="Times New Roman" w:eastAsia="Times New Roman" w:hAnsi="Times New Roman" w:cs="Times New Roman"/>
-          <w:b/>
-          <w:bCs/>
-          <w:sz w:val="27"/>
-          <w:szCs w:val="27"/>
-        </w:rPr>
-        <w:t>⚙️ Business Logic Rules</w:t>
-      </w:r>
-    </w:p>
-    <w:p>
-      <w:pPr>
-        <w:numPr>
-          <w:ilvl w:val="0"/>
-          <w:numId w:val="22"/>
-        </w:numPr>
-        <w:spacing w:before="100" w:beforeAutospacing="1" w:after="100" w:afterAutospacing="1" w:line="240" w:lineRule="auto"/>
-        <w:rPr>
-          <w:rFonts w:ascii="Times New Roman" w:eastAsia="Times New Roman" w:hAnsi="Times New Roman" w:cs="Times New Roman"/>
-          <w:sz w:val="24"/>
-          <w:szCs w:val="24"/>
-        </w:rPr>
-      </w:pPr>
-      <w:r>
-        <w:rPr>
-          <w:rFonts w:ascii="Times New Roman" w:eastAsia="Times New Roman" w:hAnsi="Times New Roman" w:cs="Times New Roman"/>
-          <w:sz w:val="24"/>
-          <w:szCs w:val="24"/>
-        </w:rPr>
-        <w:t xml:space="preserve">Review is only allowed when </w:t>
-      </w:r>
-      <w:proofErr w:type="spellStart"/>
-      <w:r>
-        <w:rPr>
-          <w:rFonts w:ascii="Courier New" w:eastAsia="Times New Roman" w:hAnsi="Courier New" w:cs="Courier New"/>
-          <w:sz w:val="20"/>
-          <w:szCs w:val="20"/>
-        </w:rPr>
-        <w:t>order.status</w:t>
-      </w:r>
-      <w:proofErr w:type="spellEnd"/>
-      <w:r>
-        <w:rPr>
-          <w:rFonts w:ascii="Courier New" w:eastAsia="Times New Roman" w:hAnsi="Courier New" w:cs="Courier New"/>
-          <w:sz w:val="20"/>
-          <w:szCs w:val="20"/>
-        </w:rPr>
-        <w:t xml:space="preserve"> == delivered</w:t>
-      </w:r>
-      <w:r>
-        <w:rPr>
-          <w:rFonts w:ascii="Times New Roman" w:eastAsia="Times New Roman" w:hAnsi="Times New Roman" w:cs="Times New Roman"/>
-          <w:sz w:val="24"/>
-          <w:szCs w:val="24"/>
-        </w:rPr>
-        <w:t xml:space="preserve"> — check this before allowing submission</w:t>
-      </w:r>
-    </w:p>
-    <w:p>
-      <w:pPr>
-        <w:numPr>
-          <w:ilvl w:val="0"/>
-          <w:numId w:val="22"/>
-        </w:numPr>
-        <w:spacing w:before="100" w:beforeAutospacing="1" w:after="100" w:afterAutospacing="1" w:line="240" w:lineRule="auto"/>
-        <w:rPr>
-          <w:rFonts w:ascii="Times New Roman" w:eastAsia="Times New Roman" w:hAnsi="Times New Roman" w:cs="Times New Roman"/>
-          <w:sz w:val="24"/>
-          <w:szCs w:val="24"/>
-        </w:rPr>
-      </w:pPr>
-      <w:r>
-        <w:rPr>
-          <w:rFonts w:ascii="Times New Roman" w:eastAsia="Times New Roman" w:hAnsi="Times New Roman" w:cs="Times New Roman"/>
-          <w:sz w:val="24"/>
-          <w:szCs w:val="24"/>
-        </w:rPr>
-        <w:t xml:space="preserve">One review per order — enforce with </w:t>
-      </w:r>
-      <w:r>
-        <w:rPr>
-          <w:rFonts w:ascii="Times New Roman" w:eastAsia="Times New Roman" w:hAnsi="Times New Roman" w:cs="Times New Roman"/>
-          <w:b/>
-          <w:bCs/>
-          <w:sz w:val="24"/>
-          <w:szCs w:val="24"/>
-        </w:rPr>
-        <w:t>unique constraint</w:t>
-      </w:r>
-      <w:r>
-        <w:rPr>
-          <w:rFonts w:ascii="Times New Roman" w:eastAsia="Times New Roman" w:hAnsi="Times New Roman" w:cs="Times New Roman"/>
-          <w:sz w:val="24"/>
-          <w:szCs w:val="24"/>
-        </w:rPr>
-        <w:t xml:space="preserve"> on </w:t>
-      </w:r>
-      <w:proofErr w:type="spellStart"/>
-      <w:r>
-        <w:rPr>
-          <w:rFonts w:ascii="Courier New" w:eastAsia="Times New Roman" w:hAnsi="Courier New" w:cs="Courier New"/>
-          <w:sz w:val="20"/>
-          <w:szCs w:val="20"/>
-        </w:rPr>
-        <w:t>order_id</w:t>
-      </w:r>
-      <w:proofErr w:type="spellEnd"/>
-      <w:r>
-        <w:rPr>
-          <w:rFonts w:ascii="Times New Roman" w:eastAsia="Times New Roman" w:hAnsi="Times New Roman" w:cs="Times New Roman"/>
-          <w:sz w:val="24"/>
-          <w:szCs w:val="24"/>
-        </w:rPr>
-        <w:t xml:space="preserve"> column</w:t>
-      </w:r>
-    </w:p>
-    <w:p>
-      <w:pPr>
-        <w:numPr>
-          <w:ilvl w:val="0"/>
-          <w:numId w:val="22"/>
-        </w:numPr>
-        <w:spacing w:before="100" w:beforeAutospacing="1" w:after="100" w:afterAutospacing="1" w:line="240" w:lineRule="auto"/>
-        <w:rPr>
-          <w:rFonts w:ascii="Times New Roman" w:eastAsia="Times New Roman" w:hAnsi="Times New Roman" w:cs="Times New Roman"/>
-          <w:sz w:val="24"/>
-          <w:szCs w:val="24"/>
-        </w:rPr>
-      </w:pPr>
-      <w:r>
-        <w:rPr>
-          <w:rFonts w:ascii="Times New Roman" w:eastAsia="Times New Roman" w:hAnsi="Times New Roman" w:cs="Times New Roman"/>
-          <w:sz w:val="24"/>
-          <w:szCs w:val="24"/>
-        </w:rPr>
-        <w:t xml:space="preserve">Validate that the order being reviewed </w:t>
-      </w:r>
-      <w:r>
-        <w:rPr>
-          <w:rFonts w:ascii="Times New Roman" w:eastAsia="Times New Roman" w:hAnsi="Times New Roman" w:cs="Times New Roman"/>
-          <w:b/>
-          <w:bCs/>
-          <w:sz w:val="24"/>
-          <w:szCs w:val="24"/>
-        </w:rPr>
-        <w:t>belongs to the logged-in customer</w:t>
-      </w:r>
-    </w:p>
-    <w:p>
-      <w:pPr>
-        <w:numPr>
-          <w:ilvl w:val="0"/>
-          <w:numId w:val="22"/>
-        </w:numPr>
-        <w:spacing w:before="100" w:beforeAutospacing="1" w:after="100" w:afterAutospacing="1" w:line="240" w:lineRule="auto"/>
-        <w:rPr>
-          <w:rFonts w:ascii="Times New Roman" w:eastAsia="Times New Roman" w:hAnsi="Times New Roman" w:cs="Times New Roman"/>
-          <w:sz w:val="24"/>
-          <w:szCs w:val="24"/>
-        </w:rPr>
-      </w:pPr>
-      <w:r>
-        <w:rPr>
-          <w:rFonts w:ascii="Times New Roman" w:eastAsia="Times New Roman" w:hAnsi="Times New Roman" w:cs="Times New Roman"/>
-          <w:sz w:val="24"/>
-          <w:szCs w:val="24"/>
-        </w:rPr>
-        <w:t xml:space="preserve">Rating must be between </w:t>
-      </w:r>
-      <w:r>
-        <w:rPr>
-          <w:rFonts w:ascii="Times New Roman" w:eastAsia="Times New Roman" w:hAnsi="Times New Roman" w:cs="Times New Roman"/>
-          <w:b/>
-          <w:bCs/>
-          <w:sz w:val="24"/>
-          <w:szCs w:val="24"/>
-        </w:rPr>
-        <w:t>1 and 5</w:t>
-      </w:r>
-      <w:r>
-        <w:rPr>
-          <w:rFonts w:ascii="Times New Roman" w:eastAsia="Times New Roman" w:hAnsi="Times New Roman" w:cs="Times New Roman"/>
-          <w:sz w:val="24"/>
-          <w:szCs w:val="24"/>
-        </w:rPr>
-        <w:t xml:space="preserve"> — validate in Pydantic with </w:t>
-      </w:r>
-      <w:proofErr w:type="spellStart"/>
-      <w:r>
-        <w:rPr>
-          <w:rFonts w:ascii="Courier New" w:eastAsia="Times New Roman" w:hAnsi="Courier New" w:cs="Courier New"/>
-          <w:sz w:val="20"/>
-          <w:szCs w:val="20"/>
-        </w:rPr>
-        <w:t>ge</w:t>
-      </w:r>
-      <w:proofErr w:type="spellEnd"/>
-      <w:r>
-        <w:rPr>
-          <w:rFonts w:ascii="Courier New" w:eastAsia="Times New Roman" w:hAnsi="Courier New" w:cs="Courier New"/>
-          <w:sz w:val="20"/>
-          <w:szCs w:val="20"/>
-        </w:rPr>
-        <w:t>=1, le=5</w:t>
-      </w:r>
-    </w:p>
-    <w:p>
-      <w:pPr>
-        <w:numPr>
-          <w:ilvl w:val="0"/>
-          <w:numId w:val="22"/>
-        </w:numPr>
-        <w:spacing w:before="100" w:beforeAutospacing="1" w:after="100" w:afterAutospacing="1" w:line="240" w:lineRule="auto"/>
-        <w:rPr>
-          <w:rFonts w:ascii="Times New Roman" w:eastAsia="Times New Roman" w:hAnsi="Times New Roman" w:cs="Times New Roman"/>
-          <w:sz w:val="24"/>
-          <w:szCs w:val="24"/>
-        </w:rPr>
-      </w:pPr>
-      <w:r>
-        <w:rPr>
-          <w:rFonts w:ascii="Times New Roman" w:eastAsia="Times New Roman" w:hAnsi="Times New Roman" w:cs="Times New Roman"/>
-          <w:sz w:val="24"/>
-          <w:szCs w:val="24"/>
-        </w:rPr>
-        <w:t xml:space="preserve">Customers </w:t>
-      </w:r>
-      <w:r>
-        <w:rPr>
-          <w:rFonts w:ascii="Times New Roman" w:eastAsia="Times New Roman" w:hAnsi="Times New Roman" w:cs="Times New Roman"/>
-          <w:b/>
-          <w:bCs/>
-          <w:sz w:val="24"/>
-          <w:szCs w:val="24"/>
-        </w:rPr>
-        <w:t>cannot edit or delete</w:t>
-      </w:r>
-      <w:r>
-        <w:rPr>
-          <w:rFonts w:ascii="Times New Roman" w:eastAsia="Times New Roman" w:hAnsi="Times New Roman" w:cs="Times New Roman"/>
-          <w:sz w:val="24"/>
-          <w:szCs w:val="24"/>
-        </w:rPr>
-        <w:t xml:space="preserve"> their own review after submission — keeps it honest</w:t>
-      </w:r>
-    </w:p>
-    <w:p>
-      <w:pPr>
-        <w:numPr>
-          <w:ilvl w:val="0"/>
-          <w:numId w:val="22"/>
-        </w:numPr>
-        <w:spacing w:before="100" w:beforeAutospacing="1" w:after="100" w:afterAutospacing="1" w:line="240" w:lineRule="auto"/>
-        <w:rPr>
-          <w:rFonts w:ascii="Times New Roman" w:eastAsia="Times New Roman" w:hAnsi="Times New Roman" w:cs="Times New Roman"/>
-          <w:sz w:val="24"/>
-          <w:szCs w:val="24"/>
-        </w:rPr>
-      </w:pPr>
-      <w:r>
-        <w:rPr>
-          <w:rFonts w:ascii="Times New Roman" w:eastAsia="Times New Roman" w:hAnsi="Times New Roman" w:cs="Times New Roman"/>
-          <w:sz w:val="24"/>
-          <w:szCs w:val="24"/>
-        </w:rPr>
-        <w:t>Only admin can delete reviews</w:t>
-      </w:r>
-    </w:p>
-    <w:p>
-      <w:pPr>
-        <w:numPr>
-          <w:ilvl w:val="0"/>
-          <w:numId w:val="22"/>
-        </w:numPr>
-        <w:spacing w:before="100" w:beforeAutospacing="1" w:after="100" w:afterAutospacing="1" w:line="240" w:lineRule="auto"/>
-        <w:rPr>
-          <w:rFonts w:ascii="Times New Roman" w:eastAsia="Times New Roman" w:hAnsi="Times New Roman" w:cs="Times New Roman"/>
-          <w:sz w:val="24"/>
-          <w:szCs w:val="24"/>
-        </w:rPr>
-      </w:pPr>
-      <w:r>
-        <w:rPr>
-          <w:rFonts w:ascii="Times New Roman" w:eastAsia="Times New Roman" w:hAnsi="Times New Roman" w:cs="Times New Roman"/>
-          <w:sz w:val="24"/>
-          <w:szCs w:val="24"/>
-        </w:rPr>
-        <w:t xml:space="preserve">When fetching pizza details, optionally include </w:t>
-      </w:r>
-      <w:r>
-        <w:rPr>
-          <w:rFonts w:ascii="Times New Roman" w:eastAsia="Times New Roman" w:hAnsi="Times New Roman" w:cs="Times New Roman"/>
-          <w:b/>
-          <w:bCs/>
-          <w:sz w:val="24"/>
-          <w:szCs w:val="24"/>
-        </w:rPr>
-        <w:t>average rating</w:t>
-      </w:r>
-      <w:r>
-        <w:rPr>
-          <w:rFonts w:ascii="Times New Roman" w:eastAsia="Times New Roman" w:hAnsi="Times New Roman" w:cs="Times New Roman"/>
-          <w:sz w:val="24"/>
-          <w:szCs w:val="24"/>
-        </w:rPr>
-        <w:t xml:space="preserve"> calculated from all its order reviews</w:t>
-      </w:r>
-    </w:p>
-    <w:p>
-      <w:pPr>
-        <w:spacing w:after="0" w:line="240" w:lineRule="auto"/>
-        <w:rPr>
-          <w:rFonts w:ascii="Times New Roman" w:eastAsia="Times New Roman" w:hAnsi="Times New Roman" w:cs="Times New Roman"/>
-          <w:sz w:val="24"/>
-          <w:szCs w:val="24"/>
-        </w:rPr>
-      </w:pPr>
-      <w:r>
-        <w:rPr>
-          <w:rFonts w:ascii="Times New Roman" w:eastAsia="Times New Roman" w:hAnsi="Times New Roman" w:cs="Times New Roman"/>
-          <w:sz w:val="24"/>
-          <w:szCs w:val="24"/>
-        </w:rPr>
-        <w:pict w14:anchorId="7C26DFAE">
-          <v:rect id="_x0000_i1026" style="width:0;height:1.5pt" o:hralign="center" o:hrstd="t" o:hr="t" fillcolor="#a0a0a0" stroked="f"/>
-        </w:pict>
-      </w:r>
-    </w:p>
-    <w:p>
-      <w:pPr>
-        <w:spacing w:before="100" w:beforeAutospacing="1" w:after="100" w:afterAutospacing="1" w:line="240" w:lineRule="auto"/>
-        <w:outlineLvl w:val="2"/>
-        <w:rPr>
-          <w:rFonts w:ascii="Times New Roman" w:eastAsia="Times New Roman" w:hAnsi="Times New Roman" w:cs="Times New Roman"/>
-          <w:b/>
-          <w:bCs/>
-          <w:sz w:val="27"/>
-          <w:szCs w:val="27"/>
-        </w:rPr>
-      </w:pPr>
-      <w:r>
-        <w:rPr>
-          <w:rFonts w:ascii="Times New Roman" w:eastAsia="Times New Roman" w:hAnsi="Times New Roman" w:cs="Times New Roman"/>
-          <w:b/>
-          <w:bCs/>
-          <w:sz w:val="27"/>
-          <w:szCs w:val="27"/>
-        </w:rPr>
-        <w:t>📦 Pydantic Schemas</w:t>
-      </w:r>
-    </w:p>
-    <w:p>
-      <w:pPr>
-        <w:numPr>
-          <w:ilvl w:val="0"/>
-          <w:numId w:val="23"/>
-        </w:numPr>
-        <w:spacing w:before="100" w:beforeAutospacing="1" w:after="100" w:afterAutospacing="1" w:line="240" w:lineRule="auto"/>
-        <w:rPr>
-          <w:rFonts w:ascii="Times New Roman" w:eastAsia="Times New Roman" w:hAnsi="Times New Roman" w:cs="Times New Roman"/>
-          <w:sz w:val="24"/>
-          <w:szCs w:val="24"/>
-        </w:rPr>
-      </w:pPr>
-      <w:proofErr w:type="spellStart"/>
-      <w:r>
-        <w:rPr>
-          <w:rFonts w:ascii="Courier New" w:eastAsia="Times New Roman" w:hAnsi="Courier New" w:cs="Courier New"/>
-          <w:sz w:val="20"/>
-          <w:szCs w:val="20"/>
-        </w:rPr>
-        <w:t>ReviewCreateSchema</w:t>
-      </w:r>
-      <w:proofErr w:type="spellEnd"/>
-      <w:r>
-        <w:rPr>
-          <w:rFonts w:ascii="Times New Roman" w:eastAsia="Times New Roman" w:hAnsi="Times New Roman" w:cs="Times New Roman"/>
-          <w:sz w:val="24"/>
-          <w:szCs w:val="24"/>
-        </w:rPr>
-        <w:t xml:space="preserve"> — </w:t>
-      </w:r>
-      <w:proofErr w:type="spellStart"/>
-      <w:r>
-        <w:rPr>
-          <w:rFonts w:ascii="Times New Roman" w:eastAsia="Times New Roman" w:hAnsi="Times New Roman" w:cs="Times New Roman"/>
-          <w:sz w:val="24"/>
-          <w:szCs w:val="24"/>
-        </w:rPr>
-        <w:t>order_id</w:t>
-      </w:r>
-      <w:proofErr w:type="spellEnd"/>
-      <w:r>
-        <w:rPr>
-          <w:rFonts w:ascii="Times New Roman" w:eastAsia="Times New Roman" w:hAnsi="Times New Roman" w:cs="Times New Roman"/>
-          <w:sz w:val="24"/>
-          <w:szCs w:val="24"/>
-        </w:rPr>
-        <w:t>, rating, comment</w:t>
-      </w:r>
-    </w:p>
-    <w:p>
-      <w:pPr>
-        <w:numPr>
-          <w:ilvl w:val="0"/>
-          <w:numId w:val="23"/>
-        </w:numPr>
-        <w:spacing w:before="100" w:beforeAutospacing="1" w:after="100" w:afterAutospacing="1" w:line="240" w:lineRule="auto"/>
-        <w:rPr>
-          <w:rFonts w:ascii="Times New Roman" w:eastAsia="Times New Roman" w:hAnsi="Times New Roman" w:cs="Times New Roman"/>
-          <w:sz w:val="24"/>
-          <w:szCs w:val="24"/>
-        </w:rPr>
-      </w:pPr>
-      <w:proofErr w:type="spellStart"/>
-      <w:r>
-        <w:rPr>
-          <w:rFonts w:ascii="Courier New" w:eastAsia="Times New Roman" w:hAnsi="Courier New" w:cs="Courier New"/>
-          <w:sz w:val="20"/>
-          <w:szCs w:val="20"/>
-        </w:rPr>
-        <w:t>ReviewResponseSchema</w:t>
-      </w:r>
-      <w:proofErr w:type="spellEnd"/>
-      <w:r>
-        <w:rPr>
-          <w:rFonts w:ascii="Times New Roman" w:eastAsia="Times New Roman" w:hAnsi="Times New Roman" w:cs="Times New Roman"/>
-          <w:sz w:val="24"/>
-          <w:szCs w:val="24"/>
-        </w:rPr>
-        <w:t xml:space="preserve"> — rating, comment, </w:t>
-      </w:r>
-      <w:proofErr w:type="spellStart"/>
-      <w:r>
-        <w:rPr>
-          <w:rFonts w:ascii="Times New Roman" w:eastAsia="Times New Roman" w:hAnsi="Times New Roman" w:cs="Times New Roman"/>
-          <w:sz w:val="24"/>
-          <w:szCs w:val="24"/>
-        </w:rPr>
-        <w:t>created_at</w:t>
-      </w:r>
-      <w:proofErr w:type="spellEnd"/>
-      <w:r>
-        <w:rPr>
-          <w:rFonts w:ascii="Times New Roman" w:eastAsia="Times New Roman" w:hAnsi="Times New Roman" w:cs="Times New Roman"/>
-          <w:sz w:val="24"/>
-          <w:szCs w:val="24"/>
-        </w:rPr>
-        <w:t xml:space="preserve">, user </w:t>
-      </w:r>
-      <w:proofErr w:type="spellStart"/>
-      <w:r>
-        <w:rPr>
-          <w:rFonts w:ascii="Times New Roman" w:eastAsia="Times New Roman" w:hAnsi="Times New Roman" w:cs="Times New Roman"/>
-          <w:sz w:val="24"/>
-          <w:szCs w:val="24"/>
-        </w:rPr>
-        <w:t>full_name</w:t>
-      </w:r>
-      <w:proofErr w:type="spellEnd"/>
-      <w:r>
-        <w:rPr>
-          <w:rFonts w:ascii="Times New Roman" w:eastAsia="Times New Roman" w:hAnsi="Times New Roman" w:cs="Times New Roman"/>
-          <w:sz w:val="24"/>
-          <w:szCs w:val="24"/>
-        </w:rPr>
-        <w:t xml:space="preserve"> (not email)</w:t>
-      </w:r>
-    </w:p>
-    <w:p>
-      <w:pPr>
-        <w:spacing w:after="0" w:line="240" w:lineRule="auto"/>
-        <w:rPr>
-          <w:rFonts w:ascii="Times New Roman" w:eastAsia="Times New Roman" w:hAnsi="Times New Roman" w:cs="Times New Roman"/>
-          <w:sz w:val="24"/>
-          <w:szCs w:val="24"/>
-        </w:rPr>
-      </w:pPr>
-      <w:r>
-        <w:rPr>
-          <w:rFonts w:ascii="Times New Roman" w:eastAsia="Times New Roman" w:hAnsi="Times New Roman" w:cs="Times New Roman"/>
-          <w:sz w:val="24"/>
-          <w:szCs w:val="24"/>
-        </w:rPr>
-        <w:pict w14:anchorId="7A601C7B">
-          <v:rect id="_x0000_i1027" style="width:0;height:1.5pt" o:hralign="center" o:hrstd="t" o:hr="t" fillcolor="#a0a0a0" stroked="f"/>
-        </w:pict>
-      </w:r>
-    </w:p>
-    <w:p>
-      <w:pPr>
-        <w:spacing w:after="0" w:line="240" w:lineRule="auto"/>
-        <w:rPr>
-          <w:rFonts w:ascii="Times New Roman" w:eastAsia="Times New Roman" w:hAnsi="Times New Roman" w:cs="Times New Roman"/>
-          <w:sz w:val="24"/>
-          <w:szCs w:val="24"/>
-        </w:rPr>
-      </w:pPr>
-      <w:r>
-        <w:rPr>
-          <w:rFonts w:ascii="Times New Roman" w:eastAsia="Times New Roman" w:hAnsi="Times New Roman" w:cs="Times New Roman"/>
-          <w:sz w:val="24"/>
-          <w:szCs w:val="24"/>
-        </w:rPr>
-        <w:pict w14:anchorId="543187B4">
-          <v:rect id="_x0000_i1028" style="width:0;height:1.5pt" o:hralign="center" o:hrstd="t" o:hr="t" fillcolor="#a0a0a0" stroked="f"/>
-        </w:pict>
-      </w:r>
-    </w:p>
-    <w:p>
-      <w:pPr>
-        <w:spacing w:before="100" w:beforeAutospacing="1" w:after="100" w:afterAutospacing="1" w:line="240" w:lineRule="auto"/>
-        <w:outlineLvl w:val="1"/>
-        <w:rPr>
-          <w:rFonts w:ascii="Times New Roman" w:eastAsia="Times New Roman" w:hAnsi="Times New Roman" w:cs="Times New Roman"/>
-          <w:b/>
-          <w:bCs/>
-          <w:sz w:val="36"/>
-          <w:szCs w:val="36"/>
-        </w:rPr>
-      </w:pPr>
-      <w:r>
-        <w:rPr>
-          <w:rFonts w:ascii="Times New Roman" w:eastAsia="Times New Roman" w:hAnsi="Times New Roman" w:cs="Times New Roman"/>
-          <w:b/>
-          <w:bCs/>
-          <w:sz w:val="36"/>
-          <w:szCs w:val="36"/>
-        </w:rPr>
-        <w:t>🔔 Notifications — Full Deep Dive</w:t>
-      </w:r>
-    </w:p>
-    <w:p>
-      <w:pPr>
-        <w:spacing w:after="0" w:line="240" w:lineRule="auto"/>
-        <w:rPr>
-          <w:rFonts w:ascii="Times New Roman" w:eastAsia="Times New Roman" w:hAnsi="Times New Roman" w:cs="Times New Roman"/>
-          <w:sz w:val="24"/>
-          <w:szCs w:val="24"/>
-        </w:rPr>
-      </w:pPr>
-      <w:r>
-        <w:rPr>
-          <w:rFonts w:ascii="Times New Roman" w:eastAsia="Times New Roman" w:hAnsi="Times New Roman" w:cs="Times New Roman"/>
-          <w:sz w:val="24"/>
-          <w:szCs w:val="24"/>
-        </w:rPr>
-        <w:pict w14:anchorId="0B2FE953">
-          <v:rect id="_x0000_i1029" style="width:0;height:1.5pt" o:hralign="center" o:hrstd="t" o:hr="t" fillcolor="#a0a0a0" stroked="f"/>
         </w:pict>
       </w:r>
     </w:p>
@@ -3648,7 +1689,7 @@
           <w:szCs w:val="24"/>
         </w:rPr>
         <w:pict w14:anchorId="4816BBF7">
-          <v:rect id="_x0000_i1030" style="width:0;height:1.5pt" o:hralign="center" o:hrstd="t" o:hr="t" fillcolor="#a0a0a0" stroked="f"/>
+          <v:rect id="_x0000_i1026" style="width:0;height:1.5pt" o:hralign="center" o:hrstd="t" o:hr="t" fillcolor="#a0a0a0" stroked="f"/>
         </w:pict>
       </w:r>
     </w:p>
@@ -3668,7 +1709,7 @@
           <w:szCs w:val="24"/>
         </w:rPr>
         <w:pict w14:anchorId="2B35D005">
-          <v:rect id="_x0000_i1031" style="width:0;height:1.5pt" o:hralign="center" o:hrstd="t" o:hr="t" fillcolor="#a0a0a0" stroked="f"/>
+          <v:rect id="_x0000_i1027" style="width:0;height:1.5pt" o:hralign="center" o:hrstd="t" o:hr="t" fillcolor="#a0a0a0" stroked="f"/>
         </w:pict>
       </w:r>
     </w:p>
@@ -3711,7 +1752,7 @@
           <w:szCs w:val="24"/>
         </w:rPr>
         <w:pict w14:anchorId="4A7A08C3">
-          <v:rect id="_x0000_i1032" style="width:0;height:1.5pt" o:hralign="center" o:hrstd="t" o:hr="t" fillcolor="#a0a0a0" stroked="f"/>
+          <v:rect id="_x0000_i1028" style="width:0;height:1.5pt" o:hralign="center" o:hrstd="t" o:hr="t" fillcolor="#a0a0a0" stroked="f"/>
         </w:pict>
       </w:r>
     </w:p>
@@ -5347,7 +3388,7 @@
           <w:szCs w:val="24"/>
         </w:rPr>
         <w:pict w14:anchorId="46AEFC7A">
-          <v:rect id="_x0000_i1033" style="width:0;height:1.5pt" o:hralign="center" o:hrstd="t" o:hr="t" fillcolor="#a0a0a0" stroked="f"/>
+          <v:rect id="_x0000_i1029" style="width:0;height:1.5pt" o:hralign="center" o:hrstd="t" o:hr="t" fillcolor="#a0a0a0" stroked="f"/>
         </w:pict>
       </w:r>
     </w:p>
@@ -5614,7 +3655,7 @@
           <w:szCs w:val="24"/>
         </w:rPr>
         <w:pict w14:anchorId="4218B3C7">
-          <v:rect id="_x0000_i1034" style="width:0;height:1.5pt" o:hralign="center" o:hrstd="t" o:hr="t" fillcolor="#a0a0a0" stroked="f"/>
+          <v:rect id="_x0000_i1030" style="width:0;height:1.5pt" o:hralign="center" o:hrstd="t" o:hr="t" fillcolor="#a0a0a0" stroked="f"/>
         </w:pict>
       </w:r>
     </w:p>
@@ -5634,7 +3675,7 @@
           <w:szCs w:val="24"/>
         </w:rPr>
         <w:pict w14:anchorId="48B5C2DE">
-          <v:rect id="_x0000_i1035" style="width:0;height:1.5pt" o:hralign="center" o:hrstd="t" o:hr="t" fillcolor="#a0a0a0" stroked="f"/>
+          <v:rect id="_x0000_i1031" style="width:0;height:1.5pt" o:hralign="center" o:hrstd="t" o:hr="t" fillcolor="#a0a0a0" stroked="f"/>
         </w:pict>
       </w:r>
     </w:p>

</xml_diff>

<commit_message>
Developed Notification Feature of my App Completely 4:25 PM 05.05.2026
</commit_message>
<xml_diff>
--- a/Project Structure/Project Structure.docx
+++ b/Project Structure/Project Structure.docx
@@ -14,8 +14,6 @@
           <w:szCs w:val="36"/>
         </w:rPr>
       </w:pPr>
-      <w:bookmarkStart w:id="0" w:name="_GoBack"/>
-      <w:bookmarkEnd w:id="0"/>
       <w:r>
         <w:rPr>
           <w:rFonts w:ascii="Times New Roman" w:eastAsia="Times New Roman" w:hAnsi="Times New Roman" w:cs="Times New Roman"/>
@@ -24,1715 +22,6 @@
           <w:sz w:val="36"/>
           <w:szCs w:val="36"/>
         </w:rPr>
-        <w:t>🔔 Notifications — Full Deep Dive</w:t>
-      </w:r>
-    </w:p>
-    <w:p>
-      <w:pPr>
-        <w:spacing w:after="0" w:line="240" w:lineRule="auto"/>
-        <w:rPr>
-          <w:rFonts w:ascii="Times New Roman" w:eastAsia="Times New Roman" w:hAnsi="Times New Roman" w:cs="Times New Roman"/>
-          <w:sz w:val="24"/>
-          <w:szCs w:val="24"/>
-        </w:rPr>
-      </w:pPr>
-      <w:r>
-        <w:rPr>
-          <w:rFonts w:ascii="Times New Roman" w:eastAsia="Times New Roman" w:hAnsi="Times New Roman" w:cs="Times New Roman"/>
-          <w:sz w:val="24"/>
-          <w:szCs w:val="24"/>
-        </w:rPr>
-        <w:pict w14:anchorId="0B2FE953">
-          <v:rect id="_x0000_i1025" style="width:0;height:1.5pt" o:hralign="center" o:hrstd="t" o:hr="t" fillcolor="#a0a0a0" stroked="f"/>
-        </w:pict>
-      </w:r>
-    </w:p>
-    <w:p>
-      <w:pPr>
-        <w:spacing w:before="100" w:beforeAutospacing="1" w:after="100" w:afterAutospacing="1" w:line="240" w:lineRule="auto"/>
-        <w:outlineLvl w:val="2"/>
-        <w:rPr>
-          <w:rFonts w:ascii="Times New Roman" w:eastAsia="Times New Roman" w:hAnsi="Times New Roman" w:cs="Times New Roman"/>
-          <w:b/>
-          <w:bCs/>
-          <w:sz w:val="27"/>
-          <w:szCs w:val="27"/>
-        </w:rPr>
-      </w:pPr>
-      <w:r>
-        <w:rPr>
-          <w:rFonts w:ascii="Times New Roman" w:eastAsia="Times New Roman" w:hAnsi="Times New Roman" w:cs="Times New Roman"/>
-          <w:b/>
-          <w:bCs/>
-          <w:sz w:val="27"/>
-          <w:szCs w:val="27"/>
-        </w:rPr>
-        <w:t>🗄️ Database Model</w:t>
-      </w:r>
-    </w:p>
-    <w:tbl>
-      <w:tblPr>
-        <w:tblW w:w="0" w:type="auto"/>
-        <w:tblCellSpacing w:w="15" w:type="dxa"/>
-        <w:tblCellMar>
-          <w:top w:w="15" w:type="dxa"/>
-          <w:left w:w="15" w:type="dxa"/>
-          <w:bottom w:w="15" w:type="dxa"/>
-          <w:right w:w="15" w:type="dxa"/>
-        </w:tblCellMar>
-        <w:tblLook w:val="04A0" w:firstRow="1" w:lastRow="0" w:firstColumn="1" w:lastColumn="0" w:noHBand="0" w:noVBand="1"/>
-      </w:tblPr>
-      <w:tblGrid>
-        <w:gridCol w:w="1276"/>
-        <w:gridCol w:w="1180"/>
-        <w:gridCol w:w="3990"/>
-      </w:tblGrid>
-      <w:tr>
-        <w:trPr>
-          <w:tblHeader/>
-          <w:tblCellSpacing w:w="15" w:type="dxa"/>
-        </w:trPr>
-        <w:tc>
-          <w:tcPr>
-            <w:tcW w:w="0" w:type="auto"/>
-            <w:vAlign w:val="center"/>
-            <w:hideMark/>
-          </w:tcPr>
-          <w:p>
-            <w:pPr>
-              <w:spacing w:after="0" w:line="240" w:lineRule="auto"/>
-              <w:jc w:val="center"/>
-              <w:rPr>
-                <w:rFonts w:ascii="Times New Roman" w:eastAsia="Times New Roman" w:hAnsi="Times New Roman" w:cs="Times New Roman"/>
-                <w:b/>
-                <w:bCs/>
-                <w:sz w:val="24"/>
-                <w:szCs w:val="24"/>
-              </w:rPr>
-            </w:pPr>
-            <w:r>
-              <w:rPr>
-                <w:rFonts w:ascii="Times New Roman" w:eastAsia="Times New Roman" w:hAnsi="Times New Roman" w:cs="Times New Roman"/>
-                <w:b/>
-                <w:bCs/>
-                <w:sz w:val="24"/>
-                <w:szCs w:val="24"/>
-              </w:rPr>
-              <w:t>Column</w:t>
-            </w:r>
-          </w:p>
-        </w:tc>
-        <w:tc>
-          <w:tcPr>
-            <w:tcW w:w="0" w:type="auto"/>
-            <w:vAlign w:val="center"/>
-            <w:hideMark/>
-          </w:tcPr>
-          <w:p>
-            <w:pPr>
-              <w:spacing w:after="0" w:line="240" w:lineRule="auto"/>
-              <w:jc w:val="center"/>
-              <w:rPr>
-                <w:rFonts w:ascii="Times New Roman" w:eastAsia="Times New Roman" w:hAnsi="Times New Roman" w:cs="Times New Roman"/>
-                <w:b/>
-                <w:bCs/>
-                <w:sz w:val="24"/>
-                <w:szCs w:val="24"/>
-              </w:rPr>
-            </w:pPr>
-            <w:r>
-              <w:rPr>
-                <w:rFonts w:ascii="Times New Roman" w:eastAsia="Times New Roman" w:hAnsi="Times New Roman" w:cs="Times New Roman"/>
-                <w:b/>
-                <w:bCs/>
-                <w:sz w:val="24"/>
-                <w:szCs w:val="24"/>
-              </w:rPr>
-              <w:t>Type</w:t>
-            </w:r>
-          </w:p>
-        </w:tc>
-        <w:tc>
-          <w:tcPr>
-            <w:tcW w:w="0" w:type="auto"/>
-            <w:vAlign w:val="center"/>
-            <w:hideMark/>
-          </w:tcPr>
-          <w:p>
-            <w:pPr>
-              <w:spacing w:after="0" w:line="240" w:lineRule="auto"/>
-              <w:jc w:val="center"/>
-              <w:rPr>
-                <w:rFonts w:ascii="Times New Roman" w:eastAsia="Times New Roman" w:hAnsi="Times New Roman" w:cs="Times New Roman"/>
-                <w:b/>
-                <w:bCs/>
-                <w:sz w:val="24"/>
-                <w:szCs w:val="24"/>
-              </w:rPr>
-            </w:pPr>
-            <w:r>
-              <w:rPr>
-                <w:rFonts w:ascii="Times New Roman" w:eastAsia="Times New Roman" w:hAnsi="Times New Roman" w:cs="Times New Roman"/>
-                <w:b/>
-                <w:bCs/>
-                <w:sz w:val="24"/>
-                <w:szCs w:val="24"/>
-              </w:rPr>
-              <w:t>Notes</w:t>
-            </w:r>
-          </w:p>
-        </w:tc>
-      </w:tr>
-      <w:tr>
-        <w:trPr>
-          <w:tblCellSpacing w:w="15" w:type="dxa"/>
-        </w:trPr>
-        <w:tc>
-          <w:tcPr>
-            <w:tcW w:w="0" w:type="auto"/>
-            <w:vAlign w:val="center"/>
-            <w:hideMark/>
-          </w:tcPr>
-          <w:p>
-            <w:pPr>
-              <w:spacing w:after="0" w:line="240" w:lineRule="auto"/>
-              <w:rPr>
-                <w:rFonts w:ascii="Times New Roman" w:eastAsia="Times New Roman" w:hAnsi="Times New Roman" w:cs="Times New Roman"/>
-                <w:sz w:val="24"/>
-                <w:szCs w:val="24"/>
-              </w:rPr>
-            </w:pPr>
-            <w:r>
-              <w:rPr>
-                <w:rFonts w:ascii="Courier New" w:eastAsia="Times New Roman" w:hAnsi="Courier New" w:cs="Courier New"/>
-                <w:sz w:val="20"/>
-                <w:szCs w:val="20"/>
-              </w:rPr>
-              <w:t>id</w:t>
-            </w:r>
-          </w:p>
-        </w:tc>
-        <w:tc>
-          <w:tcPr>
-            <w:tcW w:w="0" w:type="auto"/>
-            <w:vAlign w:val="center"/>
-            <w:hideMark/>
-          </w:tcPr>
-          <w:p>
-            <w:pPr>
-              <w:spacing w:after="0" w:line="240" w:lineRule="auto"/>
-              <w:rPr>
-                <w:rFonts w:ascii="Times New Roman" w:eastAsia="Times New Roman" w:hAnsi="Times New Roman" w:cs="Times New Roman"/>
-                <w:sz w:val="24"/>
-                <w:szCs w:val="24"/>
-              </w:rPr>
-            </w:pPr>
-            <w:r>
-              <w:rPr>
-                <w:rFonts w:ascii="Times New Roman" w:eastAsia="Times New Roman" w:hAnsi="Times New Roman" w:cs="Times New Roman"/>
-                <w:sz w:val="24"/>
-                <w:szCs w:val="24"/>
-              </w:rPr>
-              <w:t>Integer</w:t>
-            </w:r>
-          </w:p>
-        </w:tc>
-        <w:tc>
-          <w:tcPr>
-            <w:tcW w:w="0" w:type="auto"/>
-            <w:vAlign w:val="center"/>
-            <w:hideMark/>
-          </w:tcPr>
-          <w:p>
-            <w:pPr>
-              <w:spacing w:after="0" w:line="240" w:lineRule="auto"/>
-              <w:rPr>
-                <w:rFonts w:ascii="Times New Roman" w:eastAsia="Times New Roman" w:hAnsi="Times New Roman" w:cs="Times New Roman"/>
-                <w:sz w:val="24"/>
-                <w:szCs w:val="24"/>
-              </w:rPr>
-            </w:pPr>
-          </w:p>
-        </w:tc>
-      </w:tr>
-      <w:tr>
-        <w:trPr>
-          <w:tblCellSpacing w:w="15" w:type="dxa"/>
-        </w:trPr>
-        <w:tc>
-          <w:tcPr>
-            <w:tcW w:w="0" w:type="auto"/>
-            <w:vAlign w:val="center"/>
-            <w:hideMark/>
-          </w:tcPr>
-          <w:p>
-            <w:pPr>
-              <w:spacing w:after="0" w:line="240" w:lineRule="auto"/>
-              <w:rPr>
-                <w:rFonts w:ascii="Times New Roman" w:eastAsia="Times New Roman" w:hAnsi="Times New Roman" w:cs="Times New Roman"/>
-                <w:sz w:val="24"/>
-                <w:szCs w:val="24"/>
-              </w:rPr>
-            </w:pPr>
-            <w:proofErr w:type="spellStart"/>
-            <w:r>
-              <w:rPr>
-                <w:rFonts w:ascii="Courier New" w:eastAsia="Times New Roman" w:hAnsi="Courier New" w:cs="Courier New"/>
-                <w:sz w:val="20"/>
-                <w:szCs w:val="20"/>
-              </w:rPr>
-              <w:t>user_id</w:t>
-            </w:r>
-            <w:proofErr w:type="spellEnd"/>
-          </w:p>
-        </w:tc>
-        <w:tc>
-          <w:tcPr>
-            <w:tcW w:w="0" w:type="auto"/>
-            <w:vAlign w:val="center"/>
-            <w:hideMark/>
-          </w:tcPr>
-          <w:p>
-            <w:pPr>
-              <w:spacing w:after="0" w:line="240" w:lineRule="auto"/>
-              <w:rPr>
-                <w:rFonts w:ascii="Times New Roman" w:eastAsia="Times New Roman" w:hAnsi="Times New Roman" w:cs="Times New Roman"/>
-                <w:sz w:val="24"/>
-                <w:szCs w:val="24"/>
-              </w:rPr>
-            </w:pPr>
-            <w:r>
-              <w:rPr>
-                <w:rFonts w:ascii="Times New Roman" w:eastAsia="Times New Roman" w:hAnsi="Times New Roman" w:cs="Times New Roman"/>
-                <w:sz w:val="24"/>
-                <w:szCs w:val="24"/>
-              </w:rPr>
-              <w:t>FK → User</w:t>
-            </w:r>
-          </w:p>
-        </w:tc>
-        <w:tc>
-          <w:tcPr>
-            <w:tcW w:w="0" w:type="auto"/>
-            <w:vAlign w:val="center"/>
-            <w:hideMark/>
-          </w:tcPr>
-          <w:p>
-            <w:pPr>
-              <w:spacing w:after="0" w:line="240" w:lineRule="auto"/>
-              <w:rPr>
-                <w:rFonts w:ascii="Times New Roman" w:eastAsia="Times New Roman" w:hAnsi="Times New Roman" w:cs="Times New Roman"/>
-                <w:sz w:val="24"/>
-                <w:szCs w:val="24"/>
-              </w:rPr>
-            </w:pPr>
-          </w:p>
-        </w:tc>
-      </w:tr>
-      <w:tr>
-        <w:trPr>
-          <w:tblCellSpacing w:w="15" w:type="dxa"/>
-        </w:trPr>
-        <w:tc>
-          <w:tcPr>
-            <w:tcW w:w="0" w:type="auto"/>
-            <w:vAlign w:val="center"/>
-            <w:hideMark/>
-          </w:tcPr>
-          <w:p>
-            <w:pPr>
-              <w:spacing w:after="0" w:line="240" w:lineRule="auto"/>
-              <w:rPr>
-                <w:rFonts w:ascii="Times New Roman" w:eastAsia="Times New Roman" w:hAnsi="Times New Roman" w:cs="Times New Roman"/>
-                <w:sz w:val="24"/>
-                <w:szCs w:val="24"/>
-              </w:rPr>
-            </w:pPr>
-            <w:r>
-              <w:rPr>
-                <w:rFonts w:ascii="Courier New" w:eastAsia="Times New Roman" w:hAnsi="Courier New" w:cs="Courier New"/>
-                <w:sz w:val="20"/>
-                <w:szCs w:val="20"/>
-              </w:rPr>
-              <w:t>title</w:t>
-            </w:r>
-          </w:p>
-        </w:tc>
-        <w:tc>
-          <w:tcPr>
-            <w:tcW w:w="0" w:type="auto"/>
-            <w:vAlign w:val="center"/>
-            <w:hideMark/>
-          </w:tcPr>
-          <w:p>
-            <w:pPr>
-              <w:spacing w:after="0" w:line="240" w:lineRule="auto"/>
-              <w:rPr>
-                <w:rFonts w:ascii="Times New Roman" w:eastAsia="Times New Roman" w:hAnsi="Times New Roman" w:cs="Times New Roman"/>
-                <w:sz w:val="24"/>
-                <w:szCs w:val="24"/>
-              </w:rPr>
-            </w:pPr>
-            <w:r>
-              <w:rPr>
-                <w:rFonts w:ascii="Times New Roman" w:eastAsia="Times New Roman" w:hAnsi="Times New Roman" w:cs="Times New Roman"/>
-                <w:sz w:val="24"/>
-                <w:szCs w:val="24"/>
-              </w:rPr>
-              <w:t>String</w:t>
-            </w:r>
-          </w:p>
-        </w:tc>
-        <w:tc>
-          <w:tcPr>
-            <w:tcW w:w="0" w:type="auto"/>
-            <w:vAlign w:val="center"/>
-            <w:hideMark/>
-          </w:tcPr>
-          <w:p>
-            <w:pPr>
-              <w:spacing w:after="0" w:line="240" w:lineRule="auto"/>
-              <w:rPr>
-                <w:rFonts w:ascii="Times New Roman" w:eastAsia="Times New Roman" w:hAnsi="Times New Roman" w:cs="Times New Roman"/>
-                <w:sz w:val="24"/>
-                <w:szCs w:val="24"/>
-              </w:rPr>
-            </w:pPr>
-            <w:r>
-              <w:rPr>
-                <w:rFonts w:ascii="Times New Roman" w:eastAsia="Times New Roman" w:hAnsi="Times New Roman" w:cs="Times New Roman"/>
-                <w:sz w:val="24"/>
-                <w:szCs w:val="24"/>
-              </w:rPr>
-              <w:t>e.g. "Order Confirmed!"</w:t>
-            </w:r>
-          </w:p>
-        </w:tc>
-      </w:tr>
-      <w:tr>
-        <w:trPr>
-          <w:tblCellSpacing w:w="15" w:type="dxa"/>
-        </w:trPr>
-        <w:tc>
-          <w:tcPr>
-            <w:tcW w:w="0" w:type="auto"/>
-            <w:vAlign w:val="center"/>
-            <w:hideMark/>
-          </w:tcPr>
-          <w:p>
-            <w:pPr>
-              <w:spacing w:after="0" w:line="240" w:lineRule="auto"/>
-              <w:rPr>
-                <w:rFonts w:ascii="Times New Roman" w:eastAsia="Times New Roman" w:hAnsi="Times New Roman" w:cs="Times New Roman"/>
-                <w:sz w:val="24"/>
-                <w:szCs w:val="24"/>
-              </w:rPr>
-            </w:pPr>
-            <w:r>
-              <w:rPr>
-                <w:rFonts w:ascii="Courier New" w:eastAsia="Times New Roman" w:hAnsi="Courier New" w:cs="Courier New"/>
-                <w:sz w:val="20"/>
-                <w:szCs w:val="20"/>
-              </w:rPr>
-              <w:t>message</w:t>
-            </w:r>
-          </w:p>
-        </w:tc>
-        <w:tc>
-          <w:tcPr>
-            <w:tcW w:w="0" w:type="auto"/>
-            <w:vAlign w:val="center"/>
-            <w:hideMark/>
-          </w:tcPr>
-          <w:p>
-            <w:pPr>
-              <w:spacing w:after="0" w:line="240" w:lineRule="auto"/>
-              <w:rPr>
-                <w:rFonts w:ascii="Times New Roman" w:eastAsia="Times New Roman" w:hAnsi="Times New Roman" w:cs="Times New Roman"/>
-                <w:sz w:val="24"/>
-                <w:szCs w:val="24"/>
-              </w:rPr>
-            </w:pPr>
-            <w:r>
-              <w:rPr>
-                <w:rFonts w:ascii="Times New Roman" w:eastAsia="Times New Roman" w:hAnsi="Times New Roman" w:cs="Times New Roman"/>
-                <w:sz w:val="24"/>
-                <w:szCs w:val="24"/>
-              </w:rPr>
-              <w:t>String</w:t>
-            </w:r>
-          </w:p>
-        </w:tc>
-        <w:tc>
-          <w:tcPr>
-            <w:tcW w:w="0" w:type="auto"/>
-            <w:vAlign w:val="center"/>
-            <w:hideMark/>
-          </w:tcPr>
-          <w:p>
-            <w:pPr>
-              <w:spacing w:after="0" w:line="240" w:lineRule="auto"/>
-              <w:rPr>
-                <w:rFonts w:ascii="Times New Roman" w:eastAsia="Times New Roman" w:hAnsi="Times New Roman" w:cs="Times New Roman"/>
-                <w:sz w:val="24"/>
-                <w:szCs w:val="24"/>
-              </w:rPr>
-            </w:pPr>
-            <w:r>
-              <w:rPr>
-                <w:rFonts w:ascii="Times New Roman" w:eastAsia="Times New Roman" w:hAnsi="Times New Roman" w:cs="Times New Roman"/>
-                <w:sz w:val="24"/>
-                <w:szCs w:val="24"/>
-              </w:rPr>
-              <w:t>e.g. "Your order #123 is being prepared"</w:t>
-            </w:r>
-          </w:p>
-        </w:tc>
-      </w:tr>
-      <w:tr>
-        <w:trPr>
-          <w:tblCellSpacing w:w="15" w:type="dxa"/>
-        </w:trPr>
-        <w:tc>
-          <w:tcPr>
-            <w:tcW w:w="0" w:type="auto"/>
-            <w:vAlign w:val="center"/>
-            <w:hideMark/>
-          </w:tcPr>
-          <w:p>
-            <w:pPr>
-              <w:spacing w:after="0" w:line="240" w:lineRule="auto"/>
-              <w:rPr>
-                <w:rFonts w:ascii="Times New Roman" w:eastAsia="Times New Roman" w:hAnsi="Times New Roman" w:cs="Times New Roman"/>
-                <w:sz w:val="24"/>
-                <w:szCs w:val="24"/>
-              </w:rPr>
-            </w:pPr>
-            <w:proofErr w:type="spellStart"/>
-            <w:r>
-              <w:rPr>
-                <w:rFonts w:ascii="Courier New" w:eastAsia="Times New Roman" w:hAnsi="Courier New" w:cs="Courier New"/>
-                <w:sz w:val="20"/>
-                <w:szCs w:val="20"/>
-              </w:rPr>
-              <w:t>is_read</w:t>
-            </w:r>
-            <w:proofErr w:type="spellEnd"/>
-          </w:p>
-        </w:tc>
-        <w:tc>
-          <w:tcPr>
-            <w:tcW w:w="0" w:type="auto"/>
-            <w:vAlign w:val="center"/>
-            <w:hideMark/>
-          </w:tcPr>
-          <w:p>
-            <w:pPr>
-              <w:spacing w:after="0" w:line="240" w:lineRule="auto"/>
-              <w:rPr>
-                <w:rFonts w:ascii="Times New Roman" w:eastAsia="Times New Roman" w:hAnsi="Times New Roman" w:cs="Times New Roman"/>
-                <w:sz w:val="24"/>
-                <w:szCs w:val="24"/>
-              </w:rPr>
-            </w:pPr>
-            <w:r>
-              <w:rPr>
-                <w:rFonts w:ascii="Times New Roman" w:eastAsia="Times New Roman" w:hAnsi="Times New Roman" w:cs="Times New Roman"/>
-                <w:sz w:val="24"/>
-                <w:szCs w:val="24"/>
-              </w:rPr>
-              <w:t>Boolean</w:t>
-            </w:r>
-          </w:p>
-        </w:tc>
-        <w:tc>
-          <w:tcPr>
-            <w:tcW w:w="0" w:type="auto"/>
-            <w:vAlign w:val="center"/>
-            <w:hideMark/>
-          </w:tcPr>
-          <w:p>
-            <w:pPr>
-              <w:spacing w:after="0" w:line="240" w:lineRule="auto"/>
-              <w:rPr>
-                <w:rFonts w:ascii="Times New Roman" w:eastAsia="Times New Roman" w:hAnsi="Times New Roman" w:cs="Times New Roman"/>
-                <w:sz w:val="24"/>
-                <w:szCs w:val="24"/>
-              </w:rPr>
-            </w:pPr>
-            <w:r>
-              <w:rPr>
-                <w:rFonts w:ascii="Times New Roman" w:eastAsia="Times New Roman" w:hAnsi="Times New Roman" w:cs="Times New Roman"/>
-                <w:sz w:val="24"/>
-                <w:szCs w:val="24"/>
-              </w:rPr>
-              <w:t>default False</w:t>
-            </w:r>
-          </w:p>
-        </w:tc>
-      </w:tr>
-      <w:tr>
-        <w:trPr>
-          <w:tblCellSpacing w:w="15" w:type="dxa"/>
-        </w:trPr>
-        <w:tc>
-          <w:tcPr>
-            <w:tcW w:w="0" w:type="auto"/>
-            <w:vAlign w:val="center"/>
-            <w:hideMark/>
-          </w:tcPr>
-          <w:p>
-            <w:pPr>
-              <w:spacing w:after="0" w:line="240" w:lineRule="auto"/>
-              <w:rPr>
-                <w:rFonts w:ascii="Times New Roman" w:eastAsia="Times New Roman" w:hAnsi="Times New Roman" w:cs="Times New Roman"/>
-                <w:sz w:val="24"/>
-                <w:szCs w:val="24"/>
-              </w:rPr>
-            </w:pPr>
-            <w:proofErr w:type="spellStart"/>
-            <w:r>
-              <w:rPr>
-                <w:rFonts w:ascii="Courier New" w:eastAsia="Times New Roman" w:hAnsi="Courier New" w:cs="Courier New"/>
-                <w:sz w:val="20"/>
-                <w:szCs w:val="20"/>
-              </w:rPr>
-              <w:t>created_at</w:t>
-            </w:r>
-            <w:proofErr w:type="spellEnd"/>
-          </w:p>
-        </w:tc>
-        <w:tc>
-          <w:tcPr>
-            <w:tcW w:w="0" w:type="auto"/>
-            <w:vAlign w:val="center"/>
-            <w:hideMark/>
-          </w:tcPr>
-          <w:p>
-            <w:pPr>
-              <w:spacing w:after="0" w:line="240" w:lineRule="auto"/>
-              <w:rPr>
-                <w:rFonts w:ascii="Times New Roman" w:eastAsia="Times New Roman" w:hAnsi="Times New Roman" w:cs="Times New Roman"/>
-                <w:sz w:val="24"/>
-                <w:szCs w:val="24"/>
-              </w:rPr>
-            </w:pPr>
-            <w:proofErr w:type="spellStart"/>
-            <w:r>
-              <w:rPr>
-                <w:rFonts w:ascii="Times New Roman" w:eastAsia="Times New Roman" w:hAnsi="Times New Roman" w:cs="Times New Roman"/>
-                <w:sz w:val="24"/>
-                <w:szCs w:val="24"/>
-              </w:rPr>
-              <w:t>DateTime</w:t>
-            </w:r>
-            <w:proofErr w:type="spellEnd"/>
-          </w:p>
-        </w:tc>
-        <w:tc>
-          <w:tcPr>
-            <w:tcW w:w="0" w:type="auto"/>
-            <w:vAlign w:val="center"/>
-            <w:hideMark/>
-          </w:tcPr>
-          <w:p>
-            <w:pPr>
-              <w:spacing w:after="0" w:line="240" w:lineRule="auto"/>
-              <w:rPr>
-                <w:rFonts w:ascii="Times New Roman" w:eastAsia="Times New Roman" w:hAnsi="Times New Roman" w:cs="Times New Roman"/>
-                <w:sz w:val="24"/>
-                <w:szCs w:val="24"/>
-              </w:rPr>
-            </w:pPr>
-          </w:p>
-        </w:tc>
-      </w:tr>
-    </w:tbl>
-    <w:p>
-      <w:pPr>
-        <w:spacing w:before="100" w:beforeAutospacing="1" w:after="100" w:afterAutospacing="1" w:line="240" w:lineRule="auto"/>
-        <w:outlineLvl w:val="2"/>
-        <w:rPr>
-          <w:rFonts w:ascii="Times New Roman" w:eastAsia="Times New Roman" w:hAnsi="Times New Roman" w:cs="Times New Roman"/>
-          <w:b/>
-          <w:bCs/>
-          <w:sz w:val="27"/>
-          <w:szCs w:val="27"/>
-        </w:rPr>
-      </w:pPr>
-      <w:r>
-        <w:rPr>
-          <w:rFonts w:ascii="Times New Roman" w:eastAsia="Times New Roman" w:hAnsi="Times New Roman" w:cs="Times New Roman"/>
-          <w:b/>
-          <w:bCs/>
-          <w:sz w:val="27"/>
-          <w:szCs w:val="27"/>
-        </w:rPr>
-        <w:t>📡 API Endpoints</w:t>
-      </w:r>
-    </w:p>
-    <w:tbl>
-      <w:tblPr>
-        <w:tblW w:w="0" w:type="auto"/>
-        <w:tblCellSpacing w:w="15" w:type="dxa"/>
-        <w:tblCellMar>
-          <w:top w:w="15" w:type="dxa"/>
-          <w:left w:w="15" w:type="dxa"/>
-          <w:bottom w:w="15" w:type="dxa"/>
-          <w:right w:w="15" w:type="dxa"/>
-        </w:tblCellMar>
-        <w:tblLook w:val="04A0" w:firstRow="1" w:lastRow="0" w:firstColumn="1" w:lastColumn="0" w:noHBand="0" w:noVBand="1"/>
-      </w:tblPr>
-      <w:tblGrid>
-        <w:gridCol w:w="875"/>
-        <w:gridCol w:w="4141"/>
-        <w:gridCol w:w="994"/>
-        <w:gridCol w:w="2861"/>
-      </w:tblGrid>
-      <w:tr>
-        <w:trPr>
-          <w:tblHeader/>
-          <w:tblCellSpacing w:w="15" w:type="dxa"/>
-        </w:trPr>
-        <w:tc>
-          <w:tcPr>
-            <w:tcW w:w="0" w:type="auto"/>
-            <w:vAlign w:val="center"/>
-            <w:hideMark/>
-          </w:tcPr>
-          <w:p>
-            <w:pPr>
-              <w:spacing w:after="0" w:line="240" w:lineRule="auto"/>
-              <w:jc w:val="center"/>
-              <w:rPr>
-                <w:rFonts w:ascii="Times New Roman" w:eastAsia="Times New Roman" w:hAnsi="Times New Roman" w:cs="Times New Roman"/>
-                <w:b/>
-                <w:bCs/>
-                <w:sz w:val="24"/>
-                <w:szCs w:val="24"/>
-              </w:rPr>
-            </w:pPr>
-            <w:r>
-              <w:rPr>
-                <w:rFonts w:ascii="Times New Roman" w:eastAsia="Times New Roman" w:hAnsi="Times New Roman" w:cs="Times New Roman"/>
-                <w:b/>
-                <w:bCs/>
-                <w:sz w:val="24"/>
-                <w:szCs w:val="24"/>
-              </w:rPr>
-              <w:t>Method</w:t>
-            </w:r>
-          </w:p>
-        </w:tc>
-        <w:tc>
-          <w:tcPr>
-            <w:tcW w:w="0" w:type="auto"/>
-            <w:vAlign w:val="center"/>
-            <w:hideMark/>
-          </w:tcPr>
-          <w:p>
-            <w:pPr>
-              <w:spacing w:after="0" w:line="240" w:lineRule="auto"/>
-              <w:jc w:val="center"/>
-              <w:rPr>
-                <w:rFonts w:ascii="Times New Roman" w:eastAsia="Times New Roman" w:hAnsi="Times New Roman" w:cs="Times New Roman"/>
-                <w:b/>
-                <w:bCs/>
-                <w:sz w:val="24"/>
-                <w:szCs w:val="24"/>
-              </w:rPr>
-            </w:pPr>
-            <w:r>
-              <w:rPr>
-                <w:rFonts w:ascii="Times New Roman" w:eastAsia="Times New Roman" w:hAnsi="Times New Roman" w:cs="Times New Roman"/>
-                <w:b/>
-                <w:bCs/>
-                <w:sz w:val="24"/>
-                <w:szCs w:val="24"/>
-              </w:rPr>
-              <w:t>URL</w:t>
-            </w:r>
-          </w:p>
-        </w:tc>
-        <w:tc>
-          <w:tcPr>
-            <w:tcW w:w="0" w:type="auto"/>
-            <w:vAlign w:val="center"/>
-            <w:hideMark/>
-          </w:tcPr>
-          <w:p>
-            <w:pPr>
-              <w:spacing w:after="0" w:line="240" w:lineRule="auto"/>
-              <w:jc w:val="center"/>
-              <w:rPr>
-                <w:rFonts w:ascii="Times New Roman" w:eastAsia="Times New Roman" w:hAnsi="Times New Roman" w:cs="Times New Roman"/>
-                <w:b/>
-                <w:bCs/>
-                <w:sz w:val="24"/>
-                <w:szCs w:val="24"/>
-              </w:rPr>
-            </w:pPr>
-            <w:r>
-              <w:rPr>
-                <w:rFonts w:ascii="Times New Roman" w:eastAsia="Times New Roman" w:hAnsi="Times New Roman" w:cs="Times New Roman"/>
-                <w:b/>
-                <w:bCs/>
-                <w:sz w:val="24"/>
-                <w:szCs w:val="24"/>
-              </w:rPr>
-              <w:t>Who</w:t>
-            </w:r>
-          </w:p>
-        </w:tc>
-        <w:tc>
-          <w:tcPr>
-            <w:tcW w:w="0" w:type="auto"/>
-            <w:vAlign w:val="center"/>
-            <w:hideMark/>
-          </w:tcPr>
-          <w:p>
-            <w:pPr>
-              <w:spacing w:after="0" w:line="240" w:lineRule="auto"/>
-              <w:jc w:val="center"/>
-              <w:rPr>
-                <w:rFonts w:ascii="Times New Roman" w:eastAsia="Times New Roman" w:hAnsi="Times New Roman" w:cs="Times New Roman"/>
-                <w:b/>
-                <w:bCs/>
-                <w:sz w:val="24"/>
-                <w:szCs w:val="24"/>
-              </w:rPr>
-            </w:pPr>
-            <w:r>
-              <w:rPr>
-                <w:rFonts w:ascii="Times New Roman" w:eastAsia="Times New Roman" w:hAnsi="Times New Roman" w:cs="Times New Roman"/>
-                <w:b/>
-                <w:bCs/>
-                <w:sz w:val="24"/>
-                <w:szCs w:val="24"/>
-              </w:rPr>
-              <w:t>What</w:t>
-            </w:r>
-          </w:p>
-        </w:tc>
-      </w:tr>
-      <w:tr>
-        <w:trPr>
-          <w:tblCellSpacing w:w="15" w:type="dxa"/>
-        </w:trPr>
-        <w:tc>
-          <w:tcPr>
-            <w:tcW w:w="0" w:type="auto"/>
-            <w:vAlign w:val="center"/>
-            <w:hideMark/>
-          </w:tcPr>
-          <w:p>
-            <w:pPr>
-              <w:spacing w:after="0" w:line="240" w:lineRule="auto"/>
-              <w:rPr>
-                <w:rFonts w:ascii="Times New Roman" w:eastAsia="Times New Roman" w:hAnsi="Times New Roman" w:cs="Times New Roman"/>
-                <w:sz w:val="24"/>
-                <w:szCs w:val="24"/>
-              </w:rPr>
-            </w:pPr>
-            <w:r>
-              <w:rPr>
-                <w:rFonts w:ascii="Courier New" w:eastAsia="Times New Roman" w:hAnsi="Courier New" w:cs="Courier New"/>
-                <w:sz w:val="20"/>
-                <w:szCs w:val="20"/>
-              </w:rPr>
-              <w:t>GET</w:t>
-            </w:r>
-          </w:p>
-        </w:tc>
-        <w:tc>
-          <w:tcPr>
-            <w:tcW w:w="0" w:type="auto"/>
-            <w:vAlign w:val="center"/>
-            <w:hideMark/>
-          </w:tcPr>
-          <w:p>
-            <w:pPr>
-              <w:spacing w:after="0" w:line="240" w:lineRule="auto"/>
-              <w:rPr>
-                <w:rFonts w:ascii="Times New Roman" w:eastAsia="Times New Roman" w:hAnsi="Times New Roman" w:cs="Times New Roman"/>
-                <w:sz w:val="24"/>
-                <w:szCs w:val="24"/>
-              </w:rPr>
-            </w:pPr>
-            <w:r>
-              <w:rPr>
-                <w:rFonts w:ascii="Courier New" w:eastAsia="Times New Roman" w:hAnsi="Courier New" w:cs="Courier New"/>
-                <w:sz w:val="20"/>
-                <w:szCs w:val="20"/>
-              </w:rPr>
-              <w:t>/</w:t>
-            </w:r>
-            <w:proofErr w:type="spellStart"/>
-            <w:r>
-              <w:rPr>
-                <w:rFonts w:ascii="Courier New" w:eastAsia="Times New Roman" w:hAnsi="Courier New" w:cs="Courier New"/>
-                <w:sz w:val="20"/>
-                <w:szCs w:val="20"/>
-              </w:rPr>
-              <w:t>api</w:t>
-            </w:r>
-            <w:proofErr w:type="spellEnd"/>
-            <w:r>
-              <w:rPr>
-                <w:rFonts w:ascii="Courier New" w:eastAsia="Times New Roman" w:hAnsi="Courier New" w:cs="Courier New"/>
-                <w:sz w:val="20"/>
-                <w:szCs w:val="20"/>
-              </w:rPr>
-              <w:t>/v1/notifications</w:t>
-            </w:r>
-          </w:p>
-        </w:tc>
-        <w:tc>
-          <w:tcPr>
-            <w:tcW w:w="0" w:type="auto"/>
-            <w:vAlign w:val="center"/>
-            <w:hideMark/>
-          </w:tcPr>
-          <w:p>
-            <w:pPr>
-              <w:spacing w:after="0" w:line="240" w:lineRule="auto"/>
-              <w:rPr>
-                <w:rFonts w:ascii="Times New Roman" w:eastAsia="Times New Roman" w:hAnsi="Times New Roman" w:cs="Times New Roman"/>
-                <w:sz w:val="24"/>
-                <w:szCs w:val="24"/>
-              </w:rPr>
-            </w:pPr>
-            <w:r>
-              <w:rPr>
-                <w:rFonts w:ascii="Times New Roman" w:eastAsia="Times New Roman" w:hAnsi="Times New Roman" w:cs="Times New Roman"/>
-                <w:sz w:val="24"/>
-                <w:szCs w:val="24"/>
-              </w:rPr>
-              <w:t>Customer</w:t>
-            </w:r>
-          </w:p>
-        </w:tc>
-        <w:tc>
-          <w:tcPr>
-            <w:tcW w:w="0" w:type="auto"/>
-            <w:vAlign w:val="center"/>
-            <w:hideMark/>
-          </w:tcPr>
-          <w:p>
-            <w:pPr>
-              <w:spacing w:after="0" w:line="240" w:lineRule="auto"/>
-              <w:rPr>
-                <w:rFonts w:ascii="Times New Roman" w:eastAsia="Times New Roman" w:hAnsi="Times New Roman" w:cs="Times New Roman"/>
-                <w:sz w:val="24"/>
-                <w:szCs w:val="24"/>
-              </w:rPr>
-            </w:pPr>
-            <w:r>
-              <w:rPr>
-                <w:rFonts w:ascii="Times New Roman" w:eastAsia="Times New Roman" w:hAnsi="Times New Roman" w:cs="Times New Roman"/>
-                <w:sz w:val="24"/>
-                <w:szCs w:val="24"/>
-              </w:rPr>
-              <w:t>Get my notifications</w:t>
-            </w:r>
-          </w:p>
-        </w:tc>
-      </w:tr>
-      <w:tr>
-        <w:trPr>
-          <w:tblCellSpacing w:w="15" w:type="dxa"/>
-        </w:trPr>
-        <w:tc>
-          <w:tcPr>
-            <w:tcW w:w="0" w:type="auto"/>
-            <w:vAlign w:val="center"/>
-            <w:hideMark/>
-          </w:tcPr>
-          <w:p>
-            <w:pPr>
-              <w:spacing w:after="0" w:line="240" w:lineRule="auto"/>
-              <w:rPr>
-                <w:rFonts w:ascii="Times New Roman" w:eastAsia="Times New Roman" w:hAnsi="Times New Roman" w:cs="Times New Roman"/>
-                <w:sz w:val="24"/>
-                <w:szCs w:val="24"/>
-              </w:rPr>
-            </w:pPr>
-            <w:r>
-              <w:rPr>
-                <w:rFonts w:ascii="Courier New" w:eastAsia="Times New Roman" w:hAnsi="Courier New" w:cs="Courier New"/>
-                <w:sz w:val="20"/>
-                <w:szCs w:val="20"/>
-              </w:rPr>
-              <w:t>PATCH</w:t>
-            </w:r>
-          </w:p>
-        </w:tc>
-        <w:tc>
-          <w:tcPr>
-            <w:tcW w:w="0" w:type="auto"/>
-            <w:vAlign w:val="center"/>
-            <w:hideMark/>
-          </w:tcPr>
-          <w:p>
-            <w:pPr>
-              <w:spacing w:after="0" w:line="240" w:lineRule="auto"/>
-              <w:rPr>
-                <w:rFonts w:ascii="Times New Roman" w:eastAsia="Times New Roman" w:hAnsi="Times New Roman" w:cs="Times New Roman"/>
-                <w:sz w:val="24"/>
-                <w:szCs w:val="24"/>
-              </w:rPr>
-            </w:pPr>
-            <w:r>
-              <w:rPr>
-                <w:rFonts w:ascii="Courier New" w:eastAsia="Times New Roman" w:hAnsi="Courier New" w:cs="Courier New"/>
-                <w:sz w:val="20"/>
-                <w:szCs w:val="20"/>
-              </w:rPr>
-              <w:t>/</w:t>
-            </w:r>
-            <w:proofErr w:type="spellStart"/>
-            <w:r>
-              <w:rPr>
-                <w:rFonts w:ascii="Courier New" w:eastAsia="Times New Roman" w:hAnsi="Courier New" w:cs="Courier New"/>
-                <w:sz w:val="20"/>
-                <w:szCs w:val="20"/>
-              </w:rPr>
-              <w:t>api</w:t>
-            </w:r>
-            <w:proofErr w:type="spellEnd"/>
-            <w:r>
-              <w:rPr>
-                <w:rFonts w:ascii="Courier New" w:eastAsia="Times New Roman" w:hAnsi="Courier New" w:cs="Courier New"/>
-                <w:sz w:val="20"/>
-                <w:szCs w:val="20"/>
-              </w:rPr>
-              <w:t>/v1/notifications/{id}/read</w:t>
-            </w:r>
-          </w:p>
-        </w:tc>
-        <w:tc>
-          <w:tcPr>
-            <w:tcW w:w="0" w:type="auto"/>
-            <w:vAlign w:val="center"/>
-            <w:hideMark/>
-          </w:tcPr>
-          <w:p>
-            <w:pPr>
-              <w:spacing w:after="0" w:line="240" w:lineRule="auto"/>
-              <w:rPr>
-                <w:rFonts w:ascii="Times New Roman" w:eastAsia="Times New Roman" w:hAnsi="Times New Roman" w:cs="Times New Roman"/>
-                <w:sz w:val="24"/>
-                <w:szCs w:val="24"/>
-              </w:rPr>
-            </w:pPr>
-            <w:r>
-              <w:rPr>
-                <w:rFonts w:ascii="Times New Roman" w:eastAsia="Times New Roman" w:hAnsi="Times New Roman" w:cs="Times New Roman"/>
-                <w:sz w:val="24"/>
-                <w:szCs w:val="24"/>
-              </w:rPr>
-              <w:t>Customer</w:t>
-            </w:r>
-          </w:p>
-        </w:tc>
-        <w:tc>
-          <w:tcPr>
-            <w:tcW w:w="0" w:type="auto"/>
-            <w:vAlign w:val="center"/>
-            <w:hideMark/>
-          </w:tcPr>
-          <w:p>
-            <w:pPr>
-              <w:spacing w:after="0" w:line="240" w:lineRule="auto"/>
-              <w:rPr>
-                <w:rFonts w:ascii="Times New Roman" w:eastAsia="Times New Roman" w:hAnsi="Times New Roman" w:cs="Times New Roman"/>
-                <w:sz w:val="24"/>
-                <w:szCs w:val="24"/>
-              </w:rPr>
-            </w:pPr>
-            <w:r>
-              <w:rPr>
-                <w:rFonts w:ascii="Times New Roman" w:eastAsia="Times New Roman" w:hAnsi="Times New Roman" w:cs="Times New Roman"/>
-                <w:sz w:val="24"/>
-                <w:szCs w:val="24"/>
-              </w:rPr>
-              <w:t>Mark one as read</w:t>
-            </w:r>
-          </w:p>
-        </w:tc>
-      </w:tr>
-      <w:tr>
-        <w:trPr>
-          <w:tblCellSpacing w:w="15" w:type="dxa"/>
-        </w:trPr>
-        <w:tc>
-          <w:tcPr>
-            <w:tcW w:w="0" w:type="auto"/>
-            <w:vAlign w:val="center"/>
-            <w:hideMark/>
-          </w:tcPr>
-          <w:p>
-            <w:pPr>
-              <w:spacing w:after="0" w:line="240" w:lineRule="auto"/>
-              <w:rPr>
-                <w:rFonts w:ascii="Times New Roman" w:eastAsia="Times New Roman" w:hAnsi="Times New Roman" w:cs="Times New Roman"/>
-                <w:sz w:val="24"/>
-                <w:szCs w:val="24"/>
-              </w:rPr>
-            </w:pPr>
-            <w:r>
-              <w:rPr>
-                <w:rFonts w:ascii="Courier New" w:eastAsia="Times New Roman" w:hAnsi="Courier New" w:cs="Courier New"/>
-                <w:sz w:val="20"/>
-                <w:szCs w:val="20"/>
-              </w:rPr>
-              <w:t>PATCH</w:t>
-            </w:r>
-          </w:p>
-        </w:tc>
-        <w:tc>
-          <w:tcPr>
-            <w:tcW w:w="0" w:type="auto"/>
-            <w:vAlign w:val="center"/>
-            <w:hideMark/>
-          </w:tcPr>
-          <w:p>
-            <w:pPr>
-              <w:spacing w:after="0" w:line="240" w:lineRule="auto"/>
-              <w:rPr>
-                <w:rFonts w:ascii="Times New Roman" w:eastAsia="Times New Roman" w:hAnsi="Times New Roman" w:cs="Times New Roman"/>
-                <w:sz w:val="24"/>
-                <w:szCs w:val="24"/>
-              </w:rPr>
-            </w:pPr>
-            <w:r>
-              <w:rPr>
-                <w:rFonts w:ascii="Courier New" w:eastAsia="Times New Roman" w:hAnsi="Courier New" w:cs="Courier New"/>
-                <w:sz w:val="20"/>
-                <w:szCs w:val="20"/>
-              </w:rPr>
-              <w:t>/</w:t>
-            </w:r>
-            <w:proofErr w:type="spellStart"/>
-            <w:r>
-              <w:rPr>
-                <w:rFonts w:ascii="Courier New" w:eastAsia="Times New Roman" w:hAnsi="Courier New" w:cs="Courier New"/>
-                <w:sz w:val="20"/>
-                <w:szCs w:val="20"/>
-              </w:rPr>
-              <w:t>api</w:t>
-            </w:r>
-            <w:proofErr w:type="spellEnd"/>
-            <w:r>
-              <w:rPr>
-                <w:rFonts w:ascii="Courier New" w:eastAsia="Times New Roman" w:hAnsi="Courier New" w:cs="Courier New"/>
-                <w:sz w:val="20"/>
-                <w:szCs w:val="20"/>
-              </w:rPr>
-              <w:t>/v1/notifications/read-all</w:t>
-            </w:r>
-          </w:p>
-        </w:tc>
-        <w:tc>
-          <w:tcPr>
-            <w:tcW w:w="0" w:type="auto"/>
-            <w:vAlign w:val="center"/>
-            <w:hideMark/>
-          </w:tcPr>
-          <w:p>
-            <w:pPr>
-              <w:spacing w:after="0" w:line="240" w:lineRule="auto"/>
-              <w:rPr>
-                <w:rFonts w:ascii="Times New Roman" w:eastAsia="Times New Roman" w:hAnsi="Times New Roman" w:cs="Times New Roman"/>
-                <w:sz w:val="24"/>
-                <w:szCs w:val="24"/>
-              </w:rPr>
-            </w:pPr>
-            <w:r>
-              <w:rPr>
-                <w:rFonts w:ascii="Times New Roman" w:eastAsia="Times New Roman" w:hAnsi="Times New Roman" w:cs="Times New Roman"/>
-                <w:sz w:val="24"/>
-                <w:szCs w:val="24"/>
-              </w:rPr>
-              <w:t>Customer</w:t>
-            </w:r>
-          </w:p>
-        </w:tc>
-        <w:tc>
-          <w:tcPr>
-            <w:tcW w:w="0" w:type="auto"/>
-            <w:vAlign w:val="center"/>
-            <w:hideMark/>
-          </w:tcPr>
-          <w:p>
-            <w:pPr>
-              <w:spacing w:after="0" w:line="240" w:lineRule="auto"/>
-              <w:rPr>
-                <w:rFonts w:ascii="Times New Roman" w:eastAsia="Times New Roman" w:hAnsi="Times New Roman" w:cs="Times New Roman"/>
-                <w:sz w:val="24"/>
-                <w:szCs w:val="24"/>
-              </w:rPr>
-            </w:pPr>
-            <w:r>
-              <w:rPr>
-                <w:rFonts w:ascii="Times New Roman" w:eastAsia="Times New Roman" w:hAnsi="Times New Roman" w:cs="Times New Roman"/>
-                <w:sz w:val="24"/>
-                <w:szCs w:val="24"/>
-              </w:rPr>
-              <w:t>Mark all as read</w:t>
-            </w:r>
-          </w:p>
-        </w:tc>
-      </w:tr>
-      <w:tr>
-        <w:trPr>
-          <w:tblCellSpacing w:w="15" w:type="dxa"/>
-        </w:trPr>
-        <w:tc>
-          <w:tcPr>
-            <w:tcW w:w="0" w:type="auto"/>
-            <w:vAlign w:val="center"/>
-            <w:hideMark/>
-          </w:tcPr>
-          <w:p>
-            <w:pPr>
-              <w:spacing w:after="0" w:line="240" w:lineRule="auto"/>
-              <w:rPr>
-                <w:rFonts w:ascii="Times New Roman" w:eastAsia="Times New Roman" w:hAnsi="Times New Roman" w:cs="Times New Roman"/>
-                <w:sz w:val="24"/>
-                <w:szCs w:val="24"/>
-              </w:rPr>
-            </w:pPr>
-            <w:r>
-              <w:rPr>
-                <w:rFonts w:ascii="Courier New" w:eastAsia="Times New Roman" w:hAnsi="Courier New" w:cs="Courier New"/>
-                <w:sz w:val="20"/>
-                <w:szCs w:val="20"/>
-              </w:rPr>
-              <w:t>GET</w:t>
-            </w:r>
-          </w:p>
-        </w:tc>
-        <w:tc>
-          <w:tcPr>
-            <w:tcW w:w="0" w:type="auto"/>
-            <w:vAlign w:val="center"/>
-            <w:hideMark/>
-          </w:tcPr>
-          <w:p>
-            <w:pPr>
-              <w:spacing w:after="0" w:line="240" w:lineRule="auto"/>
-              <w:rPr>
-                <w:rFonts w:ascii="Times New Roman" w:eastAsia="Times New Roman" w:hAnsi="Times New Roman" w:cs="Times New Roman"/>
-                <w:sz w:val="24"/>
-                <w:szCs w:val="24"/>
-              </w:rPr>
-            </w:pPr>
-            <w:r>
-              <w:rPr>
-                <w:rFonts w:ascii="Courier New" w:eastAsia="Times New Roman" w:hAnsi="Courier New" w:cs="Courier New"/>
-                <w:sz w:val="20"/>
-                <w:szCs w:val="20"/>
-              </w:rPr>
-              <w:t>/</w:t>
-            </w:r>
-            <w:proofErr w:type="spellStart"/>
-            <w:r>
-              <w:rPr>
-                <w:rFonts w:ascii="Courier New" w:eastAsia="Times New Roman" w:hAnsi="Courier New" w:cs="Courier New"/>
-                <w:sz w:val="20"/>
-                <w:szCs w:val="20"/>
-              </w:rPr>
-              <w:t>api</w:t>
-            </w:r>
-            <w:proofErr w:type="spellEnd"/>
-            <w:r>
-              <w:rPr>
-                <w:rFonts w:ascii="Courier New" w:eastAsia="Times New Roman" w:hAnsi="Courier New" w:cs="Courier New"/>
-                <w:sz w:val="20"/>
-                <w:szCs w:val="20"/>
-              </w:rPr>
-              <w:t>/v1/notifications/unread-count</w:t>
-            </w:r>
-          </w:p>
-        </w:tc>
-        <w:tc>
-          <w:tcPr>
-            <w:tcW w:w="0" w:type="auto"/>
-            <w:vAlign w:val="center"/>
-            <w:hideMark/>
-          </w:tcPr>
-          <w:p>
-            <w:pPr>
-              <w:spacing w:after="0" w:line="240" w:lineRule="auto"/>
-              <w:rPr>
-                <w:rFonts w:ascii="Times New Roman" w:eastAsia="Times New Roman" w:hAnsi="Times New Roman" w:cs="Times New Roman"/>
-                <w:sz w:val="24"/>
-                <w:szCs w:val="24"/>
-              </w:rPr>
-            </w:pPr>
-            <w:r>
-              <w:rPr>
-                <w:rFonts w:ascii="Times New Roman" w:eastAsia="Times New Roman" w:hAnsi="Times New Roman" w:cs="Times New Roman"/>
-                <w:sz w:val="24"/>
-                <w:szCs w:val="24"/>
-              </w:rPr>
-              <w:t>Customer</w:t>
-            </w:r>
-          </w:p>
-        </w:tc>
-        <w:tc>
-          <w:tcPr>
-            <w:tcW w:w="0" w:type="auto"/>
-            <w:vAlign w:val="center"/>
-            <w:hideMark/>
-          </w:tcPr>
-          <w:p>
-            <w:pPr>
-              <w:spacing w:after="0" w:line="240" w:lineRule="auto"/>
-              <w:rPr>
-                <w:rFonts w:ascii="Times New Roman" w:eastAsia="Times New Roman" w:hAnsi="Times New Roman" w:cs="Times New Roman"/>
-                <w:sz w:val="24"/>
-                <w:szCs w:val="24"/>
-              </w:rPr>
-            </w:pPr>
-            <w:r>
-              <w:rPr>
-                <w:rFonts w:ascii="Times New Roman" w:eastAsia="Times New Roman" w:hAnsi="Times New Roman" w:cs="Times New Roman"/>
-                <w:sz w:val="24"/>
-                <w:szCs w:val="24"/>
-              </w:rPr>
-              <w:t>Get unread count (for badge)</w:t>
-            </w:r>
-          </w:p>
-        </w:tc>
-      </w:tr>
-    </w:tbl>
-    <w:p>
-      <w:pPr>
-        <w:spacing w:before="100" w:beforeAutospacing="1" w:after="100" w:afterAutospacing="1" w:line="240" w:lineRule="auto"/>
-        <w:outlineLvl w:val="2"/>
-        <w:rPr>
-          <w:rFonts w:ascii="Times New Roman" w:eastAsia="Times New Roman" w:hAnsi="Times New Roman" w:cs="Times New Roman"/>
-          <w:b/>
-          <w:bCs/>
-          <w:sz w:val="27"/>
-          <w:szCs w:val="27"/>
-        </w:rPr>
-      </w:pPr>
-      <w:r>
-        <w:rPr>
-          <w:rFonts w:ascii="Times New Roman" w:eastAsia="Times New Roman" w:hAnsi="Times New Roman" w:cs="Times New Roman"/>
-          <w:b/>
-          <w:bCs/>
-          <w:sz w:val="27"/>
-          <w:szCs w:val="27"/>
-        </w:rPr>
-        <w:t>⚙️ Business Logic Rules</w:t>
-      </w:r>
-    </w:p>
-    <w:p>
-      <w:pPr>
-        <w:numPr>
-          <w:ilvl w:val="0"/>
-          <w:numId w:val="24"/>
-        </w:numPr>
-        <w:spacing w:before="100" w:beforeAutospacing="1" w:after="100" w:afterAutospacing="1" w:line="240" w:lineRule="auto"/>
-        <w:rPr>
-          <w:rFonts w:ascii="Times New Roman" w:eastAsia="Times New Roman" w:hAnsi="Times New Roman" w:cs="Times New Roman"/>
-          <w:sz w:val="24"/>
-          <w:szCs w:val="24"/>
-        </w:rPr>
-      </w:pPr>
-      <w:r>
-        <w:rPr>
-          <w:rFonts w:ascii="Times New Roman" w:eastAsia="Times New Roman" w:hAnsi="Times New Roman" w:cs="Times New Roman"/>
-          <w:sz w:val="24"/>
-          <w:szCs w:val="24"/>
-        </w:rPr>
-        <w:t xml:space="preserve">Notifications are </w:t>
-      </w:r>
-      <w:r>
-        <w:rPr>
-          <w:rFonts w:ascii="Times New Roman" w:eastAsia="Times New Roman" w:hAnsi="Times New Roman" w:cs="Times New Roman"/>
-          <w:b/>
-          <w:bCs/>
-          <w:sz w:val="24"/>
-          <w:szCs w:val="24"/>
-        </w:rPr>
-        <w:t>created automatically by your backend</w:t>
-      </w:r>
-      <w:r>
-        <w:rPr>
-          <w:rFonts w:ascii="Times New Roman" w:eastAsia="Times New Roman" w:hAnsi="Times New Roman" w:cs="Times New Roman"/>
-          <w:sz w:val="24"/>
-          <w:szCs w:val="24"/>
-        </w:rPr>
-        <w:t xml:space="preserve"> whenever order status changes — not by users</w:t>
-      </w:r>
-    </w:p>
-    <w:p>
-      <w:pPr>
-        <w:numPr>
-          <w:ilvl w:val="0"/>
-          <w:numId w:val="24"/>
-        </w:numPr>
-        <w:spacing w:before="100" w:beforeAutospacing="1" w:after="100" w:afterAutospacing="1" w:line="240" w:lineRule="auto"/>
-        <w:rPr>
-          <w:rFonts w:ascii="Times New Roman" w:eastAsia="Times New Roman" w:hAnsi="Times New Roman" w:cs="Times New Roman"/>
-          <w:sz w:val="24"/>
-          <w:szCs w:val="24"/>
-        </w:rPr>
-      </w:pPr>
-      <w:r>
-        <w:rPr>
-          <w:rFonts w:ascii="Times New Roman" w:eastAsia="Times New Roman" w:hAnsi="Times New Roman" w:cs="Times New Roman"/>
-          <w:sz w:val="24"/>
-          <w:szCs w:val="24"/>
-        </w:rPr>
-        <w:t xml:space="preserve">Create a helper function </w:t>
-      </w:r>
-      <w:proofErr w:type="spellStart"/>
-      <w:r>
-        <w:rPr>
-          <w:rFonts w:ascii="Courier New" w:eastAsia="Times New Roman" w:hAnsi="Courier New" w:cs="Courier New"/>
-          <w:sz w:val="20"/>
-          <w:szCs w:val="20"/>
-        </w:rPr>
-        <w:t>create_notification</w:t>
-      </w:r>
-      <w:proofErr w:type="spellEnd"/>
-      <w:r>
-        <w:rPr>
-          <w:rFonts w:ascii="Courier New" w:eastAsia="Times New Roman" w:hAnsi="Courier New" w:cs="Courier New"/>
-          <w:sz w:val="20"/>
-          <w:szCs w:val="20"/>
-        </w:rPr>
-        <w:t>(</w:t>
-      </w:r>
-      <w:proofErr w:type="spellStart"/>
-      <w:r>
-        <w:rPr>
-          <w:rFonts w:ascii="Courier New" w:eastAsia="Times New Roman" w:hAnsi="Courier New" w:cs="Courier New"/>
-          <w:sz w:val="20"/>
-          <w:szCs w:val="20"/>
-        </w:rPr>
-        <w:t>user_id</w:t>
-      </w:r>
-      <w:proofErr w:type="spellEnd"/>
-      <w:r>
-        <w:rPr>
-          <w:rFonts w:ascii="Courier New" w:eastAsia="Times New Roman" w:hAnsi="Courier New" w:cs="Courier New"/>
-          <w:sz w:val="20"/>
-          <w:szCs w:val="20"/>
-        </w:rPr>
-        <w:t>, title, message)</w:t>
-      </w:r>
-      <w:r>
-        <w:rPr>
-          <w:rFonts w:ascii="Times New Roman" w:eastAsia="Times New Roman" w:hAnsi="Times New Roman" w:cs="Times New Roman"/>
-          <w:sz w:val="24"/>
-          <w:szCs w:val="24"/>
-        </w:rPr>
-        <w:t xml:space="preserve"> and call it inside your order status update service</w:t>
-      </w:r>
-    </w:p>
-    <w:p>
-      <w:pPr>
-        <w:numPr>
-          <w:ilvl w:val="0"/>
-          <w:numId w:val="24"/>
-        </w:numPr>
-        <w:spacing w:before="100" w:beforeAutospacing="1" w:after="100" w:afterAutospacing="1" w:line="240" w:lineRule="auto"/>
-        <w:rPr>
-          <w:rFonts w:ascii="Times New Roman" w:eastAsia="Times New Roman" w:hAnsi="Times New Roman" w:cs="Times New Roman"/>
-          <w:sz w:val="24"/>
-          <w:szCs w:val="24"/>
-        </w:rPr>
-      </w:pPr>
-      <w:r>
-        <w:rPr>
-          <w:rFonts w:ascii="Times New Roman" w:eastAsia="Times New Roman" w:hAnsi="Times New Roman" w:cs="Times New Roman"/>
-          <w:sz w:val="24"/>
-          <w:szCs w:val="24"/>
-        </w:rPr>
-        <w:t xml:space="preserve">The notification messages for each status: </w:t>
-      </w:r>
-    </w:p>
-    <w:p>
-      <w:pPr>
-        <w:numPr>
-          <w:ilvl w:val="1"/>
-          <w:numId w:val="24"/>
-        </w:numPr>
-        <w:spacing w:before="100" w:beforeAutospacing="1" w:after="100" w:afterAutospacing="1" w:line="240" w:lineRule="auto"/>
-        <w:rPr>
-          <w:rFonts w:ascii="Times New Roman" w:eastAsia="Times New Roman" w:hAnsi="Times New Roman" w:cs="Times New Roman"/>
-          <w:sz w:val="24"/>
-          <w:szCs w:val="24"/>
-        </w:rPr>
-      </w:pPr>
-      <w:proofErr w:type="gramStart"/>
-      <w:r>
-        <w:rPr>
-          <w:rFonts w:ascii="Courier New" w:eastAsia="Times New Roman" w:hAnsi="Courier New" w:cs="Courier New"/>
-          <w:sz w:val="20"/>
-          <w:szCs w:val="20"/>
-        </w:rPr>
-        <w:t>confirmed</w:t>
-      </w:r>
-      <w:proofErr w:type="gramEnd"/>
-      <w:r>
-        <w:rPr>
-          <w:rFonts w:ascii="Times New Roman" w:eastAsia="Times New Roman" w:hAnsi="Times New Roman" w:cs="Times New Roman"/>
-          <w:sz w:val="24"/>
-          <w:szCs w:val="24"/>
-        </w:rPr>
-        <w:t xml:space="preserve"> → "Your order has been confirmed!"</w:t>
-      </w:r>
-    </w:p>
-    <w:p>
-      <w:pPr>
-        <w:numPr>
-          <w:ilvl w:val="1"/>
-          <w:numId w:val="24"/>
-        </w:numPr>
-        <w:spacing w:before="100" w:beforeAutospacing="1" w:after="100" w:afterAutospacing="1" w:line="240" w:lineRule="auto"/>
-        <w:rPr>
-          <w:rFonts w:ascii="Times New Roman" w:eastAsia="Times New Roman" w:hAnsi="Times New Roman" w:cs="Times New Roman"/>
-          <w:sz w:val="24"/>
-          <w:szCs w:val="24"/>
-        </w:rPr>
-      </w:pPr>
-      <w:proofErr w:type="gramStart"/>
-      <w:r>
-        <w:rPr>
-          <w:rFonts w:ascii="Courier New" w:eastAsia="Times New Roman" w:hAnsi="Courier New" w:cs="Courier New"/>
-          <w:sz w:val="20"/>
-          <w:szCs w:val="20"/>
-        </w:rPr>
-        <w:t>preparing</w:t>
-      </w:r>
-      <w:proofErr w:type="gramEnd"/>
-      <w:r>
-        <w:rPr>
-          <w:rFonts w:ascii="Times New Roman" w:eastAsia="Times New Roman" w:hAnsi="Times New Roman" w:cs="Times New Roman"/>
-          <w:sz w:val="24"/>
-          <w:szCs w:val="24"/>
-        </w:rPr>
-        <w:t xml:space="preserve"> → "We are preparing your pizza!"</w:t>
-      </w:r>
-    </w:p>
-    <w:p>
-      <w:pPr>
-        <w:numPr>
-          <w:ilvl w:val="1"/>
-          <w:numId w:val="24"/>
-        </w:numPr>
-        <w:spacing w:before="100" w:beforeAutospacing="1" w:after="100" w:afterAutospacing="1" w:line="240" w:lineRule="auto"/>
-        <w:rPr>
-          <w:rFonts w:ascii="Times New Roman" w:eastAsia="Times New Roman" w:hAnsi="Times New Roman" w:cs="Times New Roman"/>
-          <w:sz w:val="24"/>
-          <w:szCs w:val="24"/>
-        </w:rPr>
-      </w:pPr>
-      <w:proofErr w:type="spellStart"/>
-      <w:r>
-        <w:rPr>
-          <w:rFonts w:ascii="Courier New" w:eastAsia="Times New Roman" w:hAnsi="Courier New" w:cs="Courier New"/>
-          <w:sz w:val="20"/>
-          <w:szCs w:val="20"/>
-        </w:rPr>
-        <w:t>out_for_delivery</w:t>
-      </w:r>
-      <w:proofErr w:type="spellEnd"/>
-      <w:r>
-        <w:rPr>
-          <w:rFonts w:ascii="Times New Roman" w:eastAsia="Times New Roman" w:hAnsi="Times New Roman" w:cs="Times New Roman"/>
-          <w:sz w:val="24"/>
-          <w:szCs w:val="24"/>
-        </w:rPr>
-        <w:t xml:space="preserve"> → "Your order is on the way!"</w:t>
-      </w:r>
-    </w:p>
-    <w:p>
-      <w:pPr>
-        <w:numPr>
-          <w:ilvl w:val="1"/>
-          <w:numId w:val="24"/>
-        </w:numPr>
-        <w:spacing w:before="100" w:beforeAutospacing="1" w:after="100" w:afterAutospacing="1" w:line="240" w:lineRule="auto"/>
-        <w:rPr>
-          <w:rFonts w:ascii="Times New Roman" w:eastAsia="Times New Roman" w:hAnsi="Times New Roman" w:cs="Times New Roman"/>
-          <w:sz w:val="24"/>
-          <w:szCs w:val="24"/>
-        </w:rPr>
-      </w:pPr>
-      <w:proofErr w:type="gramStart"/>
-      <w:r>
-        <w:rPr>
-          <w:rFonts w:ascii="Courier New" w:eastAsia="Times New Roman" w:hAnsi="Courier New" w:cs="Courier New"/>
-          <w:sz w:val="20"/>
-          <w:szCs w:val="20"/>
-        </w:rPr>
-        <w:t>delivered</w:t>
-      </w:r>
-      <w:proofErr w:type="gramEnd"/>
-      <w:r>
-        <w:rPr>
-          <w:rFonts w:ascii="Times New Roman" w:eastAsia="Times New Roman" w:hAnsi="Times New Roman" w:cs="Times New Roman"/>
-          <w:sz w:val="24"/>
-          <w:szCs w:val="24"/>
-        </w:rPr>
-        <w:t xml:space="preserve"> → "Your order has been delivered. Enjoy!"</w:t>
-      </w:r>
-    </w:p>
-    <w:p>
-      <w:pPr>
-        <w:numPr>
-          <w:ilvl w:val="1"/>
-          <w:numId w:val="24"/>
-        </w:numPr>
-        <w:spacing w:before="100" w:beforeAutospacing="1" w:after="100" w:afterAutospacing="1" w:line="240" w:lineRule="auto"/>
-        <w:rPr>
-          <w:rFonts w:ascii="Times New Roman" w:eastAsia="Times New Roman" w:hAnsi="Times New Roman" w:cs="Times New Roman"/>
-          <w:sz w:val="24"/>
-          <w:szCs w:val="24"/>
-        </w:rPr>
-      </w:pPr>
-      <w:proofErr w:type="gramStart"/>
-      <w:r>
-        <w:rPr>
-          <w:rFonts w:ascii="Courier New" w:eastAsia="Times New Roman" w:hAnsi="Courier New" w:cs="Courier New"/>
-          <w:sz w:val="20"/>
-          <w:szCs w:val="20"/>
-        </w:rPr>
-        <w:t>cancelled</w:t>
-      </w:r>
-      <w:proofErr w:type="gramEnd"/>
-      <w:r>
-        <w:rPr>
-          <w:rFonts w:ascii="Times New Roman" w:eastAsia="Times New Roman" w:hAnsi="Times New Roman" w:cs="Times New Roman"/>
-          <w:sz w:val="24"/>
-          <w:szCs w:val="24"/>
-        </w:rPr>
-        <w:t xml:space="preserve"> → "Your order has been cancelled."</w:t>
-      </w:r>
-    </w:p>
-    <w:p>
-      <w:pPr>
-        <w:numPr>
-          <w:ilvl w:val="0"/>
-          <w:numId w:val="24"/>
-        </w:numPr>
-        <w:spacing w:before="100" w:beforeAutospacing="1" w:after="100" w:afterAutospacing="1" w:line="240" w:lineRule="auto"/>
-        <w:rPr>
-          <w:rFonts w:ascii="Times New Roman" w:eastAsia="Times New Roman" w:hAnsi="Times New Roman" w:cs="Times New Roman"/>
-          <w:sz w:val="24"/>
-          <w:szCs w:val="24"/>
-        </w:rPr>
-      </w:pPr>
-      <w:r>
-        <w:rPr>
-          <w:rFonts w:ascii="Times New Roman" w:eastAsia="Times New Roman" w:hAnsi="Times New Roman" w:cs="Times New Roman"/>
-          <w:sz w:val="24"/>
-          <w:szCs w:val="24"/>
-        </w:rPr>
-        <w:t>Paginate notifications — users can have many</w:t>
-      </w:r>
-    </w:p>
-    <w:p>
-      <w:pPr>
-        <w:numPr>
-          <w:ilvl w:val="0"/>
-          <w:numId w:val="24"/>
-        </w:numPr>
-        <w:spacing w:before="100" w:beforeAutospacing="1" w:after="100" w:afterAutospacing="1" w:line="240" w:lineRule="auto"/>
-        <w:rPr>
-          <w:rFonts w:ascii="Times New Roman" w:eastAsia="Times New Roman" w:hAnsi="Times New Roman" w:cs="Times New Roman"/>
-          <w:sz w:val="24"/>
-          <w:szCs w:val="24"/>
-        </w:rPr>
-      </w:pPr>
-      <w:r>
-        <w:rPr>
-          <w:rFonts w:ascii="Times New Roman" w:eastAsia="Times New Roman" w:hAnsi="Times New Roman" w:cs="Times New Roman"/>
-          <w:sz w:val="24"/>
-          <w:szCs w:val="24"/>
-        </w:rPr>
-        <w:t xml:space="preserve">Only return notifications belonging to the </w:t>
-      </w:r>
-      <w:r>
-        <w:rPr>
-          <w:rFonts w:ascii="Times New Roman" w:eastAsia="Times New Roman" w:hAnsi="Times New Roman" w:cs="Times New Roman"/>
-          <w:b/>
-          <w:bCs/>
-          <w:sz w:val="24"/>
-          <w:szCs w:val="24"/>
-        </w:rPr>
-        <w:t>logged-in user</w:t>
-      </w:r>
-    </w:p>
-    <w:p>
-      <w:pPr>
-        <w:spacing w:after="0" w:line="240" w:lineRule="auto"/>
-        <w:rPr>
-          <w:rFonts w:ascii="Times New Roman" w:eastAsia="Times New Roman" w:hAnsi="Times New Roman" w:cs="Times New Roman"/>
-          <w:sz w:val="24"/>
-          <w:szCs w:val="24"/>
-        </w:rPr>
-      </w:pPr>
-      <w:r>
-        <w:rPr>
-          <w:rFonts w:ascii="Times New Roman" w:eastAsia="Times New Roman" w:hAnsi="Times New Roman" w:cs="Times New Roman"/>
-          <w:sz w:val="24"/>
-          <w:szCs w:val="24"/>
-        </w:rPr>
-        <w:pict w14:anchorId="4816BBF7">
-          <v:rect id="_x0000_i1026" style="width:0;height:1.5pt" o:hralign="center" o:hrstd="t" o:hr="t" fillcolor="#a0a0a0" stroked="f"/>
-        </w:pict>
-      </w:r>
-    </w:p>
-    <w:p>
-      <w:pPr>
-        <w:spacing w:after="0" w:line="240" w:lineRule="auto"/>
-        <w:rPr>
-          <w:rFonts w:ascii="Times New Roman" w:eastAsia="Times New Roman" w:hAnsi="Times New Roman" w:cs="Times New Roman"/>
-          <w:sz w:val="24"/>
-          <w:szCs w:val="24"/>
-        </w:rPr>
-      </w:pPr>
-      <w:r>
-        <w:rPr>
-          <w:rFonts w:ascii="Times New Roman" w:eastAsia="Times New Roman" w:hAnsi="Times New Roman" w:cs="Times New Roman"/>
-          <w:sz w:val="24"/>
-          <w:szCs w:val="24"/>
-        </w:rPr>
-        <w:pict w14:anchorId="2B35D005">
-          <v:rect id="_x0000_i1027" style="width:0;height:1.5pt" o:hralign="center" o:hrstd="t" o:hr="t" fillcolor="#a0a0a0" stroked="f"/>
-        </w:pict>
-      </w:r>
-    </w:p>
-    <w:p>
-      <w:pPr>
-        <w:spacing w:before="100" w:beforeAutospacing="1" w:after="100" w:afterAutospacing="1" w:line="240" w:lineRule="auto"/>
-        <w:outlineLvl w:val="1"/>
-        <w:rPr>
-          <w:rFonts w:ascii="Times New Roman" w:eastAsia="Times New Roman" w:hAnsi="Times New Roman" w:cs="Times New Roman"/>
-          <w:b/>
-          <w:bCs/>
-          <w:sz w:val="36"/>
-          <w:szCs w:val="36"/>
-        </w:rPr>
-      </w:pPr>
-      <w:r>
-        <w:rPr>
-          <w:rFonts w:ascii="Times New Roman" w:eastAsia="Times New Roman" w:hAnsi="Times New Roman" w:cs="Times New Roman"/>
-          <w:b/>
-          <w:bCs/>
-          <w:sz w:val="36"/>
-          <w:szCs w:val="36"/>
-        </w:rPr>
         <w:t>🛠️ Admin Dashboard — Full Deep Dive</w:t>
       </w:r>
     </w:p>
@@ -1752,7 +41,7 @@
           <w:szCs w:val="24"/>
         </w:rPr>
         <w:pict w14:anchorId="4A7A08C3">
-          <v:rect id="_x0000_i1028" style="width:0;height:1.5pt" o:hralign="center" o:hrstd="t" o:hr="t" fillcolor="#a0a0a0" stroked="f"/>
+          <v:rect id="_x0000_i1025" style="width:0;height:1.5pt" o:hralign="center" o:hrstd="t" o:hr="t" fillcolor="#a0a0a0" stroked="f"/>
         </w:pict>
       </w:r>
     </w:p>
@@ -3388,7 +1677,7 @@
           <w:szCs w:val="24"/>
         </w:rPr>
         <w:pict w14:anchorId="46AEFC7A">
-          <v:rect id="_x0000_i1029" style="width:0;height:1.5pt" o:hralign="center" o:hrstd="t" o:hr="t" fillcolor="#a0a0a0" stroked="f"/>
+          <v:rect id="_x0000_i1026" style="width:0;height:1.5pt" o:hralign="center" o:hrstd="t" o:hr="t" fillcolor="#a0a0a0" stroked="f"/>
         </w:pict>
       </w:r>
     </w:p>
@@ -3414,6 +1703,8 @@
         </w:rPr>
         <w:t>⚙️ Business Logic Rules</w:t>
       </w:r>
+      <w:bookmarkStart w:id="0" w:name="_GoBack"/>
+      <w:bookmarkEnd w:id="0"/>
     </w:p>
     <w:p>
       <w:pPr>
@@ -3639,716 +1930,6 @@
         <w:t xml:space="preserve"> dependency</w:t>
       </w:r>
     </w:p>
-    <w:p>
-      <w:pPr>
-        <w:spacing w:after="0" w:line="240" w:lineRule="auto"/>
-        <w:rPr>
-          <w:rFonts w:ascii="Times New Roman" w:eastAsia="Times New Roman" w:hAnsi="Times New Roman" w:cs="Times New Roman"/>
-          <w:sz w:val="24"/>
-          <w:szCs w:val="24"/>
-        </w:rPr>
-      </w:pPr>
-      <w:r>
-        <w:rPr>
-          <w:rFonts w:ascii="Times New Roman" w:eastAsia="Times New Roman" w:hAnsi="Times New Roman" w:cs="Times New Roman"/>
-          <w:sz w:val="24"/>
-          <w:szCs w:val="24"/>
-        </w:rPr>
-        <w:pict w14:anchorId="4218B3C7">
-          <v:rect id="_x0000_i1030" style="width:0;height:1.5pt" o:hralign="center" o:hrstd="t" o:hr="t" fillcolor="#a0a0a0" stroked="f"/>
-        </w:pict>
-      </w:r>
-    </w:p>
-    <w:p>
-      <w:pPr>
-        <w:spacing w:after="0" w:line="240" w:lineRule="auto"/>
-        <w:rPr>
-          <w:rFonts w:ascii="Times New Roman" w:eastAsia="Times New Roman" w:hAnsi="Times New Roman" w:cs="Times New Roman"/>
-          <w:sz w:val="24"/>
-          <w:szCs w:val="24"/>
-        </w:rPr>
-      </w:pPr>
-      <w:r>
-        <w:rPr>
-          <w:rFonts w:ascii="Times New Roman" w:eastAsia="Times New Roman" w:hAnsi="Times New Roman" w:cs="Times New Roman"/>
-          <w:sz w:val="24"/>
-          <w:szCs w:val="24"/>
-        </w:rPr>
-        <w:pict w14:anchorId="48B5C2DE">
-          <v:rect id="_x0000_i1031" style="width:0;height:1.5pt" o:hralign="center" o:hrstd="t" o:hr="t" fillcolor="#a0a0a0" stroked="f"/>
-        </w:pict>
-      </w:r>
-    </w:p>
-    <w:p>
-      <w:pPr>
-        <w:spacing w:before="100" w:beforeAutospacing="1" w:after="100" w:afterAutospacing="1" w:line="240" w:lineRule="auto"/>
-        <w:outlineLvl w:val="1"/>
-        <w:rPr>
-          <w:rFonts w:ascii="Times New Roman" w:eastAsia="Times New Roman" w:hAnsi="Times New Roman" w:cs="Times New Roman"/>
-          <w:b/>
-          <w:bCs/>
-          <w:sz w:val="36"/>
-          <w:szCs w:val="36"/>
-        </w:rPr>
-      </w:pPr>
-      <w:r>
-        <w:rPr>
-          <w:rFonts w:ascii="Times New Roman" w:eastAsia="Times New Roman" w:hAnsi="Times New Roman" w:cs="Times New Roman"/>
-          <w:b/>
-          <w:bCs/>
-          <w:sz w:val="36"/>
-          <w:szCs w:val="36"/>
-        </w:rPr>
-        <w:t>🏁 Final Checklist — What Makes This Portfolio-Grade</w:t>
-      </w:r>
-    </w:p>
-    <w:tbl>
-      <w:tblPr>
-        <w:tblW w:w="0" w:type="auto"/>
-        <w:tblCellSpacing w:w="15" w:type="dxa"/>
-        <w:tblCellMar>
-          <w:top w:w="15" w:type="dxa"/>
-          <w:left w:w="15" w:type="dxa"/>
-          <w:bottom w:w="15" w:type="dxa"/>
-          <w:right w:w="15" w:type="dxa"/>
-        </w:tblCellMar>
-        <w:tblLook w:val="04A0" w:firstRow="1" w:lastRow="0" w:firstColumn="1" w:lastColumn="0" w:noHBand="0" w:noVBand="1"/>
-      </w:tblPr>
-      <w:tblGrid>
-        <w:gridCol w:w="3481"/>
-        <w:gridCol w:w="3742"/>
-      </w:tblGrid>
-      <w:tr>
-        <w:trPr>
-          <w:tblHeader/>
-          <w:tblCellSpacing w:w="15" w:type="dxa"/>
-        </w:trPr>
-        <w:tc>
-          <w:tcPr>
-            <w:tcW w:w="0" w:type="auto"/>
-            <w:vAlign w:val="center"/>
-            <w:hideMark/>
-          </w:tcPr>
-          <w:p>
-            <w:pPr>
-              <w:spacing w:after="0" w:line="240" w:lineRule="auto"/>
-              <w:jc w:val="center"/>
-              <w:rPr>
-                <w:rFonts w:ascii="Times New Roman" w:eastAsia="Times New Roman" w:hAnsi="Times New Roman" w:cs="Times New Roman"/>
-                <w:b/>
-                <w:bCs/>
-                <w:sz w:val="24"/>
-                <w:szCs w:val="24"/>
-              </w:rPr>
-            </w:pPr>
-            <w:r>
-              <w:rPr>
-                <w:rFonts w:ascii="Times New Roman" w:eastAsia="Times New Roman" w:hAnsi="Times New Roman" w:cs="Times New Roman"/>
-                <w:b/>
-                <w:bCs/>
-                <w:sz w:val="24"/>
-                <w:szCs w:val="24"/>
-              </w:rPr>
-              <w:t>Thing</w:t>
-            </w:r>
-          </w:p>
-        </w:tc>
-        <w:tc>
-          <w:tcPr>
-            <w:tcW w:w="0" w:type="auto"/>
-            <w:vAlign w:val="center"/>
-            <w:hideMark/>
-          </w:tcPr>
-          <w:p>
-            <w:pPr>
-              <w:spacing w:after="0" w:line="240" w:lineRule="auto"/>
-              <w:jc w:val="center"/>
-              <w:rPr>
-                <w:rFonts w:ascii="Times New Roman" w:eastAsia="Times New Roman" w:hAnsi="Times New Roman" w:cs="Times New Roman"/>
-                <w:b/>
-                <w:bCs/>
-                <w:sz w:val="24"/>
-                <w:szCs w:val="24"/>
-              </w:rPr>
-            </w:pPr>
-            <w:r>
-              <w:rPr>
-                <w:rFonts w:ascii="Times New Roman" w:eastAsia="Times New Roman" w:hAnsi="Times New Roman" w:cs="Times New Roman"/>
-                <w:b/>
-                <w:bCs/>
-                <w:sz w:val="24"/>
-                <w:szCs w:val="24"/>
-              </w:rPr>
-              <w:t>Why it impresses</w:t>
-            </w:r>
-          </w:p>
-        </w:tc>
-      </w:tr>
-      <w:tr>
-        <w:trPr>
-          <w:tblCellSpacing w:w="15" w:type="dxa"/>
-        </w:trPr>
-        <w:tc>
-          <w:tcPr>
-            <w:tcW w:w="0" w:type="auto"/>
-            <w:vAlign w:val="center"/>
-            <w:hideMark/>
-          </w:tcPr>
-          <w:p>
-            <w:pPr>
-              <w:spacing w:after="0" w:line="240" w:lineRule="auto"/>
-              <w:rPr>
-                <w:rFonts w:ascii="Times New Roman" w:eastAsia="Times New Roman" w:hAnsi="Times New Roman" w:cs="Times New Roman"/>
-                <w:sz w:val="24"/>
-                <w:szCs w:val="24"/>
-              </w:rPr>
-            </w:pPr>
-            <w:r>
-              <w:rPr>
-                <w:rFonts w:ascii="Times New Roman" w:eastAsia="Times New Roman" w:hAnsi="Times New Roman" w:cs="Times New Roman"/>
-                <w:sz w:val="24"/>
-                <w:szCs w:val="24"/>
-              </w:rPr>
-              <w:t>Refresh token blacklisting</w:t>
-            </w:r>
-          </w:p>
-        </w:tc>
-        <w:tc>
-          <w:tcPr>
-            <w:tcW w:w="0" w:type="auto"/>
-            <w:vAlign w:val="center"/>
-            <w:hideMark/>
-          </w:tcPr>
-          <w:p>
-            <w:pPr>
-              <w:spacing w:after="0" w:line="240" w:lineRule="auto"/>
-              <w:rPr>
-                <w:rFonts w:ascii="Times New Roman" w:eastAsia="Times New Roman" w:hAnsi="Times New Roman" w:cs="Times New Roman"/>
-                <w:sz w:val="24"/>
-                <w:szCs w:val="24"/>
-              </w:rPr>
-            </w:pPr>
-            <w:r>
-              <w:rPr>
-                <w:rFonts w:ascii="Times New Roman" w:eastAsia="Times New Roman" w:hAnsi="Times New Roman" w:cs="Times New Roman"/>
-                <w:sz w:val="24"/>
-                <w:szCs w:val="24"/>
-              </w:rPr>
-              <w:t>Shows security awareness</w:t>
-            </w:r>
-          </w:p>
-        </w:tc>
-      </w:tr>
-      <w:tr>
-        <w:trPr>
-          <w:tblCellSpacing w:w="15" w:type="dxa"/>
-        </w:trPr>
-        <w:tc>
-          <w:tcPr>
-            <w:tcW w:w="0" w:type="auto"/>
-            <w:vAlign w:val="center"/>
-            <w:hideMark/>
-          </w:tcPr>
-          <w:p>
-            <w:pPr>
-              <w:spacing w:after="0" w:line="240" w:lineRule="auto"/>
-              <w:rPr>
-                <w:rFonts w:ascii="Times New Roman" w:eastAsia="Times New Roman" w:hAnsi="Times New Roman" w:cs="Times New Roman"/>
-                <w:sz w:val="24"/>
-                <w:szCs w:val="24"/>
-              </w:rPr>
-            </w:pPr>
-            <w:r>
-              <w:rPr>
-                <w:rFonts w:ascii="Times New Roman" w:eastAsia="Times New Roman" w:hAnsi="Times New Roman" w:cs="Times New Roman"/>
-                <w:sz w:val="24"/>
-                <w:szCs w:val="24"/>
-              </w:rPr>
-              <w:t>Price snapshots in orders</w:t>
-            </w:r>
-          </w:p>
-        </w:tc>
-        <w:tc>
-          <w:tcPr>
-            <w:tcW w:w="0" w:type="auto"/>
-            <w:vAlign w:val="center"/>
-            <w:hideMark/>
-          </w:tcPr>
-          <w:p>
-            <w:pPr>
-              <w:spacing w:after="0" w:line="240" w:lineRule="auto"/>
-              <w:rPr>
-                <w:rFonts w:ascii="Times New Roman" w:eastAsia="Times New Roman" w:hAnsi="Times New Roman" w:cs="Times New Roman"/>
-                <w:sz w:val="24"/>
-                <w:szCs w:val="24"/>
-              </w:rPr>
-            </w:pPr>
-            <w:r>
-              <w:rPr>
-                <w:rFonts w:ascii="Times New Roman" w:eastAsia="Times New Roman" w:hAnsi="Times New Roman" w:cs="Times New Roman"/>
-                <w:sz w:val="24"/>
-                <w:szCs w:val="24"/>
-              </w:rPr>
-              <w:t>Shows real-world business thinking</w:t>
-            </w:r>
-          </w:p>
-        </w:tc>
-      </w:tr>
-      <w:tr>
-        <w:trPr>
-          <w:tblCellSpacing w:w="15" w:type="dxa"/>
-        </w:trPr>
-        <w:tc>
-          <w:tcPr>
-            <w:tcW w:w="0" w:type="auto"/>
-            <w:vAlign w:val="center"/>
-            <w:hideMark/>
-          </w:tcPr>
-          <w:p>
-            <w:pPr>
-              <w:spacing w:after="0" w:line="240" w:lineRule="auto"/>
-              <w:rPr>
-                <w:rFonts w:ascii="Times New Roman" w:eastAsia="Times New Roman" w:hAnsi="Times New Roman" w:cs="Times New Roman"/>
-                <w:sz w:val="24"/>
-                <w:szCs w:val="24"/>
-              </w:rPr>
-            </w:pPr>
-            <w:r>
-              <w:rPr>
-                <w:rFonts w:ascii="Times New Roman" w:eastAsia="Times New Roman" w:hAnsi="Times New Roman" w:cs="Times New Roman"/>
-                <w:sz w:val="24"/>
-                <w:szCs w:val="24"/>
-              </w:rPr>
-              <w:t>Soft deletes on menu items</w:t>
-            </w:r>
-          </w:p>
-        </w:tc>
-        <w:tc>
-          <w:tcPr>
-            <w:tcW w:w="0" w:type="auto"/>
-            <w:vAlign w:val="center"/>
-            <w:hideMark/>
-          </w:tcPr>
-          <w:p>
-            <w:pPr>
-              <w:spacing w:after="0" w:line="240" w:lineRule="auto"/>
-              <w:rPr>
-                <w:rFonts w:ascii="Times New Roman" w:eastAsia="Times New Roman" w:hAnsi="Times New Roman" w:cs="Times New Roman"/>
-                <w:sz w:val="24"/>
-                <w:szCs w:val="24"/>
-              </w:rPr>
-            </w:pPr>
-            <w:r>
-              <w:rPr>
-                <w:rFonts w:ascii="Times New Roman" w:eastAsia="Times New Roman" w:hAnsi="Times New Roman" w:cs="Times New Roman"/>
-                <w:sz w:val="24"/>
-                <w:szCs w:val="24"/>
-              </w:rPr>
-              <w:t>Shows DB maturity</w:t>
-            </w:r>
-          </w:p>
-        </w:tc>
-      </w:tr>
-      <w:tr>
-        <w:trPr>
-          <w:tblCellSpacing w:w="15" w:type="dxa"/>
-        </w:trPr>
-        <w:tc>
-          <w:tcPr>
-            <w:tcW w:w="0" w:type="auto"/>
-            <w:vAlign w:val="center"/>
-            <w:hideMark/>
-          </w:tcPr>
-          <w:p>
-            <w:pPr>
-              <w:spacing w:after="0" w:line="240" w:lineRule="auto"/>
-              <w:rPr>
-                <w:rFonts w:ascii="Times New Roman" w:eastAsia="Times New Roman" w:hAnsi="Times New Roman" w:cs="Times New Roman"/>
-                <w:sz w:val="24"/>
-                <w:szCs w:val="24"/>
-              </w:rPr>
-            </w:pPr>
-            <w:r>
-              <w:rPr>
-                <w:rFonts w:ascii="Times New Roman" w:eastAsia="Times New Roman" w:hAnsi="Times New Roman" w:cs="Times New Roman"/>
-                <w:sz w:val="24"/>
-                <w:szCs w:val="24"/>
-              </w:rPr>
-              <w:t>Status transition validation</w:t>
-            </w:r>
-          </w:p>
-        </w:tc>
-        <w:tc>
-          <w:tcPr>
-            <w:tcW w:w="0" w:type="auto"/>
-            <w:vAlign w:val="center"/>
-            <w:hideMark/>
-          </w:tcPr>
-          <w:p>
-            <w:pPr>
-              <w:spacing w:after="0" w:line="240" w:lineRule="auto"/>
-              <w:rPr>
-                <w:rFonts w:ascii="Times New Roman" w:eastAsia="Times New Roman" w:hAnsi="Times New Roman" w:cs="Times New Roman"/>
-                <w:sz w:val="24"/>
-                <w:szCs w:val="24"/>
-              </w:rPr>
-            </w:pPr>
-            <w:r>
-              <w:rPr>
-                <w:rFonts w:ascii="Times New Roman" w:eastAsia="Times New Roman" w:hAnsi="Times New Roman" w:cs="Times New Roman"/>
-                <w:sz w:val="24"/>
-                <w:szCs w:val="24"/>
-              </w:rPr>
-              <w:t>Shows state machine thinking</w:t>
-            </w:r>
-          </w:p>
-        </w:tc>
-      </w:tr>
-      <w:tr>
-        <w:trPr>
-          <w:tblCellSpacing w:w="15" w:type="dxa"/>
-        </w:trPr>
-        <w:tc>
-          <w:tcPr>
-            <w:tcW w:w="0" w:type="auto"/>
-            <w:vAlign w:val="center"/>
-            <w:hideMark/>
-          </w:tcPr>
-          <w:p>
-            <w:pPr>
-              <w:spacing w:after="0" w:line="240" w:lineRule="auto"/>
-              <w:rPr>
-                <w:rFonts w:ascii="Times New Roman" w:eastAsia="Times New Roman" w:hAnsi="Times New Roman" w:cs="Times New Roman"/>
-                <w:sz w:val="24"/>
-                <w:szCs w:val="24"/>
-              </w:rPr>
-            </w:pPr>
-            <w:r>
-              <w:rPr>
-                <w:rFonts w:ascii="Times New Roman" w:eastAsia="Times New Roman" w:hAnsi="Times New Roman" w:cs="Times New Roman"/>
-                <w:sz w:val="24"/>
-                <w:szCs w:val="24"/>
-              </w:rPr>
-              <w:t>Auto-notifications on status change</w:t>
-            </w:r>
-          </w:p>
-        </w:tc>
-        <w:tc>
-          <w:tcPr>
-            <w:tcW w:w="0" w:type="auto"/>
-            <w:vAlign w:val="center"/>
-            <w:hideMark/>
-          </w:tcPr>
-          <w:p>
-            <w:pPr>
-              <w:spacing w:after="0" w:line="240" w:lineRule="auto"/>
-              <w:rPr>
-                <w:rFonts w:ascii="Times New Roman" w:eastAsia="Times New Roman" w:hAnsi="Times New Roman" w:cs="Times New Roman"/>
-                <w:sz w:val="24"/>
-                <w:szCs w:val="24"/>
-              </w:rPr>
-            </w:pPr>
-            <w:r>
-              <w:rPr>
-                <w:rFonts w:ascii="Times New Roman" w:eastAsia="Times New Roman" w:hAnsi="Times New Roman" w:cs="Times New Roman"/>
-                <w:sz w:val="24"/>
-                <w:szCs w:val="24"/>
-              </w:rPr>
-              <w:t>Shows event-driven thinking</w:t>
-            </w:r>
-          </w:p>
-        </w:tc>
-      </w:tr>
-      <w:tr>
-        <w:trPr>
-          <w:tblCellSpacing w:w="15" w:type="dxa"/>
-        </w:trPr>
-        <w:tc>
-          <w:tcPr>
-            <w:tcW w:w="0" w:type="auto"/>
-            <w:vAlign w:val="center"/>
-            <w:hideMark/>
-          </w:tcPr>
-          <w:p>
-            <w:pPr>
-              <w:spacing w:after="0" w:line="240" w:lineRule="auto"/>
-              <w:rPr>
-                <w:rFonts w:ascii="Times New Roman" w:eastAsia="Times New Roman" w:hAnsi="Times New Roman" w:cs="Times New Roman"/>
-                <w:sz w:val="24"/>
-                <w:szCs w:val="24"/>
-              </w:rPr>
-            </w:pPr>
-            <w:r>
-              <w:rPr>
-                <w:rFonts w:ascii="Times New Roman" w:eastAsia="Times New Roman" w:hAnsi="Times New Roman" w:cs="Times New Roman"/>
-                <w:sz w:val="24"/>
-                <w:szCs w:val="24"/>
-              </w:rPr>
-              <w:t>Pagination everywhere</w:t>
-            </w:r>
-          </w:p>
-        </w:tc>
-        <w:tc>
-          <w:tcPr>
-            <w:tcW w:w="0" w:type="auto"/>
-            <w:vAlign w:val="center"/>
-            <w:hideMark/>
-          </w:tcPr>
-          <w:p>
-            <w:pPr>
-              <w:spacing w:after="0" w:line="240" w:lineRule="auto"/>
-              <w:rPr>
-                <w:rFonts w:ascii="Times New Roman" w:eastAsia="Times New Roman" w:hAnsi="Times New Roman" w:cs="Times New Roman"/>
-                <w:sz w:val="24"/>
-                <w:szCs w:val="24"/>
-              </w:rPr>
-            </w:pPr>
-            <w:r>
-              <w:rPr>
-                <w:rFonts w:ascii="Times New Roman" w:eastAsia="Times New Roman" w:hAnsi="Times New Roman" w:cs="Times New Roman"/>
-                <w:sz w:val="24"/>
-                <w:szCs w:val="24"/>
-              </w:rPr>
-              <w:t>Shows you know production concerns</w:t>
-            </w:r>
-          </w:p>
-        </w:tc>
-      </w:tr>
-      <w:tr>
-        <w:trPr>
-          <w:tblCellSpacing w:w="15" w:type="dxa"/>
-        </w:trPr>
-        <w:tc>
-          <w:tcPr>
-            <w:tcW w:w="0" w:type="auto"/>
-            <w:vAlign w:val="center"/>
-            <w:hideMark/>
-          </w:tcPr>
-          <w:p>
-            <w:pPr>
-              <w:spacing w:after="0" w:line="240" w:lineRule="auto"/>
-              <w:rPr>
-                <w:rFonts w:ascii="Times New Roman" w:eastAsia="Times New Roman" w:hAnsi="Times New Roman" w:cs="Times New Roman"/>
-                <w:sz w:val="24"/>
-                <w:szCs w:val="24"/>
-              </w:rPr>
-            </w:pPr>
-            <w:r>
-              <w:rPr>
-                <w:rFonts w:ascii="Times New Roman" w:eastAsia="Times New Roman" w:hAnsi="Times New Roman" w:cs="Times New Roman"/>
-                <w:sz w:val="24"/>
-                <w:szCs w:val="24"/>
-              </w:rPr>
-              <w:t>Separate service layer</w:t>
-            </w:r>
-          </w:p>
-        </w:tc>
-        <w:tc>
-          <w:tcPr>
-            <w:tcW w:w="0" w:type="auto"/>
-            <w:vAlign w:val="center"/>
-            <w:hideMark/>
-          </w:tcPr>
-          <w:p>
-            <w:pPr>
-              <w:spacing w:after="0" w:line="240" w:lineRule="auto"/>
-              <w:rPr>
-                <w:rFonts w:ascii="Times New Roman" w:eastAsia="Times New Roman" w:hAnsi="Times New Roman" w:cs="Times New Roman"/>
-                <w:sz w:val="24"/>
-                <w:szCs w:val="24"/>
-              </w:rPr>
-            </w:pPr>
-            <w:r>
-              <w:rPr>
-                <w:rFonts w:ascii="Times New Roman" w:eastAsia="Times New Roman" w:hAnsi="Times New Roman" w:cs="Times New Roman"/>
-                <w:sz w:val="24"/>
-                <w:szCs w:val="24"/>
-              </w:rPr>
-              <w:t>Shows clean architecture</w:t>
-            </w:r>
-          </w:p>
-        </w:tc>
-      </w:tr>
-      <w:tr>
-        <w:trPr>
-          <w:tblCellSpacing w:w="15" w:type="dxa"/>
-        </w:trPr>
-        <w:tc>
-          <w:tcPr>
-            <w:tcW w:w="0" w:type="auto"/>
-            <w:vAlign w:val="center"/>
-            <w:hideMark/>
-          </w:tcPr>
-          <w:p>
-            <w:pPr>
-              <w:spacing w:after="0" w:line="240" w:lineRule="auto"/>
-              <w:rPr>
-                <w:rFonts w:ascii="Times New Roman" w:eastAsia="Times New Roman" w:hAnsi="Times New Roman" w:cs="Times New Roman"/>
-                <w:sz w:val="24"/>
-                <w:szCs w:val="24"/>
-              </w:rPr>
-            </w:pPr>
-            <w:r>
-              <w:rPr>
-                <w:rFonts w:ascii="Times New Roman" w:eastAsia="Times New Roman" w:hAnsi="Times New Roman" w:cs="Times New Roman"/>
-                <w:sz w:val="24"/>
-                <w:szCs w:val="24"/>
-              </w:rPr>
-              <w:t>Alembic migrations</w:t>
-            </w:r>
-          </w:p>
-        </w:tc>
-        <w:tc>
-          <w:tcPr>
-            <w:tcW w:w="0" w:type="auto"/>
-            <w:vAlign w:val="center"/>
-            <w:hideMark/>
-          </w:tcPr>
-          <w:p>
-            <w:pPr>
-              <w:spacing w:after="0" w:line="240" w:lineRule="auto"/>
-              <w:rPr>
-                <w:rFonts w:ascii="Times New Roman" w:eastAsia="Times New Roman" w:hAnsi="Times New Roman" w:cs="Times New Roman"/>
-                <w:sz w:val="24"/>
-                <w:szCs w:val="24"/>
-              </w:rPr>
-            </w:pPr>
-            <w:r>
-              <w:rPr>
-                <w:rFonts w:ascii="Times New Roman" w:eastAsia="Times New Roman" w:hAnsi="Times New Roman" w:cs="Times New Roman"/>
-                <w:sz w:val="24"/>
-                <w:szCs w:val="24"/>
-              </w:rPr>
-              <w:t>Shows you work like a real team</w:t>
-            </w:r>
-          </w:p>
-        </w:tc>
-      </w:tr>
-      <w:tr>
-        <w:trPr>
-          <w:tblCellSpacing w:w="15" w:type="dxa"/>
-        </w:trPr>
-        <w:tc>
-          <w:tcPr>
-            <w:tcW w:w="0" w:type="auto"/>
-            <w:vAlign w:val="center"/>
-            <w:hideMark/>
-          </w:tcPr>
-          <w:p>
-            <w:pPr>
-              <w:spacing w:after="0" w:line="240" w:lineRule="auto"/>
-              <w:rPr>
-                <w:rFonts w:ascii="Times New Roman" w:eastAsia="Times New Roman" w:hAnsi="Times New Roman" w:cs="Times New Roman"/>
-                <w:sz w:val="24"/>
-                <w:szCs w:val="24"/>
-              </w:rPr>
-            </w:pPr>
-            <w:r>
-              <w:rPr>
-                <w:rFonts w:ascii="Times New Roman" w:eastAsia="Times New Roman" w:hAnsi="Times New Roman" w:cs="Times New Roman"/>
-                <w:sz w:val="24"/>
-                <w:szCs w:val="24"/>
-              </w:rPr>
-              <w:t>Proper HTTP status codes</w:t>
-            </w:r>
-          </w:p>
-        </w:tc>
-        <w:tc>
-          <w:tcPr>
-            <w:tcW w:w="0" w:type="auto"/>
-            <w:vAlign w:val="center"/>
-            <w:hideMark/>
-          </w:tcPr>
-          <w:p>
-            <w:pPr>
-              <w:spacing w:after="0" w:line="240" w:lineRule="auto"/>
-              <w:rPr>
-                <w:rFonts w:ascii="Times New Roman" w:eastAsia="Times New Roman" w:hAnsi="Times New Roman" w:cs="Times New Roman"/>
-                <w:sz w:val="24"/>
-                <w:szCs w:val="24"/>
-              </w:rPr>
-            </w:pPr>
-            <w:r>
-              <w:rPr>
-                <w:rFonts w:ascii="Times New Roman" w:eastAsia="Times New Roman" w:hAnsi="Times New Roman" w:cs="Times New Roman"/>
-                <w:sz w:val="24"/>
-                <w:szCs w:val="24"/>
-              </w:rPr>
-              <w:t>Shows API design knowledge</w:t>
-            </w:r>
-          </w:p>
-        </w:tc>
-      </w:tr>
-    </w:tbl>
-    <w:p>
-      <w:pPr>
-        <w:spacing w:before="100" w:beforeAutospacing="1" w:after="100" w:afterAutospacing="1" w:line="240" w:lineRule="auto"/>
-        <w:rPr>
-          <w:rFonts w:ascii="Times New Roman" w:eastAsia="Times New Roman" w:hAnsi="Times New Roman" w:cs="Times New Roman"/>
-          <w:sz w:val="24"/>
-          <w:szCs w:val="24"/>
-        </w:rPr>
-      </w:pPr>
-      <w:r>
-        <w:rPr>
-          <w:rFonts w:ascii="Times New Roman" w:eastAsia="Times New Roman" w:hAnsi="Times New Roman" w:cs="Times New Roman"/>
-          <w:sz w:val="24"/>
-          <w:szCs w:val="24"/>
-        </w:rPr>
-        <w:t xml:space="preserve">Build it in the order we discussed, test each feature before moving </w:t>
-      </w:r>
-      <w:proofErr w:type="gramStart"/>
-      <w:r>
-        <w:rPr>
-          <w:rFonts w:ascii="Times New Roman" w:eastAsia="Times New Roman" w:hAnsi="Times New Roman" w:cs="Times New Roman"/>
-          <w:sz w:val="24"/>
-          <w:szCs w:val="24"/>
-        </w:rPr>
-        <w:t>on,</w:t>
-      </w:r>
-      <w:proofErr w:type="gramEnd"/>
-      <w:r>
-        <w:rPr>
-          <w:rFonts w:ascii="Times New Roman" w:eastAsia="Times New Roman" w:hAnsi="Times New Roman" w:cs="Times New Roman"/>
-          <w:sz w:val="24"/>
-          <w:szCs w:val="24"/>
-        </w:rPr>
-        <w:t xml:space="preserve"> and this project alone can get you a junior backend role. You've got a complete roadmap — now go build it! 🚀</w:t>
-      </w:r>
-    </w:p>
-    <w:p>
-      <w:pPr>
-        <w:spacing w:before="100" w:beforeAutospacing="1" w:after="100" w:afterAutospacing="1" w:line="240" w:lineRule="auto"/>
-        <w:rPr>
-          <w:rFonts w:ascii="Times New Roman" w:eastAsia="Times New Roman" w:hAnsi="Times New Roman" w:cs="Times New Roman"/>
-          <w:sz w:val="24"/>
-          <w:szCs w:val="24"/>
-        </w:rPr>
-      </w:pPr>
-    </w:p>
-    <w:p>
-      <w:pPr>
-        <w:spacing w:after="0" w:line="240" w:lineRule="auto"/>
-        <w:rPr>
-          <w:rFonts w:ascii="Times New Roman" w:eastAsia="Times New Roman" w:hAnsi="Times New Roman" w:cs="Times New Roman"/>
-          <w:sz w:val="24"/>
-          <w:szCs w:val="24"/>
-        </w:rPr>
-      </w:pPr>
-      <w:hyperlink r:id="rId6" w:tgtFrame="_blank" w:history="1">
-        <w:r>
-          <w:rPr>
-            <w:rFonts w:ascii="Times New Roman" w:eastAsia="Times New Roman" w:hAnsi="Times New Roman" w:cs="Times New Roman"/>
-            <w:color w:val="0000FF"/>
-            <w:sz w:val="24"/>
-            <w:szCs w:val="24"/>
-            <w:u w:val="single"/>
-          </w:rPr>
-          <w:t>Claude is AI and can make mistakes. Please double-check responses.</w:t>
-        </w:r>
-      </w:hyperlink>
-    </w:p>
-    <w:p/>
     <w:sectPr>
       <w:pgSz w:w="12240" w:h="15840"/>
       <w:pgMar w:top="1440" w:right="1440" w:bottom="1440" w:left="1440" w:header="720" w:footer="720" w:gutter="0"/>

</xml_diff>

<commit_message>
Development in Last Feature Admin DashBoard 12:48 PM 06.05.26
</commit_message>
<xml_diff>
--- a/Project Structure/Project Structure.docx
+++ b/Project Structure/Project Structure.docx
@@ -1,1935 +1,8 @@
 
 <file path=word/document.xml><?xml version="1.0" encoding="utf-8"?>
-<w:document xmlns:wpc="http://schemas.microsoft.com/office/word/2010/wordprocessingCanvas" xmlns:mc="http://schemas.openxmlformats.org/markup-compatibility/2006" xmlns:o="urn:schemas-microsoft-com:office:office" xmlns:r="http://schemas.openxmlformats.org/officeDocument/2006/relationships" xmlns:m="http://schemas.openxmlformats.org/officeDocument/2006/math" xmlns:v="urn:schemas-microsoft-com:vml" xmlns:wp14="http://schemas.microsoft.com/office/word/2010/wordprocessingDrawing" xmlns:wp="http://schemas.openxmlformats.org/drawingml/2006/wordprocessingDrawing" xmlns:w10="urn:schemas-microsoft-com:office:word" xmlns:w="http://schemas.openxmlformats.org/wordprocessingml/2006/main" xmlns:w14="http://schemas.microsoft.com/office/word/2010/wordml" xmlns:wpg="http://schemas.microsoft.com/office/word/2010/wordprocessingGroup" xmlns:wpi="http://schemas.microsoft.com/office/word/2010/wordprocessingInk" xmlns:wne="http://schemas.microsoft.com/office/word/2006/wordml" xmlns:wps="http://schemas.microsoft.com/office/word/2010/wordprocessingShape" mc:Ignorable="w14 wp14">
+<w:document xmlns:wpc="http://schemas.microsoft.com/office/word/2010/wordprocessingCanvas" xmlns:cx="http://schemas.microsoft.com/office/drawing/2014/chartex" xmlns:cx1="http://schemas.microsoft.com/office/drawing/2015/9/8/chartex" xmlns:cx2="http://schemas.microsoft.com/office/drawing/2015/10/21/chartex" xmlns:cx3="http://schemas.microsoft.com/office/drawing/2016/5/9/chartex" xmlns:cx4="http://schemas.microsoft.com/office/drawing/2016/5/10/chartex" xmlns:cx5="http://schemas.microsoft.com/office/drawing/2016/5/11/chartex" xmlns:cx6="http://schemas.microsoft.com/office/drawing/2016/5/12/chartex" xmlns:cx7="http://schemas.microsoft.com/office/drawing/2016/5/13/chartex" xmlns:cx8="http://schemas.microsoft.com/office/drawing/2016/5/14/chartex" xmlns:mc="http://schemas.openxmlformats.org/markup-compatibility/2006" xmlns:aink="http://schemas.microsoft.com/office/drawing/2016/ink" xmlns:am3d="http://schemas.microsoft.com/office/drawing/2017/model3d" xmlns:o="urn:schemas-microsoft-com:office:office" xmlns:oel="http://schemas.microsoft.com/office/2019/extlst" xmlns:r="http://schemas.openxmlformats.org/officeDocument/2006/relationships" xmlns:m="http://schemas.openxmlformats.org/officeDocument/2006/math" xmlns:v="urn:schemas-microsoft-com:vml" xmlns:wp14="http://schemas.microsoft.com/office/word/2010/wordprocessingDrawing" xmlns:wp="http://schemas.openxmlformats.org/drawingml/2006/wordprocessingDrawing" xmlns:w10="urn:schemas-microsoft-com:office:word" xmlns:w="http://schemas.openxmlformats.org/wordprocessingml/2006/main" xmlns:w14="http://schemas.microsoft.com/office/word/2010/wordml" xmlns:w15="http://schemas.microsoft.com/office/word/2012/wordml" xmlns:w16cex="http://schemas.microsoft.com/office/word/2018/wordml/cex" xmlns:w16cid="http://schemas.microsoft.com/office/word/2016/wordml/cid" xmlns:w16="http://schemas.microsoft.com/office/word/2018/wordml" xmlns:w16du="http://schemas.microsoft.com/office/word/2023/wordml/word16du" xmlns:w16sdtdh="http://schemas.microsoft.com/office/word/2020/wordml/sdtdatahash" xmlns:w16sdtfl="http://schemas.microsoft.com/office/word/2024/wordml/sdtformatlock" xmlns:w16se="http://schemas.microsoft.com/office/word/2015/wordml/symex" xmlns:wpg="http://schemas.microsoft.com/office/word/2010/wordprocessingGroup" xmlns:wpi="http://schemas.microsoft.com/office/word/2010/wordprocessingInk" xmlns:wne="http://schemas.microsoft.com/office/word/2006/wordml" xmlns:wps="http://schemas.microsoft.com/office/word/2010/wordprocessingShape" mc:Ignorable="w14 w15 w16se w16cid w16 w16cex w16sdtdh w16sdtfl w16du wp14">
   <w:body>
-    <w:p>
-      <w:pPr>
-        <w:spacing w:before="100" w:beforeAutospacing="1" w:after="100" w:afterAutospacing="1" w:line="240" w:lineRule="auto"/>
-        <w:outlineLvl w:val="1"/>
-        <w:rPr>
-          <w:rFonts w:ascii="Times New Roman" w:eastAsia="Times New Roman" w:hAnsi="Times New Roman" w:cs="Times New Roman"/>
-          <w:b/>
-          <w:bCs/>
-          <w:sz w:val="36"/>
-          <w:szCs w:val="36"/>
-        </w:rPr>
-      </w:pPr>
-      <w:r>
-        <w:rPr>
-          <w:rFonts w:ascii="Times New Roman" w:eastAsia="Times New Roman" w:hAnsi="Times New Roman" w:cs="Times New Roman"/>
-          <w:b/>
-          <w:bCs/>
-          <w:sz w:val="36"/>
-          <w:szCs w:val="36"/>
-        </w:rPr>
-        <w:t>🛠️ Admin Dashboard — Full Deep Dive</w:t>
-      </w:r>
-    </w:p>
-    <w:p>
-      <w:pPr>
-        <w:spacing w:after="0" w:line="240" w:lineRule="auto"/>
-        <w:rPr>
-          <w:rFonts w:ascii="Times New Roman" w:eastAsia="Times New Roman" w:hAnsi="Times New Roman" w:cs="Times New Roman"/>
-          <w:sz w:val="24"/>
-          <w:szCs w:val="24"/>
-        </w:rPr>
-      </w:pPr>
-      <w:r>
-        <w:rPr>
-          <w:rFonts w:ascii="Times New Roman" w:eastAsia="Times New Roman" w:hAnsi="Times New Roman" w:cs="Times New Roman"/>
-          <w:sz w:val="24"/>
-          <w:szCs w:val="24"/>
-        </w:rPr>
-        <w:pict w14:anchorId="4A7A08C3">
-          <v:rect id="_x0000_i1025" style="width:0;height:1.5pt" o:hralign="center" o:hrstd="t" o:hr="t" fillcolor="#a0a0a0" stroked="f"/>
-        </w:pict>
-      </w:r>
-    </w:p>
-    <w:p>
-      <w:pPr>
-        <w:spacing w:before="100" w:beforeAutospacing="1" w:after="100" w:afterAutospacing="1" w:line="240" w:lineRule="auto"/>
-        <w:outlineLvl w:val="2"/>
-        <w:rPr>
-          <w:rFonts w:ascii="Times New Roman" w:eastAsia="Times New Roman" w:hAnsi="Times New Roman" w:cs="Times New Roman"/>
-          <w:b/>
-          <w:bCs/>
-          <w:sz w:val="27"/>
-          <w:szCs w:val="27"/>
-        </w:rPr>
-      </w:pPr>
-      <w:r>
-        <w:rPr>
-          <w:rFonts w:ascii="Times New Roman" w:eastAsia="Times New Roman" w:hAnsi="Times New Roman" w:cs="Times New Roman"/>
-          <w:b/>
-          <w:bCs/>
-          <w:sz w:val="27"/>
-          <w:szCs w:val="27"/>
-        </w:rPr>
-        <w:t>📡 API Endpoints</w:t>
-      </w:r>
-    </w:p>
-    <w:tbl>
-      <w:tblPr>
-        <w:tblW w:w="0" w:type="auto"/>
-        <w:tblCellSpacing w:w="15" w:type="dxa"/>
-        <w:tblCellMar>
-          <w:top w:w="15" w:type="dxa"/>
-          <w:left w:w="15" w:type="dxa"/>
-          <w:bottom w:w="15" w:type="dxa"/>
-          <w:right w:w="15" w:type="dxa"/>
-        </w:tblCellMar>
-        <w:tblLook w:val="04A0" w:firstRow="1" w:lastRow="0" w:firstColumn="1" w:lastColumn="0" w:noHBand="0" w:noVBand="1"/>
-      </w:tblPr>
-      <w:tblGrid>
-        <w:gridCol w:w="875"/>
-        <w:gridCol w:w="4261"/>
-        <w:gridCol w:w="727"/>
-        <w:gridCol w:w="2148"/>
-      </w:tblGrid>
-      <w:tr>
-        <w:trPr>
-          <w:tblHeader/>
-          <w:tblCellSpacing w:w="15" w:type="dxa"/>
-        </w:trPr>
-        <w:tc>
-          <w:tcPr>
-            <w:tcW w:w="0" w:type="auto"/>
-            <w:vAlign w:val="center"/>
-            <w:hideMark/>
-          </w:tcPr>
-          <w:p>
-            <w:pPr>
-              <w:spacing w:after="0" w:line="240" w:lineRule="auto"/>
-              <w:jc w:val="center"/>
-              <w:rPr>
-                <w:rFonts w:ascii="Times New Roman" w:eastAsia="Times New Roman" w:hAnsi="Times New Roman" w:cs="Times New Roman"/>
-                <w:b/>
-                <w:bCs/>
-                <w:sz w:val="24"/>
-                <w:szCs w:val="24"/>
-              </w:rPr>
-            </w:pPr>
-            <w:r>
-              <w:rPr>
-                <w:rFonts w:ascii="Times New Roman" w:eastAsia="Times New Roman" w:hAnsi="Times New Roman" w:cs="Times New Roman"/>
-                <w:b/>
-                <w:bCs/>
-                <w:sz w:val="24"/>
-                <w:szCs w:val="24"/>
-              </w:rPr>
-              <w:t>Method</w:t>
-            </w:r>
-          </w:p>
-        </w:tc>
-        <w:tc>
-          <w:tcPr>
-            <w:tcW w:w="0" w:type="auto"/>
-            <w:vAlign w:val="center"/>
-            <w:hideMark/>
-          </w:tcPr>
-          <w:p>
-            <w:pPr>
-              <w:spacing w:after="0" w:line="240" w:lineRule="auto"/>
-              <w:jc w:val="center"/>
-              <w:rPr>
-                <w:rFonts w:ascii="Times New Roman" w:eastAsia="Times New Roman" w:hAnsi="Times New Roman" w:cs="Times New Roman"/>
-                <w:b/>
-                <w:bCs/>
-                <w:sz w:val="24"/>
-                <w:szCs w:val="24"/>
-              </w:rPr>
-            </w:pPr>
-            <w:r>
-              <w:rPr>
-                <w:rFonts w:ascii="Times New Roman" w:eastAsia="Times New Roman" w:hAnsi="Times New Roman" w:cs="Times New Roman"/>
-                <w:b/>
-                <w:bCs/>
-                <w:sz w:val="24"/>
-                <w:szCs w:val="24"/>
-              </w:rPr>
-              <w:t>URL</w:t>
-            </w:r>
-          </w:p>
-        </w:tc>
-        <w:tc>
-          <w:tcPr>
-            <w:tcW w:w="0" w:type="auto"/>
-            <w:vAlign w:val="center"/>
-            <w:hideMark/>
-          </w:tcPr>
-          <w:p>
-            <w:pPr>
-              <w:spacing w:after="0" w:line="240" w:lineRule="auto"/>
-              <w:jc w:val="center"/>
-              <w:rPr>
-                <w:rFonts w:ascii="Times New Roman" w:eastAsia="Times New Roman" w:hAnsi="Times New Roman" w:cs="Times New Roman"/>
-                <w:b/>
-                <w:bCs/>
-                <w:sz w:val="24"/>
-                <w:szCs w:val="24"/>
-              </w:rPr>
-            </w:pPr>
-            <w:r>
-              <w:rPr>
-                <w:rFonts w:ascii="Times New Roman" w:eastAsia="Times New Roman" w:hAnsi="Times New Roman" w:cs="Times New Roman"/>
-                <w:b/>
-                <w:bCs/>
-                <w:sz w:val="24"/>
-                <w:szCs w:val="24"/>
-              </w:rPr>
-              <w:t>Who</w:t>
-            </w:r>
-          </w:p>
-        </w:tc>
-        <w:tc>
-          <w:tcPr>
-            <w:tcW w:w="0" w:type="auto"/>
-            <w:vAlign w:val="center"/>
-            <w:hideMark/>
-          </w:tcPr>
-          <w:p>
-            <w:pPr>
-              <w:spacing w:after="0" w:line="240" w:lineRule="auto"/>
-              <w:jc w:val="center"/>
-              <w:rPr>
-                <w:rFonts w:ascii="Times New Roman" w:eastAsia="Times New Roman" w:hAnsi="Times New Roman" w:cs="Times New Roman"/>
-                <w:b/>
-                <w:bCs/>
-                <w:sz w:val="24"/>
-                <w:szCs w:val="24"/>
-              </w:rPr>
-            </w:pPr>
-            <w:r>
-              <w:rPr>
-                <w:rFonts w:ascii="Times New Roman" w:eastAsia="Times New Roman" w:hAnsi="Times New Roman" w:cs="Times New Roman"/>
-                <w:b/>
-                <w:bCs/>
-                <w:sz w:val="24"/>
-                <w:szCs w:val="24"/>
-              </w:rPr>
-              <w:t>What</w:t>
-            </w:r>
-          </w:p>
-        </w:tc>
-      </w:tr>
-      <w:tr>
-        <w:trPr>
-          <w:tblCellSpacing w:w="15" w:type="dxa"/>
-        </w:trPr>
-        <w:tc>
-          <w:tcPr>
-            <w:tcW w:w="0" w:type="auto"/>
-            <w:vAlign w:val="center"/>
-            <w:hideMark/>
-          </w:tcPr>
-          <w:p>
-            <w:pPr>
-              <w:spacing w:after="0" w:line="240" w:lineRule="auto"/>
-              <w:rPr>
-                <w:rFonts w:ascii="Times New Roman" w:eastAsia="Times New Roman" w:hAnsi="Times New Roman" w:cs="Times New Roman"/>
-                <w:sz w:val="24"/>
-                <w:szCs w:val="24"/>
-              </w:rPr>
-            </w:pPr>
-            <w:r>
-              <w:rPr>
-                <w:rFonts w:ascii="Courier New" w:eastAsia="Times New Roman" w:hAnsi="Courier New" w:cs="Courier New"/>
-                <w:sz w:val="20"/>
-                <w:szCs w:val="20"/>
-              </w:rPr>
-              <w:t>GET</w:t>
-            </w:r>
-          </w:p>
-        </w:tc>
-        <w:tc>
-          <w:tcPr>
-            <w:tcW w:w="0" w:type="auto"/>
-            <w:vAlign w:val="center"/>
-            <w:hideMark/>
-          </w:tcPr>
-          <w:p>
-            <w:pPr>
-              <w:spacing w:after="0" w:line="240" w:lineRule="auto"/>
-              <w:rPr>
-                <w:rFonts w:ascii="Times New Roman" w:eastAsia="Times New Roman" w:hAnsi="Times New Roman" w:cs="Times New Roman"/>
-                <w:sz w:val="24"/>
-                <w:szCs w:val="24"/>
-              </w:rPr>
-            </w:pPr>
-            <w:r>
-              <w:rPr>
-                <w:rFonts w:ascii="Courier New" w:eastAsia="Times New Roman" w:hAnsi="Courier New" w:cs="Courier New"/>
-                <w:sz w:val="20"/>
-                <w:szCs w:val="20"/>
-              </w:rPr>
-              <w:t>/</w:t>
-            </w:r>
-            <w:proofErr w:type="spellStart"/>
-            <w:r>
-              <w:rPr>
-                <w:rFonts w:ascii="Courier New" w:eastAsia="Times New Roman" w:hAnsi="Courier New" w:cs="Courier New"/>
-                <w:sz w:val="20"/>
-                <w:szCs w:val="20"/>
-              </w:rPr>
-              <w:t>api</w:t>
-            </w:r>
-            <w:proofErr w:type="spellEnd"/>
-            <w:r>
-              <w:rPr>
-                <w:rFonts w:ascii="Courier New" w:eastAsia="Times New Roman" w:hAnsi="Courier New" w:cs="Courier New"/>
-                <w:sz w:val="20"/>
-                <w:szCs w:val="20"/>
-              </w:rPr>
-              <w:t>/v1/admin/stats</w:t>
-            </w:r>
-          </w:p>
-        </w:tc>
-        <w:tc>
-          <w:tcPr>
-            <w:tcW w:w="0" w:type="auto"/>
-            <w:vAlign w:val="center"/>
-            <w:hideMark/>
-          </w:tcPr>
-          <w:p>
-            <w:pPr>
-              <w:spacing w:after="0" w:line="240" w:lineRule="auto"/>
-              <w:rPr>
-                <w:rFonts w:ascii="Times New Roman" w:eastAsia="Times New Roman" w:hAnsi="Times New Roman" w:cs="Times New Roman"/>
-                <w:sz w:val="24"/>
-                <w:szCs w:val="24"/>
-              </w:rPr>
-            </w:pPr>
-            <w:r>
-              <w:rPr>
-                <w:rFonts w:ascii="Times New Roman" w:eastAsia="Times New Roman" w:hAnsi="Times New Roman" w:cs="Times New Roman"/>
-                <w:sz w:val="24"/>
-                <w:szCs w:val="24"/>
-              </w:rPr>
-              <w:t>Admin</w:t>
-            </w:r>
-          </w:p>
-        </w:tc>
-        <w:tc>
-          <w:tcPr>
-            <w:tcW w:w="0" w:type="auto"/>
-            <w:vAlign w:val="center"/>
-            <w:hideMark/>
-          </w:tcPr>
-          <w:p>
-            <w:pPr>
-              <w:spacing w:after="0" w:line="240" w:lineRule="auto"/>
-              <w:rPr>
-                <w:rFonts w:ascii="Times New Roman" w:eastAsia="Times New Roman" w:hAnsi="Times New Roman" w:cs="Times New Roman"/>
-                <w:sz w:val="24"/>
-                <w:szCs w:val="24"/>
-              </w:rPr>
-            </w:pPr>
-            <w:r>
-              <w:rPr>
-                <w:rFonts w:ascii="Times New Roman" w:eastAsia="Times New Roman" w:hAnsi="Times New Roman" w:cs="Times New Roman"/>
-                <w:sz w:val="24"/>
-                <w:szCs w:val="24"/>
-              </w:rPr>
-              <w:t>Dashboard summary</w:t>
-            </w:r>
-          </w:p>
-        </w:tc>
-      </w:tr>
-      <w:tr>
-        <w:trPr>
-          <w:tblCellSpacing w:w="15" w:type="dxa"/>
-        </w:trPr>
-        <w:tc>
-          <w:tcPr>
-            <w:tcW w:w="0" w:type="auto"/>
-            <w:vAlign w:val="center"/>
-            <w:hideMark/>
-          </w:tcPr>
-          <w:p>
-            <w:pPr>
-              <w:spacing w:after="0" w:line="240" w:lineRule="auto"/>
-              <w:rPr>
-                <w:rFonts w:ascii="Times New Roman" w:eastAsia="Times New Roman" w:hAnsi="Times New Roman" w:cs="Times New Roman"/>
-                <w:sz w:val="24"/>
-                <w:szCs w:val="24"/>
-              </w:rPr>
-            </w:pPr>
-            <w:r>
-              <w:rPr>
-                <w:rFonts w:ascii="Courier New" w:eastAsia="Times New Roman" w:hAnsi="Courier New" w:cs="Courier New"/>
-                <w:sz w:val="20"/>
-                <w:szCs w:val="20"/>
-              </w:rPr>
-              <w:t>GET</w:t>
-            </w:r>
-          </w:p>
-        </w:tc>
-        <w:tc>
-          <w:tcPr>
-            <w:tcW w:w="0" w:type="auto"/>
-            <w:vAlign w:val="center"/>
-            <w:hideMark/>
-          </w:tcPr>
-          <w:p>
-            <w:pPr>
-              <w:spacing w:after="0" w:line="240" w:lineRule="auto"/>
-              <w:rPr>
-                <w:rFonts w:ascii="Times New Roman" w:eastAsia="Times New Roman" w:hAnsi="Times New Roman" w:cs="Times New Roman"/>
-                <w:sz w:val="24"/>
-                <w:szCs w:val="24"/>
-              </w:rPr>
-            </w:pPr>
-            <w:r>
-              <w:rPr>
-                <w:rFonts w:ascii="Courier New" w:eastAsia="Times New Roman" w:hAnsi="Courier New" w:cs="Courier New"/>
-                <w:sz w:val="20"/>
-                <w:szCs w:val="20"/>
-              </w:rPr>
-              <w:t>/</w:t>
-            </w:r>
-            <w:proofErr w:type="spellStart"/>
-            <w:r>
-              <w:rPr>
-                <w:rFonts w:ascii="Courier New" w:eastAsia="Times New Roman" w:hAnsi="Courier New" w:cs="Courier New"/>
-                <w:sz w:val="20"/>
-                <w:szCs w:val="20"/>
-              </w:rPr>
-              <w:t>api</w:t>
-            </w:r>
-            <w:proofErr w:type="spellEnd"/>
-            <w:r>
-              <w:rPr>
-                <w:rFonts w:ascii="Courier New" w:eastAsia="Times New Roman" w:hAnsi="Courier New" w:cs="Courier New"/>
-                <w:sz w:val="20"/>
-                <w:szCs w:val="20"/>
-              </w:rPr>
-              <w:t>/v1/admin/users</w:t>
-            </w:r>
-          </w:p>
-        </w:tc>
-        <w:tc>
-          <w:tcPr>
-            <w:tcW w:w="0" w:type="auto"/>
-            <w:vAlign w:val="center"/>
-            <w:hideMark/>
-          </w:tcPr>
-          <w:p>
-            <w:pPr>
-              <w:spacing w:after="0" w:line="240" w:lineRule="auto"/>
-              <w:rPr>
-                <w:rFonts w:ascii="Times New Roman" w:eastAsia="Times New Roman" w:hAnsi="Times New Roman" w:cs="Times New Roman"/>
-                <w:sz w:val="24"/>
-                <w:szCs w:val="24"/>
-              </w:rPr>
-            </w:pPr>
-            <w:r>
-              <w:rPr>
-                <w:rFonts w:ascii="Times New Roman" w:eastAsia="Times New Roman" w:hAnsi="Times New Roman" w:cs="Times New Roman"/>
-                <w:sz w:val="24"/>
-                <w:szCs w:val="24"/>
-              </w:rPr>
-              <w:t>Admin</w:t>
-            </w:r>
-          </w:p>
-        </w:tc>
-        <w:tc>
-          <w:tcPr>
-            <w:tcW w:w="0" w:type="auto"/>
-            <w:vAlign w:val="center"/>
-            <w:hideMark/>
-          </w:tcPr>
-          <w:p>
-            <w:pPr>
-              <w:spacing w:after="0" w:line="240" w:lineRule="auto"/>
-              <w:rPr>
-                <w:rFonts w:ascii="Times New Roman" w:eastAsia="Times New Roman" w:hAnsi="Times New Roman" w:cs="Times New Roman"/>
-                <w:sz w:val="24"/>
-                <w:szCs w:val="24"/>
-              </w:rPr>
-            </w:pPr>
-            <w:r>
-              <w:rPr>
-                <w:rFonts w:ascii="Times New Roman" w:eastAsia="Times New Roman" w:hAnsi="Times New Roman" w:cs="Times New Roman"/>
-                <w:sz w:val="24"/>
-                <w:szCs w:val="24"/>
-              </w:rPr>
-              <w:t>List all users</w:t>
-            </w:r>
-          </w:p>
-        </w:tc>
-      </w:tr>
-      <w:tr>
-        <w:trPr>
-          <w:tblCellSpacing w:w="15" w:type="dxa"/>
-        </w:trPr>
-        <w:tc>
-          <w:tcPr>
-            <w:tcW w:w="0" w:type="auto"/>
-            <w:vAlign w:val="center"/>
-            <w:hideMark/>
-          </w:tcPr>
-          <w:p>
-            <w:pPr>
-              <w:spacing w:after="0" w:line="240" w:lineRule="auto"/>
-              <w:rPr>
-                <w:rFonts w:ascii="Times New Roman" w:eastAsia="Times New Roman" w:hAnsi="Times New Roman" w:cs="Times New Roman"/>
-                <w:sz w:val="24"/>
-                <w:szCs w:val="24"/>
-              </w:rPr>
-            </w:pPr>
-            <w:r>
-              <w:rPr>
-                <w:rFonts w:ascii="Courier New" w:eastAsia="Times New Roman" w:hAnsi="Courier New" w:cs="Courier New"/>
-                <w:sz w:val="20"/>
-                <w:szCs w:val="20"/>
-              </w:rPr>
-              <w:t>PATCH</w:t>
-            </w:r>
-          </w:p>
-        </w:tc>
-        <w:tc>
-          <w:tcPr>
-            <w:tcW w:w="0" w:type="auto"/>
-            <w:vAlign w:val="center"/>
-            <w:hideMark/>
-          </w:tcPr>
-          <w:p>
-            <w:pPr>
-              <w:spacing w:after="0" w:line="240" w:lineRule="auto"/>
-              <w:rPr>
-                <w:rFonts w:ascii="Times New Roman" w:eastAsia="Times New Roman" w:hAnsi="Times New Roman" w:cs="Times New Roman"/>
-                <w:sz w:val="24"/>
-                <w:szCs w:val="24"/>
-              </w:rPr>
-            </w:pPr>
-            <w:r>
-              <w:rPr>
-                <w:rFonts w:ascii="Courier New" w:eastAsia="Times New Roman" w:hAnsi="Courier New" w:cs="Courier New"/>
-                <w:sz w:val="20"/>
-                <w:szCs w:val="20"/>
-              </w:rPr>
-              <w:t>/</w:t>
-            </w:r>
-            <w:proofErr w:type="spellStart"/>
-            <w:r>
-              <w:rPr>
-                <w:rFonts w:ascii="Courier New" w:eastAsia="Times New Roman" w:hAnsi="Courier New" w:cs="Courier New"/>
-                <w:sz w:val="20"/>
-                <w:szCs w:val="20"/>
-              </w:rPr>
-              <w:t>api</w:t>
-            </w:r>
-            <w:proofErr w:type="spellEnd"/>
-            <w:r>
-              <w:rPr>
-                <w:rFonts w:ascii="Courier New" w:eastAsia="Times New Roman" w:hAnsi="Courier New" w:cs="Courier New"/>
-                <w:sz w:val="20"/>
-                <w:szCs w:val="20"/>
-              </w:rPr>
-              <w:t>/v1/admin/users/{id}/deactivate</w:t>
-            </w:r>
-          </w:p>
-        </w:tc>
-        <w:tc>
-          <w:tcPr>
-            <w:tcW w:w="0" w:type="auto"/>
-            <w:vAlign w:val="center"/>
-            <w:hideMark/>
-          </w:tcPr>
-          <w:p>
-            <w:pPr>
-              <w:spacing w:after="0" w:line="240" w:lineRule="auto"/>
-              <w:rPr>
-                <w:rFonts w:ascii="Times New Roman" w:eastAsia="Times New Roman" w:hAnsi="Times New Roman" w:cs="Times New Roman"/>
-                <w:sz w:val="24"/>
-                <w:szCs w:val="24"/>
-              </w:rPr>
-            </w:pPr>
-            <w:r>
-              <w:rPr>
-                <w:rFonts w:ascii="Times New Roman" w:eastAsia="Times New Roman" w:hAnsi="Times New Roman" w:cs="Times New Roman"/>
-                <w:sz w:val="24"/>
-                <w:szCs w:val="24"/>
-              </w:rPr>
-              <w:t>Admin</w:t>
-            </w:r>
-          </w:p>
-        </w:tc>
-        <w:tc>
-          <w:tcPr>
-            <w:tcW w:w="0" w:type="auto"/>
-            <w:vAlign w:val="center"/>
-            <w:hideMark/>
-          </w:tcPr>
-          <w:p>
-            <w:pPr>
-              <w:spacing w:after="0" w:line="240" w:lineRule="auto"/>
-              <w:rPr>
-                <w:rFonts w:ascii="Times New Roman" w:eastAsia="Times New Roman" w:hAnsi="Times New Roman" w:cs="Times New Roman"/>
-                <w:sz w:val="24"/>
-                <w:szCs w:val="24"/>
-              </w:rPr>
-            </w:pPr>
-            <w:r>
-              <w:rPr>
-                <w:rFonts w:ascii="Times New Roman" w:eastAsia="Times New Roman" w:hAnsi="Times New Roman" w:cs="Times New Roman"/>
-                <w:sz w:val="24"/>
-                <w:szCs w:val="24"/>
-              </w:rPr>
-              <w:t>Deactivate a user</w:t>
-            </w:r>
-          </w:p>
-        </w:tc>
-      </w:tr>
-      <w:tr>
-        <w:trPr>
-          <w:tblCellSpacing w:w="15" w:type="dxa"/>
-        </w:trPr>
-        <w:tc>
-          <w:tcPr>
-            <w:tcW w:w="0" w:type="auto"/>
-            <w:vAlign w:val="center"/>
-            <w:hideMark/>
-          </w:tcPr>
-          <w:p>
-            <w:pPr>
-              <w:spacing w:after="0" w:line="240" w:lineRule="auto"/>
-              <w:rPr>
-                <w:rFonts w:ascii="Times New Roman" w:eastAsia="Times New Roman" w:hAnsi="Times New Roman" w:cs="Times New Roman"/>
-                <w:sz w:val="24"/>
-                <w:szCs w:val="24"/>
-              </w:rPr>
-            </w:pPr>
-            <w:r>
-              <w:rPr>
-                <w:rFonts w:ascii="Courier New" w:eastAsia="Times New Roman" w:hAnsi="Courier New" w:cs="Courier New"/>
-                <w:sz w:val="20"/>
-                <w:szCs w:val="20"/>
-              </w:rPr>
-              <w:t>PATCH</w:t>
-            </w:r>
-          </w:p>
-        </w:tc>
-        <w:tc>
-          <w:tcPr>
-            <w:tcW w:w="0" w:type="auto"/>
-            <w:vAlign w:val="center"/>
-            <w:hideMark/>
-          </w:tcPr>
-          <w:p>
-            <w:pPr>
-              <w:spacing w:after="0" w:line="240" w:lineRule="auto"/>
-              <w:rPr>
-                <w:rFonts w:ascii="Times New Roman" w:eastAsia="Times New Roman" w:hAnsi="Times New Roman" w:cs="Times New Roman"/>
-                <w:sz w:val="24"/>
-                <w:szCs w:val="24"/>
-              </w:rPr>
-            </w:pPr>
-            <w:r>
-              <w:rPr>
-                <w:rFonts w:ascii="Courier New" w:eastAsia="Times New Roman" w:hAnsi="Courier New" w:cs="Courier New"/>
-                <w:sz w:val="20"/>
-                <w:szCs w:val="20"/>
-              </w:rPr>
-              <w:t>/</w:t>
-            </w:r>
-            <w:proofErr w:type="spellStart"/>
-            <w:r>
-              <w:rPr>
-                <w:rFonts w:ascii="Courier New" w:eastAsia="Times New Roman" w:hAnsi="Courier New" w:cs="Courier New"/>
-                <w:sz w:val="20"/>
-                <w:szCs w:val="20"/>
-              </w:rPr>
-              <w:t>api</w:t>
-            </w:r>
-            <w:proofErr w:type="spellEnd"/>
-            <w:r>
-              <w:rPr>
-                <w:rFonts w:ascii="Courier New" w:eastAsia="Times New Roman" w:hAnsi="Courier New" w:cs="Courier New"/>
-                <w:sz w:val="20"/>
-                <w:szCs w:val="20"/>
-              </w:rPr>
-              <w:t>/v1/admin/users/{id}/activate</w:t>
-            </w:r>
-          </w:p>
-        </w:tc>
-        <w:tc>
-          <w:tcPr>
-            <w:tcW w:w="0" w:type="auto"/>
-            <w:vAlign w:val="center"/>
-            <w:hideMark/>
-          </w:tcPr>
-          <w:p>
-            <w:pPr>
-              <w:spacing w:after="0" w:line="240" w:lineRule="auto"/>
-              <w:rPr>
-                <w:rFonts w:ascii="Times New Roman" w:eastAsia="Times New Roman" w:hAnsi="Times New Roman" w:cs="Times New Roman"/>
-                <w:sz w:val="24"/>
-                <w:szCs w:val="24"/>
-              </w:rPr>
-            </w:pPr>
-            <w:r>
-              <w:rPr>
-                <w:rFonts w:ascii="Times New Roman" w:eastAsia="Times New Roman" w:hAnsi="Times New Roman" w:cs="Times New Roman"/>
-                <w:sz w:val="24"/>
-                <w:szCs w:val="24"/>
-              </w:rPr>
-              <w:t>Admin</w:t>
-            </w:r>
-          </w:p>
-        </w:tc>
-        <w:tc>
-          <w:tcPr>
-            <w:tcW w:w="0" w:type="auto"/>
-            <w:vAlign w:val="center"/>
-            <w:hideMark/>
-          </w:tcPr>
-          <w:p>
-            <w:pPr>
-              <w:spacing w:after="0" w:line="240" w:lineRule="auto"/>
-              <w:rPr>
-                <w:rFonts w:ascii="Times New Roman" w:eastAsia="Times New Roman" w:hAnsi="Times New Roman" w:cs="Times New Roman"/>
-                <w:sz w:val="24"/>
-                <w:szCs w:val="24"/>
-              </w:rPr>
-            </w:pPr>
-            <w:r>
-              <w:rPr>
-                <w:rFonts w:ascii="Times New Roman" w:eastAsia="Times New Roman" w:hAnsi="Times New Roman" w:cs="Times New Roman"/>
-                <w:sz w:val="24"/>
-                <w:szCs w:val="24"/>
-              </w:rPr>
-              <w:t>Reactivate a user</w:t>
-            </w:r>
-          </w:p>
-        </w:tc>
-      </w:tr>
-      <w:tr>
-        <w:trPr>
-          <w:tblCellSpacing w:w="15" w:type="dxa"/>
-        </w:trPr>
-        <w:tc>
-          <w:tcPr>
-            <w:tcW w:w="0" w:type="auto"/>
-            <w:vAlign w:val="center"/>
-            <w:hideMark/>
-          </w:tcPr>
-          <w:p>
-            <w:pPr>
-              <w:spacing w:after="0" w:line="240" w:lineRule="auto"/>
-              <w:rPr>
-                <w:rFonts w:ascii="Times New Roman" w:eastAsia="Times New Roman" w:hAnsi="Times New Roman" w:cs="Times New Roman"/>
-                <w:sz w:val="24"/>
-                <w:szCs w:val="24"/>
-              </w:rPr>
-            </w:pPr>
-            <w:r>
-              <w:rPr>
-                <w:rFonts w:ascii="Courier New" w:eastAsia="Times New Roman" w:hAnsi="Courier New" w:cs="Courier New"/>
-                <w:sz w:val="20"/>
-                <w:szCs w:val="20"/>
-              </w:rPr>
-              <w:t>PATCH</w:t>
-            </w:r>
-          </w:p>
-        </w:tc>
-        <w:tc>
-          <w:tcPr>
-            <w:tcW w:w="0" w:type="auto"/>
-            <w:vAlign w:val="center"/>
-            <w:hideMark/>
-          </w:tcPr>
-          <w:p>
-            <w:pPr>
-              <w:spacing w:after="0" w:line="240" w:lineRule="auto"/>
-              <w:rPr>
-                <w:rFonts w:ascii="Times New Roman" w:eastAsia="Times New Roman" w:hAnsi="Times New Roman" w:cs="Times New Roman"/>
-                <w:sz w:val="24"/>
-                <w:szCs w:val="24"/>
-              </w:rPr>
-            </w:pPr>
-            <w:r>
-              <w:rPr>
-                <w:rFonts w:ascii="Courier New" w:eastAsia="Times New Roman" w:hAnsi="Courier New" w:cs="Courier New"/>
-                <w:sz w:val="20"/>
-                <w:szCs w:val="20"/>
-              </w:rPr>
-              <w:t>/</w:t>
-            </w:r>
-            <w:proofErr w:type="spellStart"/>
-            <w:r>
-              <w:rPr>
-                <w:rFonts w:ascii="Courier New" w:eastAsia="Times New Roman" w:hAnsi="Courier New" w:cs="Courier New"/>
-                <w:sz w:val="20"/>
-                <w:szCs w:val="20"/>
-              </w:rPr>
-              <w:t>api</w:t>
-            </w:r>
-            <w:proofErr w:type="spellEnd"/>
-            <w:r>
-              <w:rPr>
-                <w:rFonts w:ascii="Courier New" w:eastAsia="Times New Roman" w:hAnsi="Courier New" w:cs="Courier New"/>
-                <w:sz w:val="20"/>
-                <w:szCs w:val="20"/>
-              </w:rPr>
-              <w:t>/v1/admin/users/{id}/role</w:t>
-            </w:r>
-          </w:p>
-        </w:tc>
-        <w:tc>
-          <w:tcPr>
-            <w:tcW w:w="0" w:type="auto"/>
-            <w:vAlign w:val="center"/>
-            <w:hideMark/>
-          </w:tcPr>
-          <w:p>
-            <w:pPr>
-              <w:spacing w:after="0" w:line="240" w:lineRule="auto"/>
-              <w:rPr>
-                <w:rFonts w:ascii="Times New Roman" w:eastAsia="Times New Roman" w:hAnsi="Times New Roman" w:cs="Times New Roman"/>
-                <w:sz w:val="24"/>
-                <w:szCs w:val="24"/>
-              </w:rPr>
-            </w:pPr>
-            <w:r>
-              <w:rPr>
-                <w:rFonts w:ascii="Times New Roman" w:eastAsia="Times New Roman" w:hAnsi="Times New Roman" w:cs="Times New Roman"/>
-                <w:sz w:val="24"/>
-                <w:szCs w:val="24"/>
-              </w:rPr>
-              <w:t>Admin</w:t>
-            </w:r>
-          </w:p>
-        </w:tc>
-        <w:tc>
-          <w:tcPr>
-            <w:tcW w:w="0" w:type="auto"/>
-            <w:vAlign w:val="center"/>
-            <w:hideMark/>
-          </w:tcPr>
-          <w:p>
-            <w:pPr>
-              <w:spacing w:after="0" w:line="240" w:lineRule="auto"/>
-              <w:rPr>
-                <w:rFonts w:ascii="Times New Roman" w:eastAsia="Times New Roman" w:hAnsi="Times New Roman" w:cs="Times New Roman"/>
-                <w:sz w:val="24"/>
-                <w:szCs w:val="24"/>
-              </w:rPr>
-            </w:pPr>
-            <w:r>
-              <w:rPr>
-                <w:rFonts w:ascii="Times New Roman" w:eastAsia="Times New Roman" w:hAnsi="Times New Roman" w:cs="Times New Roman"/>
-                <w:sz w:val="24"/>
-                <w:szCs w:val="24"/>
-              </w:rPr>
-              <w:t>Change user role</w:t>
-            </w:r>
-          </w:p>
-        </w:tc>
-      </w:tr>
-      <w:tr>
-        <w:trPr>
-          <w:tblCellSpacing w:w="15" w:type="dxa"/>
-        </w:trPr>
-        <w:tc>
-          <w:tcPr>
-            <w:tcW w:w="0" w:type="auto"/>
-            <w:vAlign w:val="center"/>
-            <w:hideMark/>
-          </w:tcPr>
-          <w:p>
-            <w:pPr>
-              <w:spacing w:after="0" w:line="240" w:lineRule="auto"/>
-              <w:rPr>
-                <w:rFonts w:ascii="Times New Roman" w:eastAsia="Times New Roman" w:hAnsi="Times New Roman" w:cs="Times New Roman"/>
-                <w:sz w:val="24"/>
-                <w:szCs w:val="24"/>
-              </w:rPr>
-            </w:pPr>
-            <w:r>
-              <w:rPr>
-                <w:rFonts w:ascii="Courier New" w:eastAsia="Times New Roman" w:hAnsi="Courier New" w:cs="Courier New"/>
-                <w:sz w:val="20"/>
-                <w:szCs w:val="20"/>
-              </w:rPr>
-              <w:t>GET</w:t>
-            </w:r>
-          </w:p>
-        </w:tc>
-        <w:tc>
-          <w:tcPr>
-            <w:tcW w:w="0" w:type="auto"/>
-            <w:vAlign w:val="center"/>
-            <w:hideMark/>
-          </w:tcPr>
-          <w:p>
-            <w:pPr>
-              <w:spacing w:after="0" w:line="240" w:lineRule="auto"/>
-              <w:rPr>
-                <w:rFonts w:ascii="Times New Roman" w:eastAsia="Times New Roman" w:hAnsi="Times New Roman" w:cs="Times New Roman"/>
-                <w:sz w:val="24"/>
-                <w:szCs w:val="24"/>
-              </w:rPr>
-            </w:pPr>
-            <w:r>
-              <w:rPr>
-                <w:rFonts w:ascii="Courier New" w:eastAsia="Times New Roman" w:hAnsi="Courier New" w:cs="Courier New"/>
-                <w:sz w:val="20"/>
-                <w:szCs w:val="20"/>
-              </w:rPr>
-              <w:t>/</w:t>
-            </w:r>
-            <w:proofErr w:type="spellStart"/>
-            <w:r>
-              <w:rPr>
-                <w:rFonts w:ascii="Courier New" w:eastAsia="Times New Roman" w:hAnsi="Courier New" w:cs="Courier New"/>
-                <w:sz w:val="20"/>
-                <w:szCs w:val="20"/>
-              </w:rPr>
-              <w:t>api</w:t>
-            </w:r>
-            <w:proofErr w:type="spellEnd"/>
-            <w:r>
-              <w:rPr>
-                <w:rFonts w:ascii="Courier New" w:eastAsia="Times New Roman" w:hAnsi="Courier New" w:cs="Courier New"/>
-                <w:sz w:val="20"/>
-                <w:szCs w:val="20"/>
-              </w:rPr>
-              <w:t>/v1/admin/orders</w:t>
-            </w:r>
-          </w:p>
-        </w:tc>
-        <w:tc>
-          <w:tcPr>
-            <w:tcW w:w="0" w:type="auto"/>
-            <w:vAlign w:val="center"/>
-            <w:hideMark/>
-          </w:tcPr>
-          <w:p>
-            <w:pPr>
-              <w:spacing w:after="0" w:line="240" w:lineRule="auto"/>
-              <w:rPr>
-                <w:rFonts w:ascii="Times New Roman" w:eastAsia="Times New Roman" w:hAnsi="Times New Roman" w:cs="Times New Roman"/>
-                <w:sz w:val="24"/>
-                <w:szCs w:val="24"/>
-              </w:rPr>
-            </w:pPr>
-            <w:r>
-              <w:rPr>
-                <w:rFonts w:ascii="Times New Roman" w:eastAsia="Times New Roman" w:hAnsi="Times New Roman" w:cs="Times New Roman"/>
-                <w:sz w:val="24"/>
-                <w:szCs w:val="24"/>
-              </w:rPr>
-              <w:t>Admin</w:t>
-            </w:r>
-          </w:p>
-        </w:tc>
-        <w:tc>
-          <w:tcPr>
-            <w:tcW w:w="0" w:type="auto"/>
-            <w:vAlign w:val="center"/>
-            <w:hideMark/>
-          </w:tcPr>
-          <w:p>
-            <w:pPr>
-              <w:spacing w:after="0" w:line="240" w:lineRule="auto"/>
-              <w:rPr>
-                <w:rFonts w:ascii="Times New Roman" w:eastAsia="Times New Roman" w:hAnsi="Times New Roman" w:cs="Times New Roman"/>
-                <w:sz w:val="24"/>
-                <w:szCs w:val="24"/>
-              </w:rPr>
-            </w:pPr>
-            <w:r>
-              <w:rPr>
-                <w:rFonts w:ascii="Times New Roman" w:eastAsia="Times New Roman" w:hAnsi="Times New Roman" w:cs="Times New Roman"/>
-                <w:sz w:val="24"/>
-                <w:szCs w:val="24"/>
-              </w:rPr>
-              <w:t>All orders with filters</w:t>
-            </w:r>
-          </w:p>
-        </w:tc>
-      </w:tr>
-    </w:tbl>
-    <w:p>
-      <w:pPr>
-        <w:spacing w:before="100" w:beforeAutospacing="1" w:after="100" w:afterAutospacing="1" w:line="240" w:lineRule="auto"/>
-        <w:outlineLvl w:val="2"/>
-        <w:rPr>
-          <w:rFonts w:ascii="Times New Roman" w:eastAsia="Times New Roman" w:hAnsi="Times New Roman" w:cs="Times New Roman"/>
-          <w:b/>
-          <w:bCs/>
-          <w:sz w:val="27"/>
-          <w:szCs w:val="27"/>
-        </w:rPr>
-      </w:pPr>
-      <w:r>
-        <w:rPr>
-          <w:rFonts w:ascii="Times New Roman" w:eastAsia="Times New Roman" w:hAnsi="Times New Roman" w:cs="Times New Roman"/>
-          <w:b/>
-          <w:bCs/>
-          <w:sz w:val="27"/>
-          <w:szCs w:val="27"/>
-        </w:rPr>
-        <w:t xml:space="preserve">⚙️ </w:t>
-      </w:r>
-      <w:proofErr w:type="gramStart"/>
-      <w:r>
-        <w:rPr>
-          <w:rFonts w:ascii="Times New Roman" w:eastAsia="Times New Roman" w:hAnsi="Times New Roman" w:cs="Times New Roman"/>
-          <w:b/>
-          <w:bCs/>
-          <w:sz w:val="27"/>
-          <w:szCs w:val="27"/>
-        </w:rPr>
-        <w:t>The</w:t>
-      </w:r>
-      <w:proofErr w:type="gramEnd"/>
-      <w:r>
-        <w:rPr>
-          <w:rFonts w:ascii="Times New Roman" w:eastAsia="Times New Roman" w:hAnsi="Times New Roman" w:cs="Times New Roman"/>
-          <w:b/>
-          <w:bCs/>
-          <w:sz w:val="27"/>
-          <w:szCs w:val="27"/>
-        </w:rPr>
-        <w:t xml:space="preserve"> Stats Endpoint — What to Return</w:t>
-      </w:r>
-    </w:p>
-    <w:p>
-      <w:pPr>
-        <w:tabs>
-          <w:tab w:val="left" w:pos="916"/>
-          <w:tab w:val="left" w:pos="1832"/>
-          <w:tab w:val="left" w:pos="2748"/>
-          <w:tab w:val="left" w:pos="3664"/>
-          <w:tab w:val="left" w:pos="4580"/>
-          <w:tab w:val="left" w:pos="5496"/>
-          <w:tab w:val="left" w:pos="6412"/>
-          <w:tab w:val="left" w:pos="7328"/>
-          <w:tab w:val="left" w:pos="8244"/>
-          <w:tab w:val="left" w:pos="9160"/>
-          <w:tab w:val="left" w:pos="10076"/>
-          <w:tab w:val="left" w:pos="10992"/>
-          <w:tab w:val="left" w:pos="11908"/>
-          <w:tab w:val="left" w:pos="12824"/>
-          <w:tab w:val="left" w:pos="13740"/>
-          <w:tab w:val="left" w:pos="14656"/>
-        </w:tabs>
-        <w:spacing w:after="0" w:line="240" w:lineRule="auto"/>
-        <w:rPr>
-          <w:rFonts w:ascii="var(--font-mono)" w:eastAsia="Times New Roman" w:hAnsi="var(--font-mono)" w:cs="Courier New"/>
-          <w:color w:val="EAECF0"/>
-          <w:sz w:val="20"/>
-          <w:szCs w:val="20"/>
-        </w:rPr>
-      </w:pPr>
-      <w:r>
-        <w:rPr>
-          <w:rFonts w:ascii="var(--font-mono)" w:eastAsia="Times New Roman" w:hAnsi="var(--font-mono)" w:cs="Courier New"/>
-          <w:color w:val="EAECF0"/>
-          <w:sz w:val="20"/>
-          <w:szCs w:val="20"/>
-        </w:rPr>
-        <w:t>GET /</w:t>
-      </w:r>
-      <w:proofErr w:type="spellStart"/>
-      <w:r>
-        <w:rPr>
-          <w:rFonts w:ascii="var(--font-mono)" w:eastAsia="Times New Roman" w:hAnsi="var(--font-mono)" w:cs="Courier New"/>
-          <w:color w:val="EAECF0"/>
-          <w:sz w:val="20"/>
-          <w:szCs w:val="20"/>
-        </w:rPr>
-        <w:t>api</w:t>
-      </w:r>
-      <w:proofErr w:type="spellEnd"/>
-      <w:r>
-        <w:rPr>
-          <w:rFonts w:ascii="var(--font-mono)" w:eastAsia="Times New Roman" w:hAnsi="var(--font-mono)" w:cs="Courier New"/>
-          <w:color w:val="EAECF0"/>
-          <w:sz w:val="20"/>
-          <w:szCs w:val="20"/>
-        </w:rPr>
-        <w:t>/v1/admin/stats</w:t>
-      </w:r>
-    </w:p>
-    <w:p>
-      <w:pPr>
-        <w:tabs>
-          <w:tab w:val="left" w:pos="916"/>
-          <w:tab w:val="left" w:pos="1832"/>
-          <w:tab w:val="left" w:pos="2748"/>
-          <w:tab w:val="left" w:pos="3664"/>
-          <w:tab w:val="left" w:pos="4580"/>
-          <w:tab w:val="left" w:pos="5496"/>
-          <w:tab w:val="left" w:pos="6412"/>
-          <w:tab w:val="left" w:pos="7328"/>
-          <w:tab w:val="left" w:pos="8244"/>
-          <w:tab w:val="left" w:pos="9160"/>
-          <w:tab w:val="left" w:pos="10076"/>
-          <w:tab w:val="left" w:pos="10992"/>
-          <w:tab w:val="left" w:pos="11908"/>
-          <w:tab w:val="left" w:pos="12824"/>
-          <w:tab w:val="left" w:pos="13740"/>
-          <w:tab w:val="left" w:pos="14656"/>
-        </w:tabs>
-        <w:spacing w:after="0" w:line="240" w:lineRule="auto"/>
-        <w:rPr>
-          <w:rFonts w:ascii="var(--font-mono)" w:eastAsia="Times New Roman" w:hAnsi="var(--font-mono)" w:cs="Courier New"/>
-          <w:color w:val="EAECF0"/>
-          <w:sz w:val="20"/>
-          <w:szCs w:val="20"/>
-        </w:rPr>
-      </w:pPr>
-    </w:p>
-    <w:p>
-      <w:pPr>
-        <w:tabs>
-          <w:tab w:val="left" w:pos="916"/>
-          <w:tab w:val="left" w:pos="1832"/>
-          <w:tab w:val="left" w:pos="2748"/>
-          <w:tab w:val="left" w:pos="3664"/>
-          <w:tab w:val="left" w:pos="4580"/>
-          <w:tab w:val="left" w:pos="5496"/>
-          <w:tab w:val="left" w:pos="6412"/>
-          <w:tab w:val="left" w:pos="7328"/>
-          <w:tab w:val="left" w:pos="8244"/>
-          <w:tab w:val="left" w:pos="9160"/>
-          <w:tab w:val="left" w:pos="10076"/>
-          <w:tab w:val="left" w:pos="10992"/>
-          <w:tab w:val="left" w:pos="11908"/>
-          <w:tab w:val="left" w:pos="12824"/>
-          <w:tab w:val="left" w:pos="13740"/>
-          <w:tab w:val="left" w:pos="14656"/>
-        </w:tabs>
-        <w:spacing w:after="0" w:line="240" w:lineRule="auto"/>
-        <w:rPr>
-          <w:rFonts w:ascii="var(--font-mono)" w:eastAsia="Times New Roman" w:hAnsi="var(--font-mono)" w:cs="Courier New"/>
-          <w:color w:val="EAECF0"/>
-          <w:sz w:val="20"/>
-          <w:szCs w:val="20"/>
-        </w:rPr>
-      </w:pPr>
-      <w:r>
-        <w:rPr>
-          <w:rFonts w:ascii="var(--font-mono)" w:eastAsia="Times New Roman" w:hAnsi="var(--font-mono)" w:cs="Courier New"/>
-          <w:color w:val="EAECF0"/>
-          <w:sz w:val="20"/>
-          <w:szCs w:val="20"/>
-        </w:rPr>
-        <w:t>Response:</w:t>
-      </w:r>
-    </w:p>
-    <w:p>
-      <w:pPr>
-        <w:tabs>
-          <w:tab w:val="left" w:pos="916"/>
-          <w:tab w:val="left" w:pos="1832"/>
-          <w:tab w:val="left" w:pos="2748"/>
-          <w:tab w:val="left" w:pos="3664"/>
-          <w:tab w:val="left" w:pos="4580"/>
-          <w:tab w:val="left" w:pos="5496"/>
-          <w:tab w:val="left" w:pos="6412"/>
-          <w:tab w:val="left" w:pos="7328"/>
-          <w:tab w:val="left" w:pos="8244"/>
-          <w:tab w:val="left" w:pos="9160"/>
-          <w:tab w:val="left" w:pos="10076"/>
-          <w:tab w:val="left" w:pos="10992"/>
-          <w:tab w:val="left" w:pos="11908"/>
-          <w:tab w:val="left" w:pos="12824"/>
-          <w:tab w:val="left" w:pos="13740"/>
-          <w:tab w:val="left" w:pos="14656"/>
-        </w:tabs>
-        <w:spacing w:after="0" w:line="240" w:lineRule="auto"/>
-        <w:rPr>
-          <w:rFonts w:ascii="var(--font-mono)" w:eastAsia="Times New Roman" w:hAnsi="var(--font-mono)" w:cs="Courier New"/>
-          <w:color w:val="EAECF0"/>
-          <w:sz w:val="20"/>
-          <w:szCs w:val="20"/>
-        </w:rPr>
-      </w:pPr>
-      <w:r>
-        <w:rPr>
-          <w:rFonts w:ascii="var(--font-mono)" w:eastAsia="Times New Roman" w:hAnsi="var(--font-mono)" w:cs="Courier New"/>
-          <w:color w:val="EAECF0"/>
-          <w:sz w:val="20"/>
-          <w:szCs w:val="20"/>
-        </w:rPr>
-        <w:t>{</w:t>
-      </w:r>
-    </w:p>
-    <w:p>
-      <w:pPr>
-        <w:tabs>
-          <w:tab w:val="left" w:pos="916"/>
-          <w:tab w:val="left" w:pos="1832"/>
-          <w:tab w:val="left" w:pos="2748"/>
-          <w:tab w:val="left" w:pos="3664"/>
-          <w:tab w:val="left" w:pos="4580"/>
-          <w:tab w:val="left" w:pos="5496"/>
-          <w:tab w:val="left" w:pos="6412"/>
-          <w:tab w:val="left" w:pos="7328"/>
-          <w:tab w:val="left" w:pos="8244"/>
-          <w:tab w:val="left" w:pos="9160"/>
-          <w:tab w:val="left" w:pos="10076"/>
-          <w:tab w:val="left" w:pos="10992"/>
-          <w:tab w:val="left" w:pos="11908"/>
-          <w:tab w:val="left" w:pos="12824"/>
-          <w:tab w:val="left" w:pos="13740"/>
-          <w:tab w:val="left" w:pos="14656"/>
-        </w:tabs>
-        <w:spacing w:after="0" w:line="240" w:lineRule="auto"/>
-        <w:rPr>
-          <w:rFonts w:ascii="var(--font-mono)" w:eastAsia="Times New Roman" w:hAnsi="var(--font-mono)" w:cs="Courier New"/>
-          <w:color w:val="EAECF0"/>
-          <w:sz w:val="20"/>
-          <w:szCs w:val="20"/>
-        </w:rPr>
-      </w:pPr>
-      <w:r>
-        <w:rPr>
-          <w:rFonts w:ascii="var(--font-mono)" w:eastAsia="Times New Roman" w:hAnsi="var(--font-mono)" w:cs="Courier New"/>
-          <w:color w:val="EAECF0"/>
-          <w:sz w:val="20"/>
-          <w:szCs w:val="20"/>
-        </w:rPr>
-        <w:t xml:space="preserve">  "</w:t>
-      </w:r>
-      <w:proofErr w:type="spellStart"/>
-      <w:r>
-        <w:rPr>
-          <w:rFonts w:ascii="var(--font-mono)" w:eastAsia="Times New Roman" w:hAnsi="var(--font-mono)" w:cs="Courier New"/>
-          <w:color w:val="EAECF0"/>
-          <w:sz w:val="20"/>
-          <w:szCs w:val="20"/>
-        </w:rPr>
-        <w:t>total_orders_today</w:t>
-      </w:r>
-      <w:proofErr w:type="spellEnd"/>
-      <w:r>
-        <w:rPr>
-          <w:rFonts w:ascii="var(--font-mono)" w:eastAsia="Times New Roman" w:hAnsi="var(--font-mono)" w:cs="Courier New"/>
-          <w:color w:val="EAECF0"/>
-          <w:sz w:val="20"/>
-          <w:szCs w:val="20"/>
-        </w:rPr>
-        <w:t>": 24,</w:t>
-      </w:r>
-    </w:p>
-    <w:p>
-      <w:pPr>
-        <w:tabs>
-          <w:tab w:val="left" w:pos="916"/>
-          <w:tab w:val="left" w:pos="1832"/>
-          <w:tab w:val="left" w:pos="2748"/>
-          <w:tab w:val="left" w:pos="3664"/>
-          <w:tab w:val="left" w:pos="4580"/>
-          <w:tab w:val="left" w:pos="5496"/>
-          <w:tab w:val="left" w:pos="6412"/>
-          <w:tab w:val="left" w:pos="7328"/>
-          <w:tab w:val="left" w:pos="8244"/>
-          <w:tab w:val="left" w:pos="9160"/>
-          <w:tab w:val="left" w:pos="10076"/>
-          <w:tab w:val="left" w:pos="10992"/>
-          <w:tab w:val="left" w:pos="11908"/>
-          <w:tab w:val="left" w:pos="12824"/>
-          <w:tab w:val="left" w:pos="13740"/>
-          <w:tab w:val="left" w:pos="14656"/>
-        </w:tabs>
-        <w:spacing w:after="0" w:line="240" w:lineRule="auto"/>
-        <w:rPr>
-          <w:rFonts w:ascii="var(--font-mono)" w:eastAsia="Times New Roman" w:hAnsi="var(--font-mono)" w:cs="Courier New"/>
-          <w:color w:val="EAECF0"/>
-          <w:sz w:val="20"/>
-          <w:szCs w:val="20"/>
-        </w:rPr>
-      </w:pPr>
-      <w:r>
-        <w:rPr>
-          <w:rFonts w:ascii="var(--font-mono)" w:eastAsia="Times New Roman" w:hAnsi="var(--font-mono)" w:cs="Courier New"/>
-          <w:color w:val="EAECF0"/>
-          <w:sz w:val="20"/>
-          <w:szCs w:val="20"/>
-        </w:rPr>
-        <w:t xml:space="preserve">  "</w:t>
-      </w:r>
-      <w:proofErr w:type="spellStart"/>
-      <w:r>
-        <w:rPr>
-          <w:rFonts w:ascii="var(--font-mono)" w:eastAsia="Times New Roman" w:hAnsi="var(--font-mono)" w:cs="Courier New"/>
-          <w:color w:val="EAECF0"/>
-          <w:sz w:val="20"/>
-          <w:szCs w:val="20"/>
-        </w:rPr>
-        <w:t>revenue_today</w:t>
-      </w:r>
-      <w:proofErr w:type="spellEnd"/>
-      <w:r>
-        <w:rPr>
-          <w:rFonts w:ascii="var(--font-mono)" w:eastAsia="Times New Roman" w:hAnsi="var(--font-mono)" w:cs="Courier New"/>
-          <w:color w:val="EAECF0"/>
-          <w:sz w:val="20"/>
-          <w:szCs w:val="20"/>
-        </w:rPr>
-        <w:t>": 18450.00,</w:t>
-      </w:r>
-    </w:p>
-    <w:p>
-      <w:pPr>
-        <w:tabs>
-          <w:tab w:val="left" w:pos="916"/>
-          <w:tab w:val="left" w:pos="1832"/>
-          <w:tab w:val="left" w:pos="2748"/>
-          <w:tab w:val="left" w:pos="3664"/>
-          <w:tab w:val="left" w:pos="4580"/>
-          <w:tab w:val="left" w:pos="5496"/>
-          <w:tab w:val="left" w:pos="6412"/>
-          <w:tab w:val="left" w:pos="7328"/>
-          <w:tab w:val="left" w:pos="8244"/>
-          <w:tab w:val="left" w:pos="9160"/>
-          <w:tab w:val="left" w:pos="10076"/>
-          <w:tab w:val="left" w:pos="10992"/>
-          <w:tab w:val="left" w:pos="11908"/>
-          <w:tab w:val="left" w:pos="12824"/>
-          <w:tab w:val="left" w:pos="13740"/>
-          <w:tab w:val="left" w:pos="14656"/>
-        </w:tabs>
-        <w:spacing w:after="0" w:line="240" w:lineRule="auto"/>
-        <w:rPr>
-          <w:rFonts w:ascii="var(--font-mono)" w:eastAsia="Times New Roman" w:hAnsi="var(--font-mono)" w:cs="Courier New"/>
-          <w:color w:val="EAECF0"/>
-          <w:sz w:val="20"/>
-          <w:szCs w:val="20"/>
-        </w:rPr>
-      </w:pPr>
-      <w:r>
-        <w:rPr>
-          <w:rFonts w:ascii="var(--font-mono)" w:eastAsia="Times New Roman" w:hAnsi="var(--font-mono)" w:cs="Courier New"/>
-          <w:color w:val="EAECF0"/>
-          <w:sz w:val="20"/>
-          <w:szCs w:val="20"/>
-        </w:rPr>
-        <w:t xml:space="preserve">  "</w:t>
-      </w:r>
-      <w:proofErr w:type="spellStart"/>
-      <w:r>
-        <w:rPr>
-          <w:rFonts w:ascii="var(--font-mono)" w:eastAsia="Times New Roman" w:hAnsi="var(--font-mono)" w:cs="Courier New"/>
-          <w:color w:val="EAECF0"/>
-          <w:sz w:val="20"/>
-          <w:szCs w:val="20"/>
-        </w:rPr>
-        <w:t>pending_orders</w:t>
-      </w:r>
-      <w:proofErr w:type="spellEnd"/>
-      <w:r>
-        <w:rPr>
-          <w:rFonts w:ascii="var(--font-mono)" w:eastAsia="Times New Roman" w:hAnsi="var(--font-mono)" w:cs="Courier New"/>
-          <w:color w:val="EAECF0"/>
-          <w:sz w:val="20"/>
-          <w:szCs w:val="20"/>
-        </w:rPr>
-        <w:t>": 5,</w:t>
-      </w:r>
-    </w:p>
-    <w:p>
-      <w:pPr>
-        <w:tabs>
-          <w:tab w:val="left" w:pos="916"/>
-          <w:tab w:val="left" w:pos="1832"/>
-          <w:tab w:val="left" w:pos="2748"/>
-          <w:tab w:val="left" w:pos="3664"/>
-          <w:tab w:val="left" w:pos="4580"/>
-          <w:tab w:val="left" w:pos="5496"/>
-          <w:tab w:val="left" w:pos="6412"/>
-          <w:tab w:val="left" w:pos="7328"/>
-          <w:tab w:val="left" w:pos="8244"/>
-          <w:tab w:val="left" w:pos="9160"/>
-          <w:tab w:val="left" w:pos="10076"/>
-          <w:tab w:val="left" w:pos="10992"/>
-          <w:tab w:val="left" w:pos="11908"/>
-          <w:tab w:val="left" w:pos="12824"/>
-          <w:tab w:val="left" w:pos="13740"/>
-          <w:tab w:val="left" w:pos="14656"/>
-        </w:tabs>
-        <w:spacing w:after="0" w:line="240" w:lineRule="auto"/>
-        <w:rPr>
-          <w:rFonts w:ascii="var(--font-mono)" w:eastAsia="Times New Roman" w:hAnsi="var(--font-mono)" w:cs="Courier New"/>
-          <w:color w:val="EAECF0"/>
-          <w:sz w:val="20"/>
-          <w:szCs w:val="20"/>
-        </w:rPr>
-      </w:pPr>
-      <w:r>
-        <w:rPr>
-          <w:rFonts w:ascii="var(--font-mono)" w:eastAsia="Times New Roman" w:hAnsi="var(--font-mono)" w:cs="Courier New"/>
-          <w:color w:val="EAECF0"/>
-          <w:sz w:val="20"/>
-          <w:szCs w:val="20"/>
-        </w:rPr>
-        <w:t xml:space="preserve">  "</w:t>
-      </w:r>
-      <w:proofErr w:type="spellStart"/>
-      <w:r>
-        <w:rPr>
-          <w:rFonts w:ascii="var(--font-mono)" w:eastAsia="Times New Roman" w:hAnsi="var(--font-mono)" w:cs="Courier New"/>
-          <w:color w:val="EAECF0"/>
-          <w:sz w:val="20"/>
-          <w:szCs w:val="20"/>
-        </w:rPr>
-        <w:t>total_users</w:t>
-      </w:r>
-      <w:proofErr w:type="spellEnd"/>
-      <w:r>
-        <w:rPr>
-          <w:rFonts w:ascii="var(--font-mono)" w:eastAsia="Times New Roman" w:hAnsi="var(--font-mono)" w:cs="Courier New"/>
-          <w:color w:val="EAECF0"/>
-          <w:sz w:val="20"/>
-          <w:szCs w:val="20"/>
-        </w:rPr>
-        <w:t>": 312,</w:t>
-      </w:r>
-    </w:p>
-    <w:p>
-      <w:pPr>
-        <w:tabs>
-          <w:tab w:val="left" w:pos="916"/>
-          <w:tab w:val="left" w:pos="1832"/>
-          <w:tab w:val="left" w:pos="2748"/>
-          <w:tab w:val="left" w:pos="3664"/>
-          <w:tab w:val="left" w:pos="4580"/>
-          <w:tab w:val="left" w:pos="5496"/>
-          <w:tab w:val="left" w:pos="6412"/>
-          <w:tab w:val="left" w:pos="7328"/>
-          <w:tab w:val="left" w:pos="8244"/>
-          <w:tab w:val="left" w:pos="9160"/>
-          <w:tab w:val="left" w:pos="10076"/>
-          <w:tab w:val="left" w:pos="10992"/>
-          <w:tab w:val="left" w:pos="11908"/>
-          <w:tab w:val="left" w:pos="12824"/>
-          <w:tab w:val="left" w:pos="13740"/>
-          <w:tab w:val="left" w:pos="14656"/>
-        </w:tabs>
-        <w:spacing w:after="0" w:line="240" w:lineRule="auto"/>
-        <w:rPr>
-          <w:rFonts w:ascii="var(--font-mono)" w:eastAsia="Times New Roman" w:hAnsi="var(--font-mono)" w:cs="Courier New"/>
-          <w:color w:val="EAECF0"/>
-          <w:sz w:val="20"/>
-          <w:szCs w:val="20"/>
-        </w:rPr>
-      </w:pPr>
-      <w:r>
-        <w:rPr>
-          <w:rFonts w:ascii="var(--font-mono)" w:eastAsia="Times New Roman" w:hAnsi="var(--font-mono)" w:cs="Courier New"/>
-          <w:color w:val="EAECF0"/>
-          <w:sz w:val="20"/>
-          <w:szCs w:val="20"/>
-        </w:rPr>
-        <w:t xml:space="preserve">  "</w:t>
-      </w:r>
-      <w:proofErr w:type="spellStart"/>
-      <w:r>
-        <w:rPr>
-          <w:rFonts w:ascii="var(--font-mono)" w:eastAsia="Times New Roman" w:hAnsi="var(--font-mono)" w:cs="Courier New"/>
-          <w:color w:val="EAECF0"/>
-          <w:sz w:val="20"/>
-          <w:szCs w:val="20"/>
-        </w:rPr>
-        <w:t>total_orders_all_time</w:t>
-      </w:r>
-      <w:proofErr w:type="spellEnd"/>
-      <w:r>
-        <w:rPr>
-          <w:rFonts w:ascii="var(--font-mono)" w:eastAsia="Times New Roman" w:hAnsi="var(--font-mono)" w:cs="Courier New"/>
-          <w:color w:val="EAECF0"/>
-          <w:sz w:val="20"/>
-          <w:szCs w:val="20"/>
-        </w:rPr>
-        <w:t>": 1894,</w:t>
-      </w:r>
-    </w:p>
-    <w:p>
-      <w:pPr>
-        <w:tabs>
-          <w:tab w:val="left" w:pos="916"/>
-          <w:tab w:val="left" w:pos="1832"/>
-          <w:tab w:val="left" w:pos="2748"/>
-          <w:tab w:val="left" w:pos="3664"/>
-          <w:tab w:val="left" w:pos="4580"/>
-          <w:tab w:val="left" w:pos="5496"/>
-          <w:tab w:val="left" w:pos="6412"/>
-          <w:tab w:val="left" w:pos="7328"/>
-          <w:tab w:val="left" w:pos="8244"/>
-          <w:tab w:val="left" w:pos="9160"/>
-          <w:tab w:val="left" w:pos="10076"/>
-          <w:tab w:val="left" w:pos="10992"/>
-          <w:tab w:val="left" w:pos="11908"/>
-          <w:tab w:val="left" w:pos="12824"/>
-          <w:tab w:val="left" w:pos="13740"/>
-          <w:tab w:val="left" w:pos="14656"/>
-        </w:tabs>
-        <w:spacing w:after="0" w:line="240" w:lineRule="auto"/>
-        <w:rPr>
-          <w:rFonts w:ascii="var(--font-mono)" w:eastAsia="Times New Roman" w:hAnsi="var(--font-mono)" w:cs="Courier New"/>
-          <w:color w:val="EAECF0"/>
-          <w:sz w:val="20"/>
-          <w:szCs w:val="20"/>
-        </w:rPr>
-      </w:pPr>
-      <w:r>
-        <w:rPr>
-          <w:rFonts w:ascii="var(--font-mono)" w:eastAsia="Times New Roman" w:hAnsi="var(--font-mono)" w:cs="Courier New"/>
-          <w:color w:val="EAECF0"/>
-          <w:sz w:val="20"/>
-          <w:szCs w:val="20"/>
-        </w:rPr>
-        <w:t xml:space="preserve">  "</w:t>
-      </w:r>
-      <w:proofErr w:type="spellStart"/>
-      <w:r>
-        <w:rPr>
-          <w:rFonts w:ascii="var(--font-mono)" w:eastAsia="Times New Roman" w:hAnsi="var(--font-mono)" w:cs="Courier New"/>
-          <w:color w:val="EAECF0"/>
-          <w:sz w:val="20"/>
-          <w:szCs w:val="20"/>
-        </w:rPr>
-        <w:t>total_revenue_all_time</w:t>
-      </w:r>
-      <w:proofErr w:type="spellEnd"/>
-      <w:r>
-        <w:rPr>
-          <w:rFonts w:ascii="var(--font-mono)" w:eastAsia="Times New Roman" w:hAnsi="var(--font-mono)" w:cs="Courier New"/>
-          <w:color w:val="EAECF0"/>
-          <w:sz w:val="20"/>
-          <w:szCs w:val="20"/>
-        </w:rPr>
-        <w:t>": 945000.00</w:t>
-      </w:r>
-    </w:p>
-    <w:p>
-      <w:pPr>
-        <w:tabs>
-          <w:tab w:val="left" w:pos="916"/>
-          <w:tab w:val="left" w:pos="1832"/>
-          <w:tab w:val="left" w:pos="2748"/>
-          <w:tab w:val="left" w:pos="3664"/>
-          <w:tab w:val="left" w:pos="4580"/>
-          <w:tab w:val="left" w:pos="5496"/>
-          <w:tab w:val="left" w:pos="6412"/>
-          <w:tab w:val="left" w:pos="7328"/>
-          <w:tab w:val="left" w:pos="8244"/>
-          <w:tab w:val="left" w:pos="9160"/>
-          <w:tab w:val="left" w:pos="10076"/>
-          <w:tab w:val="left" w:pos="10992"/>
-          <w:tab w:val="left" w:pos="11908"/>
-          <w:tab w:val="left" w:pos="12824"/>
-          <w:tab w:val="left" w:pos="13740"/>
-          <w:tab w:val="left" w:pos="14656"/>
-        </w:tabs>
-        <w:spacing w:after="0" w:line="240" w:lineRule="auto"/>
-        <w:rPr>
-          <w:rFonts w:ascii="var(--font-mono)" w:eastAsia="Times New Roman" w:hAnsi="var(--font-mono)" w:cs="Courier New"/>
-          <w:color w:val="EAECF0"/>
-          <w:sz w:val="20"/>
-          <w:szCs w:val="20"/>
-        </w:rPr>
-      </w:pPr>
-      <w:r>
-        <w:rPr>
-          <w:rFonts w:ascii="var(--font-mono)" w:eastAsia="Times New Roman" w:hAnsi="var(--font-mono)" w:cs="Courier New"/>
-          <w:color w:val="EAECF0"/>
-          <w:sz w:val="20"/>
-          <w:szCs w:val="20"/>
-        </w:rPr>
-        <w:t>}</w:t>
-      </w:r>
-    </w:p>
-    <w:p>
-      <w:pPr>
-        <w:spacing w:before="100" w:beforeAutospacing="1" w:after="100" w:afterAutospacing="1" w:line="240" w:lineRule="auto"/>
-        <w:rPr>
-          <w:rFonts w:ascii="Times New Roman" w:eastAsia="Times New Roman" w:hAnsi="Times New Roman" w:cs="Times New Roman"/>
-          <w:sz w:val="24"/>
-          <w:szCs w:val="24"/>
-        </w:rPr>
-      </w:pPr>
-      <w:r>
-        <w:rPr>
-          <w:rFonts w:ascii="Times New Roman" w:eastAsia="Times New Roman" w:hAnsi="Times New Roman" w:cs="Times New Roman"/>
-          <w:sz w:val="24"/>
-          <w:szCs w:val="24"/>
-        </w:rPr>
-        <w:t xml:space="preserve">This is a single endpoint but does </w:t>
-      </w:r>
-      <w:r>
-        <w:rPr>
-          <w:rFonts w:ascii="Times New Roman" w:eastAsia="Times New Roman" w:hAnsi="Times New Roman" w:cs="Times New Roman"/>
-          <w:b/>
-          <w:bCs/>
-          <w:sz w:val="24"/>
-          <w:szCs w:val="24"/>
-        </w:rPr>
-        <w:t>multiple DB aggregation queries</w:t>
-      </w:r>
-      <w:r>
-        <w:rPr>
-          <w:rFonts w:ascii="Times New Roman" w:eastAsia="Times New Roman" w:hAnsi="Times New Roman" w:cs="Times New Roman"/>
-          <w:sz w:val="24"/>
-          <w:szCs w:val="24"/>
-        </w:rPr>
-        <w:t xml:space="preserve"> behind the scenes using </w:t>
-      </w:r>
-      <w:proofErr w:type="spellStart"/>
-      <w:r>
-        <w:rPr>
-          <w:rFonts w:ascii="Times New Roman" w:eastAsia="Times New Roman" w:hAnsi="Times New Roman" w:cs="Times New Roman"/>
-          <w:sz w:val="24"/>
-          <w:szCs w:val="24"/>
-        </w:rPr>
-        <w:t>SQLAlchemy's</w:t>
-      </w:r>
-      <w:proofErr w:type="spellEnd"/>
-      <w:r>
-        <w:rPr>
-          <w:rFonts w:ascii="Times New Roman" w:eastAsia="Times New Roman" w:hAnsi="Times New Roman" w:cs="Times New Roman"/>
-          <w:sz w:val="24"/>
-          <w:szCs w:val="24"/>
-        </w:rPr>
-        <w:t xml:space="preserve"> </w:t>
-      </w:r>
-      <w:proofErr w:type="spellStart"/>
-      <w:proofErr w:type="gramStart"/>
-      <w:r>
-        <w:rPr>
-          <w:rFonts w:ascii="Courier New" w:eastAsia="Times New Roman" w:hAnsi="Courier New" w:cs="Courier New"/>
-          <w:sz w:val="20"/>
-          <w:szCs w:val="20"/>
-        </w:rPr>
-        <w:t>func.count</w:t>
-      </w:r>
-      <w:proofErr w:type="spellEnd"/>
-      <w:r>
-        <w:rPr>
-          <w:rFonts w:ascii="Courier New" w:eastAsia="Times New Roman" w:hAnsi="Courier New" w:cs="Courier New"/>
-          <w:sz w:val="20"/>
-          <w:szCs w:val="20"/>
-        </w:rPr>
-        <w:t>(</w:t>
-      </w:r>
-      <w:proofErr w:type="gramEnd"/>
-      <w:r>
-        <w:rPr>
-          <w:rFonts w:ascii="Courier New" w:eastAsia="Times New Roman" w:hAnsi="Courier New" w:cs="Courier New"/>
-          <w:sz w:val="20"/>
-          <w:szCs w:val="20"/>
-        </w:rPr>
-        <w:t>)</w:t>
-      </w:r>
-      <w:r>
-        <w:rPr>
-          <w:rFonts w:ascii="Times New Roman" w:eastAsia="Times New Roman" w:hAnsi="Times New Roman" w:cs="Times New Roman"/>
-          <w:sz w:val="24"/>
-          <w:szCs w:val="24"/>
-        </w:rPr>
-        <w:t xml:space="preserve"> and </w:t>
-      </w:r>
-      <w:proofErr w:type="spellStart"/>
-      <w:r>
-        <w:rPr>
-          <w:rFonts w:ascii="Courier New" w:eastAsia="Times New Roman" w:hAnsi="Courier New" w:cs="Courier New"/>
-          <w:sz w:val="20"/>
-          <w:szCs w:val="20"/>
-        </w:rPr>
-        <w:t>func.sum</w:t>
-      </w:r>
-      <w:proofErr w:type="spellEnd"/>
-      <w:r>
-        <w:rPr>
-          <w:rFonts w:ascii="Courier New" w:eastAsia="Times New Roman" w:hAnsi="Courier New" w:cs="Courier New"/>
-          <w:sz w:val="20"/>
-          <w:szCs w:val="20"/>
-        </w:rPr>
-        <w:t>()</w:t>
-      </w:r>
-      <w:r>
-        <w:rPr>
-          <w:rFonts w:ascii="Times New Roman" w:eastAsia="Times New Roman" w:hAnsi="Times New Roman" w:cs="Times New Roman"/>
-          <w:sz w:val="24"/>
-          <w:szCs w:val="24"/>
-        </w:rPr>
-        <w:t>.</w:t>
-      </w:r>
-    </w:p>
-    <w:p>
-      <w:pPr>
-        <w:spacing w:after="0" w:line="240" w:lineRule="auto"/>
-        <w:rPr>
-          <w:rFonts w:ascii="Times New Roman" w:eastAsia="Times New Roman" w:hAnsi="Times New Roman" w:cs="Times New Roman"/>
-          <w:sz w:val="24"/>
-          <w:szCs w:val="24"/>
-        </w:rPr>
-      </w:pPr>
-      <w:r>
-        <w:rPr>
-          <w:rFonts w:ascii="Times New Roman" w:eastAsia="Times New Roman" w:hAnsi="Times New Roman" w:cs="Times New Roman"/>
-          <w:sz w:val="24"/>
-          <w:szCs w:val="24"/>
-        </w:rPr>
-        <w:pict w14:anchorId="46AEFC7A">
-          <v:rect id="_x0000_i1026" style="width:0;height:1.5pt" o:hralign="center" o:hrstd="t" o:hr="t" fillcolor="#a0a0a0" stroked="f"/>
-        </w:pict>
-      </w:r>
-    </w:p>
-    <w:p>
-      <w:pPr>
-        <w:spacing w:before="100" w:beforeAutospacing="1" w:after="100" w:afterAutospacing="1" w:line="240" w:lineRule="auto"/>
-        <w:outlineLvl w:val="2"/>
-        <w:rPr>
-          <w:rFonts w:ascii="Times New Roman" w:eastAsia="Times New Roman" w:hAnsi="Times New Roman" w:cs="Times New Roman"/>
-          <w:b/>
-          <w:bCs/>
-          <w:sz w:val="27"/>
-          <w:szCs w:val="27"/>
-        </w:rPr>
-      </w:pPr>
-      <w:r>
-        <w:rPr>
-          <w:rFonts w:ascii="Times New Roman" w:eastAsia="Times New Roman" w:hAnsi="Times New Roman" w:cs="Times New Roman"/>
-          <w:b/>
-          <w:bCs/>
-          <w:sz w:val="27"/>
-          <w:szCs w:val="27"/>
-        </w:rPr>
-        <w:t>⚙️ Business Logic Rules</w:t>
-      </w:r>
-      <w:bookmarkStart w:id="0" w:name="_GoBack"/>
-      <w:bookmarkEnd w:id="0"/>
-    </w:p>
-    <w:p>
-      <w:pPr>
-        <w:numPr>
-          <w:ilvl w:val="0"/>
-          <w:numId w:val="25"/>
-        </w:numPr>
-        <w:spacing w:before="100" w:beforeAutospacing="1" w:after="100" w:afterAutospacing="1" w:line="240" w:lineRule="auto"/>
-        <w:rPr>
-          <w:rFonts w:ascii="Times New Roman" w:eastAsia="Times New Roman" w:hAnsi="Times New Roman" w:cs="Times New Roman"/>
-          <w:sz w:val="24"/>
-          <w:szCs w:val="24"/>
-        </w:rPr>
-      </w:pPr>
-      <w:r>
-        <w:rPr>
-          <w:rFonts w:ascii="Times New Roman" w:eastAsia="Times New Roman" w:hAnsi="Times New Roman" w:cs="Times New Roman"/>
-          <w:sz w:val="24"/>
-          <w:szCs w:val="24"/>
-        </w:rPr>
-        <w:t xml:space="preserve">Admin </w:t>
-      </w:r>
-      <w:r>
-        <w:rPr>
-          <w:rFonts w:ascii="Times New Roman" w:eastAsia="Times New Roman" w:hAnsi="Times New Roman" w:cs="Times New Roman"/>
-          <w:b/>
-          <w:bCs/>
-          <w:sz w:val="24"/>
-          <w:szCs w:val="24"/>
-        </w:rPr>
-        <w:t>cannot deactivate another admin</w:t>
-      </w:r>
-      <w:r>
-        <w:rPr>
-          <w:rFonts w:ascii="Times New Roman" w:eastAsia="Times New Roman" w:hAnsi="Times New Roman" w:cs="Times New Roman"/>
-          <w:sz w:val="24"/>
-          <w:szCs w:val="24"/>
-        </w:rPr>
-        <w:t xml:space="preserve"> — protect against this</w:t>
-      </w:r>
-    </w:p>
-    <w:p>
-      <w:pPr>
-        <w:numPr>
-          <w:ilvl w:val="0"/>
-          <w:numId w:val="25"/>
-        </w:numPr>
-        <w:spacing w:before="100" w:beforeAutospacing="1" w:after="100" w:afterAutospacing="1" w:line="240" w:lineRule="auto"/>
-        <w:rPr>
-          <w:rFonts w:ascii="Times New Roman" w:eastAsia="Times New Roman" w:hAnsi="Times New Roman" w:cs="Times New Roman"/>
-          <w:sz w:val="24"/>
-          <w:szCs w:val="24"/>
-        </w:rPr>
-      </w:pPr>
-      <w:r>
-        <w:rPr>
-          <w:rFonts w:ascii="Times New Roman" w:eastAsia="Times New Roman" w:hAnsi="Times New Roman" w:cs="Times New Roman"/>
-          <w:sz w:val="24"/>
-          <w:szCs w:val="24"/>
-        </w:rPr>
-        <w:t>Admin cannot change their own role — prevents accidental self-lockout</w:t>
-      </w:r>
-    </w:p>
-    <w:p>
-      <w:pPr>
-        <w:numPr>
-          <w:ilvl w:val="0"/>
-          <w:numId w:val="25"/>
-        </w:numPr>
-        <w:spacing w:before="100" w:beforeAutospacing="1" w:after="100" w:afterAutospacing="1" w:line="240" w:lineRule="auto"/>
-        <w:rPr>
-          <w:rFonts w:ascii="Times New Roman" w:eastAsia="Times New Roman" w:hAnsi="Times New Roman" w:cs="Times New Roman"/>
-          <w:sz w:val="24"/>
-          <w:szCs w:val="24"/>
-        </w:rPr>
-      </w:pPr>
-      <w:r>
-        <w:rPr>
-          <w:rFonts w:ascii="Times New Roman" w:eastAsia="Times New Roman" w:hAnsi="Times New Roman" w:cs="Times New Roman"/>
-          <w:sz w:val="24"/>
-          <w:szCs w:val="24"/>
-        </w:rPr>
-        <w:t xml:space="preserve">The orders list for admin should support </w:t>
-      </w:r>
-      <w:r>
-        <w:rPr>
-          <w:rFonts w:ascii="Times New Roman" w:eastAsia="Times New Roman" w:hAnsi="Times New Roman" w:cs="Times New Roman"/>
-          <w:b/>
-          <w:bCs/>
-          <w:sz w:val="24"/>
-          <w:szCs w:val="24"/>
-        </w:rPr>
-        <w:t>filtering by status</w:t>
-      </w:r>
-      <w:r>
-        <w:rPr>
-          <w:rFonts w:ascii="Times New Roman" w:eastAsia="Times New Roman" w:hAnsi="Times New Roman" w:cs="Times New Roman"/>
-          <w:sz w:val="24"/>
-          <w:szCs w:val="24"/>
-        </w:rPr>
-        <w:t xml:space="preserve"> — </w:t>
-      </w:r>
-      <w:r>
-        <w:rPr>
-          <w:rFonts w:ascii="Courier New" w:eastAsia="Times New Roman" w:hAnsi="Courier New" w:cs="Courier New"/>
-          <w:sz w:val="20"/>
-          <w:szCs w:val="20"/>
-        </w:rPr>
-        <w:t>?status=pending</w:t>
-      </w:r>
-    </w:p>
-    <w:p>
-      <w:pPr>
-        <w:numPr>
-          <w:ilvl w:val="0"/>
-          <w:numId w:val="25"/>
-        </w:numPr>
-        <w:spacing w:before="100" w:beforeAutospacing="1" w:after="100" w:afterAutospacing="1" w:line="240" w:lineRule="auto"/>
-        <w:rPr>
-          <w:rFonts w:ascii="Times New Roman" w:eastAsia="Times New Roman" w:hAnsi="Times New Roman" w:cs="Times New Roman"/>
-          <w:sz w:val="24"/>
-          <w:szCs w:val="24"/>
-        </w:rPr>
-      </w:pPr>
-      <w:r>
-        <w:rPr>
-          <w:rFonts w:ascii="Times New Roman" w:eastAsia="Times New Roman" w:hAnsi="Times New Roman" w:cs="Times New Roman"/>
-          <w:sz w:val="24"/>
-          <w:szCs w:val="24"/>
-        </w:rPr>
-        <w:t xml:space="preserve">Deactivating a user should </w:t>
-      </w:r>
-      <w:r>
-        <w:rPr>
-          <w:rFonts w:ascii="Times New Roman" w:eastAsia="Times New Roman" w:hAnsi="Times New Roman" w:cs="Times New Roman"/>
-          <w:b/>
-          <w:bCs/>
-          <w:sz w:val="24"/>
-          <w:szCs w:val="24"/>
-        </w:rPr>
-        <w:t>not cancel their active orders</w:t>
-      </w:r>
-      <w:r>
-        <w:rPr>
-          <w:rFonts w:ascii="Times New Roman" w:eastAsia="Times New Roman" w:hAnsi="Times New Roman" w:cs="Times New Roman"/>
-          <w:sz w:val="24"/>
-          <w:szCs w:val="24"/>
-        </w:rPr>
-        <w:t xml:space="preserve"> — handle separately</w:t>
-      </w:r>
-    </w:p>
-    <w:p>
-      <w:pPr>
-        <w:numPr>
-          <w:ilvl w:val="0"/>
-          <w:numId w:val="25"/>
-        </w:numPr>
-        <w:spacing w:before="100" w:beforeAutospacing="1" w:after="100" w:afterAutospacing="1" w:line="240" w:lineRule="auto"/>
-        <w:rPr>
-          <w:rFonts w:ascii="Times New Roman" w:eastAsia="Times New Roman" w:hAnsi="Times New Roman" w:cs="Times New Roman"/>
-          <w:sz w:val="24"/>
-          <w:szCs w:val="24"/>
-        </w:rPr>
-      </w:pPr>
-      <w:r>
-        <w:rPr>
-          <w:rFonts w:ascii="Times New Roman" w:eastAsia="Times New Roman" w:hAnsi="Times New Roman" w:cs="Times New Roman"/>
-          <w:sz w:val="24"/>
-          <w:szCs w:val="24"/>
-        </w:rPr>
-        <w:t xml:space="preserve">Keep all admin routes under </w:t>
-      </w:r>
-      <w:r>
-        <w:rPr>
-          <w:rFonts w:ascii="Courier New" w:eastAsia="Times New Roman" w:hAnsi="Courier New" w:cs="Courier New"/>
-          <w:sz w:val="20"/>
-          <w:szCs w:val="20"/>
-        </w:rPr>
-        <w:t>/</w:t>
-      </w:r>
-      <w:proofErr w:type="spellStart"/>
-      <w:r>
-        <w:rPr>
-          <w:rFonts w:ascii="Courier New" w:eastAsia="Times New Roman" w:hAnsi="Courier New" w:cs="Courier New"/>
-          <w:sz w:val="20"/>
-          <w:szCs w:val="20"/>
-        </w:rPr>
-        <w:t>api</w:t>
-      </w:r>
-      <w:proofErr w:type="spellEnd"/>
-      <w:r>
-        <w:rPr>
-          <w:rFonts w:ascii="Courier New" w:eastAsia="Times New Roman" w:hAnsi="Courier New" w:cs="Courier New"/>
-          <w:sz w:val="20"/>
-          <w:szCs w:val="20"/>
-        </w:rPr>
-        <w:t>/v1/admin/</w:t>
-      </w:r>
-      <w:r>
-        <w:rPr>
-          <w:rFonts w:ascii="Times New Roman" w:eastAsia="Times New Roman" w:hAnsi="Times New Roman" w:cs="Times New Roman"/>
-          <w:sz w:val="24"/>
-          <w:szCs w:val="24"/>
-        </w:rPr>
-        <w:t xml:space="preserve"> prefix and protect with </w:t>
-      </w:r>
-      <w:proofErr w:type="spellStart"/>
-      <w:r>
-        <w:rPr>
-          <w:rFonts w:ascii="Courier New" w:eastAsia="Times New Roman" w:hAnsi="Courier New" w:cs="Courier New"/>
-          <w:sz w:val="20"/>
-          <w:szCs w:val="20"/>
-        </w:rPr>
-        <w:t>require_admin</w:t>
-      </w:r>
-      <w:proofErr w:type="spellEnd"/>
-      <w:r>
-        <w:rPr>
-          <w:rFonts w:ascii="Times New Roman" w:eastAsia="Times New Roman" w:hAnsi="Times New Roman" w:cs="Times New Roman"/>
-          <w:sz w:val="24"/>
-          <w:szCs w:val="24"/>
-        </w:rPr>
-        <w:t xml:space="preserve"> dependency</w:t>
-      </w:r>
-    </w:p>
+    <w:p/>
     <w:sectPr>
       <w:pgSz w:w="12240" w:h="15840"/>
       <w:pgMar w:top="1440" w:right="1440" w:bottom="1440" w:left="1440" w:header="720" w:footer="720" w:gutter="0"/>
@@ -1941,8 +14,8 @@
 </file>
 
 <file path=word/numbering.xml><?xml version="1.0" encoding="utf-8"?>
-<w:numbering xmlns:wpc="http://schemas.microsoft.com/office/word/2010/wordprocessingCanvas" xmlns:mc="http://schemas.openxmlformats.org/markup-compatibility/2006" xmlns:o="urn:schemas-microsoft-com:office:office" xmlns:r="http://schemas.openxmlformats.org/officeDocument/2006/relationships" xmlns:m="http://schemas.openxmlformats.org/officeDocument/2006/math" xmlns:v="urn:schemas-microsoft-com:vml" xmlns:wp14="http://schemas.microsoft.com/office/word/2010/wordprocessingDrawing" xmlns:wp="http://schemas.openxmlformats.org/drawingml/2006/wordprocessingDrawing" xmlns:w10="urn:schemas-microsoft-com:office:word" xmlns:w="http://schemas.openxmlformats.org/wordprocessingml/2006/main" xmlns:w14="http://schemas.microsoft.com/office/word/2010/wordml" xmlns:wpg="http://schemas.microsoft.com/office/word/2010/wordprocessingGroup" xmlns:wpi="http://schemas.microsoft.com/office/word/2010/wordprocessingInk" xmlns:wne="http://schemas.microsoft.com/office/word/2006/wordml" xmlns:wps="http://schemas.microsoft.com/office/word/2010/wordprocessingShape" mc:Ignorable="w14 wp14">
-  <w:abstractNum w:abstractNumId="0">
+<w:numbering xmlns:wpc="http://schemas.microsoft.com/office/word/2010/wordprocessingCanvas" xmlns:cx="http://schemas.microsoft.com/office/drawing/2014/chartex" xmlns:cx1="http://schemas.microsoft.com/office/drawing/2015/9/8/chartex" xmlns:cx2="http://schemas.microsoft.com/office/drawing/2015/10/21/chartex" xmlns:cx3="http://schemas.microsoft.com/office/drawing/2016/5/9/chartex" xmlns:cx4="http://schemas.microsoft.com/office/drawing/2016/5/10/chartex" xmlns:cx5="http://schemas.microsoft.com/office/drawing/2016/5/11/chartex" xmlns:cx6="http://schemas.microsoft.com/office/drawing/2016/5/12/chartex" xmlns:cx7="http://schemas.microsoft.com/office/drawing/2016/5/13/chartex" xmlns:cx8="http://schemas.microsoft.com/office/drawing/2016/5/14/chartex" xmlns:mc="http://schemas.openxmlformats.org/markup-compatibility/2006" xmlns:aink="http://schemas.microsoft.com/office/drawing/2016/ink" xmlns:am3d="http://schemas.microsoft.com/office/drawing/2017/model3d" xmlns:o="urn:schemas-microsoft-com:office:office" xmlns:oel="http://schemas.microsoft.com/office/2019/extlst" xmlns:r="http://schemas.openxmlformats.org/officeDocument/2006/relationships" xmlns:m="http://schemas.openxmlformats.org/officeDocument/2006/math" xmlns:v="urn:schemas-microsoft-com:vml" xmlns:wp14="http://schemas.microsoft.com/office/word/2010/wordprocessingDrawing" xmlns:wp="http://schemas.openxmlformats.org/drawingml/2006/wordprocessingDrawing" xmlns:w10="urn:schemas-microsoft-com:office:word" xmlns:w="http://schemas.openxmlformats.org/wordprocessingml/2006/main" xmlns:w14="http://schemas.microsoft.com/office/word/2010/wordml" xmlns:w15="http://schemas.microsoft.com/office/word/2012/wordml" xmlns:w16cex="http://schemas.microsoft.com/office/word/2018/wordml/cex" xmlns:w16cid="http://schemas.microsoft.com/office/word/2016/wordml/cid" xmlns:w16="http://schemas.microsoft.com/office/word/2018/wordml" xmlns:w16du="http://schemas.microsoft.com/office/word/2023/wordml/word16du" xmlns:w16sdtdh="http://schemas.microsoft.com/office/word/2020/wordml/sdtdatahash" xmlns:w16sdtfl="http://schemas.microsoft.com/office/word/2024/wordml/sdtformatlock" xmlns:w16se="http://schemas.microsoft.com/office/word/2015/wordml/symex" xmlns:wpg="http://schemas.microsoft.com/office/word/2010/wordprocessingGroup" xmlns:wpi="http://schemas.microsoft.com/office/word/2010/wordprocessingInk" xmlns:wne="http://schemas.microsoft.com/office/word/2006/wordml" xmlns:wps="http://schemas.microsoft.com/office/word/2010/wordprocessingShape" mc:Ignorable="w14 w15 w16se w16cid w16 w16cex w16sdtdh w16sdtfl w16du wp14">
+  <w:abstractNum w:abstractNumId="0" w15:restartNumberingAfterBreak="0">
     <w:nsid w:val="0A50570B"/>
     <w:multiLevelType w:val="multilevel"/>
     <w:tmpl w:val="EF566AD4"/>
@@ -2091,7 +164,7 @@
       </w:rPr>
     </w:lvl>
   </w:abstractNum>
-  <w:abstractNum w:abstractNumId="1">
+  <w:abstractNum w:abstractNumId="1" w15:restartNumberingAfterBreak="0">
     <w:nsid w:val="0B5B5F0E"/>
     <w:multiLevelType w:val="multilevel"/>
     <w:tmpl w:val="D72C641E"/>
@@ -2240,7 +313,7 @@
       </w:rPr>
     </w:lvl>
   </w:abstractNum>
-  <w:abstractNum w:abstractNumId="2">
+  <w:abstractNum w:abstractNumId="2" w15:restartNumberingAfterBreak="0">
     <w:nsid w:val="0CE15302"/>
     <w:multiLevelType w:val="multilevel"/>
     <w:tmpl w:val="97E6D028"/>
@@ -2389,7 +462,7 @@
       </w:rPr>
     </w:lvl>
   </w:abstractNum>
-  <w:abstractNum w:abstractNumId="3">
+  <w:abstractNum w:abstractNumId="3" w15:restartNumberingAfterBreak="0">
     <w:nsid w:val="0F0A3508"/>
     <w:multiLevelType w:val="multilevel"/>
     <w:tmpl w:val="4562407A"/>
@@ -2538,7 +611,7 @@
       </w:rPr>
     </w:lvl>
   </w:abstractNum>
-  <w:abstractNum w:abstractNumId="4">
+  <w:abstractNum w:abstractNumId="4" w15:restartNumberingAfterBreak="0">
     <w:nsid w:val="10D911F9"/>
     <w:multiLevelType w:val="multilevel"/>
     <w:tmpl w:val="76400EA4"/>
@@ -2687,7 +760,7 @@
       </w:rPr>
     </w:lvl>
   </w:abstractNum>
-  <w:abstractNum w:abstractNumId="5">
+  <w:abstractNum w:abstractNumId="5" w15:restartNumberingAfterBreak="0">
     <w:nsid w:val="14A70BA8"/>
     <w:multiLevelType w:val="multilevel"/>
     <w:tmpl w:val="D730D732"/>
@@ -2836,7 +909,7 @@
       </w:rPr>
     </w:lvl>
   </w:abstractNum>
-  <w:abstractNum w:abstractNumId="6">
+  <w:abstractNum w:abstractNumId="6" w15:restartNumberingAfterBreak="0">
     <w:nsid w:val="168E7618"/>
     <w:multiLevelType w:val="multilevel"/>
     <w:tmpl w:val="AAFE45A0"/>
@@ -2985,7 +1058,7 @@
       </w:rPr>
     </w:lvl>
   </w:abstractNum>
-  <w:abstractNum w:abstractNumId="7">
+  <w:abstractNum w:abstractNumId="7" w15:restartNumberingAfterBreak="0">
     <w:nsid w:val="1C0E063D"/>
     <w:multiLevelType w:val="multilevel"/>
     <w:tmpl w:val="FB0A4638"/>
@@ -3134,7 +1207,7 @@
       </w:rPr>
     </w:lvl>
   </w:abstractNum>
-  <w:abstractNum w:abstractNumId="8">
+  <w:abstractNum w:abstractNumId="8" w15:restartNumberingAfterBreak="0">
     <w:nsid w:val="1C30125A"/>
     <w:multiLevelType w:val="multilevel"/>
     <w:tmpl w:val="514432C6"/>
@@ -3283,7 +1356,7 @@
       </w:rPr>
     </w:lvl>
   </w:abstractNum>
-  <w:abstractNum w:abstractNumId="9">
+  <w:abstractNum w:abstractNumId="9" w15:restartNumberingAfterBreak="0">
     <w:nsid w:val="1CF105EA"/>
     <w:multiLevelType w:val="multilevel"/>
     <w:tmpl w:val="18F24F44"/>
@@ -3432,7 +1505,7 @@
       </w:rPr>
     </w:lvl>
   </w:abstractNum>
-  <w:abstractNum w:abstractNumId="10">
+  <w:abstractNum w:abstractNumId="10" w15:restartNumberingAfterBreak="0">
     <w:nsid w:val="1FE252DA"/>
     <w:multiLevelType w:val="multilevel"/>
     <w:tmpl w:val="7742AD76"/>
@@ -3581,7 +1654,7 @@
       </w:rPr>
     </w:lvl>
   </w:abstractNum>
-  <w:abstractNum w:abstractNumId="11">
+  <w:abstractNum w:abstractNumId="11" w15:restartNumberingAfterBreak="0">
     <w:nsid w:val="295E48F4"/>
     <w:multiLevelType w:val="multilevel"/>
     <w:tmpl w:val="0330C6AE"/>
@@ -3730,7 +1803,7 @@
       </w:rPr>
     </w:lvl>
   </w:abstractNum>
-  <w:abstractNum w:abstractNumId="12">
+  <w:abstractNum w:abstractNumId="12" w15:restartNumberingAfterBreak="0">
     <w:nsid w:val="335D39FD"/>
     <w:multiLevelType w:val="multilevel"/>
     <w:tmpl w:val="992A5AF4"/>
@@ -3879,7 +1952,7 @@
       </w:rPr>
     </w:lvl>
   </w:abstractNum>
-  <w:abstractNum w:abstractNumId="13">
+  <w:abstractNum w:abstractNumId="13" w15:restartNumberingAfterBreak="0">
     <w:nsid w:val="48116BC5"/>
     <w:multiLevelType w:val="multilevel"/>
     <w:tmpl w:val="40C2B214"/>
@@ -3992,7 +2065,7 @@
       </w:pPr>
     </w:lvl>
   </w:abstractNum>
-  <w:abstractNum w:abstractNumId="14">
+  <w:abstractNum w:abstractNumId="14" w15:restartNumberingAfterBreak="0">
     <w:nsid w:val="4B8A1F08"/>
     <w:multiLevelType w:val="multilevel"/>
     <w:tmpl w:val="6D863582"/>
@@ -4141,7 +2214,7 @@
       </w:rPr>
     </w:lvl>
   </w:abstractNum>
-  <w:abstractNum w:abstractNumId="15">
+  <w:abstractNum w:abstractNumId="15" w15:restartNumberingAfterBreak="0">
     <w:nsid w:val="4DB84BA5"/>
     <w:multiLevelType w:val="multilevel"/>
     <w:tmpl w:val="76808A26"/>
@@ -4290,7 +2363,7 @@
       </w:rPr>
     </w:lvl>
   </w:abstractNum>
-  <w:abstractNum w:abstractNumId="16">
+  <w:abstractNum w:abstractNumId="16" w15:restartNumberingAfterBreak="0">
     <w:nsid w:val="4DD07A24"/>
     <w:multiLevelType w:val="multilevel"/>
     <w:tmpl w:val="332A202A"/>
@@ -4439,7 +2512,7 @@
       </w:rPr>
     </w:lvl>
   </w:abstractNum>
-  <w:abstractNum w:abstractNumId="17">
+  <w:abstractNum w:abstractNumId="17" w15:restartNumberingAfterBreak="0">
     <w:nsid w:val="5A595DFF"/>
     <w:multiLevelType w:val="multilevel"/>
     <w:tmpl w:val="AD400E6A"/>
@@ -4588,7 +2661,7 @@
       </w:rPr>
     </w:lvl>
   </w:abstractNum>
-  <w:abstractNum w:abstractNumId="18">
+  <w:abstractNum w:abstractNumId="18" w15:restartNumberingAfterBreak="0">
     <w:nsid w:val="5F086D89"/>
     <w:multiLevelType w:val="multilevel"/>
     <w:tmpl w:val="BE74D8C8"/>
@@ -4737,7 +2810,7 @@
       </w:rPr>
     </w:lvl>
   </w:abstractNum>
-  <w:abstractNum w:abstractNumId="19">
+  <w:abstractNum w:abstractNumId="19" w15:restartNumberingAfterBreak="0">
     <w:nsid w:val="604C044A"/>
     <w:multiLevelType w:val="multilevel"/>
     <w:tmpl w:val="854638F8"/>
@@ -4886,7 +2959,7 @@
       </w:rPr>
     </w:lvl>
   </w:abstractNum>
-  <w:abstractNum w:abstractNumId="20">
+  <w:abstractNum w:abstractNumId="20" w15:restartNumberingAfterBreak="0">
     <w:nsid w:val="670C7641"/>
     <w:multiLevelType w:val="multilevel"/>
     <w:tmpl w:val="EBC486DE"/>
@@ -5035,7 +3108,7 @@
       </w:rPr>
     </w:lvl>
   </w:abstractNum>
-  <w:abstractNum w:abstractNumId="21">
+  <w:abstractNum w:abstractNumId="21" w15:restartNumberingAfterBreak="0">
     <w:nsid w:val="6A3C4075"/>
     <w:multiLevelType w:val="multilevel"/>
     <w:tmpl w:val="38383568"/>
@@ -5184,7 +3257,7 @@
       </w:rPr>
     </w:lvl>
   </w:abstractNum>
-  <w:abstractNum w:abstractNumId="22">
+  <w:abstractNum w:abstractNumId="22" w15:restartNumberingAfterBreak="0">
     <w:nsid w:val="7695054D"/>
     <w:multiLevelType w:val="multilevel"/>
     <w:tmpl w:val="026C3AFC"/>
@@ -5333,7 +3406,7 @@
       </w:rPr>
     </w:lvl>
   </w:abstractNum>
-  <w:abstractNum w:abstractNumId="23">
+  <w:abstractNum w:abstractNumId="23" w15:restartNumberingAfterBreak="0">
     <w:nsid w:val="7B8875FC"/>
     <w:multiLevelType w:val="multilevel"/>
     <w:tmpl w:val="0632EBEE"/>
@@ -5482,7 +3555,7 @@
       </w:rPr>
     </w:lvl>
   </w:abstractNum>
-  <w:abstractNum w:abstractNumId="24">
+  <w:abstractNum w:abstractNumId="24" w15:restartNumberingAfterBreak="0">
     <w:nsid w:val="7E84640A"/>
     <w:multiLevelType w:val="multilevel"/>
     <w:tmpl w:val="36C6D712"/>
@@ -5631,86 +3704,86 @@
       </w:rPr>
     </w:lvl>
   </w:abstractNum>
-  <w:num w:numId="1">
+  <w:num w:numId="1" w16cid:durableId="1378699253">
     <w:abstractNumId w:val="18"/>
   </w:num>
-  <w:num w:numId="2">
+  <w:num w:numId="2" w16cid:durableId="1662079415">
     <w:abstractNumId w:val="24"/>
   </w:num>
-  <w:num w:numId="3">
+  <w:num w:numId="3" w16cid:durableId="1017466664">
     <w:abstractNumId w:val="2"/>
   </w:num>
-  <w:num w:numId="4">
+  <w:num w:numId="4" w16cid:durableId="929004724">
     <w:abstractNumId w:val="0"/>
   </w:num>
-  <w:num w:numId="5">
+  <w:num w:numId="5" w16cid:durableId="1395540230">
     <w:abstractNumId w:val="19"/>
   </w:num>
-  <w:num w:numId="6">
+  <w:num w:numId="6" w16cid:durableId="985162095">
     <w:abstractNumId w:val="23"/>
   </w:num>
-  <w:num w:numId="7">
+  <w:num w:numId="7" w16cid:durableId="379474594">
     <w:abstractNumId w:val="13"/>
   </w:num>
-  <w:num w:numId="8">
+  <w:num w:numId="8" w16cid:durableId="1074356969">
     <w:abstractNumId w:val="6"/>
   </w:num>
-  <w:num w:numId="9">
+  <w:num w:numId="9" w16cid:durableId="169032683">
     <w:abstractNumId w:val="16"/>
   </w:num>
-  <w:num w:numId="10">
+  <w:num w:numId="10" w16cid:durableId="1625041938">
     <w:abstractNumId w:val="7"/>
   </w:num>
-  <w:num w:numId="11">
+  <w:num w:numId="11" w16cid:durableId="391585335">
     <w:abstractNumId w:val="10"/>
   </w:num>
-  <w:num w:numId="12">
+  <w:num w:numId="12" w16cid:durableId="1433427729">
     <w:abstractNumId w:val="8"/>
   </w:num>
-  <w:num w:numId="13">
+  <w:num w:numId="13" w16cid:durableId="336230655">
     <w:abstractNumId w:val="11"/>
   </w:num>
-  <w:num w:numId="14">
+  <w:num w:numId="14" w16cid:durableId="1640063465">
     <w:abstractNumId w:val="22"/>
   </w:num>
-  <w:num w:numId="15">
+  <w:num w:numId="15" w16cid:durableId="1797067795">
     <w:abstractNumId w:val="3"/>
   </w:num>
-  <w:num w:numId="16">
+  <w:num w:numId="16" w16cid:durableId="1973903561">
     <w:abstractNumId w:val="21"/>
   </w:num>
-  <w:num w:numId="17">
+  <w:num w:numId="17" w16cid:durableId="1979457339">
     <w:abstractNumId w:val="4"/>
   </w:num>
-  <w:num w:numId="18">
+  <w:num w:numId="18" w16cid:durableId="59788295">
     <w:abstractNumId w:val="20"/>
   </w:num>
-  <w:num w:numId="19">
+  <w:num w:numId="19" w16cid:durableId="589237595">
     <w:abstractNumId w:val="12"/>
   </w:num>
-  <w:num w:numId="20">
+  <w:num w:numId="20" w16cid:durableId="812449884">
     <w:abstractNumId w:val="15"/>
   </w:num>
-  <w:num w:numId="21">
+  <w:num w:numId="21" w16cid:durableId="1278567488">
     <w:abstractNumId w:val="9"/>
   </w:num>
-  <w:num w:numId="22">
+  <w:num w:numId="22" w16cid:durableId="676344824">
     <w:abstractNumId w:val="14"/>
   </w:num>
-  <w:num w:numId="23">
+  <w:num w:numId="23" w16cid:durableId="975064692">
     <w:abstractNumId w:val="5"/>
   </w:num>
-  <w:num w:numId="24">
+  <w:num w:numId="24" w16cid:durableId="654648198">
     <w:abstractNumId w:val="17"/>
   </w:num>
-  <w:num w:numId="25">
+  <w:num w:numId="25" w16cid:durableId="405687725">
     <w:abstractNumId w:val="1"/>
   </w:num>
 </w:numbering>
 </file>
 
 <file path=word/styles.xml><?xml version="1.0" encoding="utf-8"?>
-<w:styles xmlns:mc="http://schemas.openxmlformats.org/markup-compatibility/2006" xmlns:r="http://schemas.openxmlformats.org/officeDocument/2006/relationships" xmlns:w="http://schemas.openxmlformats.org/wordprocessingml/2006/main" xmlns:w14="http://schemas.microsoft.com/office/word/2010/wordml" mc:Ignorable="w14">
+<w:styles xmlns:mc="http://schemas.openxmlformats.org/markup-compatibility/2006" xmlns:r="http://schemas.openxmlformats.org/officeDocument/2006/relationships" xmlns:w="http://schemas.openxmlformats.org/wordprocessingml/2006/main" xmlns:w14="http://schemas.microsoft.com/office/word/2010/wordml" xmlns:w15="http://schemas.microsoft.com/office/word/2012/wordml" xmlns:w16cex="http://schemas.microsoft.com/office/word/2018/wordml/cex" xmlns:w16cid="http://schemas.microsoft.com/office/word/2016/wordml/cid" xmlns:w16="http://schemas.microsoft.com/office/word/2018/wordml" xmlns:w16du="http://schemas.microsoft.com/office/word/2023/wordml/word16du" xmlns:w16sdtdh="http://schemas.microsoft.com/office/word/2020/wordml/sdtdatahash" xmlns:w16sdtfl="http://schemas.microsoft.com/office/word/2024/wordml/sdtformatlock" xmlns:w16se="http://schemas.microsoft.com/office/word/2015/wordml/symex" mc:Ignorable="w14 w15 w16se w16cid w16 w16cex w16sdtdh w16sdtfl w16du">
   <w:docDefaults>
     <w:rPrDefault>
       <w:rPr>
@@ -5726,539 +3799,383 @@
       </w:pPr>
     </w:pPrDefault>
   </w:docDefaults>
-  <w:latentStyles w:defLockedState="0" w:defUIPriority="99" w:defSemiHidden="1" w:defUnhideWhenUsed="1" w:defQFormat="0" w:count="267">
-    <w:lsdException w:name="Normal" w:semiHidden="0" w:uiPriority="0" w:unhideWhenUsed="0" w:qFormat="1"/>
-    <w:lsdException w:name="heading 1" w:semiHidden="0" w:uiPriority="9" w:unhideWhenUsed="0" w:qFormat="1"/>
-    <w:lsdException w:name="heading 2" w:uiPriority="9" w:qFormat="1"/>
-    <w:lsdException w:name="heading 3" w:uiPriority="9" w:qFormat="1"/>
-    <w:lsdException w:name="heading 4" w:uiPriority="9" w:qFormat="1"/>
-    <w:lsdException w:name="heading 5" w:uiPriority="9" w:qFormat="1"/>
-    <w:lsdException w:name="heading 6" w:uiPriority="9" w:qFormat="1"/>
-    <w:lsdException w:name="heading 7" w:uiPriority="9" w:qFormat="1"/>
-    <w:lsdException w:name="heading 8" w:uiPriority="9" w:qFormat="1"/>
-    <w:lsdException w:name="heading 9" w:uiPriority="9" w:qFormat="1"/>
-    <w:lsdException w:name="toc 1" w:uiPriority="39"/>
-    <w:lsdException w:name="toc 2" w:uiPriority="39"/>
-    <w:lsdException w:name="toc 3" w:uiPriority="39"/>
-    <w:lsdException w:name="toc 4" w:uiPriority="39"/>
-    <w:lsdException w:name="toc 5" w:uiPriority="39"/>
-    <w:lsdException w:name="toc 6" w:uiPriority="39"/>
-    <w:lsdException w:name="toc 7" w:uiPriority="39"/>
-    <w:lsdException w:name="toc 8" w:uiPriority="39"/>
-    <w:lsdException w:name="toc 9" w:uiPriority="39"/>
-    <w:lsdException w:name="caption" w:uiPriority="35" w:qFormat="1"/>
-    <w:lsdException w:name="Title" w:semiHidden="0" w:uiPriority="10" w:unhideWhenUsed="0" w:qFormat="1"/>
-    <w:lsdException w:name="Default Paragraph Font" w:uiPriority="1"/>
-    <w:lsdException w:name="Subtitle" w:semiHidden="0" w:uiPriority="11" w:unhideWhenUsed="0" w:qFormat="1"/>
-    <w:lsdException w:name="Strong" w:semiHidden="0" w:uiPriority="22" w:unhideWhenUsed="0" w:qFormat="1"/>
-    <w:lsdException w:name="Emphasis" w:semiHidden="0" w:uiPriority="20" w:unhideWhenUsed="0" w:qFormat="1"/>
-    <w:lsdException w:name="Table Grid" w:semiHidden="0" w:uiPriority="59" w:unhideWhenUsed="0"/>
-    <w:lsdException w:name="Placeholder Text" w:unhideWhenUsed="0"/>
-    <w:lsdException w:name="No Spacing" w:semiHidden="0" w:uiPriority="1" w:unhideWhenUsed="0" w:qFormat="1"/>
-    <w:lsdException w:name="Light Shading" w:semiHidden="0" w:uiPriority="60" w:unhideWhenUsed="0"/>
-    <w:lsdException w:name="Light List" w:semiHidden="0" w:uiPriority="61" w:unhideWhenUsed="0"/>
-    <w:lsdException w:name="Light Grid" w:semiHidden="0" w:uiPriority="62" w:unhideWhenUsed="0"/>
-    <w:lsdException w:name="Medium Shading 1" w:semiHidden="0" w:uiPriority="63" w:unhideWhenUsed="0"/>
-    <w:lsdException w:name="Medium Shading 2" w:semiHidden="0" w:uiPriority="64" w:unhideWhenUsed="0"/>
-    <w:lsdException w:name="Medium List 1" w:semiHidden="0" w:uiPriority="65" w:unhideWhenUsed="0"/>
-    <w:lsdException w:name="Medium List 2" w:semiHidden="0" w:uiPriority="66" w:unhideWhenUsed="0"/>
-    <w:lsdException w:name="Medium Grid 1" w:semiHidden="0" w:uiPriority="67" w:unhideWhenUsed="0"/>
-    <w:lsdException w:name="Medium Grid 2" w:semiHidden="0" w:uiPriority="68" w:unhideWhenUsed="0"/>
-    <w:lsdException w:name="Medium Grid 3" w:semiHidden="0" w:uiPriority="69" w:unhideWhenUsed="0"/>
-    <w:lsdException w:name="Dark List" w:semiHidden="0" w:uiPriority="70" w:unhideWhenUsed="0"/>
-    <w:lsdException w:name="Colorful Shading" w:semiHidden="0" w:uiPriority="71" w:unhideWhenUsed="0"/>
-    <w:lsdException w:name="Colorful List" w:semiHidden="0" w:uiPriority="72" w:unhideWhenUsed="0"/>
-    <w:lsdException w:name="Colorful Grid" w:semiHidden="0" w:uiPriority="73" w:unhideWhenUsed="0"/>
-    <w:lsdException w:name="Light Shading Accent 1" w:semiHidden="0" w:uiPriority="60" w:unhideWhenUsed="0"/>
-    <w:lsdException w:name="Light List Accent 1" w:semiHidden="0" w:uiPriority="61" w:unhideWhenUsed="0"/>
-    <w:lsdException w:name="Light Grid Accent 1" w:semiHidden="0" w:uiPriority="62" w:unhideWhenUsed="0"/>
-    <w:lsdException w:name="Medium Shading 1 Accent 1" w:semiHidden="0" w:uiPriority="63" w:unhideWhenUsed="0"/>
-    <w:lsdException w:name="Medium Shading 2 Accent 1" w:semiHidden="0" w:uiPriority="64" w:unhideWhenUsed="0"/>
-    <w:lsdException w:name="Medium List 1 Accent 1" w:semiHidden="0" w:uiPriority="65" w:unhideWhenUsed="0"/>
-    <w:lsdException w:name="Revision" w:unhideWhenUsed="0"/>
-    <w:lsdException w:name="List Paragraph" w:semiHidden="0" w:uiPriority="34" w:unhideWhenUsed="0" w:qFormat="1"/>
-    <w:lsdException w:name="Quote" w:semiHidden="0" w:uiPriority="29" w:unhideWhenUsed="0" w:qFormat="1"/>
-    <w:lsdException w:name="Intense Quote" w:semiHidden="0" w:uiPriority="30" w:unhideWhenUsed="0" w:qFormat="1"/>
-    <w:lsdException w:name="Medium List 2 Accent 1" w:semiHidden="0" w:uiPriority="66" w:unhideWhenUsed="0"/>
-    <w:lsdException w:name="Medium Grid 1 Accent 1" w:semiHidden="0" w:uiPriority="67" w:unhideWhenUsed="0"/>
-    <w:lsdException w:name="Medium Grid 2 Accent 1" w:semiHidden="0" w:uiPriority="68" w:unhideWhenUsed="0"/>
-    <w:lsdException w:name="Medium Grid 3 Accent 1" w:semiHidden="0" w:uiPriority="69" w:unhideWhenUsed="0"/>
-    <w:lsdException w:name="Dark List Accent 1" w:semiHidden="0" w:uiPriority="70" w:unhideWhenUsed="0"/>
-    <w:lsdException w:name="Colorful Shading Accent 1" w:semiHidden="0" w:uiPriority="71" w:unhideWhenUsed="0"/>
-    <w:lsdException w:name="Colorful List Accent 1" w:semiHidden="0" w:uiPriority="72" w:unhideWhenUsed="0"/>
-    <w:lsdException w:name="Colorful Grid Accent 1" w:semiHidden="0" w:uiPriority="73" w:unhideWhenUsed="0"/>
-    <w:lsdException w:name="Light Shading Accent 2" w:semiHidden="0" w:uiPriority="60" w:unhideWhenUsed="0"/>
-    <w:lsdException w:name="Light List Accent 2" w:semiHidden="0" w:uiPriority="61" w:unhideWhenUsed="0"/>
-    <w:lsdException w:name="Light Grid Accent 2" w:semiHidden="0" w:uiPriority="62" w:unhideWhenUsed="0"/>
-    <w:lsdException w:name="Medium Shading 1 Accent 2" w:semiHidden="0" w:uiPriority="63" w:unhideWhenUsed="0"/>
-    <w:lsdException w:name="Medium Shading 2 Accent 2" w:semiHidden="0" w:uiPriority="64" w:unhideWhenUsed="0"/>
-    <w:lsdException w:name="Medium List 1 Accent 2" w:semiHidden="0" w:uiPriority="65" w:unhideWhenUsed="0"/>
-    <w:lsdException w:name="Medium List 2 Accent 2" w:semiHidden="0" w:uiPriority="66" w:unhideWhenUsed="0"/>
-    <w:lsdException w:name="Medium Grid 1 Accent 2" w:semiHidden="0" w:uiPriority="67" w:unhideWhenUsed="0"/>
-    <w:lsdException w:name="Medium Grid 2 Accent 2" w:semiHidden="0" w:uiPriority="68" w:unhideWhenUsed="0"/>
-    <w:lsdException w:name="Medium Grid 3 Accent 2" w:semiHidden="0" w:uiPriority="69" w:unhideWhenUsed="0"/>
-    <w:lsdException w:name="Dark List Accent 2" w:semiHidden="0" w:uiPriority="70" w:unhideWhenUsed="0"/>
-    <w:lsdException w:name="Colorful Shading Accent 2" w:semiHidden="0" w:uiPriority="71" w:unhideWhenUsed="0"/>
-    <w:lsdException w:name="Colorful List Accent 2" w:semiHidden="0" w:uiPriority="72" w:unhideWhenUsed="0"/>
-    <w:lsdException w:name="Colorful Grid Accent 2" w:semiHidden="0" w:uiPriority="73" w:unhideWhenUsed="0"/>
-    <w:lsdException w:name="Light Shading Accent 3" w:semiHidden="0" w:uiPriority="60" w:unhideWhenUsed="0"/>
-    <w:lsdException w:name="Light List Accent 3" w:semiHidden="0" w:uiPriority="61" w:unhideWhenUsed="0"/>
-    <w:lsdException w:name="Light Grid Accent 3" w:semiHidden="0" w:uiPriority="62" w:unhideWhenUsed="0"/>
-    <w:lsdException w:name="Medium Shading 1 Accent 3" w:semiHidden="0" w:uiPriority="63" w:unhideWhenUsed="0"/>
-    <w:lsdException w:name="Medium Shading 2 Accent 3" w:semiHidden="0" w:uiPriority="64" w:unhideWhenUsed="0"/>
-    <w:lsdException w:name="Medium List 1 Accent 3" w:semiHidden="0" w:uiPriority="65" w:unhideWhenUsed="0"/>
-    <w:lsdException w:name="Medium List 2 Accent 3" w:semiHidden="0" w:uiPriority="66" w:unhideWhenUsed="0"/>
-    <w:lsdException w:name="Medium Grid 1 Accent 3" w:semiHidden="0" w:uiPriority="67" w:unhideWhenUsed="0"/>
-    <w:lsdException w:name="Medium Grid 2 Accent 3" w:semiHidden="0" w:uiPriority="68" w:unhideWhenUsed="0"/>
-    <w:lsdException w:name="Medium Grid 3 Accent 3" w:semiHidden="0" w:uiPriority="69" w:unhideWhenUsed="0"/>
-    <w:lsdException w:name="Dark List Accent 3" w:semiHidden="0" w:uiPriority="70" w:unhideWhenUsed="0"/>
-    <w:lsdException w:name="Colorful Shading Accent 3" w:semiHidden="0" w:uiPriority="71" w:unhideWhenUsed="0"/>
-    <w:lsdException w:name="Colorful List Accent 3" w:semiHidden="0" w:uiPriority="72" w:unhideWhenUsed="0"/>
-    <w:lsdException w:name="Colorful Grid Accent 3" w:semiHidden="0" w:uiPriority="73" w:unhideWhenUsed="0"/>
-    <w:lsdException w:name="Light Shading Accent 4" w:semiHidden="0" w:uiPriority="60" w:unhideWhenUsed="0"/>
-    <w:lsdException w:name="Light List Accent 4" w:semiHidden="0" w:uiPriority="61" w:unhideWhenUsed="0"/>
-    <w:lsdException w:name="Light Grid Accent 4" w:semiHidden="0" w:uiPriority="62" w:unhideWhenUsed="0"/>
-    <w:lsdException w:name="Medium Shading 1 Accent 4" w:semiHidden="0" w:uiPriority="63" w:unhideWhenUsed="0"/>
-    <w:lsdException w:name="Medium Shading 2 Accent 4" w:semiHidden="0" w:uiPriority="64" w:unhideWhenUsed="0"/>
-    <w:lsdException w:name="Medium List 1 Accent 4" w:semiHidden="0" w:uiPriority="65" w:unhideWhenUsed="0"/>
-    <w:lsdException w:name="Medium List 2 Accent 4" w:semiHidden="0" w:uiPriority="66" w:unhideWhenUsed="0"/>
-    <w:lsdException w:name="Medium Grid 1 Accent 4" w:semiHidden="0" w:uiPriority="67" w:unhideWhenUsed="0"/>
-    <w:lsdException w:name="Medium Grid 2 Accent 4" w:semiHidden="0" w:uiPriority="68" w:unhideWhenUsed="0"/>
-    <w:lsdException w:name="Medium Grid 3 Accent 4" w:semiHidden="0" w:uiPriority="69" w:unhideWhenUsed="0"/>
-    <w:lsdException w:name="Dark List Accent 4" w:semiHidden="0" w:uiPriority="70" w:unhideWhenUsed="0"/>
-    <w:lsdException w:name="Colorful Shading Accent 4" w:semiHidden="0" w:uiPriority="71" w:unhideWhenUsed="0"/>
-    <w:lsdException w:name="Colorful List Accent 4" w:semiHidden="0" w:uiPriority="72" w:unhideWhenUsed="0"/>
-    <w:lsdException w:name="Colorful Grid Accent 4" w:semiHidden="0" w:uiPriority="73" w:unhideWhenUsed="0"/>
-    <w:lsdException w:name="Light Shading Accent 5" w:semiHidden="0" w:uiPriority="60" w:unhideWhenUsed="0"/>
-    <w:lsdException w:name="Light List Accent 5" w:semiHidden="0" w:uiPriority="61" w:unhideWhenUsed="0"/>
-    <w:lsdException w:name="Light Grid Accent 5" w:semiHidden="0" w:uiPriority="62" w:unhideWhenUsed="0"/>
-    <w:lsdException w:name="Medium Shading 1 Accent 5" w:semiHidden="0" w:uiPriority="63" w:unhideWhenUsed="0"/>
-    <w:lsdException w:name="Medium Shading 2 Accent 5" w:semiHidden="0" w:uiPriority="64" w:unhideWhenUsed="0"/>
-    <w:lsdException w:name="Medium List 1 Accent 5" w:semiHidden="0" w:uiPriority="65" w:unhideWhenUsed="0"/>
-    <w:lsdException w:name="Medium List 2 Accent 5" w:semiHidden="0" w:uiPriority="66" w:unhideWhenUsed="0"/>
-    <w:lsdException w:name="Medium Grid 1 Accent 5" w:semiHidden="0" w:uiPriority="67" w:unhideWhenUsed="0"/>
-    <w:lsdException w:name="Medium Grid 2 Accent 5" w:semiHidden="0" w:uiPriority="68" w:unhideWhenUsed="0"/>
-    <w:lsdException w:name="Medium Grid 3 Accent 5" w:semiHidden="0" w:uiPriority="69" w:unhideWhenUsed="0"/>
-    <w:lsdException w:name="Dark List Accent 5" w:semiHidden="0" w:uiPriority="70" w:unhideWhenUsed="0"/>
-    <w:lsdException w:name="Colorful Shading Accent 5" w:semiHidden="0" w:uiPriority="71" w:unhideWhenUsed="0"/>
-    <w:lsdException w:name="Colorful List Accent 5" w:semiHidden="0" w:uiPriority="72" w:unhideWhenUsed="0"/>
-    <w:lsdException w:name="Colorful Grid Accent 5" w:semiHidden="0" w:uiPriority="73" w:unhideWhenUsed="0"/>
-    <w:lsdException w:name="Light Shading Accent 6" w:semiHidden="0" w:uiPriority="60" w:unhideWhenUsed="0"/>
-    <w:lsdException w:name="Light List Accent 6" w:semiHidden="0" w:uiPriority="61" w:unhideWhenUsed="0"/>
-    <w:lsdException w:name="Light Grid Accent 6" w:semiHidden="0" w:uiPriority="62" w:unhideWhenUsed="0"/>
-    <w:lsdException w:name="Medium Shading 1 Accent 6" w:semiHidden="0" w:uiPriority="63" w:unhideWhenUsed="0"/>
-    <w:lsdException w:name="Medium Shading 2 Accent 6" w:semiHidden="0" w:uiPriority="64" w:unhideWhenUsed="0"/>
-    <w:lsdException w:name="Medium List 1 Accent 6" w:semiHidden="0" w:uiPriority="65" w:unhideWhenUsed="0"/>
-    <w:lsdException w:name="Medium List 2 Accent 6" w:semiHidden="0" w:uiPriority="66" w:unhideWhenUsed="0"/>
-    <w:lsdException w:name="Medium Grid 1 Accent 6" w:semiHidden="0" w:uiPriority="67" w:unhideWhenUsed="0"/>
-    <w:lsdException w:name="Medium Grid 2 Accent 6" w:semiHidden="0" w:uiPriority="68" w:unhideWhenUsed="0"/>
-    <w:lsdException w:name="Medium Grid 3 Accent 6" w:semiHidden="0" w:uiPriority="69" w:unhideWhenUsed="0"/>
-    <w:lsdException w:name="Dark List Accent 6" w:semiHidden="0" w:uiPriority="70" w:unhideWhenUsed="0"/>
-    <w:lsdException w:name="Colorful Shading Accent 6" w:semiHidden="0" w:uiPriority="71" w:unhideWhenUsed="0"/>
-    <w:lsdException w:name="Colorful List Accent 6" w:semiHidden="0" w:uiPriority="72" w:unhideWhenUsed="0"/>
-    <w:lsdException w:name="Colorful Grid Accent 6" w:semiHidden="0" w:uiPriority="73" w:unhideWhenUsed="0"/>
-    <w:lsdException w:name="Subtle Emphasis" w:semiHidden="0" w:uiPriority="19" w:unhideWhenUsed="0" w:qFormat="1"/>
-    <w:lsdException w:name="Intense Emphasis" w:semiHidden="0" w:uiPriority="21" w:unhideWhenUsed="0" w:qFormat="1"/>
-    <w:lsdException w:name="Subtle Reference" w:semiHidden="0" w:uiPriority="31" w:unhideWhenUsed="0" w:qFormat="1"/>
-    <w:lsdException w:name="Intense Reference" w:semiHidden="0" w:uiPriority="32" w:unhideWhenUsed="0" w:qFormat="1"/>
-    <w:lsdException w:name="Book Title" w:semiHidden="0" w:uiPriority="33" w:unhideWhenUsed="0" w:qFormat="1"/>
-    <w:lsdException w:name="Bibliography" w:uiPriority="37"/>
-    <w:lsdException w:name="TOC Heading" w:uiPriority="39" w:qFormat="1"/>
-  </w:latentStyles>
-  <w:style w:type="paragraph" w:default="1" w:styleId="Normal">
-    <w:name w:val="Normal"/>
-    <w:qFormat/>
-  </w:style>
-  <w:style w:type="paragraph" w:styleId="Heading2">
-    <w:name w:val="heading 2"/>
-    <w:basedOn w:val="Normal"/>
-    <w:link w:val="Heading2Char"/>
-    <w:uiPriority w:val="9"/>
-    <w:qFormat/>
-    <w:rsid w:val="00AB74FD"/>
-    <w:pPr>
-      <w:spacing w:before="100" w:beforeAutospacing="1" w:after="100" w:afterAutospacing="1" w:line="240" w:lineRule="auto"/>
-      <w:outlineLvl w:val="1"/>
-    </w:pPr>
-    <w:rPr>
-      <w:rFonts w:ascii="Times New Roman" w:eastAsia="Times New Roman" w:hAnsi="Times New Roman" w:cs="Times New Roman"/>
-      <w:b/>
-      <w:bCs/>
-      <w:sz w:val="36"/>
-      <w:szCs w:val="36"/>
-    </w:rPr>
-  </w:style>
-  <w:style w:type="paragraph" w:styleId="Heading3">
-    <w:name w:val="heading 3"/>
-    <w:basedOn w:val="Normal"/>
-    <w:link w:val="Heading3Char"/>
-    <w:uiPriority w:val="9"/>
-    <w:qFormat/>
-    <w:rsid w:val="00AB74FD"/>
-    <w:pPr>
-      <w:spacing w:before="100" w:beforeAutospacing="1" w:after="100" w:afterAutospacing="1" w:line="240" w:lineRule="auto"/>
-      <w:outlineLvl w:val="2"/>
-    </w:pPr>
-    <w:rPr>
-      <w:rFonts w:ascii="Times New Roman" w:eastAsia="Times New Roman" w:hAnsi="Times New Roman" w:cs="Times New Roman"/>
-      <w:b/>
-      <w:bCs/>
-      <w:sz w:val="27"/>
-      <w:szCs w:val="27"/>
-    </w:rPr>
-  </w:style>
-  <w:style w:type="character" w:default="1" w:styleId="DefaultParagraphFont">
-    <w:name w:val="Default Paragraph Font"/>
-    <w:uiPriority w:val="1"/>
-    <w:semiHidden/>
-    <w:unhideWhenUsed/>
-  </w:style>
-  <w:style w:type="table" w:default="1" w:styleId="TableNormal">
-    <w:name w:val="Normal Table"/>
-    <w:uiPriority w:val="99"/>
-    <w:semiHidden/>
-    <w:unhideWhenUsed/>
-    <w:tblPr>
-      <w:tblInd w:w="0" w:type="dxa"/>
-      <w:tblCellMar>
-        <w:top w:w="0" w:type="dxa"/>
-        <w:left w:w="108" w:type="dxa"/>
-        <w:bottom w:w="0" w:type="dxa"/>
-        <w:right w:w="108" w:type="dxa"/>
-      </w:tblCellMar>
-    </w:tblPr>
-  </w:style>
-  <w:style w:type="numbering" w:default="1" w:styleId="NoList">
-    <w:name w:val="No List"/>
-    <w:uiPriority w:val="99"/>
-    <w:semiHidden/>
-    <w:unhideWhenUsed/>
-  </w:style>
-  <w:style w:type="character" w:customStyle="1" w:styleId="Heading2Char">
-    <w:name w:val="Heading 2 Char"/>
-    <w:basedOn w:val="DefaultParagraphFont"/>
-    <w:link w:val="Heading2"/>
-    <w:uiPriority w:val="9"/>
-    <w:rsid w:val="00AB74FD"/>
-    <w:rPr>
-      <w:rFonts w:ascii="Times New Roman" w:eastAsia="Times New Roman" w:hAnsi="Times New Roman" w:cs="Times New Roman"/>
-      <w:b/>
-      <w:bCs/>
-      <w:sz w:val="36"/>
-      <w:szCs w:val="36"/>
-    </w:rPr>
-  </w:style>
-  <w:style w:type="character" w:customStyle="1" w:styleId="Heading3Char">
-    <w:name w:val="Heading 3 Char"/>
-    <w:basedOn w:val="DefaultParagraphFont"/>
-    <w:link w:val="Heading3"/>
-    <w:uiPriority w:val="9"/>
-    <w:rsid w:val="00AB74FD"/>
-    <w:rPr>
-      <w:rFonts w:ascii="Times New Roman" w:eastAsia="Times New Roman" w:hAnsi="Times New Roman" w:cs="Times New Roman"/>
-      <w:b/>
-      <w:bCs/>
-      <w:sz w:val="27"/>
-      <w:szCs w:val="27"/>
-    </w:rPr>
-  </w:style>
-  <w:style w:type="paragraph" w:customStyle="1" w:styleId="whitespace-pre-wrap">
-    <w:name w:val="whitespace-pre-wrap"/>
-    <w:basedOn w:val="Normal"/>
-    <w:rsid w:val="00AB74FD"/>
-    <w:pPr>
-      <w:spacing w:before="100" w:beforeAutospacing="1" w:after="100" w:afterAutospacing="1" w:line="240" w:lineRule="auto"/>
-    </w:pPr>
-    <w:rPr>
-      <w:rFonts w:ascii="Times New Roman" w:eastAsia="Times New Roman" w:hAnsi="Times New Roman" w:cs="Times New Roman"/>
-      <w:sz w:val="24"/>
-      <w:szCs w:val="24"/>
-    </w:rPr>
-  </w:style>
-  <w:style w:type="character" w:customStyle="1" w:styleId="text-text-500">
-    <w:name w:val="text-text-500"/>
-    <w:basedOn w:val="DefaultParagraphFont"/>
-    <w:rsid w:val="00AB74FD"/>
-  </w:style>
-  <w:style w:type="paragraph" w:customStyle="1" w:styleId="font-claude-response-body">
-    <w:name w:val="font-claude-response-body"/>
-    <w:basedOn w:val="Normal"/>
-    <w:rsid w:val="00AB74FD"/>
-    <w:pPr>
-      <w:spacing w:before="100" w:beforeAutospacing="1" w:after="100" w:afterAutospacing="1" w:line="240" w:lineRule="auto"/>
-    </w:pPr>
-    <w:rPr>
-      <w:rFonts w:ascii="Times New Roman" w:eastAsia="Times New Roman" w:hAnsi="Times New Roman" w:cs="Times New Roman"/>
-      <w:sz w:val="24"/>
-      <w:szCs w:val="24"/>
-    </w:rPr>
-  </w:style>
-  <w:style w:type="character" w:styleId="Strong">
-    <w:name w:val="Strong"/>
-    <w:basedOn w:val="DefaultParagraphFont"/>
-    <w:uiPriority w:val="22"/>
-    <w:qFormat/>
-    <w:rsid w:val="00AB74FD"/>
-    <w:rPr>
-      <w:b/>
-      <w:bCs/>
-    </w:rPr>
-  </w:style>
-  <w:style w:type="character" w:styleId="HTMLCode">
-    <w:name w:val="HTML Code"/>
-    <w:basedOn w:val="DefaultParagraphFont"/>
-    <w:uiPriority w:val="99"/>
-    <w:semiHidden/>
-    <w:unhideWhenUsed/>
-    <w:rsid w:val="00AB74FD"/>
-    <w:rPr>
-      <w:rFonts w:ascii="Courier New" w:eastAsia="Times New Roman" w:hAnsi="Courier New" w:cs="Courier New"/>
-      <w:sz w:val="20"/>
-      <w:szCs w:val="20"/>
-    </w:rPr>
-  </w:style>
-  <w:style w:type="paragraph" w:styleId="HTMLPreformatted">
-    <w:name w:val="HTML Preformatted"/>
-    <w:basedOn w:val="Normal"/>
-    <w:link w:val="HTMLPreformattedChar"/>
-    <w:uiPriority w:val="99"/>
-    <w:semiHidden/>
-    <w:unhideWhenUsed/>
-    <w:rsid w:val="00AB74FD"/>
-    <w:pPr>
-      <w:tabs>
-        <w:tab w:val="left" w:pos="916"/>
-        <w:tab w:val="left" w:pos="1832"/>
-        <w:tab w:val="left" w:pos="2748"/>
-        <w:tab w:val="left" w:pos="3664"/>
-        <w:tab w:val="left" w:pos="4580"/>
-        <w:tab w:val="left" w:pos="5496"/>
-        <w:tab w:val="left" w:pos="6412"/>
-        <w:tab w:val="left" w:pos="7328"/>
-        <w:tab w:val="left" w:pos="8244"/>
-        <w:tab w:val="left" w:pos="9160"/>
-        <w:tab w:val="left" w:pos="10076"/>
-        <w:tab w:val="left" w:pos="10992"/>
-        <w:tab w:val="left" w:pos="11908"/>
-        <w:tab w:val="left" w:pos="12824"/>
-        <w:tab w:val="left" w:pos="13740"/>
-        <w:tab w:val="left" w:pos="14656"/>
-      </w:tabs>
-      <w:spacing w:after="0" w:line="240" w:lineRule="auto"/>
-    </w:pPr>
-    <w:rPr>
-      <w:rFonts w:ascii="Courier New" w:eastAsia="Times New Roman" w:hAnsi="Courier New" w:cs="Courier New"/>
-      <w:sz w:val="20"/>
-      <w:szCs w:val="20"/>
-    </w:rPr>
-  </w:style>
-  <w:style w:type="character" w:customStyle="1" w:styleId="HTMLPreformattedChar">
-    <w:name w:val="HTML Preformatted Char"/>
-    <w:basedOn w:val="DefaultParagraphFont"/>
-    <w:link w:val="HTMLPreformatted"/>
-    <w:uiPriority w:val="99"/>
-    <w:semiHidden/>
-    <w:rsid w:val="00AB74FD"/>
-    <w:rPr>
-      <w:rFonts w:ascii="Courier New" w:eastAsia="Times New Roman" w:hAnsi="Courier New" w:cs="Courier New"/>
-      <w:sz w:val="20"/>
-      <w:szCs w:val="20"/>
-    </w:rPr>
-  </w:style>
-  <w:style w:type="character" w:styleId="Emphasis">
-    <w:name w:val="Emphasis"/>
-    <w:basedOn w:val="DefaultParagraphFont"/>
-    <w:uiPriority w:val="20"/>
-    <w:qFormat/>
-    <w:rsid w:val="00AB74FD"/>
-    <w:rPr>
-      <w:i/>
-      <w:iCs/>
-    </w:rPr>
-  </w:style>
-  <w:style w:type="paragraph" w:customStyle="1" w:styleId="is-empty">
-    <w:name w:val="is-empty"/>
-    <w:basedOn w:val="Normal"/>
-    <w:rsid w:val="00AB74FD"/>
-    <w:pPr>
-      <w:spacing w:before="100" w:beforeAutospacing="1" w:after="100" w:afterAutospacing="1" w:line="240" w:lineRule="auto"/>
-    </w:pPr>
-    <w:rPr>
-      <w:rFonts w:ascii="Times New Roman" w:eastAsia="Times New Roman" w:hAnsi="Times New Roman" w:cs="Times New Roman"/>
-      <w:sz w:val="24"/>
-      <w:szCs w:val="24"/>
-    </w:rPr>
-  </w:style>
-  <w:style w:type="character" w:styleId="Hyperlink">
-    <w:name w:val="Hyperlink"/>
-    <w:basedOn w:val="DefaultParagraphFont"/>
-    <w:uiPriority w:val="99"/>
-    <w:semiHidden/>
-    <w:unhideWhenUsed/>
-    <w:rsid w:val="00AB74FD"/>
-    <w:rPr>
-      <w:color w:val="0000FF"/>
-      <w:u w:val="single"/>
-    </w:rPr>
-  </w:style>
-</w:styles>
-</file>
-
-<file path=word/stylesWithEffects.xml><?xml version="1.0" encoding="utf-8"?>
-<w:styles xmlns:wpc="http://schemas.microsoft.com/office/word/2010/wordprocessingCanvas" xmlns:mc="http://schemas.openxmlformats.org/markup-compatibility/2006" xmlns:o="urn:schemas-microsoft-com:office:office" xmlns:r="http://schemas.openxmlformats.org/officeDocument/2006/relationships" xmlns:m="http://schemas.openxmlformats.org/officeDocument/2006/math" xmlns:v="urn:schemas-microsoft-com:vml" xmlns:wp14="http://schemas.microsoft.com/office/word/2010/wordprocessingDrawing" xmlns:wp="http://schemas.openxmlformats.org/drawingml/2006/wordprocessingDrawing" xmlns:w10="urn:schemas-microsoft-com:office:word" xmlns:w="http://schemas.openxmlformats.org/wordprocessingml/2006/main" xmlns:w14="http://schemas.microsoft.com/office/word/2010/wordml" xmlns:wpg="http://schemas.microsoft.com/office/word/2010/wordprocessingGroup" xmlns:wpi="http://schemas.microsoft.com/office/word/2010/wordprocessingInk" xmlns:wne="http://schemas.microsoft.com/office/word/2006/wordml" xmlns:wps="http://schemas.microsoft.com/office/word/2010/wordprocessingShape" mc:Ignorable="w14 wp14">
-  <w:docDefaults>
-    <w:rPrDefault>
-      <w:rPr>
-        <w:rFonts w:asciiTheme="minorHAnsi" w:eastAsiaTheme="minorHAnsi" w:hAnsiTheme="minorHAnsi" w:cstheme="minorBidi"/>
-        <w:sz w:val="22"/>
-        <w:szCs w:val="22"/>
-        <w:lang w:val="en-US" w:eastAsia="en-US" w:bidi="ar-SA"/>
-      </w:rPr>
-    </w:rPrDefault>
-    <w:pPrDefault>
-      <w:pPr>
-        <w:spacing w:after="200" w:line="276" w:lineRule="auto"/>
-      </w:pPr>
-    </w:pPrDefault>
-  </w:docDefaults>
-  <w:latentStyles w:defLockedState="0" w:defUIPriority="99" w:defSemiHidden="1" w:defUnhideWhenUsed="1" w:defQFormat="0" w:count="267">
-    <w:lsdException w:name="Normal" w:semiHidden="0" w:uiPriority="0" w:unhideWhenUsed="0" w:qFormat="1"/>
-    <w:lsdException w:name="heading 1" w:semiHidden="0" w:uiPriority="9" w:unhideWhenUsed="0" w:qFormat="1"/>
-    <w:lsdException w:name="heading 2" w:uiPriority="9" w:qFormat="1"/>
-    <w:lsdException w:name="heading 3" w:uiPriority="9" w:qFormat="1"/>
-    <w:lsdException w:name="heading 4" w:uiPriority="9" w:qFormat="1"/>
-    <w:lsdException w:name="heading 5" w:uiPriority="9" w:qFormat="1"/>
-    <w:lsdException w:name="heading 6" w:uiPriority="9" w:qFormat="1"/>
-    <w:lsdException w:name="heading 7" w:uiPriority="9" w:qFormat="1"/>
-    <w:lsdException w:name="heading 8" w:uiPriority="9" w:qFormat="1"/>
-    <w:lsdException w:name="heading 9" w:uiPriority="9" w:qFormat="1"/>
-    <w:lsdException w:name="toc 1" w:uiPriority="39"/>
-    <w:lsdException w:name="toc 2" w:uiPriority="39"/>
-    <w:lsdException w:name="toc 3" w:uiPriority="39"/>
-    <w:lsdException w:name="toc 4" w:uiPriority="39"/>
-    <w:lsdException w:name="toc 5" w:uiPriority="39"/>
-    <w:lsdException w:name="toc 6" w:uiPriority="39"/>
-    <w:lsdException w:name="toc 7" w:uiPriority="39"/>
-    <w:lsdException w:name="toc 8" w:uiPriority="39"/>
-    <w:lsdException w:name="toc 9" w:uiPriority="39"/>
-    <w:lsdException w:name="caption" w:uiPriority="35" w:qFormat="1"/>
-    <w:lsdException w:name="Title" w:semiHidden="0" w:uiPriority="10" w:unhideWhenUsed="0" w:qFormat="1"/>
-    <w:lsdException w:name="Default Paragraph Font" w:uiPriority="1"/>
-    <w:lsdException w:name="Subtitle" w:semiHidden="0" w:uiPriority="11" w:unhideWhenUsed="0" w:qFormat="1"/>
-    <w:lsdException w:name="Strong" w:semiHidden="0" w:uiPriority="22" w:unhideWhenUsed="0" w:qFormat="1"/>
-    <w:lsdException w:name="Emphasis" w:semiHidden="0" w:uiPriority="20" w:unhideWhenUsed="0" w:qFormat="1"/>
-    <w:lsdException w:name="Table Grid" w:semiHidden="0" w:uiPriority="59" w:unhideWhenUsed="0"/>
-    <w:lsdException w:name="Placeholder Text" w:unhideWhenUsed="0"/>
-    <w:lsdException w:name="No Spacing" w:semiHidden="0" w:uiPriority="1" w:unhideWhenUsed="0" w:qFormat="1"/>
-    <w:lsdException w:name="Light Shading" w:semiHidden="0" w:uiPriority="60" w:unhideWhenUsed="0"/>
-    <w:lsdException w:name="Light List" w:semiHidden="0" w:uiPriority="61" w:unhideWhenUsed="0"/>
-    <w:lsdException w:name="Light Grid" w:semiHidden="0" w:uiPriority="62" w:unhideWhenUsed="0"/>
-    <w:lsdException w:name="Medium Shading 1" w:semiHidden="0" w:uiPriority="63" w:unhideWhenUsed="0"/>
-    <w:lsdException w:name="Medium Shading 2" w:semiHidden="0" w:uiPriority="64" w:unhideWhenUsed="0"/>
-    <w:lsdException w:name="Medium List 1" w:semiHidden="0" w:uiPriority="65" w:unhideWhenUsed="0"/>
-    <w:lsdException w:name="Medium List 2" w:semiHidden="0" w:uiPriority="66" w:unhideWhenUsed="0"/>
-    <w:lsdException w:name="Medium Grid 1" w:semiHidden="0" w:uiPriority="67" w:unhideWhenUsed="0"/>
-    <w:lsdException w:name="Medium Grid 2" w:semiHidden="0" w:uiPriority="68" w:unhideWhenUsed="0"/>
-    <w:lsdException w:name="Medium Grid 3" w:semiHidden="0" w:uiPriority="69" w:unhideWhenUsed="0"/>
-    <w:lsdException w:name="Dark List" w:semiHidden="0" w:uiPriority="70" w:unhideWhenUsed="0"/>
-    <w:lsdException w:name="Colorful Shading" w:semiHidden="0" w:uiPriority="71" w:unhideWhenUsed="0"/>
-    <w:lsdException w:name="Colorful List" w:semiHidden="0" w:uiPriority="72" w:unhideWhenUsed="0"/>
-    <w:lsdException w:name="Colorful Grid" w:semiHidden="0" w:uiPriority="73" w:unhideWhenUsed="0"/>
-    <w:lsdException w:name="Light Shading Accent 1" w:semiHidden="0" w:uiPriority="60" w:unhideWhenUsed="0"/>
-    <w:lsdException w:name="Light List Accent 1" w:semiHidden="0" w:uiPriority="61" w:unhideWhenUsed="0"/>
-    <w:lsdException w:name="Light Grid Accent 1" w:semiHidden="0" w:uiPriority="62" w:unhideWhenUsed="0"/>
-    <w:lsdException w:name="Medium Shading 1 Accent 1" w:semiHidden="0" w:uiPriority="63" w:unhideWhenUsed="0"/>
-    <w:lsdException w:name="Medium Shading 2 Accent 1" w:semiHidden="0" w:uiPriority="64" w:unhideWhenUsed="0"/>
-    <w:lsdException w:name="Medium List 1 Accent 1" w:semiHidden="0" w:uiPriority="65" w:unhideWhenUsed="0"/>
-    <w:lsdException w:name="Revision" w:unhideWhenUsed="0"/>
-    <w:lsdException w:name="List Paragraph" w:semiHidden="0" w:uiPriority="34" w:unhideWhenUsed="0" w:qFormat="1"/>
-    <w:lsdException w:name="Quote" w:semiHidden="0" w:uiPriority="29" w:unhideWhenUsed="0" w:qFormat="1"/>
-    <w:lsdException w:name="Intense Quote" w:semiHidden="0" w:uiPriority="30" w:unhideWhenUsed="0" w:qFormat="1"/>
-    <w:lsdException w:name="Medium List 2 Accent 1" w:semiHidden="0" w:uiPriority="66" w:unhideWhenUsed="0"/>
-    <w:lsdException w:name="Medium Grid 1 Accent 1" w:semiHidden="0" w:uiPriority="67" w:unhideWhenUsed="0"/>
-    <w:lsdException w:name="Medium Grid 2 Accent 1" w:semiHidden="0" w:uiPriority="68" w:unhideWhenUsed="0"/>
-    <w:lsdException w:name="Medium Grid 3 Accent 1" w:semiHidden="0" w:uiPriority="69" w:unhideWhenUsed="0"/>
-    <w:lsdException w:name="Dark List Accent 1" w:semiHidden="0" w:uiPriority="70" w:unhideWhenUsed="0"/>
-    <w:lsdException w:name="Colorful Shading Accent 1" w:semiHidden="0" w:uiPriority="71" w:unhideWhenUsed="0"/>
-    <w:lsdException w:name="Colorful List Accent 1" w:semiHidden="0" w:uiPriority="72" w:unhideWhenUsed="0"/>
-    <w:lsdException w:name="Colorful Grid Accent 1" w:semiHidden="0" w:uiPriority="73" w:unhideWhenUsed="0"/>
-    <w:lsdException w:name="Light Shading Accent 2" w:semiHidden="0" w:uiPriority="60" w:unhideWhenUsed="0"/>
-    <w:lsdException w:name="Light List Accent 2" w:semiHidden="0" w:uiPriority="61" w:unhideWhenUsed="0"/>
-    <w:lsdException w:name="Light Grid Accent 2" w:semiHidden="0" w:uiPriority="62" w:unhideWhenUsed="0"/>
-    <w:lsdException w:name="Medium Shading 1 Accent 2" w:semiHidden="0" w:uiPriority="63" w:unhideWhenUsed="0"/>
-    <w:lsdException w:name="Medium Shading 2 Accent 2" w:semiHidden="0" w:uiPriority="64" w:unhideWhenUsed="0"/>
-    <w:lsdException w:name="Medium List 1 Accent 2" w:semiHidden="0" w:uiPriority="65" w:unhideWhenUsed="0"/>
-    <w:lsdException w:name="Medium List 2 Accent 2" w:semiHidden="0" w:uiPriority="66" w:unhideWhenUsed="0"/>
-    <w:lsdException w:name="Medium Grid 1 Accent 2" w:semiHidden="0" w:uiPriority="67" w:unhideWhenUsed="0"/>
-    <w:lsdException w:name="Medium Grid 2 Accent 2" w:semiHidden="0" w:uiPriority="68" w:unhideWhenUsed="0"/>
-    <w:lsdException w:name="Medium Grid 3 Accent 2" w:semiHidden="0" w:uiPriority="69" w:unhideWhenUsed="0"/>
-    <w:lsdException w:name="Dark List Accent 2" w:semiHidden="0" w:uiPriority="70" w:unhideWhenUsed="0"/>
-    <w:lsdException w:name="Colorful Shading Accent 2" w:semiHidden="0" w:uiPriority="71" w:unhideWhenUsed="0"/>
-    <w:lsdException w:name="Colorful List Accent 2" w:semiHidden="0" w:uiPriority="72" w:unhideWhenUsed="0"/>
-    <w:lsdException w:name="Colorful Grid Accent 2" w:semiHidden="0" w:uiPriority="73" w:unhideWhenUsed="0"/>
-    <w:lsdException w:name="Light Shading Accent 3" w:semiHidden="0" w:uiPriority="60" w:unhideWhenUsed="0"/>
-    <w:lsdException w:name="Light List Accent 3" w:semiHidden="0" w:uiPriority="61" w:unhideWhenUsed="0"/>
-    <w:lsdException w:name="Light Grid Accent 3" w:semiHidden="0" w:uiPriority="62" w:unhideWhenUsed="0"/>
-    <w:lsdException w:name="Medium Shading 1 Accent 3" w:semiHidden="0" w:uiPriority="63" w:unhideWhenUsed="0"/>
-    <w:lsdException w:name="Medium Shading 2 Accent 3" w:semiHidden="0" w:uiPriority="64" w:unhideWhenUsed="0"/>
-    <w:lsdException w:name="Medium List 1 Accent 3" w:semiHidden="0" w:uiPriority="65" w:unhideWhenUsed="0"/>
-    <w:lsdException w:name="Medium List 2 Accent 3" w:semiHidden="0" w:uiPriority="66" w:unhideWhenUsed="0"/>
-    <w:lsdException w:name="Medium Grid 1 Accent 3" w:semiHidden="0" w:uiPriority="67" w:unhideWhenUsed="0"/>
-    <w:lsdException w:name="Medium Grid 2 Accent 3" w:semiHidden="0" w:uiPriority="68" w:unhideWhenUsed="0"/>
-    <w:lsdException w:name="Medium Grid 3 Accent 3" w:semiHidden="0" w:uiPriority="69" w:unhideWhenUsed="0"/>
-    <w:lsdException w:name="Dark List Accent 3" w:semiHidden="0" w:uiPriority="70" w:unhideWhenUsed="0"/>
-    <w:lsdException w:name="Colorful Shading Accent 3" w:semiHidden="0" w:uiPriority="71" w:unhideWhenUsed="0"/>
-    <w:lsdException w:name="Colorful List Accent 3" w:semiHidden="0" w:uiPriority="72" w:unhideWhenUsed="0"/>
-    <w:lsdException w:name="Colorful Grid Accent 3" w:semiHidden="0" w:uiPriority="73" w:unhideWhenUsed="0"/>
-    <w:lsdException w:name="Light Shading Accent 4" w:semiHidden="0" w:uiPriority="60" w:unhideWhenUsed="0"/>
-    <w:lsdException w:name="Light List Accent 4" w:semiHidden="0" w:uiPriority="61" w:unhideWhenUsed="0"/>
-    <w:lsdException w:name="Light Grid Accent 4" w:semiHidden="0" w:uiPriority="62" w:unhideWhenUsed="0"/>
-    <w:lsdException w:name="Medium Shading 1 Accent 4" w:semiHidden="0" w:uiPriority="63" w:unhideWhenUsed="0"/>
-    <w:lsdException w:name="Medium Shading 2 Accent 4" w:semiHidden="0" w:uiPriority="64" w:unhideWhenUsed="0"/>
-    <w:lsdException w:name="Medium List 1 Accent 4" w:semiHidden="0" w:uiPriority="65" w:unhideWhenUsed="0"/>
-    <w:lsdException w:name="Medium List 2 Accent 4" w:semiHidden="0" w:uiPriority="66" w:unhideWhenUsed="0"/>
-    <w:lsdException w:name="Medium Grid 1 Accent 4" w:semiHidden="0" w:uiPriority="67" w:unhideWhenUsed="0"/>
-    <w:lsdException w:name="Medium Grid 2 Accent 4" w:semiHidden="0" w:uiPriority="68" w:unhideWhenUsed="0"/>
-    <w:lsdException w:name="Medium Grid 3 Accent 4" w:semiHidden="0" w:uiPriority="69" w:unhideWhenUsed="0"/>
-    <w:lsdException w:name="Dark List Accent 4" w:semiHidden="0" w:uiPriority="70" w:unhideWhenUsed="0"/>
-    <w:lsdException w:name="Colorful Shading Accent 4" w:semiHidden="0" w:uiPriority="71" w:unhideWhenUsed="0"/>
-    <w:lsdException w:name="Colorful List Accent 4" w:semiHidden="0" w:uiPriority="72" w:unhideWhenUsed="0"/>
-    <w:lsdException w:name="Colorful Grid Accent 4" w:semiHidden="0" w:uiPriority="73" w:unhideWhenUsed="0"/>
-    <w:lsdException w:name="Light Shading Accent 5" w:semiHidden="0" w:uiPriority="60" w:unhideWhenUsed="0"/>
-    <w:lsdException w:name="Light List Accent 5" w:semiHidden="0" w:uiPriority="61" w:unhideWhenUsed="0"/>
-    <w:lsdException w:name="Light Grid Accent 5" w:semiHidden="0" w:uiPriority="62" w:unhideWhenUsed="0"/>
-    <w:lsdException w:name="Medium Shading 1 Accent 5" w:semiHidden="0" w:uiPriority="63" w:unhideWhenUsed="0"/>
-    <w:lsdException w:name="Medium Shading 2 Accent 5" w:semiHidden="0" w:uiPriority="64" w:unhideWhenUsed="0"/>
-    <w:lsdException w:name="Medium List 1 Accent 5" w:semiHidden="0" w:uiPriority="65" w:unhideWhenUsed="0"/>
-    <w:lsdException w:name="Medium List 2 Accent 5" w:semiHidden="0" w:uiPriority="66" w:unhideWhenUsed="0"/>
-    <w:lsdException w:name="Medium Grid 1 Accent 5" w:semiHidden="0" w:uiPriority="67" w:unhideWhenUsed="0"/>
-    <w:lsdException w:name="Medium Grid 2 Accent 5" w:semiHidden="0" w:uiPriority="68" w:unhideWhenUsed="0"/>
-    <w:lsdException w:name="Medium Grid 3 Accent 5" w:semiHidden="0" w:uiPriority="69" w:unhideWhenUsed="0"/>
-    <w:lsdException w:name="Dark List Accent 5" w:semiHidden="0" w:uiPriority="70" w:unhideWhenUsed="0"/>
-    <w:lsdException w:name="Colorful Shading Accent 5" w:semiHidden="0" w:uiPriority="71" w:unhideWhenUsed="0"/>
-    <w:lsdException w:name="Colorful List Accent 5" w:semiHidden="0" w:uiPriority="72" w:unhideWhenUsed="0"/>
-    <w:lsdException w:name="Colorful Grid Accent 5" w:semiHidden="0" w:uiPriority="73" w:unhideWhenUsed="0"/>
-    <w:lsdException w:name="Light Shading Accent 6" w:semiHidden="0" w:uiPriority="60" w:unhideWhenUsed="0"/>
-    <w:lsdException w:name="Light List Accent 6" w:semiHidden="0" w:uiPriority="61" w:unhideWhenUsed="0"/>
-    <w:lsdException w:name="Light Grid Accent 6" w:semiHidden="0" w:uiPriority="62" w:unhideWhenUsed="0"/>
-    <w:lsdException w:name="Medium Shading 1 Accent 6" w:semiHidden="0" w:uiPriority="63" w:unhideWhenUsed="0"/>
-    <w:lsdException w:name="Medium Shading 2 Accent 6" w:semiHidden="0" w:uiPriority="64" w:unhideWhenUsed="0"/>
-    <w:lsdException w:name="Medium List 1 Accent 6" w:semiHidden="0" w:uiPriority="65" w:unhideWhenUsed="0"/>
-    <w:lsdException w:name="Medium List 2 Accent 6" w:semiHidden="0" w:uiPriority="66" w:unhideWhenUsed="0"/>
-    <w:lsdException w:name="Medium Grid 1 Accent 6" w:semiHidden="0" w:uiPriority="67" w:unhideWhenUsed="0"/>
-    <w:lsdException w:name="Medium Grid 2 Accent 6" w:semiHidden="0" w:uiPriority="68" w:unhideWhenUsed="0"/>
-    <w:lsdException w:name="Medium Grid 3 Accent 6" w:semiHidden="0" w:uiPriority="69" w:unhideWhenUsed="0"/>
-    <w:lsdException w:name="Dark List Accent 6" w:semiHidden="0" w:uiPriority="70" w:unhideWhenUsed="0"/>
-    <w:lsdException w:name="Colorful Shading Accent 6" w:semiHidden="0" w:uiPriority="71" w:unhideWhenUsed="0"/>
-    <w:lsdException w:name="Colorful List Accent 6" w:semiHidden="0" w:uiPriority="72" w:unhideWhenUsed="0"/>
-    <w:lsdException w:name="Colorful Grid Accent 6" w:semiHidden="0" w:uiPriority="73" w:unhideWhenUsed="0"/>
-    <w:lsdException w:name="Subtle Emphasis" w:semiHidden="0" w:uiPriority="19" w:unhideWhenUsed="0" w:qFormat="1"/>
-    <w:lsdException w:name="Intense Emphasis" w:semiHidden="0" w:uiPriority="21" w:unhideWhenUsed="0" w:qFormat="1"/>
-    <w:lsdException w:name="Subtle Reference" w:semiHidden="0" w:uiPriority="31" w:unhideWhenUsed="0" w:qFormat="1"/>
-    <w:lsdException w:name="Intense Reference" w:semiHidden="0" w:uiPriority="32" w:unhideWhenUsed="0" w:qFormat="1"/>
-    <w:lsdException w:name="Book Title" w:semiHidden="0" w:uiPriority="33" w:unhideWhenUsed="0" w:qFormat="1"/>
-    <w:lsdException w:name="Bibliography" w:uiPriority="37"/>
-    <w:lsdException w:name="TOC Heading" w:uiPriority="39" w:qFormat="1"/>
+  <w:latentStyles w:defLockedState="0" w:defUIPriority="99" w:defSemiHidden="0" w:defUnhideWhenUsed="0" w:defQFormat="0" w:count="376">
+    <w:lsdException w:name="Normal" w:uiPriority="0" w:qFormat="1"/>
+    <w:lsdException w:name="heading 1" w:uiPriority="9" w:qFormat="1"/>
+    <w:lsdException w:name="heading 2" w:semiHidden="1" w:uiPriority="9" w:unhideWhenUsed="1" w:qFormat="1"/>
+    <w:lsdException w:name="heading 3" w:semiHidden="1" w:uiPriority="9" w:unhideWhenUsed="1" w:qFormat="1"/>
+    <w:lsdException w:name="heading 4" w:semiHidden="1" w:uiPriority="9" w:unhideWhenUsed="1" w:qFormat="1"/>
+    <w:lsdException w:name="heading 5" w:semiHidden="1" w:uiPriority="9" w:unhideWhenUsed="1" w:qFormat="1"/>
+    <w:lsdException w:name="heading 6" w:semiHidden="1" w:uiPriority="9" w:unhideWhenUsed="1" w:qFormat="1"/>
+    <w:lsdException w:name="heading 7" w:semiHidden="1" w:uiPriority="9" w:unhideWhenUsed="1" w:qFormat="1"/>
+    <w:lsdException w:name="heading 8" w:semiHidden="1" w:uiPriority="9" w:unhideWhenUsed="1" w:qFormat="1"/>
+    <w:lsdException w:name="heading 9" w:semiHidden="1" w:uiPriority="9" w:unhideWhenUsed="1" w:qFormat="1"/>
+    <w:lsdException w:name="index 1" w:semiHidden="1" w:unhideWhenUsed="1"/>
+    <w:lsdException w:name="index 2" w:semiHidden="1" w:unhideWhenUsed="1"/>
+    <w:lsdException w:name="index 3" w:semiHidden="1" w:unhideWhenUsed="1"/>
+    <w:lsdException w:name="index 4" w:semiHidden="1" w:unhideWhenUsed="1"/>
+    <w:lsdException w:name="index 5" w:semiHidden="1" w:unhideWhenUsed="1"/>
+    <w:lsdException w:name="index 6" w:semiHidden="1" w:unhideWhenUsed="1"/>
+    <w:lsdException w:name="index 7" w:semiHidden="1" w:unhideWhenUsed="1"/>
+    <w:lsdException w:name="index 8" w:semiHidden="1" w:unhideWhenUsed="1"/>
+    <w:lsdException w:name="index 9" w:semiHidden="1" w:unhideWhenUsed="1"/>
+    <w:lsdException w:name="toc 1" w:semiHidden="1" w:uiPriority="39" w:unhideWhenUsed="1"/>
+    <w:lsdException w:name="toc 2" w:semiHidden="1" w:uiPriority="39" w:unhideWhenUsed="1"/>
+    <w:lsdException w:name="toc 3" w:semiHidden="1" w:uiPriority="39" w:unhideWhenUsed="1"/>
+    <w:lsdException w:name="toc 4" w:semiHidden="1" w:uiPriority="39" w:unhideWhenUsed="1"/>
+    <w:lsdException w:name="toc 5" w:semiHidden="1" w:uiPriority="39" w:unhideWhenUsed="1"/>
+    <w:lsdException w:name="toc 6" w:semiHidden="1" w:uiPriority="39" w:unhideWhenUsed="1"/>
+    <w:lsdException w:name="toc 7" w:semiHidden="1" w:uiPriority="39" w:unhideWhenUsed="1"/>
+    <w:lsdException w:name="toc 8" w:semiHidden="1" w:uiPriority="39" w:unhideWhenUsed="1"/>
+    <w:lsdException w:name="toc 9" w:semiHidden="1" w:uiPriority="39" w:unhideWhenUsed="1"/>
+    <w:lsdException w:name="Normal Indent" w:semiHidden="1" w:unhideWhenUsed="1"/>
+    <w:lsdException w:name="footnote text" w:semiHidden="1" w:unhideWhenUsed="1"/>
+    <w:lsdException w:name="annotation text" w:semiHidden="1" w:unhideWhenUsed="1"/>
+    <w:lsdException w:name="header" w:semiHidden="1" w:unhideWhenUsed="1"/>
+    <w:lsdException w:name="footer" w:semiHidden="1" w:unhideWhenUsed="1"/>
+    <w:lsdException w:name="index heading" w:semiHidden="1" w:unhideWhenUsed="1"/>
+    <w:lsdException w:name="caption" w:semiHidden="1" w:uiPriority="35" w:unhideWhenUsed="1" w:qFormat="1"/>
+    <w:lsdException w:name="table of figures" w:semiHidden="1" w:unhideWhenUsed="1"/>
+    <w:lsdException w:name="envelope address" w:semiHidden="1" w:unhideWhenUsed="1"/>
+    <w:lsdException w:name="envelope return" w:semiHidden="1" w:unhideWhenUsed="1"/>
+    <w:lsdException w:name="footnote reference" w:semiHidden="1" w:unhideWhenUsed="1"/>
+    <w:lsdException w:name="annotation reference" w:semiHidden="1" w:unhideWhenUsed="1"/>
+    <w:lsdException w:name="line number" w:semiHidden="1" w:unhideWhenUsed="1"/>
+    <w:lsdException w:name="page number" w:semiHidden="1" w:unhideWhenUsed="1"/>
+    <w:lsdException w:name="endnote reference" w:semiHidden="1" w:unhideWhenUsed="1"/>
+    <w:lsdException w:name="endnote text" w:semiHidden="1" w:unhideWhenUsed="1"/>
+    <w:lsdException w:name="table of authorities" w:semiHidden="1" w:unhideWhenUsed="1"/>
+    <w:lsdException w:name="macro" w:semiHidden="1" w:unhideWhenUsed="1"/>
+    <w:lsdException w:name="toa heading" w:semiHidden="1" w:unhideWhenUsed="1"/>
+    <w:lsdException w:name="List" w:semiHidden="1" w:unhideWhenUsed="1"/>
+    <w:lsdException w:name="List Bullet" w:semiHidden="1" w:unhideWhenUsed="1"/>
+    <w:lsdException w:name="List Number" w:semiHidden="1" w:unhideWhenUsed="1"/>
+    <w:lsdException w:name="List 2" w:semiHidden="1" w:unhideWhenUsed="1"/>
+    <w:lsdException w:name="List 3" w:semiHidden="1" w:unhideWhenUsed="1"/>
+    <w:lsdException w:name="List 4" w:semiHidden="1" w:unhideWhenUsed="1"/>
+    <w:lsdException w:name="List 5" w:semiHidden="1" w:unhideWhenUsed="1"/>
+    <w:lsdException w:name="List Bullet 2" w:semiHidden="1" w:unhideWhenUsed="1"/>
+    <w:lsdException w:name="List Bullet 3" w:semiHidden="1" w:unhideWhenUsed="1"/>
+    <w:lsdException w:name="List Bullet 4" w:semiHidden="1" w:unhideWhenUsed="1"/>
+    <w:lsdException w:name="List Bullet 5" w:semiHidden="1" w:unhideWhenUsed="1"/>
+    <w:lsdException w:name="List Number 2" w:semiHidden="1" w:unhideWhenUsed="1"/>
+    <w:lsdException w:name="List Number 3" w:semiHidden="1" w:unhideWhenUsed="1"/>
+    <w:lsdException w:name="List Number 4" w:semiHidden="1" w:unhideWhenUsed="1"/>
+    <w:lsdException w:name="List Number 5" w:semiHidden="1" w:unhideWhenUsed="1"/>
+    <w:lsdException w:name="Title" w:uiPriority="10" w:qFormat="1"/>
+    <w:lsdException w:name="Closing" w:semiHidden="1" w:unhideWhenUsed="1"/>
+    <w:lsdException w:name="Signature" w:semiHidden="1" w:unhideWhenUsed="1"/>
+    <w:lsdException w:name="Default Paragraph Font" w:semiHidden="1" w:uiPriority="1" w:unhideWhenUsed="1"/>
+    <w:lsdException w:name="Body Text" w:semiHidden="1" w:unhideWhenUsed="1"/>
+    <w:lsdException w:name="Body Text Indent" w:semiHidden="1" w:unhideWhenUsed="1"/>
+    <w:lsdException w:name="List Continue" w:semiHidden="1" w:unhideWhenUsed="1"/>
+    <w:lsdException w:name="List Continue 2" w:semiHidden="1" w:unhideWhenUsed="1"/>
+    <w:lsdException w:name="List Continue 3" w:semiHidden="1" w:unhideWhenUsed="1"/>
+    <w:lsdException w:name="List Continue 4" w:semiHidden="1" w:unhideWhenUsed="1"/>
+    <w:lsdException w:name="List Continue 5" w:semiHidden="1" w:unhideWhenUsed="1"/>
+    <w:lsdException w:name="Message Header" w:semiHidden="1" w:unhideWhenUsed="1"/>
+    <w:lsdException w:name="Subtitle" w:uiPriority="11" w:qFormat="1"/>
+    <w:lsdException w:name="Salutation" w:semiHidden="1" w:unhideWhenUsed="1"/>
+    <w:lsdException w:name="Date" w:semiHidden="1" w:unhideWhenUsed="1"/>
+    <w:lsdException w:name="Body Text First Indent" w:semiHidden="1" w:unhideWhenUsed="1"/>
+    <w:lsdException w:name="Body Text First Indent 2" w:semiHidden="1" w:unhideWhenUsed="1"/>
+    <w:lsdException w:name="Note Heading" w:semiHidden="1" w:unhideWhenUsed="1"/>
+    <w:lsdException w:name="Body Text 2" w:semiHidden="1" w:unhideWhenUsed="1"/>
+    <w:lsdException w:name="Body Text 3" w:semiHidden="1" w:unhideWhenUsed="1"/>
+    <w:lsdException w:name="Body Text Indent 2" w:semiHidden="1" w:unhideWhenUsed="1"/>
+    <w:lsdException w:name="Body Text Indent 3" w:semiHidden="1" w:unhideWhenUsed="1"/>
+    <w:lsdException w:name="Block Text" w:semiHidden="1" w:unhideWhenUsed="1"/>
+    <w:lsdException w:name="Hyperlink" w:semiHidden="1" w:unhideWhenUsed="1"/>
+    <w:lsdException w:name="FollowedHyperlink" w:semiHidden="1" w:unhideWhenUsed="1"/>
+    <w:lsdException w:name="Strong" w:uiPriority="22" w:qFormat="1"/>
+    <w:lsdException w:name="Emphasis" w:uiPriority="20" w:qFormat="1"/>
+    <w:lsdException w:name="Document Map" w:semiHidden="1" w:unhideWhenUsed="1"/>
+    <w:lsdException w:name="Plain Text" w:semiHidden="1" w:unhideWhenUsed="1"/>
+    <w:lsdException w:name="E-mail Signature" w:semiHidden="1" w:unhideWhenUsed="1"/>
+    <w:lsdException w:name="HTML Top of Form" w:semiHidden="1" w:unhideWhenUsed="1"/>
+    <w:lsdException w:name="HTML Bottom of Form" w:semiHidden="1" w:unhideWhenUsed="1"/>
+    <w:lsdException w:name="Normal (Web)" w:semiHidden="1" w:unhideWhenUsed="1"/>
+    <w:lsdException w:name="HTML Acronym" w:semiHidden="1" w:unhideWhenUsed="1"/>
+    <w:lsdException w:name="HTML Address" w:semiHidden="1" w:unhideWhenUsed="1"/>
+    <w:lsdException w:name="HTML Cite" w:semiHidden="1" w:unhideWhenUsed="1"/>
+    <w:lsdException w:name="HTML Code" w:semiHidden="1" w:unhideWhenUsed="1"/>
+    <w:lsdException w:name="HTML Definition" w:semiHidden="1" w:unhideWhenUsed="1"/>
+    <w:lsdException w:name="HTML Keyboard" w:semiHidden="1" w:unhideWhenUsed="1"/>
+    <w:lsdException w:name="HTML Preformatted" w:semiHidden="1" w:unhideWhenUsed="1"/>
+    <w:lsdException w:name="HTML Sample" w:semiHidden="1" w:unhideWhenUsed="1"/>
+    <w:lsdException w:name="HTML Typewriter" w:semiHidden="1" w:unhideWhenUsed="1"/>
+    <w:lsdException w:name="HTML Variable" w:semiHidden="1" w:unhideWhenUsed="1"/>
+    <w:lsdException w:name="Normal Table" w:semiHidden="1" w:unhideWhenUsed="1"/>
+    <w:lsdException w:name="annotation subject" w:semiHidden="1" w:unhideWhenUsed="1"/>
+    <w:lsdException w:name="No List" w:semiHidden="1" w:unhideWhenUsed="1"/>
+    <w:lsdException w:name="Outline List 1" w:semiHidden="1" w:unhideWhenUsed="1"/>
+    <w:lsdException w:name="Outline List 2" w:semiHidden="1" w:unhideWhenUsed="1"/>
+    <w:lsdException w:name="Outline List 3" w:semiHidden="1" w:unhideWhenUsed="1"/>
+    <w:lsdException w:name="Table Simple 1" w:semiHidden="1" w:unhideWhenUsed="1"/>
+    <w:lsdException w:name="Table Simple 2" w:semiHidden="1" w:unhideWhenUsed="1"/>
+    <w:lsdException w:name="Table Simple 3" w:semiHidden="1" w:unhideWhenUsed="1"/>
+    <w:lsdException w:name="Table Classic 1" w:semiHidden="1" w:unhideWhenUsed="1"/>
+    <w:lsdException w:name="Table Classic 2" w:semiHidden="1" w:unhideWhenUsed="1"/>
+    <w:lsdException w:name="Table Classic 3" w:semiHidden="1" w:unhideWhenUsed="1"/>
+    <w:lsdException w:name="Table Classic 4" w:semiHidden="1" w:unhideWhenUsed="1"/>
+    <w:lsdException w:name="Table Colorful 1" w:semiHidden="1" w:unhideWhenUsed="1"/>
+    <w:lsdException w:name="Table Colorful 2" w:semiHidden="1" w:unhideWhenUsed="1"/>
+    <w:lsdException w:name="Table Colorful 3" w:semiHidden="1" w:unhideWhenUsed="1"/>
+    <w:lsdException w:name="Table Columns 1" w:semiHidden="1" w:unhideWhenUsed="1"/>
+    <w:lsdException w:name="Table Columns 2" w:semiHidden="1" w:unhideWhenUsed="1"/>
+    <w:lsdException w:name="Table Columns 3" w:semiHidden="1" w:unhideWhenUsed="1"/>
+    <w:lsdException w:name="Table Columns 4" w:semiHidden="1" w:unhideWhenUsed="1"/>
+    <w:lsdException w:name="Table Columns 5" w:semiHidden="1" w:unhideWhenUsed="1"/>
+    <w:lsdException w:name="Table Grid 1" w:semiHidden="1" w:unhideWhenUsed="1"/>
+    <w:lsdException w:name="Table Grid 2" w:semiHidden="1" w:unhideWhenUsed="1"/>
+    <w:lsdException w:name="Table Grid 3" w:semiHidden="1" w:unhideWhenUsed="1"/>
+    <w:lsdException w:name="Table Grid 4" w:semiHidden="1" w:unhideWhenUsed="1"/>
+    <w:lsdException w:name="Table Grid 5" w:semiHidden="1" w:unhideWhenUsed="1"/>
+    <w:lsdException w:name="Table Grid 6" w:semiHidden="1" w:unhideWhenUsed="1"/>
+    <w:lsdException w:name="Table Grid 7" w:semiHidden="1" w:unhideWhenUsed="1"/>
+    <w:lsdException w:name="Table Grid 8" w:semiHidden="1" w:unhideWhenUsed="1"/>
+    <w:lsdException w:name="Table List 1" w:semiHidden="1" w:unhideWhenUsed="1"/>
+    <w:lsdException w:name="Table List 2" w:semiHidden="1" w:unhideWhenUsed="1"/>
+    <w:lsdException w:name="Table List 3" w:semiHidden="1" w:unhideWhenUsed="1"/>
+    <w:lsdException w:name="Table List 4" w:semiHidden="1" w:unhideWhenUsed="1"/>
+    <w:lsdException w:name="Table List 5" w:semiHidden="1" w:unhideWhenUsed="1"/>
+    <w:lsdException w:name="Table List 6" w:semiHidden="1" w:unhideWhenUsed="1"/>
+    <w:lsdException w:name="Table List 7" w:semiHidden="1" w:unhideWhenUsed="1"/>
+    <w:lsdException w:name="Table List 8" w:semiHidden="1" w:unhideWhenUsed="1"/>
+    <w:lsdException w:name="Table 3D effects 1" w:semiHidden="1" w:unhideWhenUsed="1"/>
+    <w:lsdException w:name="Table 3D effects 2" w:semiHidden="1" w:unhideWhenUsed="1"/>
+    <w:lsdException w:name="Table 3D effects 3" w:semiHidden="1" w:unhideWhenUsed="1"/>
+    <w:lsdException w:name="Table Contemporary" w:semiHidden="1" w:unhideWhenUsed="1"/>
+    <w:lsdException w:name="Table Elegant" w:semiHidden="1" w:unhideWhenUsed="1"/>
+    <w:lsdException w:name="Table Professional" w:semiHidden="1" w:unhideWhenUsed="1"/>
+    <w:lsdException w:name="Table Subtle 1" w:semiHidden="1" w:unhideWhenUsed="1"/>
+    <w:lsdException w:name="Table Subtle 2" w:semiHidden="1" w:unhideWhenUsed="1"/>
+    <w:lsdException w:name="Table Web 1" w:semiHidden="1" w:unhideWhenUsed="1"/>
+    <w:lsdException w:name="Table Web 2" w:semiHidden="1" w:unhideWhenUsed="1"/>
+    <w:lsdException w:name="Table Web 3" w:semiHidden="1" w:unhideWhenUsed="1"/>
+    <w:lsdException w:name="Balloon Text" w:semiHidden="1" w:unhideWhenUsed="1"/>
+    <w:lsdException w:name="Table Grid" w:uiPriority="59"/>
+    <w:lsdException w:name="Table Theme" w:semiHidden="1" w:unhideWhenUsed="1"/>
+    <w:lsdException w:name="Placeholder Text" w:semiHidden="1"/>
+    <w:lsdException w:name="No Spacing" w:uiPriority="1" w:qFormat="1"/>
+    <w:lsdException w:name="Light Shading" w:uiPriority="60"/>
+    <w:lsdException w:name="Light List" w:uiPriority="61"/>
+    <w:lsdException w:name="Light Grid" w:uiPriority="62"/>
+    <w:lsdException w:name="Medium Shading 1" w:uiPriority="63"/>
+    <w:lsdException w:name="Medium Shading 2" w:uiPriority="64"/>
+    <w:lsdException w:name="Medium List 1" w:uiPriority="65"/>
+    <w:lsdException w:name="Medium List 2" w:uiPriority="66"/>
+    <w:lsdException w:name="Medium Grid 1" w:uiPriority="67"/>
+    <w:lsdException w:name="Medium Grid 2" w:uiPriority="68"/>
+    <w:lsdException w:name="Medium Grid 3" w:uiPriority="69"/>
+    <w:lsdException w:name="Dark List" w:uiPriority="70"/>
+    <w:lsdException w:name="Colorful Shading" w:uiPriority="71"/>
+    <w:lsdException w:name="Colorful List" w:uiPriority="72"/>
+    <w:lsdException w:name="Colorful Grid" w:uiPriority="73"/>
+    <w:lsdException w:name="Light Shading Accent 1" w:uiPriority="60"/>
+    <w:lsdException w:name="Light List Accent 1" w:uiPriority="61"/>
+    <w:lsdException w:name="Light Grid Accent 1" w:uiPriority="62"/>
+    <w:lsdException w:name="Medium Shading 1 Accent 1" w:uiPriority="63"/>
+    <w:lsdException w:name="Medium Shading 2 Accent 1" w:uiPriority="64"/>
+    <w:lsdException w:name="Medium List 1 Accent 1" w:uiPriority="65"/>
+    <w:lsdException w:name="Revision" w:semiHidden="1"/>
+    <w:lsdException w:name="List Paragraph" w:uiPriority="34" w:qFormat="1"/>
+    <w:lsdException w:name="Quote" w:uiPriority="29" w:qFormat="1"/>
+    <w:lsdException w:name="Intense Quote" w:uiPriority="30" w:qFormat="1"/>
+    <w:lsdException w:name="Medium List 2 Accent 1" w:uiPriority="66"/>
+    <w:lsdException w:name="Medium Grid 1 Accent 1" w:uiPriority="67"/>
+    <w:lsdException w:name="Medium Grid 2 Accent 1" w:uiPriority="68"/>
+    <w:lsdException w:name="Medium Grid 3 Accent 1" w:uiPriority="69"/>
+    <w:lsdException w:name="Dark List Accent 1" w:uiPriority="70"/>
+    <w:lsdException w:name="Colorful Shading Accent 1" w:uiPriority="71"/>
+    <w:lsdException w:name="Colorful List Accent 1" w:uiPriority="72"/>
+    <w:lsdException w:name="Colorful Grid Accent 1" w:uiPriority="73"/>
+    <w:lsdException w:name="Light Shading Accent 2" w:uiPriority="60"/>
+    <w:lsdException w:name="Light List Accent 2" w:uiPriority="61"/>
+    <w:lsdException w:name="Light Grid Accent 2" w:uiPriority="62"/>
+    <w:lsdException w:name="Medium Shading 1 Accent 2" w:uiPriority="63"/>
+    <w:lsdException w:name="Medium Shading 2 Accent 2" w:uiPriority="64"/>
+    <w:lsdException w:name="Medium List 1 Accent 2" w:uiPriority="65"/>
+    <w:lsdException w:name="Medium List 2 Accent 2" w:uiPriority="66"/>
+    <w:lsdException w:name="Medium Grid 1 Accent 2" w:uiPriority="67"/>
+    <w:lsdException w:name="Medium Grid 2 Accent 2" w:uiPriority="68"/>
+    <w:lsdException w:name="Medium Grid 3 Accent 2" w:uiPriority="69"/>
+    <w:lsdException w:name="Dark List Accent 2" w:uiPriority="70"/>
+    <w:lsdException w:name="Colorful Shading Accent 2" w:uiPriority="71"/>
+    <w:lsdException w:name="Colorful List Accent 2" w:uiPriority="72"/>
+    <w:lsdException w:name="Colorful Grid Accent 2" w:uiPriority="73"/>
+    <w:lsdException w:name="Light Shading Accent 3" w:uiPriority="60"/>
+    <w:lsdException w:name="Light List Accent 3" w:uiPriority="61"/>
+    <w:lsdException w:name="Light Grid Accent 3" w:uiPriority="62"/>
+    <w:lsdException w:name="Medium Shading 1 Accent 3" w:uiPriority="63"/>
+    <w:lsdException w:name="Medium Shading 2 Accent 3" w:uiPriority="64"/>
+    <w:lsdException w:name="Medium List 1 Accent 3" w:uiPriority="65"/>
+    <w:lsdException w:name="Medium List 2 Accent 3" w:uiPriority="66"/>
+    <w:lsdException w:name="Medium Grid 1 Accent 3" w:uiPriority="67"/>
+    <w:lsdException w:name="Medium Grid 2 Accent 3" w:uiPriority="68"/>
+    <w:lsdException w:name="Medium Grid 3 Accent 3" w:uiPriority="69"/>
+    <w:lsdException w:name="Dark List Accent 3" w:uiPriority="70"/>
+    <w:lsdException w:name="Colorful Shading Accent 3" w:uiPriority="71"/>
+    <w:lsdException w:name="Colorful List Accent 3" w:uiPriority="72"/>
+    <w:lsdException w:name="Colorful Grid Accent 3" w:uiPriority="73"/>
+    <w:lsdException w:name="Light Shading Accent 4" w:uiPriority="60"/>
+    <w:lsdException w:name="Light List Accent 4" w:uiPriority="61"/>
+    <w:lsdException w:name="Light Grid Accent 4" w:uiPriority="62"/>
+    <w:lsdException w:name="Medium Shading 1 Accent 4" w:uiPriority="63"/>
+    <w:lsdException w:name="Medium Shading 2 Accent 4" w:uiPriority="64"/>
+    <w:lsdException w:name="Medium List 1 Accent 4" w:uiPriority="65"/>
+    <w:lsdException w:name="Medium List 2 Accent 4" w:uiPriority="66"/>
+    <w:lsdException w:name="Medium Grid 1 Accent 4" w:uiPriority="67"/>
+    <w:lsdException w:name="Medium Grid 2 Accent 4" w:uiPriority="68"/>
+    <w:lsdException w:name="Medium Grid 3 Accent 4" w:uiPriority="69"/>
+    <w:lsdException w:name="Dark List Accent 4" w:uiPriority="70"/>
+    <w:lsdException w:name="Colorful Shading Accent 4" w:uiPriority="71"/>
+    <w:lsdException w:name="Colorful List Accent 4" w:uiPriority="72"/>
+    <w:lsdException w:name="Colorful Grid Accent 4" w:uiPriority="73"/>
+    <w:lsdException w:name="Light Shading Accent 5" w:uiPriority="60"/>
+    <w:lsdException w:name="Light List Accent 5" w:uiPriority="61"/>
+    <w:lsdException w:name="Light Grid Accent 5" w:uiPriority="62"/>
+    <w:lsdException w:name="Medium Shading 1 Accent 5" w:uiPriority="63"/>
+    <w:lsdException w:name="Medium Shading 2 Accent 5" w:uiPriority="64"/>
+    <w:lsdException w:name="Medium List 1 Accent 5" w:uiPriority="65"/>
+    <w:lsdException w:name="Medium List 2 Accent 5" w:uiPriority="66"/>
+    <w:lsdException w:name="Medium Grid 1 Accent 5" w:uiPriority="67"/>
+    <w:lsdException w:name="Medium Grid 2 Accent 5" w:uiPriority="68"/>
+    <w:lsdException w:name="Medium Grid 3 Accent 5" w:uiPriority="69"/>
+    <w:lsdException w:name="Dark List Accent 5" w:uiPriority="70"/>
+    <w:lsdException w:name="Colorful Shading Accent 5" w:uiPriority="71"/>
+    <w:lsdException w:name="Colorful List Accent 5" w:uiPriority="72"/>
+    <w:lsdException w:name="Colorful Grid Accent 5" w:uiPriority="73"/>
+    <w:lsdException w:name="Light Shading Accent 6" w:uiPriority="60"/>
+    <w:lsdException w:name="Light List Accent 6" w:uiPriority="61"/>
+    <w:lsdException w:name="Light Grid Accent 6" w:uiPriority="62"/>
+    <w:lsdException w:name="Medium Shading 1 Accent 6" w:uiPriority="63"/>
+    <w:lsdException w:name="Medium Shading 2 Accent 6" w:uiPriority="64"/>
+    <w:lsdException w:name="Medium List 1 Accent 6" w:uiPriority="65"/>
+    <w:lsdException w:name="Medium List 2 Accent 6" w:uiPriority="66"/>
+    <w:lsdException w:name="Medium Grid 1 Accent 6" w:uiPriority="67"/>
+    <w:lsdException w:name="Medium Grid 2 Accent 6" w:uiPriority="68"/>
+    <w:lsdException w:name="Medium Grid 3 Accent 6" w:uiPriority="69"/>
+    <w:lsdException w:name="Dark List Accent 6" w:uiPriority="70"/>
+    <w:lsdException w:name="Colorful Shading Accent 6" w:uiPriority="71"/>
+    <w:lsdException w:name="Colorful List Accent 6" w:uiPriority="72"/>
+    <w:lsdException w:name="Colorful Grid Accent 6" w:uiPriority="73"/>
+    <w:lsdException w:name="Subtle Emphasis" w:uiPriority="19" w:qFormat="1"/>
+    <w:lsdException w:name="Intense Emphasis" w:uiPriority="21" w:qFormat="1"/>
+    <w:lsdException w:name="Subtle Reference" w:uiPriority="31" w:qFormat="1"/>
+    <w:lsdException w:name="Intense Reference" w:uiPriority="32" w:qFormat="1"/>
+    <w:lsdException w:name="Book Title" w:uiPriority="33" w:qFormat="1"/>
+    <w:lsdException w:name="Bibliography" w:semiHidden="1" w:uiPriority="37" w:unhideWhenUsed="1"/>
+    <w:lsdException w:name="TOC Heading" w:semiHidden="1" w:uiPriority="39" w:unhideWhenUsed="1" w:qFormat="1"/>
+    <w:lsdException w:name="Plain Table 1" w:uiPriority="41"/>
+    <w:lsdException w:name="Plain Table 2" w:uiPriority="42"/>
+    <w:lsdException w:name="Plain Table 3" w:uiPriority="43"/>
+    <w:lsdException w:name="Plain Table 4" w:uiPriority="44"/>
+    <w:lsdException w:name="Plain Table 5" w:uiPriority="45"/>
+    <w:lsdException w:name="Grid Table Light" w:uiPriority="40"/>
+    <w:lsdException w:name="Grid Table 1 Light" w:uiPriority="46"/>
+    <w:lsdException w:name="Grid Table 2" w:uiPriority="47"/>
+    <w:lsdException w:name="Grid Table 3" w:uiPriority="48"/>
+    <w:lsdException w:name="Grid Table 4" w:uiPriority="49"/>
+    <w:lsdException w:name="Grid Table 5 Dark" w:uiPriority="50"/>
+    <w:lsdException w:name="Grid Table 6 Colorful" w:uiPriority="51"/>
+    <w:lsdException w:name="Grid Table 7 Colorful" w:uiPriority="52"/>
+    <w:lsdException w:name="Grid Table 1 Light Accent 1" w:uiPriority="46"/>
+    <w:lsdException w:name="Grid Table 2 Accent 1" w:uiPriority="47"/>
+    <w:lsdException w:name="Grid Table 3 Accent 1" w:uiPriority="48"/>
+    <w:lsdException w:name="Grid Table 4 Accent 1" w:uiPriority="49"/>
+    <w:lsdException w:name="Grid Table 5 Dark Accent 1" w:uiPriority="50"/>
+    <w:lsdException w:name="Grid Table 6 Colorful Accent 1" w:uiPriority="51"/>
+    <w:lsdException w:name="Grid Table 7 Colorful Accent 1" w:uiPriority="52"/>
+    <w:lsdException w:name="Grid Table 1 Light Accent 2" w:uiPriority="46"/>
+    <w:lsdException w:name="Grid Table 2 Accent 2" w:uiPriority="47"/>
+    <w:lsdException w:name="Grid Table 3 Accent 2" w:uiPriority="48"/>
+    <w:lsdException w:name="Grid Table 4 Accent 2" w:uiPriority="49"/>
+    <w:lsdException w:name="Grid Table 5 Dark Accent 2" w:uiPriority="50"/>
+    <w:lsdException w:name="Grid Table 6 Colorful Accent 2" w:uiPriority="51"/>
+    <w:lsdException w:name="Grid Table 7 Colorful Accent 2" w:uiPriority="52"/>
+    <w:lsdException w:name="Grid Table 1 Light Accent 3" w:uiPriority="46"/>
+    <w:lsdException w:name="Grid Table 2 Accent 3" w:uiPriority="47"/>
+    <w:lsdException w:name="Grid Table 3 Accent 3" w:uiPriority="48"/>
+    <w:lsdException w:name="Grid Table 4 Accent 3" w:uiPriority="49"/>
+    <w:lsdException w:name="Grid Table 5 Dark Accent 3" w:uiPriority="50"/>
+    <w:lsdException w:name="Grid Table 6 Colorful Accent 3" w:uiPriority="51"/>
+    <w:lsdException w:name="Grid Table 7 Colorful Accent 3" w:uiPriority="52"/>
+    <w:lsdException w:name="Grid Table 1 Light Accent 4" w:uiPriority="46"/>
+    <w:lsdException w:name="Grid Table 2 Accent 4" w:uiPriority="47"/>
+    <w:lsdException w:name="Grid Table 3 Accent 4" w:uiPriority="48"/>
+    <w:lsdException w:name="Grid Table 4 Accent 4" w:uiPriority="49"/>
+    <w:lsdException w:name="Grid Table 5 Dark Accent 4" w:uiPriority="50"/>
+    <w:lsdException w:name="Grid Table 6 Colorful Accent 4" w:uiPriority="51"/>
+    <w:lsdException w:name="Grid Table 7 Colorful Accent 4" w:uiPriority="52"/>
+    <w:lsdException w:name="Grid Table 1 Light Accent 5" w:uiPriority="46"/>
+    <w:lsdException w:name="Grid Table 2 Accent 5" w:uiPriority="47"/>
+    <w:lsdException w:name="Grid Table 3 Accent 5" w:uiPriority="48"/>
+    <w:lsdException w:name="Grid Table 4 Accent 5" w:uiPriority="49"/>
+    <w:lsdException w:name="Grid Table 5 Dark Accent 5" w:uiPriority="50"/>
+    <w:lsdException w:name="Grid Table 6 Colorful Accent 5" w:uiPriority="51"/>
+    <w:lsdException w:name="Grid Table 7 Colorful Accent 5" w:uiPriority="52"/>
+    <w:lsdException w:name="Grid Table 1 Light Accent 6" w:uiPriority="46"/>
+    <w:lsdException w:name="Grid Table 2 Accent 6" w:uiPriority="47"/>
+    <w:lsdException w:name="Grid Table 3 Accent 6" w:uiPriority="48"/>
+    <w:lsdException w:name="Grid Table 4 Accent 6" w:uiPriority="49"/>
+    <w:lsdException w:name="Grid Table 5 Dark Accent 6" w:uiPriority="50"/>
+    <w:lsdException w:name="Grid Table 6 Colorful Accent 6" w:uiPriority="51"/>
+    <w:lsdException w:name="Grid Table 7 Colorful Accent 6" w:uiPriority="52"/>
+    <w:lsdException w:name="List Table 1 Light" w:uiPriority="46"/>
+    <w:lsdException w:name="List Table 2" w:uiPriority="47"/>
+    <w:lsdException w:name="List Table 3" w:uiPriority="48"/>
+    <w:lsdException w:name="List Table 4" w:uiPriority="49"/>
+    <w:lsdException w:name="List Table 5 Dark" w:uiPriority="50"/>
+    <w:lsdException w:name="List Table 6 Colorful" w:uiPriority="51"/>
+    <w:lsdException w:name="List Table 7 Colorful" w:uiPriority="52"/>
+    <w:lsdException w:name="List Table 1 Light Accent 1" w:uiPriority="46"/>
+    <w:lsdException w:name="List Table 2 Accent 1" w:uiPriority="47"/>
+    <w:lsdException w:name="List Table 3 Accent 1" w:uiPriority="48"/>
+    <w:lsdException w:name="List Table 4 Accent 1" w:uiPriority="49"/>
+    <w:lsdException w:name="List Table 5 Dark Accent 1" w:uiPriority="50"/>
+    <w:lsdException w:name="List Table 6 Colorful Accent 1" w:uiPriority="51"/>
+    <w:lsdException w:name="List Table 7 Colorful Accent 1" w:uiPriority="52"/>
+    <w:lsdException w:name="List Table 1 Light Accent 2" w:uiPriority="46"/>
+    <w:lsdException w:name="List Table 2 Accent 2" w:uiPriority="47"/>
+    <w:lsdException w:name="List Table 3 Accent 2" w:uiPriority="48"/>
+    <w:lsdException w:name="List Table 4 Accent 2" w:uiPriority="49"/>
+    <w:lsdException w:name="List Table 5 Dark Accent 2" w:uiPriority="50"/>
+    <w:lsdException w:name="List Table 6 Colorful Accent 2" w:uiPriority="51"/>
+    <w:lsdException w:name="List Table 7 Colorful Accent 2" w:uiPriority="52"/>
+    <w:lsdException w:name="List Table 1 Light Accent 3" w:uiPriority="46"/>
+    <w:lsdException w:name="List Table 2 Accent 3" w:uiPriority="47"/>
+    <w:lsdException w:name="List Table 3 Accent 3" w:uiPriority="48"/>
+    <w:lsdException w:name="List Table 4 Accent 3" w:uiPriority="49"/>
+    <w:lsdException w:name="List Table 5 Dark Accent 3" w:uiPriority="50"/>
+    <w:lsdException w:name="List Table 6 Colorful Accent 3" w:uiPriority="51"/>
+    <w:lsdException w:name="List Table 7 Colorful Accent 3" w:uiPriority="52"/>
+    <w:lsdException w:name="List Table 1 Light Accent 4" w:uiPriority="46"/>
+    <w:lsdException w:name="List Table 2 Accent 4" w:uiPriority="47"/>
+    <w:lsdException w:name="List Table 3 Accent 4" w:uiPriority="48"/>
+    <w:lsdException w:name="List Table 4 Accent 4" w:uiPriority="49"/>
+    <w:lsdException w:name="List Table 5 Dark Accent 4" w:uiPriority="50"/>
+    <w:lsdException w:name="List Table 6 Colorful Accent 4" w:uiPriority="51"/>
+    <w:lsdException w:name="List Table 7 Colorful Accent 4" w:uiPriority="52"/>
+    <w:lsdException w:name="List Table 1 Light Accent 5" w:uiPriority="46"/>
+    <w:lsdException w:name="List Table 2 Accent 5" w:uiPriority="47"/>
+    <w:lsdException w:name="List Table 3 Accent 5" w:uiPriority="48"/>
+    <w:lsdException w:name="List Table 4 Accent 5" w:uiPriority="49"/>
+    <w:lsdException w:name="List Table 5 Dark Accent 5" w:uiPriority="50"/>
+    <w:lsdException w:name="List Table 6 Colorful Accent 5" w:uiPriority="51"/>
+    <w:lsdException w:name="List Table 7 Colorful Accent 5" w:uiPriority="52"/>
+    <w:lsdException w:name="List Table 1 Light Accent 6" w:uiPriority="46"/>
+    <w:lsdException w:name="List Table 2 Accent 6" w:uiPriority="47"/>
+    <w:lsdException w:name="List Table 3 Accent 6" w:uiPriority="48"/>
+    <w:lsdException w:name="List Table 4 Accent 6" w:uiPriority="49"/>
+    <w:lsdException w:name="List Table 5 Dark Accent 6" w:uiPriority="50"/>
+    <w:lsdException w:name="List Table 6 Colorful Accent 6" w:uiPriority="51"/>
+    <w:lsdException w:name="List Table 7 Colorful Accent 6" w:uiPriority="52"/>
+    <w:lsdException w:name="Mention" w:semiHidden="1" w:unhideWhenUsed="1"/>
+    <w:lsdException w:name="Smart Hyperlink" w:semiHidden="1" w:unhideWhenUsed="1"/>
+    <w:lsdException w:name="Hashtag" w:semiHidden="1" w:unhideWhenUsed="1"/>
+    <w:lsdException w:name="Unresolved Mention" w:semiHidden="1" w:unhideWhenUsed="1"/>
+    <w:lsdException w:name="Smart Link" w:semiHidden="1" w:unhideWhenUsed="1"/>
   </w:latentStyles>
   <w:style w:type="paragraph" w:default="1" w:styleId="Normal">
     <w:name w:val="Normal"/>

</xml_diff>